<commit_message>
Primera version del mockup del prototipo
</commit_message>
<xml_diff>
--- a/Reporte_Proyecto_DSA.docx
+++ b/Reporte_Proyecto_DSA.docx
@@ -5,7 +5,13 @@
     <w:sdt>
       <w:sdtPr>
         <w:rPr>
-          <w:lang w:val="es-ES"/>
+          <w:rFonts w:asciiTheme="minorHAnsi" w:eastAsiaTheme="minorHAnsi" w:hAnsiTheme="minorHAnsi" w:cstheme="minorBidi"/>
+          <w:color w:val="auto"/>
+          <w:kern w:val="2"/>
+          <w:sz w:val="22"/>
+          <w:szCs w:val="22"/>
+          <w:lang w:val="es-ES" w:eastAsia="en-US"/>
+          <w14:ligatures w14:val="standardContextual"/>
         </w:rPr>
         <w:id w:val="485522806"/>
         <w:docPartObj>
@@ -15,15 +21,8 @@
       </w:sdtPr>
       <w:sdtEndPr>
         <w:rPr>
-          <w:rFonts w:asciiTheme="minorHAnsi" w:eastAsiaTheme="minorHAnsi" w:hAnsiTheme="minorHAnsi" w:cstheme="minorBidi"/>
           <w:b/>
           <w:bCs/>
-          <w:color w:val="auto"/>
-          <w:kern w:val="2"/>
-          <w:sz w:val="22"/>
-          <w:szCs w:val="22"/>
-          <w:lang w:eastAsia="en-US"/>
-          <w14:ligatures w14:val="standardContextual"/>
         </w:rPr>
       </w:sdtEndPr>
       <w:sdtContent>
@@ -1095,6 +1094,7 @@
       <w:r>
         <w:rPr>
           <w:rFonts w:eastAsia="Times New Roman" w:cstheme="minorHAnsi"/>
+          <w:noProof/>
           <w:kern w:val="0"/>
           <w:lang w:eastAsia="es-CO"/>
           <w14:ligatures w14:val="none"/>
@@ -1233,6 +1233,7 @@
       <w:r>
         <w:rPr>
           <w:rFonts w:eastAsia="Times New Roman" w:cstheme="minorHAnsi"/>
+          <w:noProof/>
           <w:kern w:val="0"/>
           <w:lang w:eastAsia="es-CO"/>
           <w14:ligatures w14:val="none"/>
@@ -1401,12 +1402,133 @@
     <w:p>
       <w:pPr>
         <w:pStyle w:val="Ttulo1"/>
+        <w:numPr>
+          <w:ilvl w:val="0"/>
+          <w:numId w:val="1"/>
+        </w:numPr>
       </w:pPr>
       <w:bookmarkStart w:id="4" w:name="_Toc243490729"/>
       <w:r>
-        <w:t>5. Maqueta (mockup) del prototipo</w:t>
+        <w:t>Maqueta (mockup) del prototipo</w:t>
       </w:r>
       <w:bookmarkEnd w:id="4"/>
+    </w:p>
+    <w:p>
+      <w:pPr>
+        <w:spacing w:after="0" w:line="300" w:lineRule="atLeast"/>
+        <w:rPr>
+          <w:rFonts w:eastAsia="Times New Roman" w:cstheme="minorHAnsi"/>
+          <w:kern w:val="0"/>
+          <w:lang w:eastAsia="es-CO"/>
+          <w14:ligatures w14:val="none"/>
+        </w:rPr>
+      </w:pPr>
+      <w:r>
+        <w:rPr>
+          <w:rFonts w:eastAsia="Times New Roman" w:cstheme="minorHAnsi"/>
+          <w:kern w:val="0"/>
+          <w:lang w:eastAsia="es-CO"/>
+          <w14:ligatures w14:val="none"/>
+        </w:rPr>
+        <w:t>Como propuesta inicial del prototipo se plantea un tablero que permita comparar de forma sencilla la actividad inmobiliaria de Armenia, Manizales y Pereira. La maqueta reúne elementos para consultar la evolución de las compraventas y los valores registrados, comparar los municipios seleccionados y presentar posteriormente los resultados del componente predictivo. De esta manera, el prototipo busca integrar en una misma vista la información necesaria para apoyar la priorización de municipios para estudios posteriores de inversión inmobiliaria.</w:t>
+      </w:r>
+    </w:p>
+    <w:p>
+      <w:pPr>
+        <w:spacing w:after="0" w:line="300" w:lineRule="atLeast"/>
+        <w:rPr>
+          <w:rFonts w:eastAsia="Times New Roman" w:cstheme="minorHAnsi"/>
+          <w:kern w:val="0"/>
+          <w:lang w:eastAsia="es-CO"/>
+          <w14:ligatures w14:val="none"/>
+        </w:rPr>
+      </w:pPr>
+    </w:p>
+    <w:p>
+      <w:pPr>
+        <w:spacing w:after="0" w:line="300" w:lineRule="atLeast"/>
+        <w:rPr>
+          <w:rFonts w:eastAsia="Times New Roman" w:cstheme="minorHAnsi"/>
+          <w:kern w:val="0"/>
+          <w:lang w:eastAsia="es-CO"/>
+          <w14:ligatures w14:val="none"/>
+        </w:rPr>
+      </w:pPr>
+      <w:r>
+        <w:rPr>
+          <w:rFonts w:eastAsia="Times New Roman" w:cstheme="minorHAnsi"/>
+          <w:kern w:val="0"/>
+          <w:lang w:eastAsia="es-CO"/>
+          <w14:ligatures w14:val="none"/>
+        </w:rPr>
+        <w:drawing>
+          <wp:inline distT="0" distB="0" distL="0" distR="0" wp14:anchorId="61BF39FA" wp14:editId="337E8ACE">
+            <wp:extent cx="5612130" cy="3128645"/>
+            <wp:effectExtent l="0" t="0" r="7620" b="0"/>
+            <wp:docPr id="577539495" name="Imagen 1"/>
+            <wp:cNvGraphicFramePr>
+              <a:graphicFrameLocks xmlns:a="http://schemas.openxmlformats.org/drawingml/2006/main" noChangeAspect="1"/>
+            </wp:cNvGraphicFramePr>
+            <a:graphic xmlns:a="http://schemas.openxmlformats.org/drawingml/2006/main">
+              <a:graphicData uri="http://schemas.openxmlformats.org/drawingml/2006/picture">
+                <pic:pic xmlns:pic="http://schemas.openxmlformats.org/drawingml/2006/picture">
+                  <pic:nvPicPr>
+                    <pic:cNvPr id="577539495" name=""/>
+                    <pic:cNvPicPr/>
+                  </pic:nvPicPr>
+                  <pic:blipFill>
+                    <a:blip r:embed="rId8"/>
+                    <a:stretch>
+                      <a:fillRect/>
+                    </a:stretch>
+                  </pic:blipFill>
+                  <pic:spPr>
+                    <a:xfrm>
+                      <a:off x="0" y="0"/>
+                      <a:ext cx="5612130" cy="3128645"/>
+                    </a:xfrm>
+                    <a:prstGeom prst="rect">
+                      <a:avLst/>
+                    </a:prstGeom>
+                  </pic:spPr>
+                </pic:pic>
+              </a:graphicData>
+            </a:graphic>
+          </wp:inline>
+        </w:drawing>
+      </w:r>
+    </w:p>
+    <w:p>
+      <w:pPr>
+        <w:spacing w:after="0" w:line="300" w:lineRule="atLeast"/>
+        <w:jc w:val="right"/>
+        <w:rPr>
+          <w:rFonts w:eastAsia="Times New Roman" w:cstheme="minorHAnsi"/>
+          <w:kern w:val="0"/>
+          <w:lang w:eastAsia="es-CO"/>
+          <w14:ligatures w14:val="none"/>
+        </w:rPr>
+      </w:pPr>
+      <w:r>
+        <w:rPr>
+          <w:rFonts w:eastAsia="Times New Roman" w:cstheme="minorHAnsi"/>
+          <w:kern w:val="0"/>
+          <w:lang w:eastAsia="es-CO"/>
+          <w14:ligatures w14:val="none"/>
+        </w:rPr>
+        <w:t>Figura 3. Maqueta inicial del prototipo propuesto.</w:t>
+      </w:r>
+    </w:p>
+    <w:p>
+      <w:pPr>
+        <w:spacing w:after="0" w:line="300" w:lineRule="atLeast"/>
+        <w:rPr>
+          <w:rFonts w:eastAsia="Times New Roman" w:cstheme="minorHAnsi"/>
+          <w:kern w:val="0"/>
+          <w:lang w:eastAsia="es-CO"/>
+          <w14:ligatures w14:val="none"/>
+        </w:rPr>
+      </w:pPr>
     </w:p>
     <w:p>
       <w:pPr>

</xml_diff>

<commit_message>
Ajustes del reporte y datos del proyecto
</commit_message>
<xml_diff>
--- a/Reporte_Proyecto_DSA.docx
+++ b/Reporte_Proyecto_DSA.docx
@@ -29,6 +29,7 @@
         <w:p>
           <w:pPr>
             <w:pStyle w:val="TtuloTDC"/>
+            <w:ind w:firstLine="708"/>
           </w:pPr>
           <w:r>
             <w:rPr>
@@ -545,6 +546,8 @@
         <w:rPr>
           <w:rStyle w:val="Fuerte"/>
           <w:rFonts w:asciiTheme="minorHAnsi" w:hAnsiTheme="minorHAnsi" w:cstheme="minorHAnsi"/>
+          <w:b w:val="0"/>
+          <w:bCs w:val="0"/>
           <w:sz w:val="22"/>
           <w:szCs w:val="22"/>
         </w:rPr>
@@ -553,15 +556,37 @@
       <w:r>
         <w:rPr>
           <w:rFonts w:asciiTheme="minorHAnsi" w:hAnsiTheme="minorHAnsi" w:cstheme="minorHAnsi"/>
-          <w:sz w:val="22"/>
-          <w:szCs w:val="22"/>
-        </w:rPr>
-        <w:t xml:space="preserve">, tomando como periodo de análisis los años </w:t>
+          <w:b/>
+          <w:bCs/>
+          <w:sz w:val="22"/>
+          <w:szCs w:val="22"/>
+        </w:rPr>
+        <w:t xml:space="preserve">, </w:t>
+      </w:r>
+      <w:r>
+        <w:rPr>
+          <w:rFonts w:asciiTheme="minorHAnsi" w:hAnsiTheme="minorHAnsi" w:cstheme="minorHAnsi"/>
+          <w:sz w:val="22"/>
+          <w:szCs w:val="22"/>
+        </w:rPr>
+        <w:t>tomando como periodo de análisis los años</w:t>
+      </w:r>
+      <w:r>
+        <w:rPr>
+          <w:rFonts w:asciiTheme="minorHAnsi" w:hAnsiTheme="minorHAnsi" w:cstheme="minorHAnsi"/>
+          <w:b/>
+          <w:bCs/>
+          <w:sz w:val="22"/>
+          <w:szCs w:val="22"/>
+        </w:rPr>
+        <w:t xml:space="preserve"> </w:t>
       </w:r>
       <w:r>
         <w:rPr>
           <w:rStyle w:val="Fuerte"/>
           <w:rFonts w:asciiTheme="minorHAnsi" w:hAnsiTheme="minorHAnsi" w:cstheme="minorHAnsi"/>
+          <w:b w:val="0"/>
+          <w:bCs w:val="0"/>
           <w:sz w:val="22"/>
           <w:szCs w:val="22"/>
         </w:rPr>
@@ -570,46 +595,39 @@
       <w:r>
         <w:rPr>
           <w:rFonts w:asciiTheme="minorHAnsi" w:hAnsiTheme="minorHAnsi" w:cstheme="minorHAnsi"/>
-          <w:sz w:val="22"/>
-          <w:szCs w:val="22"/>
-        </w:rPr>
-        <w:t>. El interés principal es aprovechar estos datos para generar información que sirva como apoyo en la priorización de municipios donde se puedan profundizar posteriormente estudios de inversión inmobiliaria.</w:t>
-      </w:r>
-    </w:p>
-    <w:p>
-      <w:pPr>
-        <w:pStyle w:val="NormalWeb"/>
-        <w:spacing w:line="300" w:lineRule="atLeast"/>
-        <w:rPr>
-          <w:rFonts w:asciiTheme="minorHAnsi" w:hAnsiTheme="minorHAnsi" w:cstheme="minorHAnsi"/>
-          <w:sz w:val="22"/>
-          <w:szCs w:val="22"/>
-        </w:rPr>
-      </w:pPr>
-      <w:r>
-        <w:rPr>
-          <w:rFonts w:asciiTheme="minorHAnsi" w:hAnsiTheme="minorHAnsi" w:cstheme="minorHAnsi"/>
-          <w:sz w:val="22"/>
-          <w:szCs w:val="22"/>
-        </w:rPr>
-        <w:t xml:space="preserve">El análisis se enfocará en </w:t>
-      </w:r>
-      <w:r>
-        <w:rPr>
-          <w:rStyle w:val="Fuerte"/>
-          <w:rFonts w:asciiTheme="minorHAnsi" w:hAnsiTheme="minorHAnsi" w:cstheme="minorHAnsi"/>
-          <w:sz w:val="22"/>
-          <w:szCs w:val="22"/>
-        </w:rPr>
-        <w:t>compraventas de predios urbanos</w:t>
-      </w:r>
-      <w:r>
-        <w:rPr>
-          <w:rFonts w:asciiTheme="minorHAnsi" w:hAnsiTheme="minorHAnsi" w:cstheme="minorHAnsi"/>
-          <w:sz w:val="22"/>
-          <w:szCs w:val="22"/>
-        </w:rPr>
-        <w:t xml:space="preserve"> y buscará combinar la revisión de la actividad transaccional histórica con el análisis de los valores registrados. De esta manera, se espera contar con elementos de comparación entre los municipios seleccionados, sin que los resultados se interpreten como una recomendación directa de inversión o como una garantía de rentabilidad.</w:t>
+          <w:b/>
+          <w:bCs/>
+          <w:sz w:val="22"/>
+          <w:szCs w:val="22"/>
+        </w:rPr>
+        <w:t>.</w:t>
+      </w:r>
+      <w:r>
+        <w:rPr>
+          <w:rFonts w:asciiTheme="minorHAnsi" w:hAnsiTheme="minorHAnsi" w:cstheme="minorHAnsi"/>
+          <w:sz w:val="22"/>
+          <w:szCs w:val="22"/>
+        </w:rPr>
+        <w:t xml:space="preserve"> El interés principal es aprovechar estos datos para generar información que sirva como apoyo en la priorización de municipios donde se puedan profundizar posteriormente estudios de inversión inmobiliaria.</w:t>
+      </w:r>
+    </w:p>
+    <w:p>
+      <w:pPr>
+        <w:rPr>
+          <w:rFonts w:eastAsia="Times New Roman" w:cstheme="minorHAnsi"/>
+          <w:kern w:val="0"/>
+          <w:lang w:eastAsia="es-CO"/>
+          <w14:ligatures w14:val="none"/>
+        </w:rPr>
+      </w:pPr>
+      <w:r>
+        <w:rPr>
+          <w:rFonts w:eastAsia="Times New Roman" w:cstheme="minorHAnsi"/>
+          <w:kern w:val="0"/>
+          <w:lang w:eastAsia="es-CO"/>
+          <w14:ligatures w14:val="none"/>
+        </w:rPr>
+        <w:t>El análisis se enfocará en compraventas de predios urbanos y buscará combinar la revisión de la actividad transaccional histórica con el análisis de los valores registrados. De esta manera, se espera contar con elementos de comparación entre los municipios seleccionados. Además, el componente predictivo permitirá complementar este análisis mediante la estimación de valores a partir de la información disponible, aportando un elemento adicional para apoyar la evaluación de los municipios. Los resultados no se interpretarán como una recomendación directa de inversión ni como una garantía de rentabilidad.</w:t>
       </w:r>
     </w:p>
     <w:p/>
@@ -681,47 +699,26 @@
           <w:lang w:eastAsia="es-CO"/>
           <w14:ligatures w14:val="none"/>
         </w:rPr>
-        <w:t xml:space="preserve">El proyecto se concentrará en el análisis de compraventas de predios urbanos en </w:t>
-      </w:r>
-      <w:r>
-        <w:rPr>
-          <w:rFonts w:eastAsia="Times New Roman" w:cstheme="minorHAnsi"/>
-          <w:b/>
-          <w:bCs/>
-          <w:kern w:val="0"/>
-          <w:lang w:eastAsia="es-CO"/>
-          <w14:ligatures w14:val="none"/>
-        </w:rPr>
-        <w:t>Armenia, Manizales y Pereira</w:t>
-      </w:r>
-      <w:r>
-        <w:rPr>
-          <w:rFonts w:eastAsia="Times New Roman" w:cstheme="minorHAnsi"/>
-          <w:kern w:val="0"/>
-          <w:lang w:eastAsia="es-CO"/>
-          <w14:ligatures w14:val="none"/>
-        </w:rPr>
-        <w:t xml:space="preserve"> durante el periodo </w:t>
-      </w:r>
-      <w:r>
-        <w:rPr>
-          <w:rFonts w:eastAsia="Times New Roman" w:cstheme="minorHAnsi"/>
-          <w:b/>
-          <w:bCs/>
-          <w:kern w:val="0"/>
-          <w:lang w:eastAsia="es-CO"/>
-          <w14:ligatures w14:val="none"/>
-        </w:rPr>
-        <w:t>2015–2023</w:t>
-      </w:r>
-      <w:r>
-        <w:rPr>
-          <w:rFonts w:eastAsia="Times New Roman" w:cstheme="minorHAnsi"/>
-          <w:kern w:val="0"/>
-          <w:lang w:eastAsia="es-CO"/>
-          <w14:ligatures w14:val="none"/>
-        </w:rPr>
-        <w:t>. Se utilizarán registros de compraventa con valores positivos y sin indicador de múltiples valores, con el fin de trabajar con criterios comunes entre los tres municipios.</w:t>
+        <w:t>El proyecto se concentrará en el análisis de compraventas de predios urbanos en Armenia, Manizales y Pereira durante el periodo 2015–2023. Se utilizarán registros de compraventa co</w:t>
+      </w:r>
+      <w:r>
+        <w:rPr>
+          <w:rFonts w:eastAsia="Times New Roman" w:cstheme="minorHAnsi"/>
+          <w:kern w:val="0"/>
+          <w:lang w:eastAsia="es-CO"/>
+          <w14:ligatures w14:val="none"/>
+        </w:rPr>
+        <w:t xml:space="preserve">n </w:t>
+      </w:r>
+      <w:r>
+        <w:rPr>
+          <w:rFonts w:eastAsia="Times New Roman" w:cstheme="minorHAnsi"/>
+          <w:kern w:val="0"/>
+          <w:lang w:eastAsia="es-CO"/>
+          <w14:ligatures w14:val="none"/>
+        </w:rPr>
+        <w:lastRenderedPageBreak/>
+        <w:t>valores positivos y sin indicador de múltiples valores, con el fin de trabajar con criterios comunes entre los tres municipios.</w:t>
       </w:r>
     </w:p>
     <w:p>
@@ -741,7 +738,6 @@
           <w:lang w:eastAsia="es-CO"/>
           <w14:ligatures w14:val="none"/>
         </w:rPr>
-        <w:lastRenderedPageBreak/>
         <w:t>La solución buscará combinar un componente descriptivo, que permita comparar la actividad transaccional y los valores registrados, con un componente predictivo orientado a la estimación de valores. Los resultados servirán como apoyo para identificar qué municipios pueden ser priorizados para estudios posteriores de inversión. El alcance no incluye recomendaciones sobre la compra de inmuebles específicos ni pretende garantizar una rentabilidad futura.</w:t>
       </w:r>
     </w:p>
@@ -787,17 +783,15 @@
           <w:sz w:val="22"/>
           <w:szCs w:val="22"/>
         </w:rPr>
-        <w:t xml:space="preserve">Para el proyecto se utilizará como fuente principal el conjunto de </w:t>
-      </w:r>
-      <w:proofErr w:type="spellStart"/>
-      <w:proofErr w:type="gramStart"/>
-      <w:r>
-        <w:rPr>
-          <w:rFonts w:asciiTheme="minorHAnsi" w:hAnsiTheme="minorHAnsi" w:cstheme="minorHAnsi"/>
-          <w:sz w:val="22"/>
-          <w:szCs w:val="22"/>
-        </w:rPr>
-        <w:t>datos</w:t>
+        <w:t>Para el proyecto se utilizará como fuente principal el conjunto de datos</w:t>
+      </w:r>
+      <w:r>
+        <w:rPr>
+          <w:rFonts w:asciiTheme="minorHAnsi" w:hAnsiTheme="minorHAnsi" w:cstheme="minorHAnsi"/>
+          <w:sz w:val="22"/>
+          <w:szCs w:val="22"/>
+        </w:rPr>
+        <w:t xml:space="preserve"> </w:t>
       </w:r>
       <w:r>
         <w:rPr>
@@ -806,27 +800,7 @@
           <w:sz w:val="22"/>
           <w:szCs w:val="22"/>
         </w:rPr>
-        <w:t>“</w:t>
-      </w:r>
-      <w:proofErr w:type="gramEnd"/>
-      <w:r>
-        <w:rPr>
-          <w:rStyle w:val="Fuerte"/>
-          <w:rFonts w:asciiTheme="minorHAnsi" w:hAnsiTheme="minorHAnsi" w:cstheme="minorHAnsi"/>
-          <w:sz w:val="22"/>
-          <w:szCs w:val="22"/>
-        </w:rPr>
-        <w:t>Registro</w:t>
-      </w:r>
-      <w:proofErr w:type="spellEnd"/>
-      <w:r>
-        <w:rPr>
-          <w:rStyle w:val="Fuerte"/>
-          <w:rFonts w:asciiTheme="minorHAnsi" w:hAnsiTheme="minorHAnsi" w:cstheme="minorHAnsi"/>
-          <w:sz w:val="22"/>
-          <w:szCs w:val="22"/>
-        </w:rPr>
-        <w:t xml:space="preserve"> de Transacciones Inmobiliarias en Colombia IGAC 2015–2023”</w:t>
+        <w:t>“Registro de Transacciones Inmobiliarias en Colombia IGAC 2015–2023”</w:t>
       </w:r>
       <w:r>
         <w:rPr>
@@ -879,7 +853,27 @@
           <w:sz w:val="22"/>
           <w:szCs w:val="22"/>
         </w:rPr>
-        <w:t>2015 y 2023</w:t>
+        <w:t xml:space="preserve">2015 </w:t>
+      </w:r>
+      <w:r>
+        <w:rPr>
+          <w:rStyle w:val="Fuerte"/>
+          <w:rFonts w:asciiTheme="minorHAnsi" w:hAnsiTheme="minorHAnsi" w:cstheme="minorHAnsi"/>
+          <w:b w:val="0"/>
+          <w:bCs w:val="0"/>
+          <w:sz w:val="22"/>
+          <w:szCs w:val="22"/>
+        </w:rPr>
+        <w:t>y</w:t>
+      </w:r>
+      <w:r>
+        <w:rPr>
+          <w:rStyle w:val="Fuerte"/>
+          <w:rFonts w:asciiTheme="minorHAnsi" w:hAnsiTheme="minorHAnsi" w:cstheme="minorHAnsi"/>
+          <w:sz w:val="22"/>
+          <w:szCs w:val="22"/>
+        </w:rPr>
+        <w:t xml:space="preserve"> 2023</w:t>
       </w:r>
       <w:r>
         <w:rPr>
@@ -912,6 +906,8 @@
         <w:rPr>
           <w:rStyle w:val="Fuerte"/>
           <w:rFonts w:asciiTheme="minorHAnsi" w:hAnsiTheme="minorHAnsi" w:cstheme="minorHAnsi"/>
+          <w:b w:val="0"/>
+          <w:bCs w:val="0"/>
           <w:sz w:val="22"/>
           <w:szCs w:val="22"/>
         </w:rPr>
@@ -929,6 +925,8 @@
         <w:rPr>
           <w:rStyle w:val="Fuerte"/>
           <w:rFonts w:asciiTheme="minorHAnsi" w:hAnsiTheme="minorHAnsi" w:cstheme="minorHAnsi"/>
+          <w:b w:val="0"/>
+          <w:bCs w:val="0"/>
           <w:sz w:val="22"/>
           <w:szCs w:val="22"/>
         </w:rPr>
@@ -1206,7 +1204,7 @@
           <w:lang w:eastAsia="es-CO"/>
           <w14:ligatures w14:val="none"/>
         </w:rPr>
-        <w:t>. También se observa una reducción de las operaciones en los tres municipios durante 2020 y una recuperación posterior, aunque con comportamientos diferentes entre las ciudades.</w:t>
+        <w:t>, seguida por Manizales y Pereira. También se observa una disminución de las compraventas registradas en los tres municipios durante 2020 y una recuperación en 2021. A partir de ese momento, los municipios presentan comportamientos diferentes, lo que permite observar que la actividad transaccional no ha evolucionado de la misma manera en las tres ciudades.</w:t>
       </w:r>
     </w:p>
     <w:p>
@@ -1293,6 +1291,7 @@
           <w:lang w:eastAsia="es-CO"/>
           <w14:ligatures w14:val="none"/>
         </w:rPr>
+        <w:lastRenderedPageBreak/>
         <w:t>Figura 2. Valor mediano registrado por municipio, 2015–2023</w:t>
       </w:r>
     </w:p>
@@ -1324,68 +1323,7 @@
           <w:lang w:eastAsia="es-CO"/>
           <w14:ligatures w14:val="none"/>
         </w:rPr>
-        <w:lastRenderedPageBreak/>
-        <w:t xml:space="preserve">Al revisar los valores registrados se encontraron diferencias importantes entre el promedio y la mediana, debido a la presencia de valores muy altos y muy bajos dentro de los datos. Por esta razón, se utilizó la mediana para realizar una comparación menos afectada por estos valores extremos. En el periodo analizado, la mediana pasó de </w:t>
-      </w:r>
-      <w:r>
-        <w:rPr>
-          <w:rFonts w:eastAsia="Times New Roman" w:cstheme="minorHAnsi"/>
-          <w:b/>
-          <w:bCs/>
-          <w:kern w:val="0"/>
-          <w:lang w:eastAsia="es-CO"/>
-          <w14:ligatures w14:val="none"/>
-        </w:rPr>
-        <w:t>$45,1 millones a $108 millones en Armenia</w:t>
-      </w:r>
-      <w:r>
-        <w:rPr>
-          <w:rFonts w:eastAsia="Times New Roman" w:cstheme="minorHAnsi"/>
-          <w:kern w:val="0"/>
-          <w:lang w:eastAsia="es-CO"/>
-          <w14:ligatures w14:val="none"/>
-        </w:rPr>
-        <w:t xml:space="preserve">, de </w:t>
-      </w:r>
-      <w:r>
-        <w:rPr>
-          <w:rFonts w:eastAsia="Times New Roman" w:cstheme="minorHAnsi"/>
-          <w:b/>
-          <w:bCs/>
-          <w:kern w:val="0"/>
-          <w:lang w:eastAsia="es-CO"/>
-          <w14:ligatures w14:val="none"/>
-        </w:rPr>
-        <w:t>$83,1 millones a $135 millones en Manizales</w:t>
-      </w:r>
-      <w:r>
-        <w:rPr>
-          <w:rFonts w:eastAsia="Times New Roman" w:cstheme="minorHAnsi"/>
-          <w:kern w:val="0"/>
-          <w:lang w:eastAsia="es-CO"/>
-          <w14:ligatures w14:val="none"/>
-        </w:rPr>
-        <w:t xml:space="preserve"> y de </w:t>
-      </w:r>
-      <w:r>
-        <w:rPr>
-          <w:rFonts w:eastAsia="Times New Roman" w:cstheme="minorHAnsi"/>
-          <w:b/>
-          <w:bCs/>
-          <w:kern w:val="0"/>
-          <w:lang w:eastAsia="es-CO"/>
-          <w14:ligatures w14:val="none"/>
-        </w:rPr>
-        <w:t>$79,7 millones a $123 millones en Pereira</w:t>
-      </w:r>
-      <w:r>
-        <w:rPr>
-          <w:rFonts w:eastAsia="Times New Roman" w:cstheme="minorHAnsi"/>
-          <w:kern w:val="0"/>
-          <w:lang w:eastAsia="es-CO"/>
-          <w14:ligatures w14:val="none"/>
-        </w:rPr>
-        <w:t>, entre 2015 y 2023. Estos valores corresponden a los registros disponibles y no están ajustados por inflación, por lo que se utilizan únicamente como una comparación descriptiva de su evolución.</w:t>
+        <w:t>Al revisar la distribución de los valores registrados se encontraron diferencias importantes entre el promedio y la mediana. Para el conjunto analizado, Armenia presenta una mediana de $68 millones frente a un promedio cercano a $101,6 millones; Manizales una mediana de $99 millones frente a un promedio de $210,2 millones; y Pereira una mediana de $92,5 millones frente a un promedio de $283,9 millones. Estas diferencias, junto con la presencia de valores mínimos y máximos muy alejados, muestran que el promedio puede verse afectado por valores extremos. Por esta razón, se utilizó la mediana para realizar una comparación menos afectada por dichos valores. En el periodo analizado, la mediana pasó de $45,1 millones a $108 millones en Armenia, de $83,1 millones a $135 millones en Manizales y de $79,7 millones a $123 millones en Pereira entre 2015 y 2023. Estos valores corresponden a los registros disponibles y no están ajustados por inflación, por lo que se utilizan únicamente como una comparación descriptiva de su evolución.</w:t>
       </w:r>
     </w:p>
     <w:p>
@@ -1457,6 +1395,7 @@
       <w:r>
         <w:rPr>
           <w:rFonts w:eastAsia="Times New Roman" w:cstheme="minorHAnsi"/>
+          <w:noProof/>
           <w:kern w:val="0"/>
           <w:lang w:eastAsia="es-CO"/>
           <w14:ligatures w14:val="none"/>
@@ -1536,6 +1475,7 @@
       </w:pPr>
       <w:bookmarkStart w:id="5" w:name="_Toc243490730"/>
       <w:r>
+        <w:lastRenderedPageBreak/>
         <w:t>6. Repositorios y soportes</w:t>
       </w:r>
       <w:bookmarkEnd w:id="5"/>

</xml_diff>

<commit_message>
Actualizacion de informe con evidencias DVC e informe de trabajo en equipo
</commit_message>
<xml_diff>
--- a/Reporte_Proyecto_DSA.docx
+++ b/Reporte_Proyecto_DSA.docx
@@ -544,7 +544,7 @@
       </w:r>
       <w:r>
         <w:rPr>
-          <w:rStyle w:val="Fuerte"/>
+          <w:rStyle w:val="Textoennegrita"/>
           <w:rFonts w:asciiTheme="minorHAnsi" w:hAnsiTheme="minorHAnsi" w:cstheme="minorHAnsi"/>
           <w:b w:val="0"/>
           <w:bCs w:val="0"/>
@@ -583,7 +583,7 @@
       </w:r>
       <w:r>
         <w:rPr>
-          <w:rStyle w:val="Fuerte"/>
+          <w:rStyle w:val="Textoennegrita"/>
           <w:rFonts w:asciiTheme="minorHAnsi" w:hAnsiTheme="minorHAnsi" w:cstheme="minorHAnsi"/>
           <w:b w:val="0"/>
           <w:bCs w:val="0"/>
@@ -795,7 +795,7 @@
       </w:r>
       <w:r>
         <w:rPr>
-          <w:rStyle w:val="Fuerte"/>
+          <w:rStyle w:val="Textoennegrita"/>
           <w:rFonts w:asciiTheme="minorHAnsi" w:hAnsiTheme="minorHAnsi" w:cstheme="minorHAnsi"/>
           <w:sz w:val="22"/>
           <w:szCs w:val="22"/>
@@ -831,7 +831,7 @@
       </w:r>
       <w:r>
         <w:rPr>
-          <w:rStyle w:val="Fuerte"/>
+          <w:rStyle w:val="Textoennegrita"/>
           <w:rFonts w:asciiTheme="minorHAnsi" w:hAnsiTheme="minorHAnsi" w:cstheme="minorHAnsi"/>
           <w:sz w:val="22"/>
           <w:szCs w:val="22"/>
@@ -848,7 +848,7 @@
       </w:r>
       <w:r>
         <w:rPr>
-          <w:rStyle w:val="Fuerte"/>
+          <w:rStyle w:val="Textoennegrita"/>
           <w:rFonts w:asciiTheme="minorHAnsi" w:hAnsiTheme="minorHAnsi" w:cstheme="minorHAnsi"/>
           <w:sz w:val="22"/>
           <w:szCs w:val="22"/>
@@ -857,7 +857,7 @@
       </w:r>
       <w:r>
         <w:rPr>
-          <w:rStyle w:val="Fuerte"/>
+          <w:rStyle w:val="Textoennegrita"/>
           <w:rFonts w:asciiTheme="minorHAnsi" w:hAnsiTheme="minorHAnsi" w:cstheme="minorHAnsi"/>
           <w:b w:val="0"/>
           <w:bCs w:val="0"/>
@@ -868,7 +868,7 @@
       </w:r>
       <w:r>
         <w:rPr>
-          <w:rStyle w:val="Fuerte"/>
+          <w:rStyle w:val="Textoennegrita"/>
           <w:rFonts w:asciiTheme="minorHAnsi" w:hAnsiTheme="minorHAnsi" w:cstheme="minorHAnsi"/>
           <w:sz w:val="22"/>
           <w:szCs w:val="22"/>
@@ -904,7 +904,7 @@
       </w:r>
       <w:r>
         <w:rPr>
-          <w:rStyle w:val="Fuerte"/>
+          <w:rStyle w:val="Textoennegrita"/>
           <w:rFonts w:asciiTheme="minorHAnsi" w:hAnsiTheme="minorHAnsi" w:cstheme="minorHAnsi"/>
           <w:b w:val="0"/>
           <w:bCs w:val="0"/>
@@ -923,7 +923,7 @@
       </w:r>
       <w:r>
         <w:rPr>
-          <w:rStyle w:val="Fuerte"/>
+          <w:rStyle w:val="Textoennegrita"/>
           <w:rFonts w:asciiTheme="minorHAnsi" w:hAnsiTheme="minorHAnsi" w:cstheme="minorHAnsi"/>
           <w:b w:val="0"/>
           <w:bCs w:val="0"/>
@@ -942,7 +942,7 @@
       </w:r>
       <w:r>
         <w:rPr>
-          <w:rStyle w:val="Fuerte"/>
+          <w:rStyle w:val="Textoennegrita"/>
           <w:rFonts w:asciiTheme="minorHAnsi" w:hAnsiTheme="minorHAnsi" w:cstheme="minorHAnsi"/>
           <w:sz w:val="22"/>
           <w:szCs w:val="22"/>
@@ -1480,7 +1480,1435 @@
       </w:r>
       <w:bookmarkEnd w:id="5"/>
     </w:p>
-    <w:p/>
+    <w:p>
+      <w:pPr>
+        <w:keepNext/>
+        <w:keepLines/>
+        <w:spacing w:before="360" w:after="80"/>
+        <w:outlineLvl w:val="0"/>
+        <w:rPr>
+          <w:lang w:val="es-ES"/>
+        </w:rPr>
+      </w:pPr>
+      <w:r>
+        <w:rPr>
+          <w:lang w:val="es-ES"/>
+        </w:rPr>
+        <w:t>6.1. Repositorio de código y documentación – GitHub</w:t>
+      </w:r>
+    </w:p>
+    <w:p>
+      <w:pPr>
+        <w:keepNext/>
+        <w:keepLines/>
+        <w:spacing w:before="360" w:after="80"/>
+        <w:outlineLvl w:val="0"/>
+        <w:rPr>
+          <w:lang w:val="es-ES"/>
+        </w:rPr>
+      </w:pPr>
+      <w:r>
+        <w:rPr>
+          <w:lang w:val="es-ES"/>
+        </w:rPr>
+        <w:t>El proyecto cuenta con un repositorio en GitHub que permite centralizar el código, los documentos y los avances realizados por los integrantes del equipo. Mediante Git se mantiene un historial de versiones y contribuciones, facilitando la trazabilidad de los cambios durante el desarrollo de la solución analítica.</w:t>
+      </w:r>
+    </w:p>
+    <w:p>
+      <w:pPr>
+        <w:keepNext/>
+        <w:keepLines/>
+        <w:spacing w:before="360" w:after="80"/>
+        <w:outlineLvl w:val="0"/>
+        <w:rPr>
+          <w:lang w:val="es-ES"/>
+        </w:rPr>
+      </w:pPr>
+      <w:r>
+        <w:rPr>
+          <w:lang w:val="es-ES"/>
+        </w:rPr>
+        <w:t xml:space="preserve">Repositorio: </w:t>
+      </w:r>
+      <w:hyperlink r:id="rId9" w:history="1">
+        <w:r>
+          <w:rPr>
+            <w:rStyle w:val="Hipervnculo"/>
+            <w:lang w:val="es-ES"/>
+          </w:rPr>
+          <w:t>https://github.com/GuillermoPrietoP/proyecto-inmobiliario-dsa</w:t>
+        </w:r>
+      </w:hyperlink>
+    </w:p>
+    <w:p>
+      <w:pPr>
+        <w:keepNext/>
+        <w:keepLines/>
+        <w:spacing w:before="360" w:after="80"/>
+        <w:outlineLvl w:val="0"/>
+        <w:rPr>
+          <w:lang w:val="es-ES"/>
+        </w:rPr>
+      </w:pPr>
+      <w:r>
+        <w:rPr>
+          <w:lang w:val="es-ES"/>
+        </w:rPr>
+        <w:t xml:space="preserve">En este repositorio se encuentran el notebook </w:t>
+      </w:r>
+      <w:proofErr w:type="spellStart"/>
+      <w:r>
+        <w:rPr>
+          <w:lang w:val="es-ES"/>
+        </w:rPr>
+        <w:t>exploracion_</w:t>
+      </w:r>
+      <w:proofErr w:type="gramStart"/>
+      <w:r>
+        <w:rPr>
+          <w:lang w:val="es-ES"/>
+        </w:rPr>
+        <w:t>datos.ipynb</w:t>
+      </w:r>
+      <w:proofErr w:type="spellEnd"/>
+      <w:proofErr w:type="gramEnd"/>
+      <w:r>
+        <w:rPr>
+          <w:lang w:val="es-ES"/>
+        </w:rPr>
+        <w:t>, el reporte del proyecto, el mockup del tablero y los archivos de configuración de DVC.</w:t>
+      </w:r>
+    </w:p>
+    <w:p>
+      <w:pPr>
+        <w:keepNext/>
+        <w:keepLines/>
+        <w:spacing w:before="360" w:after="80"/>
+        <w:outlineLvl w:val="0"/>
+        <w:rPr>
+          <w:lang w:val="es-ES"/>
+        </w:rPr>
+      </w:pPr>
+      <w:r>
+        <w:rPr>
+          <w:lang w:val="es-ES"/>
+        </w:rPr>
+        <w:t xml:space="preserve">6.2. </w:t>
+      </w:r>
+      <w:proofErr w:type="spellStart"/>
+      <w:r>
+        <w:rPr>
+          <w:lang w:val="es-ES"/>
+        </w:rPr>
+        <w:t>Versionamiento</w:t>
+      </w:r>
+      <w:proofErr w:type="spellEnd"/>
+      <w:r>
+        <w:rPr>
+          <w:lang w:val="es-ES"/>
+        </w:rPr>
+        <w:t xml:space="preserve"> de datos con DVC y Amazon S3</w:t>
+      </w:r>
+    </w:p>
+    <w:p>
+      <w:pPr>
+        <w:keepNext/>
+        <w:keepLines/>
+        <w:spacing w:before="360" w:after="80"/>
+        <w:outlineLvl w:val="0"/>
+        <w:rPr>
+          <w:lang w:val="es-ES"/>
+        </w:rPr>
+      </w:pPr>
+      <w:r>
+        <w:rPr>
+          <w:lang w:val="es-ES"/>
+        </w:rPr>
+        <w:t xml:space="preserve">Para gestionar los datos del proyecto se implementó Data </w:t>
+      </w:r>
+      <w:proofErr w:type="spellStart"/>
+      <w:r>
+        <w:rPr>
+          <w:lang w:val="es-ES"/>
+        </w:rPr>
+        <w:t>Version</w:t>
+      </w:r>
+      <w:proofErr w:type="spellEnd"/>
+      <w:r>
+        <w:rPr>
+          <w:lang w:val="es-ES"/>
+        </w:rPr>
+        <w:t xml:space="preserve"> Control (DVC), integrado con Git y Amazon S3.</w:t>
+      </w:r>
+    </w:p>
+    <w:p>
+      <w:pPr>
+        <w:keepNext/>
+        <w:keepLines/>
+        <w:spacing w:before="360" w:after="80"/>
+        <w:outlineLvl w:val="0"/>
+        <w:rPr>
+          <w:lang w:val="es-ES"/>
+        </w:rPr>
+      </w:pPr>
+      <w:r>
+        <w:rPr>
+          <w:lang w:val="es-ES"/>
+        </w:rPr>
+        <w:t xml:space="preserve">El conjunto de datos datos_inmobiliarios.csv se incorporó al seguimiento de DVC mediante el comando </w:t>
+      </w:r>
+      <w:proofErr w:type="spellStart"/>
+      <w:r>
+        <w:rPr>
+          <w:lang w:val="es-ES"/>
+        </w:rPr>
+        <w:t>dvc</w:t>
+      </w:r>
+      <w:proofErr w:type="spellEnd"/>
+      <w:r>
+        <w:rPr>
+          <w:lang w:val="es-ES"/>
+        </w:rPr>
+        <w:t xml:space="preserve"> </w:t>
+      </w:r>
+      <w:proofErr w:type="spellStart"/>
+      <w:r>
+        <w:rPr>
+          <w:lang w:val="es-ES"/>
+        </w:rPr>
+        <w:t>add</w:t>
+      </w:r>
+      <w:proofErr w:type="spellEnd"/>
+      <w:r>
+        <w:rPr>
+          <w:lang w:val="es-ES"/>
+        </w:rPr>
+        <w:t xml:space="preserve">. Esta operación generó el archivo </w:t>
+      </w:r>
+      <w:proofErr w:type="spellStart"/>
+      <w:r>
+        <w:rPr>
+          <w:lang w:val="es-ES"/>
+        </w:rPr>
+        <w:t>datos_inmobiliarios.csv.dvc</w:t>
+      </w:r>
+      <w:proofErr w:type="spellEnd"/>
+      <w:r>
+        <w:rPr>
+          <w:lang w:val="es-ES"/>
+        </w:rPr>
+        <w:t>, que permite identificar la versión de los datos utilizada en el proyecto.</w:t>
+      </w:r>
+    </w:p>
+    <w:p>
+      <w:pPr>
+        <w:keepNext/>
+        <w:keepLines/>
+        <w:spacing w:before="360" w:after="80"/>
+        <w:outlineLvl w:val="0"/>
+        <w:rPr>
+          <w:lang w:val="es-ES"/>
+        </w:rPr>
+      </w:pPr>
+      <w:r>
+        <w:rPr>
+          <w:lang w:val="es-ES"/>
+        </w:rPr>
+        <w:t>Se configuró Amazon S3 como almacenamiento remoto de DVC:</w:t>
+      </w:r>
+    </w:p>
+    <w:p>
+      <w:pPr>
+        <w:keepNext/>
+        <w:keepLines/>
+        <w:spacing w:before="360" w:after="80"/>
+        <w:outlineLvl w:val="0"/>
+        <w:rPr>
+          <w:lang w:val="es-ES"/>
+        </w:rPr>
+      </w:pPr>
+      <w:proofErr w:type="spellStart"/>
+      <w:r>
+        <w:rPr>
+          <w:lang w:val="es-ES"/>
+        </w:rPr>
+        <w:t>Bucket</w:t>
+      </w:r>
+      <w:proofErr w:type="spellEnd"/>
+      <w:r>
+        <w:rPr>
+          <w:lang w:val="es-ES"/>
+        </w:rPr>
+        <w:t xml:space="preserve">: </w:t>
+      </w:r>
+      <w:proofErr w:type="spellStart"/>
+      <w:r>
+        <w:rPr>
+          <w:lang w:val="es-ES"/>
+        </w:rPr>
+        <w:t>miad</w:t>
+      </w:r>
+      <w:proofErr w:type="spellEnd"/>
+      <w:r>
+        <w:rPr>
+          <w:lang w:val="es-ES"/>
+        </w:rPr>
+        <w:t>-proyecto-inmobiliario</w:t>
+      </w:r>
+    </w:p>
+    <w:p>
+      <w:pPr>
+        <w:keepNext/>
+        <w:keepLines/>
+        <w:spacing w:before="360" w:after="80"/>
+        <w:outlineLvl w:val="0"/>
+        <w:rPr>
+          <w:lang w:val="es-ES"/>
+        </w:rPr>
+      </w:pPr>
+      <w:r>
+        <w:rPr>
+          <w:lang w:val="es-ES"/>
+        </w:rPr>
+        <w:t>Ruta del almacenamiento: s3://miad-proyecto-inmobiliario/dvc-storage</w:t>
+      </w:r>
+    </w:p>
+    <w:p>
+      <w:pPr>
+        <w:keepNext/>
+        <w:keepLines/>
+        <w:spacing w:before="360" w:after="80"/>
+        <w:outlineLvl w:val="0"/>
+        <w:rPr>
+          <w:lang w:val="es-ES"/>
+        </w:rPr>
+      </w:pPr>
+      <w:r>
+        <w:rPr>
+          <w:lang w:val="es-ES"/>
+        </w:rPr>
+        <w:t>El archivo CSV dejó de almacenarse directamente en la versión actual del repositorio Git, mientras que sus metadatos de seguimiento permanecen en GitHub.</w:t>
+      </w:r>
+    </w:p>
+    <w:p>
+      <w:pPr>
+        <w:keepNext/>
+        <w:keepLines/>
+        <w:spacing w:before="360" w:after="80"/>
+        <w:outlineLvl w:val="0"/>
+        <w:rPr>
+          <w:lang w:val="es-ES"/>
+        </w:rPr>
+      </w:pPr>
+      <w:r>
+        <w:rPr>
+          <w:lang w:val="es-ES"/>
+        </w:rPr>
+        <w:t>La configuración se validó mediante las siguientes operaciones:</w:t>
+      </w:r>
+    </w:p>
+    <w:p>
+      <w:pPr>
+        <w:keepNext/>
+        <w:keepLines/>
+        <w:numPr>
+          <w:ilvl w:val="0"/>
+          <w:numId w:val="2"/>
+        </w:numPr>
+        <w:spacing w:before="360" w:after="80"/>
+        <w:outlineLvl w:val="0"/>
+        <w:rPr>
+          <w:lang w:val="es-ES"/>
+        </w:rPr>
+      </w:pPr>
+      <w:proofErr w:type="spellStart"/>
+      <w:r>
+        <w:rPr>
+          <w:lang w:val="es-ES"/>
+        </w:rPr>
+        <w:t>dvc</w:t>
+      </w:r>
+      <w:proofErr w:type="spellEnd"/>
+      <w:r>
+        <w:rPr>
+          <w:lang w:val="es-ES"/>
+        </w:rPr>
+        <w:t xml:space="preserve"> </w:t>
+      </w:r>
+      <w:proofErr w:type="spellStart"/>
+      <w:r>
+        <w:rPr>
+          <w:lang w:val="es-ES"/>
+        </w:rPr>
+        <w:t>push</w:t>
+      </w:r>
+      <w:proofErr w:type="spellEnd"/>
+      <w:r>
+        <w:rPr>
+          <w:lang w:val="es-ES"/>
+        </w:rPr>
+        <w:t xml:space="preserve">: se realizó exitosamente la transferencia del conjunto de datos hacia Amazon S3, obteniendo el resultado 1 file </w:t>
+      </w:r>
+      <w:proofErr w:type="spellStart"/>
+      <w:r>
+        <w:rPr>
+          <w:lang w:val="es-ES"/>
+        </w:rPr>
+        <w:t>pushed</w:t>
+      </w:r>
+      <w:proofErr w:type="spellEnd"/>
+      <w:r>
+        <w:rPr>
+          <w:lang w:val="es-ES"/>
+        </w:rPr>
+        <w:t>.</w:t>
+      </w:r>
+    </w:p>
+    <w:p>
+      <w:pPr>
+        <w:keepNext/>
+        <w:keepLines/>
+        <w:numPr>
+          <w:ilvl w:val="0"/>
+          <w:numId w:val="2"/>
+        </w:numPr>
+        <w:spacing w:before="360" w:after="80"/>
+        <w:outlineLvl w:val="0"/>
+        <w:rPr>
+          <w:lang w:val="es-ES"/>
+        </w:rPr>
+      </w:pPr>
+      <w:r>
+        <w:rPr>
+          <w:lang w:val="es-ES"/>
+        </w:rPr>
+        <w:t xml:space="preserve">Verificación en S3: se confirmó la existencia del objeto almacenado en el </w:t>
+      </w:r>
+      <w:proofErr w:type="spellStart"/>
+      <w:r>
+        <w:rPr>
+          <w:lang w:val="es-ES"/>
+        </w:rPr>
+        <w:t>bucket</w:t>
+      </w:r>
+      <w:proofErr w:type="spellEnd"/>
+      <w:r>
+        <w:rPr>
+          <w:lang w:val="es-ES"/>
+        </w:rPr>
+        <w:t xml:space="preserve"> mediante AWS CLI.</w:t>
+      </w:r>
+    </w:p>
+    <w:p>
+      <w:pPr>
+        <w:keepNext/>
+        <w:keepLines/>
+        <w:numPr>
+          <w:ilvl w:val="0"/>
+          <w:numId w:val="2"/>
+        </w:numPr>
+        <w:spacing w:before="360" w:after="80"/>
+        <w:outlineLvl w:val="0"/>
+        <w:rPr>
+          <w:lang w:val="es-ES"/>
+        </w:rPr>
+      </w:pPr>
+      <w:proofErr w:type="spellStart"/>
+      <w:r>
+        <w:rPr>
+          <w:lang w:val="es-ES"/>
+        </w:rPr>
+        <w:lastRenderedPageBreak/>
+        <w:t>dvc</w:t>
+      </w:r>
+      <w:proofErr w:type="spellEnd"/>
+      <w:r>
+        <w:rPr>
+          <w:lang w:val="es-ES"/>
+        </w:rPr>
+        <w:t xml:space="preserve"> </w:t>
+      </w:r>
+      <w:proofErr w:type="spellStart"/>
+      <w:r>
+        <w:rPr>
+          <w:lang w:val="es-ES"/>
+        </w:rPr>
+        <w:t>pull</w:t>
+      </w:r>
+      <w:proofErr w:type="spellEnd"/>
+      <w:r>
+        <w:rPr>
+          <w:lang w:val="es-ES"/>
+        </w:rPr>
+        <w:t xml:space="preserve">: se realizó una prueba de recuperación desde una copia independiente del repositorio, sin el archivo CSV ni la caché de datos local. El resultado fue 1 file </w:t>
+      </w:r>
+      <w:proofErr w:type="spellStart"/>
+      <w:r>
+        <w:rPr>
+          <w:lang w:val="es-ES"/>
+        </w:rPr>
+        <w:t>fetched</w:t>
+      </w:r>
+      <w:proofErr w:type="spellEnd"/>
+      <w:r>
+        <w:rPr>
+          <w:lang w:val="es-ES"/>
+        </w:rPr>
+        <w:t xml:space="preserve"> and 1 file </w:t>
+      </w:r>
+      <w:proofErr w:type="spellStart"/>
+      <w:r>
+        <w:rPr>
+          <w:lang w:val="es-ES"/>
+        </w:rPr>
+        <w:t>added</w:t>
+      </w:r>
+      <w:proofErr w:type="spellEnd"/>
+      <w:r>
+        <w:rPr>
+          <w:lang w:val="es-ES"/>
+        </w:rPr>
+        <w:t>.</w:t>
+      </w:r>
+    </w:p>
+    <w:p>
+      <w:pPr>
+        <w:keepNext/>
+        <w:keepLines/>
+        <w:numPr>
+          <w:ilvl w:val="0"/>
+          <w:numId w:val="2"/>
+        </w:numPr>
+        <w:spacing w:before="360" w:after="80"/>
+        <w:outlineLvl w:val="0"/>
+        <w:rPr>
+          <w:lang w:val="es-ES"/>
+        </w:rPr>
+      </w:pPr>
+      <w:proofErr w:type="spellStart"/>
+      <w:r>
+        <w:rPr>
+          <w:lang w:val="es-ES"/>
+        </w:rPr>
+        <w:t>dvc</w:t>
+      </w:r>
+      <w:proofErr w:type="spellEnd"/>
+      <w:r>
+        <w:rPr>
+          <w:lang w:val="es-ES"/>
+        </w:rPr>
+        <w:t xml:space="preserve"> status: se verificó la consistencia de los datos recuperados mediante el mensaje Data and pipelines are up </w:t>
+      </w:r>
+      <w:proofErr w:type="spellStart"/>
+      <w:r>
+        <w:rPr>
+          <w:lang w:val="es-ES"/>
+        </w:rPr>
+        <w:t>to</w:t>
+      </w:r>
+      <w:proofErr w:type="spellEnd"/>
+      <w:r>
+        <w:rPr>
+          <w:lang w:val="es-ES"/>
+        </w:rPr>
+        <w:t xml:space="preserve"> date.</w:t>
+      </w:r>
+    </w:p>
+    <w:p>
+      <w:pPr>
+        <w:keepNext/>
+        <w:keepLines/>
+        <w:spacing w:before="360" w:after="80"/>
+        <w:outlineLvl w:val="0"/>
+        <w:rPr>
+          <w:lang w:val="es-ES"/>
+        </w:rPr>
+      </w:pPr>
+      <w:r>
+        <w:rPr>
+          <w:lang w:val="es-ES"/>
+        </w:rPr>
+        <w:t xml:space="preserve">Estas pruebas demuestran el funcionamiento del </w:t>
+      </w:r>
+      <w:proofErr w:type="spellStart"/>
+      <w:r>
+        <w:rPr>
+          <w:lang w:val="es-ES"/>
+        </w:rPr>
+        <w:t>versionamiento</w:t>
+      </w:r>
+      <w:proofErr w:type="spellEnd"/>
+      <w:r>
+        <w:rPr>
+          <w:lang w:val="es-ES"/>
+        </w:rPr>
+        <w:t xml:space="preserve"> y la recuperación del conjunto de datos mediante DVC y S3.</w:t>
+      </w:r>
+    </w:p>
+    <w:p>
+      <w:pPr>
+        <w:keepNext/>
+        <w:keepLines/>
+        <w:spacing w:before="360" w:after="80"/>
+        <w:outlineLvl w:val="0"/>
+        <w:rPr>
+          <w:lang w:val="es-ES"/>
+        </w:rPr>
+      </w:pPr>
+      <w:r>
+        <w:rPr>
+          <w:lang w:val="es-ES"/>
+        </w:rPr>
+        <w:t>6.3. Evidencias de implementación</w:t>
+      </w:r>
+    </w:p>
+    <w:p>
+      <w:pPr>
+        <w:keepNext/>
+        <w:keepLines/>
+        <w:spacing w:before="360" w:after="80"/>
+        <w:outlineLvl w:val="0"/>
+        <w:rPr>
+          <w:lang w:val="es-ES"/>
+        </w:rPr>
+      </w:pPr>
+      <w:r>
+        <w:rPr>
+          <w:lang w:val="es-ES"/>
+        </w:rPr>
+        <w:t>Como soporte de la configuración realizada se presentan las siguientes evidencias:</w:t>
+      </w:r>
+    </w:p>
+    <w:p>
+      <w:pPr>
+        <w:keepNext/>
+        <w:keepLines/>
+        <w:spacing w:before="360" w:after="80"/>
+        <w:jc w:val="right"/>
+        <w:outlineLvl w:val="0"/>
+        <w:rPr>
+          <w:lang w:val="es-ES"/>
+        </w:rPr>
+      </w:pPr>
+      <w:r>
+        <w:rPr>
+          <w:lang w:val="es-ES"/>
+        </w:rPr>
+        <w:drawing>
+          <wp:inline distT="0" distB="0" distL="0" distR="0" wp14:anchorId="71839998" wp14:editId="1DF329EB">
+            <wp:extent cx="5612130" cy="3241675"/>
+            <wp:effectExtent l="0" t="0" r="7620" b="0"/>
+            <wp:docPr id="1887521468" name="Imagen 1"/>
+            <wp:cNvGraphicFramePr>
+              <a:graphicFrameLocks xmlns:a="http://schemas.openxmlformats.org/drawingml/2006/main" noChangeAspect="1"/>
+            </wp:cNvGraphicFramePr>
+            <a:graphic xmlns:a="http://schemas.openxmlformats.org/drawingml/2006/main">
+              <a:graphicData uri="http://schemas.openxmlformats.org/drawingml/2006/picture">
+                <pic:pic xmlns:pic="http://schemas.openxmlformats.org/drawingml/2006/picture">
+                  <pic:nvPicPr>
+                    <pic:cNvPr id="1887521468" name=""/>
+                    <pic:cNvPicPr/>
+                  </pic:nvPicPr>
+                  <pic:blipFill>
+                    <a:blip r:embed="rId10"/>
+                    <a:stretch>
+                      <a:fillRect/>
+                    </a:stretch>
+                  </pic:blipFill>
+                  <pic:spPr>
+                    <a:xfrm>
+                      <a:off x="0" y="0"/>
+                      <a:ext cx="5612130" cy="3241675"/>
+                    </a:xfrm>
+                    <a:prstGeom prst="rect">
+                      <a:avLst/>
+                    </a:prstGeom>
+                  </pic:spPr>
+                </pic:pic>
+              </a:graphicData>
+            </a:graphic>
+          </wp:inline>
+        </w:drawing>
+      </w:r>
+      <w:r>
+        <w:rPr>
+          <w:lang w:val="es-ES"/>
+        </w:rPr>
+        <w:t xml:space="preserve">Figura 1. Repositorio GitHub con los </w:t>
+      </w:r>
+      <w:proofErr w:type="gramStart"/>
+      <w:r>
+        <w:rPr>
+          <w:lang w:val="es-ES"/>
+        </w:rPr>
+        <w:t>archivos .</w:t>
+      </w:r>
+      <w:proofErr w:type="spellStart"/>
+      <w:r>
+        <w:rPr>
+          <w:lang w:val="es-ES"/>
+        </w:rPr>
+        <w:t>dvc</w:t>
+      </w:r>
+      <w:proofErr w:type="spellEnd"/>
+      <w:r>
+        <w:rPr>
+          <w:lang w:val="es-ES"/>
+        </w:rPr>
+        <w:t>, .</w:t>
+      </w:r>
+      <w:proofErr w:type="spellStart"/>
+      <w:r>
+        <w:rPr>
+          <w:lang w:val="es-ES"/>
+        </w:rPr>
+        <w:t>dvcignore</w:t>
+      </w:r>
+      <w:proofErr w:type="spellEnd"/>
+      <w:r>
+        <w:rPr>
+          <w:lang w:val="es-ES"/>
+        </w:rPr>
+        <w:t>, .</w:t>
+      </w:r>
+      <w:proofErr w:type="spellStart"/>
+      <w:r>
+        <w:rPr>
+          <w:lang w:val="es-ES"/>
+        </w:rPr>
+        <w:t>gitignore</w:t>
+      </w:r>
+      <w:proofErr w:type="spellEnd"/>
+      <w:proofErr w:type="gramEnd"/>
+      <w:r>
+        <w:rPr>
+          <w:lang w:val="es-ES"/>
+        </w:rPr>
+        <w:t xml:space="preserve"> y </w:t>
+      </w:r>
+      <w:proofErr w:type="spellStart"/>
+      <w:r>
+        <w:rPr>
+          <w:lang w:val="es-ES"/>
+        </w:rPr>
+        <w:t>datos_inmobiliarios.csv.dvc</w:t>
+      </w:r>
+      <w:proofErr w:type="spellEnd"/>
+      <w:r>
+        <w:rPr>
+          <w:lang w:val="es-ES"/>
+        </w:rPr>
+        <w:t>.</w:t>
+      </w:r>
+    </w:p>
+    <w:p>
+      <w:pPr>
+        <w:keepNext/>
+        <w:keepLines/>
+        <w:spacing w:before="360" w:after="80"/>
+        <w:jc w:val="right"/>
+        <w:outlineLvl w:val="0"/>
+        <w:rPr>
+          <w:lang w:val="es-ES"/>
+        </w:rPr>
+      </w:pPr>
+    </w:p>
+    <w:p>
+      <w:pPr>
+        <w:keepNext/>
+        <w:keepLines/>
+        <w:spacing w:before="360" w:after="80"/>
+        <w:jc w:val="right"/>
+        <w:outlineLvl w:val="0"/>
+        <w:rPr>
+          <w:lang w:val="es-ES"/>
+        </w:rPr>
+      </w:pPr>
+    </w:p>
+    <w:p>
+      <w:pPr>
+        <w:keepNext/>
+        <w:keepLines/>
+        <w:spacing w:before="360" w:after="80"/>
+        <w:jc w:val="right"/>
+        <w:outlineLvl w:val="0"/>
+        <w:rPr>
+          <w:lang w:val="es-ES"/>
+        </w:rPr>
+      </w:pPr>
+      <w:r>
+        <w:rPr>
+          <w:lang w:val="es-ES"/>
+        </w:rPr>
+        <w:lastRenderedPageBreak/>
+        <w:drawing>
+          <wp:inline distT="0" distB="0" distL="0" distR="0" wp14:anchorId="19D68A0D" wp14:editId="36928CFD">
+            <wp:extent cx="5324475" cy="1665367"/>
+            <wp:effectExtent l="0" t="0" r="0" b="0"/>
+            <wp:docPr id="1361615991" name="Imagen 2"/>
+            <wp:cNvGraphicFramePr>
+              <a:graphicFrameLocks xmlns:a="http://schemas.openxmlformats.org/drawingml/2006/main" noChangeAspect="1"/>
+            </wp:cNvGraphicFramePr>
+            <a:graphic xmlns:a="http://schemas.openxmlformats.org/drawingml/2006/main">
+              <a:graphicData uri="http://schemas.openxmlformats.org/drawingml/2006/picture">
+                <pic:pic xmlns:pic="http://schemas.openxmlformats.org/drawingml/2006/picture">
+                  <pic:nvPicPr>
+                    <pic:cNvPr id="0" name="Picture 6"/>
+                    <pic:cNvPicPr>
+                      <a:picLocks noChangeAspect="1" noChangeArrowheads="1"/>
+                    </pic:cNvPicPr>
+                  </pic:nvPicPr>
+                  <pic:blipFill rotWithShape="1">
+                    <a:blip r:embed="rId11">
+                      <a:extLst>
+                        <a:ext uri="{28A0092B-C50C-407E-A947-70E740481C1C}">
+                          <a14:useLocalDpi xmlns:a14="http://schemas.microsoft.com/office/drawing/2010/main" val="0"/>
+                        </a:ext>
+                      </a:extLst>
+                    </a:blip>
+                    <a:srcRect r="30217"/>
+                    <a:stretch>
+                      <a:fillRect/>
+                    </a:stretch>
+                  </pic:blipFill>
+                  <pic:spPr bwMode="auto">
+                    <a:xfrm>
+                      <a:off x="0" y="0"/>
+                      <a:ext cx="5346694" cy="1672317"/>
+                    </a:xfrm>
+                    <a:prstGeom prst="rect">
+                      <a:avLst/>
+                    </a:prstGeom>
+                    <a:noFill/>
+                    <a:ln>
+                      <a:noFill/>
+                    </a:ln>
+                    <a:extLst>
+                      <a:ext uri="{53640926-AAD7-44D8-BBD7-CCE9431645EC}">
+                        <a14:shadowObscured xmlns:a14="http://schemas.microsoft.com/office/drawing/2010/main"/>
+                      </a:ext>
+                    </a:extLst>
+                  </pic:spPr>
+                </pic:pic>
+              </a:graphicData>
+            </a:graphic>
+          </wp:inline>
+        </w:drawing>
+      </w:r>
+      <w:r>
+        <w:rPr>
+          <w:lang w:val="es-ES"/>
+        </w:rPr>
+        <w:t xml:space="preserve">Figura 2. Ejecución exitosa de </w:t>
+      </w:r>
+      <w:proofErr w:type="spellStart"/>
+      <w:r>
+        <w:rPr>
+          <w:lang w:val="es-ES"/>
+        </w:rPr>
+        <w:t>dvc</w:t>
+      </w:r>
+      <w:proofErr w:type="spellEnd"/>
+      <w:r>
+        <w:rPr>
+          <w:lang w:val="es-ES"/>
+        </w:rPr>
+        <w:t xml:space="preserve"> </w:t>
+      </w:r>
+      <w:proofErr w:type="spellStart"/>
+      <w:r>
+        <w:rPr>
+          <w:lang w:val="es-ES"/>
+        </w:rPr>
+        <w:t>push</w:t>
+      </w:r>
+      <w:proofErr w:type="spellEnd"/>
+      <w:r>
+        <w:rPr>
+          <w:lang w:val="es-ES"/>
+        </w:rPr>
+        <w:t xml:space="preserve"> y confirmación de 1 file </w:t>
+      </w:r>
+      <w:proofErr w:type="spellStart"/>
+      <w:r>
+        <w:rPr>
+          <w:lang w:val="es-ES"/>
+        </w:rPr>
+        <w:t>pushed</w:t>
+      </w:r>
+      <w:proofErr w:type="spellEnd"/>
+      <w:r>
+        <w:rPr>
+          <w:lang w:val="es-ES"/>
+        </w:rPr>
+        <w:t>.</w:t>
+      </w:r>
+    </w:p>
+    <w:p>
+      <w:pPr>
+        <w:keepNext/>
+        <w:keepLines/>
+        <w:spacing w:before="360" w:after="80"/>
+        <w:jc w:val="right"/>
+        <w:outlineLvl w:val="0"/>
+        <w:rPr>
+          <w:lang w:val="es-ES"/>
+        </w:rPr>
+      </w:pPr>
+    </w:p>
+    <w:p>
+      <w:pPr>
+        <w:keepNext/>
+        <w:keepLines/>
+        <w:spacing w:before="360" w:after="80"/>
+        <w:jc w:val="right"/>
+        <w:outlineLvl w:val="0"/>
+        <w:rPr>
+          <w:lang w:val="es-ES"/>
+        </w:rPr>
+      </w:pPr>
+      <w:r>
+        <w:rPr>
+          <w:lang w:val="es-ES"/>
+        </w:rPr>
+        <w:drawing>
+          <wp:inline distT="0" distB="0" distL="0" distR="0" wp14:anchorId="0B8912E9" wp14:editId="0AD63FF6">
+            <wp:extent cx="6134100" cy="1184760"/>
+            <wp:effectExtent l="0" t="0" r="0" b="0"/>
+            <wp:docPr id="57272160" name="Imagen 1"/>
+            <wp:cNvGraphicFramePr>
+              <a:graphicFrameLocks xmlns:a="http://schemas.openxmlformats.org/drawingml/2006/main" noChangeAspect="1"/>
+            </wp:cNvGraphicFramePr>
+            <a:graphic xmlns:a="http://schemas.openxmlformats.org/drawingml/2006/main">
+              <a:graphicData uri="http://schemas.openxmlformats.org/drawingml/2006/picture">
+                <pic:pic xmlns:pic="http://schemas.openxmlformats.org/drawingml/2006/picture">
+                  <pic:nvPicPr>
+                    <pic:cNvPr id="57272160" name=""/>
+                    <pic:cNvPicPr/>
+                  </pic:nvPicPr>
+                  <pic:blipFill>
+                    <a:blip r:embed="rId12"/>
+                    <a:stretch>
+                      <a:fillRect/>
+                    </a:stretch>
+                  </pic:blipFill>
+                  <pic:spPr>
+                    <a:xfrm>
+                      <a:off x="0" y="0"/>
+                      <a:ext cx="6155839" cy="1188959"/>
+                    </a:xfrm>
+                    <a:prstGeom prst="rect">
+                      <a:avLst/>
+                    </a:prstGeom>
+                  </pic:spPr>
+                </pic:pic>
+              </a:graphicData>
+            </a:graphic>
+          </wp:inline>
+        </w:drawing>
+      </w:r>
+      <w:r>
+        <w:rPr>
+          <w:lang w:val="es-ES"/>
+        </w:rPr>
+        <w:t xml:space="preserve">Figura 3. Objeto almacenado en Amazon S3 dentro de </w:t>
+      </w:r>
+      <w:proofErr w:type="spellStart"/>
+      <w:r>
+        <w:rPr>
+          <w:lang w:val="es-ES"/>
+        </w:rPr>
+        <w:t>dvc-storage</w:t>
+      </w:r>
+      <w:proofErr w:type="spellEnd"/>
+      <w:r>
+        <w:rPr>
+          <w:lang w:val="es-ES"/>
+        </w:rPr>
+        <w:t>.</w:t>
+      </w:r>
+    </w:p>
+    <w:p>
+      <w:pPr>
+        <w:keepNext/>
+        <w:keepLines/>
+        <w:spacing w:before="360" w:after="80"/>
+        <w:jc w:val="right"/>
+        <w:outlineLvl w:val="0"/>
+        <w:rPr>
+          <w:lang w:val="es-ES"/>
+        </w:rPr>
+      </w:pPr>
+    </w:p>
+    <w:p>
+      <w:pPr>
+        <w:keepNext/>
+        <w:keepLines/>
+        <w:spacing w:before="360" w:after="80"/>
+        <w:jc w:val="right"/>
+        <w:outlineLvl w:val="0"/>
+        <w:rPr>
+          <w:lang w:val="es-ES"/>
+        </w:rPr>
+      </w:pPr>
+      <w:r>
+        <w:rPr>
+          <w:lang w:val="es-ES"/>
+        </w:rPr>
+        <w:drawing>
+          <wp:inline distT="0" distB="0" distL="0" distR="0" wp14:anchorId="11C6D4D9" wp14:editId="384C4A78">
+            <wp:extent cx="5612130" cy="862330"/>
+            <wp:effectExtent l="0" t="0" r="7620" b="0"/>
+            <wp:docPr id="13578429" name="Imagen 4"/>
+            <wp:cNvGraphicFramePr>
+              <a:graphicFrameLocks xmlns:a="http://schemas.openxmlformats.org/drawingml/2006/main" noChangeAspect="1"/>
+            </wp:cNvGraphicFramePr>
+            <a:graphic xmlns:a="http://schemas.openxmlformats.org/drawingml/2006/main">
+              <a:graphicData uri="http://schemas.openxmlformats.org/drawingml/2006/picture">
+                <pic:pic xmlns:pic="http://schemas.openxmlformats.org/drawingml/2006/picture">
+                  <pic:nvPicPr>
+                    <pic:cNvPr id="0" name="Picture 13"/>
+                    <pic:cNvPicPr>
+                      <a:picLocks noChangeAspect="1" noChangeArrowheads="1"/>
+                    </pic:cNvPicPr>
+                  </pic:nvPicPr>
+                  <pic:blipFill>
+                    <a:blip r:embed="rId13">
+                      <a:extLst>
+                        <a:ext uri="{28A0092B-C50C-407E-A947-70E740481C1C}">
+                          <a14:useLocalDpi xmlns:a14="http://schemas.microsoft.com/office/drawing/2010/main" val="0"/>
+                        </a:ext>
+                      </a:extLst>
+                    </a:blip>
+                    <a:srcRect/>
+                    <a:stretch>
+                      <a:fillRect/>
+                    </a:stretch>
+                  </pic:blipFill>
+                  <pic:spPr bwMode="auto">
+                    <a:xfrm>
+                      <a:off x="0" y="0"/>
+                      <a:ext cx="5612130" cy="862330"/>
+                    </a:xfrm>
+                    <a:prstGeom prst="rect">
+                      <a:avLst/>
+                    </a:prstGeom>
+                    <a:noFill/>
+                    <a:ln>
+                      <a:noFill/>
+                    </a:ln>
+                  </pic:spPr>
+                </pic:pic>
+              </a:graphicData>
+            </a:graphic>
+          </wp:inline>
+        </w:drawing>
+      </w:r>
+      <w:r>
+        <w:rPr>
+          <w:lang w:val="es-ES"/>
+        </w:rPr>
+        <w:t xml:space="preserve">Figura 4. Recuperación de los datos mediante </w:t>
+      </w:r>
+      <w:proofErr w:type="spellStart"/>
+      <w:r>
+        <w:rPr>
+          <w:lang w:val="es-ES"/>
+        </w:rPr>
+        <w:t>dvc</w:t>
+      </w:r>
+      <w:proofErr w:type="spellEnd"/>
+      <w:r>
+        <w:rPr>
+          <w:lang w:val="es-ES"/>
+        </w:rPr>
+        <w:t xml:space="preserve"> </w:t>
+      </w:r>
+      <w:proofErr w:type="spellStart"/>
+      <w:r>
+        <w:rPr>
+          <w:lang w:val="es-ES"/>
+        </w:rPr>
+        <w:t>pull</w:t>
+      </w:r>
+      <w:proofErr w:type="spellEnd"/>
+      <w:r>
+        <w:rPr>
+          <w:lang w:val="es-ES"/>
+        </w:rPr>
+        <w:t xml:space="preserve"> y verificación posterior con </w:t>
+      </w:r>
+      <w:proofErr w:type="spellStart"/>
+      <w:r>
+        <w:rPr>
+          <w:lang w:val="es-ES"/>
+        </w:rPr>
+        <w:t>dvc</w:t>
+      </w:r>
+      <w:proofErr w:type="spellEnd"/>
+      <w:r>
+        <w:rPr>
+          <w:lang w:val="es-ES"/>
+        </w:rPr>
+        <w:t xml:space="preserve"> status.</w:t>
+      </w:r>
+    </w:p>
+    <w:p>
+      <w:pPr>
+        <w:keepNext/>
+        <w:keepLines/>
+        <w:spacing w:before="360" w:after="80"/>
+        <w:outlineLvl w:val="0"/>
+        <w:rPr>
+          <w:lang w:val="es-ES"/>
+        </w:rPr>
+      </w:pPr>
+      <w:r>
+        <w:rPr>
+          <w:lang w:val="es-ES"/>
+        </w:rPr>
+        <w:t xml:space="preserve">La implementación quedó registrada en GitHub mediante el </w:t>
+      </w:r>
+      <w:proofErr w:type="spellStart"/>
+      <w:r>
+        <w:rPr>
+          <w:lang w:val="es-ES"/>
+        </w:rPr>
+        <w:t>commit</w:t>
+      </w:r>
+      <w:proofErr w:type="spellEnd"/>
+      <w:r>
+        <w:rPr>
+          <w:lang w:val="es-ES"/>
+        </w:rPr>
+        <w:t xml:space="preserve"> ba5822f, denominado </w:t>
+      </w:r>
+      <w:r>
+        <w:rPr>
+          <w:i/>
+          <w:iCs/>
+          <w:lang w:val="es-ES"/>
+        </w:rPr>
+        <w:t>Configurar DVC con almacenamiento remoto en AWS S3</w:t>
+      </w:r>
+      <w:r>
+        <w:rPr>
+          <w:lang w:val="es-ES"/>
+        </w:rPr>
+        <w:t>.</w:t>
+      </w:r>
+    </w:p>
+    <w:p>
+      <w:pPr>
+        <w:keepNext/>
+        <w:keepLines/>
+        <w:spacing w:before="360" w:after="80"/>
+        <w:outlineLvl w:val="0"/>
+        <w:rPr>
+          <w:lang w:val="es-ES"/>
+        </w:rPr>
+      </w:pPr>
+      <w:r>
+        <w:rPr>
+          <w:lang w:val="es-ES"/>
+        </w:rPr>
+        <w:t>Las evidencias presentadas permiten verificar la integración de DVC con el repositorio GitHub y el almacenamiento remoto Amazon S3. Se documenta el registro de los datos, su transferencia al almacenamiento remoto y su posterior recuperación desde una copia independiente del proyecto, confirmando la reproducibilidad del proceso de gestión de datos.</w:t>
+      </w:r>
+    </w:p>
+    <w:p>
+      <w:pPr>
+        <w:keepNext/>
+        <w:keepLines/>
+        <w:spacing w:before="360" w:after="80"/>
+        <w:outlineLvl w:val="0"/>
+        <w:rPr>
+          <w:lang w:val="es-ES"/>
+        </w:rPr>
+      </w:pPr>
+      <w:r>
+        <w:rPr>
+          <w:lang w:val="es-ES"/>
+        </w:rPr>
+        <w:t xml:space="preserve">Consideración de acceso: el almacenamiento S3 es privado y su utilización requiere credenciales AWS autorizadas. La implementación se probó desde una instancia EC2 de AWS </w:t>
+      </w:r>
+      <w:proofErr w:type="spellStart"/>
+      <w:r>
+        <w:rPr>
+          <w:lang w:val="es-ES"/>
+        </w:rPr>
+        <w:t>Academy</w:t>
+      </w:r>
+      <w:proofErr w:type="spellEnd"/>
+      <w:r>
+        <w:rPr>
+          <w:lang w:val="es-ES"/>
+        </w:rPr>
+        <w:t xml:space="preserve"> utilizando credenciales temporales del laboratorio; por tanto, el acceso posterior depende de la vigencia de dichas credenciales y de los permisos disponibles.</w:t>
+      </w:r>
+    </w:p>
+    <w:p>
+      <w:pPr>
+        <w:pStyle w:val="Ttulo1"/>
+      </w:pPr>
+      <w:r>
+        <w:lastRenderedPageBreak/>
+        <w:t>7. Reporte de trabajo en equipo</w:t>
+      </w:r>
+    </w:p>
+    <w:p>
+      <w:pPr>
+        <w:keepNext/>
+        <w:keepLines/>
+        <w:spacing w:before="360" w:after="80"/>
+        <w:outlineLvl w:val="0"/>
+        <w:rPr>
+          <w:lang w:val="es-ES"/>
+        </w:rPr>
+      </w:pPr>
+      <w:r>
+        <w:rPr>
+          <w:lang w:val="es-ES"/>
+        </w:rPr>
+        <w:t>El proyecto fue desarrollado por un equipo conformado por Jecika León, Ivonne Campos, Guillermo Prieto y Juan Sebastián Victoria. Las actividades se distribuyeron entre la elaboración del informe, la exploración de datos, el diseño del prototipo y la configuración de herramientas de control de versiones.</w:t>
+      </w:r>
+    </w:p>
+    <w:p>
+      <w:pPr>
+        <w:keepNext/>
+        <w:keepLines/>
+        <w:spacing w:before="360" w:after="80"/>
+        <w:outlineLvl w:val="0"/>
+        <w:rPr>
+          <w:lang w:val="es-ES"/>
+        </w:rPr>
+      </w:pPr>
+      <w:r>
+        <w:rPr>
+          <w:b/>
+          <w:bCs/>
+          <w:lang w:val="es-ES"/>
+        </w:rPr>
+        <w:t>Guillermo Prieto:</w:t>
+      </w:r>
+      <w:r>
+        <w:rPr>
+          <w:lang w:val="es-ES"/>
+        </w:rPr>
+        <w:t xml:space="preserve"> realizó la publicación y actualización de los archivos del proyecto en GitHub, incluyendo el notebook de exploración, el informe y la primera versión del mockup del tablero. Su participación está registrada mediante tres </w:t>
+      </w:r>
+      <w:proofErr w:type="spellStart"/>
+      <w:r>
+        <w:rPr>
+          <w:lang w:val="es-ES"/>
+        </w:rPr>
+        <w:t>commits</w:t>
+      </w:r>
+      <w:proofErr w:type="spellEnd"/>
+      <w:r>
+        <w:rPr>
+          <w:lang w:val="es-ES"/>
+        </w:rPr>
+        <w:t xml:space="preserve"> en el repositorio.</w:t>
+      </w:r>
+    </w:p>
+    <w:p>
+      <w:pPr>
+        <w:keepNext/>
+        <w:keepLines/>
+        <w:spacing w:before="360" w:after="80"/>
+        <w:outlineLvl w:val="0"/>
+        <w:rPr>
+          <w:lang w:val="es-ES"/>
+        </w:rPr>
+      </w:pPr>
+      <w:r>
+        <w:rPr>
+          <w:b/>
+          <w:bCs/>
+          <w:lang w:val="es-ES"/>
+        </w:rPr>
+        <w:t>Juan Sebastián Victoria:</w:t>
+      </w:r>
+      <w:r>
+        <w:rPr>
+          <w:lang w:val="es-ES"/>
+        </w:rPr>
+        <w:t xml:space="preserve"> realizó la implementación de Data </w:t>
+      </w:r>
+      <w:proofErr w:type="spellStart"/>
+      <w:r>
+        <w:rPr>
+          <w:lang w:val="es-ES"/>
+        </w:rPr>
+        <w:t>Version</w:t>
+      </w:r>
+      <w:proofErr w:type="spellEnd"/>
+      <w:r>
+        <w:rPr>
+          <w:lang w:val="es-ES"/>
+        </w:rPr>
+        <w:t xml:space="preserve"> Control (DVC), configuró Amazon S3 como almacenamiento remoto y ejecutó pruebas exitosas de almacenamiento y recuperación de datos mediante </w:t>
+      </w:r>
+      <w:proofErr w:type="spellStart"/>
+      <w:r>
+        <w:rPr>
+          <w:lang w:val="es-ES"/>
+        </w:rPr>
+        <w:t>dvc</w:t>
+      </w:r>
+      <w:proofErr w:type="spellEnd"/>
+      <w:r>
+        <w:rPr>
+          <w:lang w:val="es-ES"/>
+        </w:rPr>
+        <w:t xml:space="preserve"> </w:t>
+      </w:r>
+      <w:proofErr w:type="spellStart"/>
+      <w:r>
+        <w:rPr>
+          <w:lang w:val="es-ES"/>
+        </w:rPr>
+        <w:t>push</w:t>
+      </w:r>
+      <w:proofErr w:type="spellEnd"/>
+      <w:r>
+        <w:rPr>
+          <w:lang w:val="es-ES"/>
+        </w:rPr>
+        <w:t xml:space="preserve"> y </w:t>
+      </w:r>
+      <w:proofErr w:type="spellStart"/>
+      <w:r>
+        <w:rPr>
+          <w:lang w:val="es-ES"/>
+        </w:rPr>
+        <w:t>dvc</w:t>
+      </w:r>
+      <w:proofErr w:type="spellEnd"/>
+      <w:r>
+        <w:rPr>
+          <w:lang w:val="es-ES"/>
+        </w:rPr>
+        <w:t xml:space="preserve"> </w:t>
+      </w:r>
+      <w:proofErr w:type="spellStart"/>
+      <w:r>
+        <w:rPr>
+          <w:lang w:val="es-ES"/>
+        </w:rPr>
+        <w:t>pull</w:t>
+      </w:r>
+      <w:proofErr w:type="spellEnd"/>
+      <w:r>
+        <w:rPr>
+          <w:lang w:val="es-ES"/>
+        </w:rPr>
+        <w:t xml:space="preserve">. Estos cambios quedaron registrados en el </w:t>
+      </w:r>
+      <w:proofErr w:type="spellStart"/>
+      <w:r>
+        <w:rPr>
+          <w:lang w:val="es-ES"/>
+        </w:rPr>
+        <w:t>commit</w:t>
+      </w:r>
+      <w:proofErr w:type="spellEnd"/>
+      <w:r>
+        <w:rPr>
+          <w:lang w:val="es-ES"/>
+        </w:rPr>
+        <w:t xml:space="preserve"> ba5822f.</w:t>
+      </w:r>
+    </w:p>
+    <w:p>
+      <w:pPr>
+        <w:keepNext/>
+        <w:keepLines/>
+        <w:spacing w:before="360" w:after="80"/>
+        <w:outlineLvl w:val="0"/>
+        <w:rPr>
+          <w:lang w:val="es-ES"/>
+        </w:rPr>
+      </w:pPr>
+      <w:r>
+        <w:rPr>
+          <w:b/>
+          <w:bCs/>
+          <w:lang w:val="es-ES"/>
+        </w:rPr>
+        <w:t>Jecika León e Ivonne Campos:</w:t>
+      </w:r>
+      <w:r>
+        <w:rPr>
+          <w:lang w:val="es-ES"/>
+        </w:rPr>
+        <w:t xml:space="preserve"> participaron en la elaboración del informe escrito del proyecto. Sus contribuciones se incorporaron al documento que posteriormente fue publicado en GitHub por Guillermo Prieto, razón por la cual no aparecen como autoras individuales de </w:t>
+      </w:r>
+      <w:proofErr w:type="spellStart"/>
+      <w:r>
+        <w:rPr>
+          <w:lang w:val="es-ES"/>
+        </w:rPr>
+        <w:t>commits</w:t>
+      </w:r>
+      <w:proofErr w:type="spellEnd"/>
+      <w:r>
+        <w:rPr>
+          <w:lang w:val="es-ES"/>
+        </w:rPr>
+        <w:t>.</w:t>
+      </w:r>
+    </w:p>
+    <w:p>
+      <w:pPr>
+        <w:keepNext/>
+        <w:keepLines/>
+        <w:spacing w:before="360" w:after="80"/>
+        <w:outlineLvl w:val="0"/>
+        <w:rPr>
+          <w:lang w:val="es-ES"/>
+        </w:rPr>
+      </w:pPr>
+      <w:r>
+        <w:rPr>
+          <w:b/>
+          <w:bCs/>
+          <w:lang w:val="es-ES"/>
+        </w:rPr>
+        <w:t>Coordinación y trazabilidad:</w:t>
+      </w:r>
+      <w:r>
+        <w:rPr>
+          <w:lang w:val="es-ES"/>
+        </w:rPr>
+        <w:t xml:space="preserve"> el equipo utilizó GitHub como repositorio central para consolidar los entregables. Las contribuciones técnicas se evidencian mediante el historial de </w:t>
+      </w:r>
+      <w:proofErr w:type="spellStart"/>
+      <w:r>
+        <w:rPr>
+          <w:lang w:val="es-ES"/>
+        </w:rPr>
+        <w:t>commits</w:t>
+      </w:r>
+      <w:proofErr w:type="spellEnd"/>
+      <w:r>
+        <w:rPr>
+          <w:lang w:val="es-ES"/>
+        </w:rPr>
+        <w:t>, mientras que el trabajo colaborativo de redacción se documenta en este reporte. Se reconoce que el historial de Git no refleja de manera individual todas las actividades realizadas fuera del repositorio.</w:t>
+      </w:r>
+    </w:p>
+    <w:p>
+      <w:pPr>
+        <w:keepNext/>
+        <w:keepLines/>
+        <w:spacing w:before="360" w:after="80"/>
+        <w:outlineLvl w:val="0"/>
+        <w:rPr>
+          <w:lang w:val="es-ES"/>
+        </w:rPr>
+      </w:pPr>
+    </w:p>
     <w:p>
       <w:pPr>
         <w:keepNext/>
@@ -1507,6 +2935,155 @@
 <file path=word/numbering.xml><?xml version="1.0" encoding="utf-8"?>
 <w:numbering xmlns:wpc="http://schemas.microsoft.com/office/word/2010/wordprocessingCanvas" xmlns:cx="http://schemas.microsoft.com/office/drawing/2014/chartex" xmlns:cx1="http://schemas.microsoft.com/office/drawing/2015/9/8/chartex" xmlns:cx2="http://schemas.microsoft.com/office/drawing/2015/10/21/chartex" xmlns:cx3="http://schemas.microsoft.com/office/drawing/2016/5/9/chartex" xmlns:cx4="http://schemas.microsoft.com/office/drawing/2016/5/10/chartex" xmlns:cx5="http://schemas.microsoft.com/office/drawing/2016/5/11/chartex" xmlns:cx6="http://schemas.microsoft.com/office/drawing/2016/5/12/chartex" xmlns:cx7="http://schemas.microsoft.com/office/drawing/2016/5/13/chartex" xmlns:cx8="http://schemas.microsoft.com/office/drawing/2016/5/14/chartex" xmlns:mc="http://schemas.openxmlformats.org/markup-compatibility/2006" xmlns:aink="http://schemas.microsoft.com/office/drawing/2016/ink" xmlns:am3d="http://schemas.microsoft.com/office/drawing/2017/model3d" xmlns:o="urn:schemas-microsoft-com:office:office" xmlns:oel="http://schemas.microsoft.com/office/2019/extlst" xmlns:r="http://schemas.openxmlformats.org/officeDocument/2006/relationships" xmlns:m="http://schemas.openxmlformats.org/officeDocument/2006/math" xmlns:v="urn:schemas-microsoft-com:vml" xmlns:wp14="http://schemas.microsoft.com/office/word/2010/wordprocessingDrawing" xmlns:wp="http://schemas.openxmlformats.org/drawingml/2006/wordprocessingDrawing" xmlns:w10="urn:schemas-microsoft-com:office:word" xmlns:w="http://schemas.openxmlformats.org/wordprocessingml/2006/main" xmlns:w14="http://schemas.microsoft.com/office/word/2010/wordml" xmlns:w15="http://schemas.microsoft.com/office/word/2012/wordml" xmlns:w16cex="http://schemas.microsoft.com/office/word/2018/wordml/cex" xmlns:w16cid="http://schemas.microsoft.com/office/word/2016/wordml/cid" xmlns:w16="http://schemas.microsoft.com/office/word/2018/wordml" xmlns:w16du="http://schemas.microsoft.com/office/word/2023/wordml/word16du" xmlns:w16sdtdh="http://schemas.microsoft.com/office/word/2020/wordml/sdtdatahash" xmlns:w16sdtfl="http://schemas.microsoft.com/office/word/2024/wordml/sdtformatlock" xmlns:w16se="http://schemas.microsoft.com/office/word/2015/wordml/symex" xmlns:wpg="http://schemas.microsoft.com/office/word/2010/wordprocessingGroup" xmlns:wpi="http://schemas.microsoft.com/office/word/2010/wordprocessingInk" xmlns:wne="http://schemas.microsoft.com/office/word/2006/wordml" xmlns:wps="http://schemas.microsoft.com/office/word/2010/wordprocessingShape" mc:Ignorable="w14 w15 w16se w16cid w16 w16cex w16sdtdh w16sdtfl w16du wp14">
   <w:abstractNum w:abstractNumId="0" w15:restartNumberingAfterBreak="0">
+    <w:nsid w:val="407E6571"/>
+    <w:multiLevelType w:val="multilevel"/>
+    <w:tmpl w:val="ED54780A"/>
+    <w:lvl w:ilvl="0">
+      <w:start w:val="1"/>
+      <w:numFmt w:val="bullet"/>
+      <w:lvlText w:val=""/>
+      <w:lvlJc w:val="left"/>
+      <w:pPr>
+        <w:tabs>
+          <w:tab w:val="num" w:pos="720"/>
+        </w:tabs>
+        <w:ind w:left="720" w:hanging="360"/>
+      </w:pPr>
+      <w:rPr>
+        <w:rFonts w:ascii="Symbol" w:hAnsi="Symbol" w:hint="default"/>
+        <w:sz w:val="20"/>
+      </w:rPr>
+    </w:lvl>
+    <w:lvl w:ilvl="1" w:tentative="1">
+      <w:start w:val="1"/>
+      <w:numFmt w:val="bullet"/>
+      <w:lvlText w:val="o"/>
+      <w:lvlJc w:val="left"/>
+      <w:pPr>
+        <w:tabs>
+          <w:tab w:val="num" w:pos="1440"/>
+        </w:tabs>
+        <w:ind w:left="1440" w:hanging="360"/>
+      </w:pPr>
+      <w:rPr>
+        <w:rFonts w:ascii="Courier New" w:hAnsi="Courier New" w:hint="default"/>
+        <w:sz w:val="20"/>
+      </w:rPr>
+    </w:lvl>
+    <w:lvl w:ilvl="2" w:tentative="1">
+      <w:start w:val="1"/>
+      <w:numFmt w:val="bullet"/>
+      <w:lvlText w:val=""/>
+      <w:lvlJc w:val="left"/>
+      <w:pPr>
+        <w:tabs>
+          <w:tab w:val="num" w:pos="2160"/>
+        </w:tabs>
+        <w:ind w:left="2160" w:hanging="360"/>
+      </w:pPr>
+      <w:rPr>
+        <w:rFonts w:ascii="Wingdings" w:hAnsi="Wingdings" w:hint="default"/>
+        <w:sz w:val="20"/>
+      </w:rPr>
+    </w:lvl>
+    <w:lvl w:ilvl="3" w:tentative="1">
+      <w:start w:val="1"/>
+      <w:numFmt w:val="bullet"/>
+      <w:lvlText w:val=""/>
+      <w:lvlJc w:val="left"/>
+      <w:pPr>
+        <w:tabs>
+          <w:tab w:val="num" w:pos="2880"/>
+        </w:tabs>
+        <w:ind w:left="2880" w:hanging="360"/>
+      </w:pPr>
+      <w:rPr>
+        <w:rFonts w:ascii="Wingdings" w:hAnsi="Wingdings" w:hint="default"/>
+        <w:sz w:val="20"/>
+      </w:rPr>
+    </w:lvl>
+    <w:lvl w:ilvl="4" w:tentative="1">
+      <w:start w:val="1"/>
+      <w:numFmt w:val="bullet"/>
+      <w:lvlText w:val=""/>
+      <w:lvlJc w:val="left"/>
+      <w:pPr>
+        <w:tabs>
+          <w:tab w:val="num" w:pos="3600"/>
+        </w:tabs>
+        <w:ind w:left="3600" w:hanging="360"/>
+      </w:pPr>
+      <w:rPr>
+        <w:rFonts w:ascii="Wingdings" w:hAnsi="Wingdings" w:hint="default"/>
+        <w:sz w:val="20"/>
+      </w:rPr>
+    </w:lvl>
+    <w:lvl w:ilvl="5" w:tentative="1">
+      <w:start w:val="1"/>
+      <w:numFmt w:val="bullet"/>
+      <w:lvlText w:val=""/>
+      <w:lvlJc w:val="left"/>
+      <w:pPr>
+        <w:tabs>
+          <w:tab w:val="num" w:pos="4320"/>
+        </w:tabs>
+        <w:ind w:left="4320" w:hanging="360"/>
+      </w:pPr>
+      <w:rPr>
+        <w:rFonts w:ascii="Wingdings" w:hAnsi="Wingdings" w:hint="default"/>
+        <w:sz w:val="20"/>
+      </w:rPr>
+    </w:lvl>
+    <w:lvl w:ilvl="6" w:tentative="1">
+      <w:start w:val="1"/>
+      <w:numFmt w:val="bullet"/>
+      <w:lvlText w:val=""/>
+      <w:lvlJc w:val="left"/>
+      <w:pPr>
+        <w:tabs>
+          <w:tab w:val="num" w:pos="5040"/>
+        </w:tabs>
+        <w:ind w:left="5040" w:hanging="360"/>
+      </w:pPr>
+      <w:rPr>
+        <w:rFonts w:ascii="Wingdings" w:hAnsi="Wingdings" w:hint="default"/>
+        <w:sz w:val="20"/>
+      </w:rPr>
+    </w:lvl>
+    <w:lvl w:ilvl="7" w:tentative="1">
+      <w:start w:val="1"/>
+      <w:numFmt w:val="bullet"/>
+      <w:lvlText w:val=""/>
+      <w:lvlJc w:val="left"/>
+      <w:pPr>
+        <w:tabs>
+          <w:tab w:val="num" w:pos="5760"/>
+        </w:tabs>
+        <w:ind w:left="5760" w:hanging="360"/>
+      </w:pPr>
+      <w:rPr>
+        <w:rFonts w:ascii="Wingdings" w:hAnsi="Wingdings" w:hint="default"/>
+        <w:sz w:val="20"/>
+      </w:rPr>
+    </w:lvl>
+    <w:lvl w:ilvl="8" w:tentative="1">
+      <w:start w:val="1"/>
+      <w:numFmt w:val="bullet"/>
+      <w:lvlText w:val=""/>
+      <w:lvlJc w:val="left"/>
+      <w:pPr>
+        <w:tabs>
+          <w:tab w:val="num" w:pos="6480"/>
+        </w:tabs>
+        <w:ind w:left="6480" w:hanging="360"/>
+      </w:pPr>
+      <w:rPr>
+        <w:rFonts w:ascii="Wingdings" w:hAnsi="Wingdings" w:hint="default"/>
+        <w:sz w:val="20"/>
+      </w:rPr>
+    </w:lvl>
+  </w:abstractNum>
+  <w:abstractNum w:abstractNumId="1" w15:restartNumberingAfterBreak="0">
     <w:nsid w:val="57356727"/>
     <w:multiLevelType w:val="hybridMultilevel"/>
     <w:tmpl w:val="386E4D0C"/>
@@ -1596,6 +3173,9 @@
     </w:lvl>
   </w:abstractNum>
   <w:num w:numId="1" w16cid:durableId="1685279359">
+    <w:abstractNumId w:val="1"/>
+  </w:num>
+  <w:num w:numId="2" w16cid:durableId="1515922087">
     <w:abstractNumId w:val="0"/>
   </w:num>
 </w:numbering>
@@ -2579,7 +4159,7 @@
       <w14:ligatures w14:val="none"/>
     </w:rPr>
   </w:style>
-  <w:style w:type="character" w:styleId="Fuerte">
+  <w:style w:type="character" w:styleId="Textoennegrita">
     <w:name w:val="Strong"/>
     <w:basedOn w:val="Fuentedeprrafopredeter"/>
     <w:uiPriority w:val="22"/>
@@ -2588,6 +4168,18 @@
     <w:rPr>
       <w:b/>
       <w:bCs/>
+    </w:rPr>
+  </w:style>
+  <w:style w:type="character" w:styleId="Mencinsinresolver">
+    <w:name w:val="Unresolved Mention"/>
+    <w:basedOn w:val="Fuentedeprrafopredeter"/>
+    <w:uiPriority w:val="99"/>
+    <w:semiHidden/>
+    <w:unhideWhenUsed/>
+    <w:rsid w:val="006410F8"/>
+    <w:rPr>
+      <w:color w:val="605E5C"/>
+      <w:shd w:val="clear" w:color="auto" w:fill="E1DFDD"/>
     </w:rPr>
   </w:style>
 </w:styles>

</xml_diff>

<commit_message>
Actualiza reporte de trabajo en equipo y evidencia de commits
</commit_message>
<xml_diff>
--- a/Reporte_Proyecto_DSA.docx
+++ b/Reporte_Proyecto_DSA.docx
@@ -509,6 +509,7 @@
     <w:p>
       <w:pPr>
         <w:pStyle w:val="NormalWeb"/>
+        <w:jc w:val="both"/>
         <w:rPr>
           <w:rFonts w:asciiTheme="minorHAnsi" w:hAnsiTheme="minorHAnsi" w:cstheme="minorHAnsi"/>
           <w:sz w:val="22"/>
@@ -528,6 +529,7 @@
       <w:pPr>
         <w:pStyle w:val="NormalWeb"/>
         <w:spacing w:line="300" w:lineRule="atLeast"/>
+        <w:jc w:val="both"/>
         <w:rPr>
           <w:rFonts w:asciiTheme="minorHAnsi" w:hAnsiTheme="minorHAnsi" w:cstheme="minorHAnsi"/>
           <w:sz w:val="22"/>
@@ -544,7 +546,7 @@
       </w:r>
       <w:r>
         <w:rPr>
-          <w:rStyle w:val="Textoennegrita"/>
+          <w:rStyle w:val="Fuerte"/>
           <w:rFonts w:asciiTheme="minorHAnsi" w:hAnsiTheme="minorHAnsi" w:cstheme="minorHAnsi"/>
           <w:b w:val="0"/>
           <w:bCs w:val="0"/>
@@ -583,7 +585,7 @@
       </w:r>
       <w:r>
         <w:rPr>
-          <w:rStyle w:val="Textoennegrita"/>
+          <w:rStyle w:val="Fuerte"/>
           <w:rFonts w:asciiTheme="minorHAnsi" w:hAnsiTheme="minorHAnsi" w:cstheme="minorHAnsi"/>
           <w:b w:val="0"/>
           <w:bCs w:val="0"/>
@@ -613,6 +615,7 @@
     </w:p>
     <w:p>
       <w:pPr>
+        <w:jc w:val="both"/>
         <w:rPr>
           <w:rFonts w:eastAsia="Times New Roman" w:cstheme="minorHAnsi"/>
           <w:kern w:val="0"/>
@@ -654,6 +657,7 @@
     <w:p>
       <w:pPr>
         <w:spacing w:after="0" w:line="240" w:lineRule="auto"/>
+        <w:jc w:val="both"/>
         <w:rPr>
           <w:rFonts w:eastAsia="Times New Roman" w:cstheme="minorHAnsi"/>
           <w:kern w:val="0"/>
@@ -674,6 +678,7 @@
     <w:p>
       <w:pPr>
         <w:spacing w:after="0" w:line="240" w:lineRule="auto"/>
+        <w:jc w:val="both"/>
         <w:rPr>
           <w:rFonts w:eastAsia="Times New Roman" w:cstheme="minorHAnsi"/>
           <w:kern w:val="0"/>
@@ -685,6 +690,7 @@
     <w:p>
       <w:pPr>
         <w:spacing w:after="0" w:line="240" w:lineRule="auto"/>
+        <w:jc w:val="both"/>
         <w:rPr>
           <w:rFonts w:eastAsia="Times New Roman" w:cstheme="minorHAnsi"/>
           <w:kern w:val="0"/>
@@ -724,6 +730,7 @@
     <w:p>
       <w:pPr>
         <w:spacing w:after="0" w:line="240" w:lineRule="auto"/>
+        <w:jc w:val="both"/>
         <w:rPr>
           <w:rFonts w:eastAsia="Times New Roman" w:cstheme="minorHAnsi"/>
           <w:kern w:val="0"/>
@@ -771,6 +778,7 @@
       <w:pPr>
         <w:pStyle w:val="NormalWeb"/>
         <w:spacing w:line="300" w:lineRule="atLeast"/>
+        <w:jc w:val="both"/>
         <w:rPr>
           <w:rFonts w:asciiTheme="minorHAnsi" w:hAnsiTheme="minorHAnsi" w:cstheme="minorHAnsi"/>
           <w:sz w:val="22"/>
@@ -795,7 +803,7 @@
       </w:r>
       <w:r>
         <w:rPr>
-          <w:rStyle w:val="Textoennegrita"/>
+          <w:rStyle w:val="Fuerte"/>
           <w:rFonts w:asciiTheme="minorHAnsi" w:hAnsiTheme="minorHAnsi" w:cstheme="minorHAnsi"/>
           <w:sz w:val="22"/>
           <w:szCs w:val="22"/>
@@ -815,6 +823,7 @@
       <w:pPr>
         <w:pStyle w:val="NormalWeb"/>
         <w:spacing w:line="300" w:lineRule="atLeast"/>
+        <w:jc w:val="both"/>
         <w:rPr>
           <w:rFonts w:asciiTheme="minorHAnsi" w:hAnsiTheme="minorHAnsi" w:cstheme="minorHAnsi"/>
           <w:sz w:val="22"/>
@@ -831,7 +840,7 @@
       </w:r>
       <w:r>
         <w:rPr>
-          <w:rStyle w:val="Textoennegrita"/>
+          <w:rStyle w:val="Fuerte"/>
           <w:rFonts w:asciiTheme="minorHAnsi" w:hAnsiTheme="minorHAnsi" w:cstheme="minorHAnsi"/>
           <w:sz w:val="22"/>
           <w:szCs w:val="22"/>
@@ -848,7 +857,7 @@
       </w:r>
       <w:r>
         <w:rPr>
-          <w:rStyle w:val="Textoennegrita"/>
+          <w:rStyle w:val="Fuerte"/>
           <w:rFonts w:asciiTheme="minorHAnsi" w:hAnsiTheme="minorHAnsi" w:cstheme="minorHAnsi"/>
           <w:sz w:val="22"/>
           <w:szCs w:val="22"/>
@@ -857,7 +866,7 @@
       </w:r>
       <w:r>
         <w:rPr>
-          <w:rStyle w:val="Textoennegrita"/>
+          <w:rStyle w:val="Fuerte"/>
           <w:rFonts w:asciiTheme="minorHAnsi" w:hAnsiTheme="minorHAnsi" w:cstheme="minorHAnsi"/>
           <w:b w:val="0"/>
           <w:bCs w:val="0"/>
@@ -868,7 +877,7 @@
       </w:r>
       <w:r>
         <w:rPr>
-          <w:rStyle w:val="Textoennegrita"/>
+          <w:rStyle w:val="Fuerte"/>
           <w:rFonts w:asciiTheme="minorHAnsi" w:hAnsiTheme="minorHAnsi" w:cstheme="minorHAnsi"/>
           <w:sz w:val="22"/>
           <w:szCs w:val="22"/>
@@ -888,6 +897,7 @@
       <w:pPr>
         <w:pStyle w:val="NormalWeb"/>
         <w:spacing w:line="300" w:lineRule="atLeast"/>
+        <w:jc w:val="both"/>
         <w:rPr>
           <w:rFonts w:asciiTheme="minorHAnsi" w:hAnsiTheme="minorHAnsi" w:cstheme="minorHAnsi"/>
           <w:sz w:val="22"/>
@@ -904,7 +914,7 @@
       </w:r>
       <w:r>
         <w:rPr>
-          <w:rStyle w:val="Textoennegrita"/>
+          <w:rStyle w:val="Fuerte"/>
           <w:rFonts w:asciiTheme="minorHAnsi" w:hAnsiTheme="minorHAnsi" w:cstheme="minorHAnsi"/>
           <w:b w:val="0"/>
           <w:bCs w:val="0"/>
@@ -923,7 +933,7 @@
       </w:r>
       <w:r>
         <w:rPr>
-          <w:rStyle w:val="Textoennegrita"/>
+          <w:rStyle w:val="Fuerte"/>
           <w:rFonts w:asciiTheme="minorHAnsi" w:hAnsiTheme="minorHAnsi" w:cstheme="minorHAnsi"/>
           <w:b w:val="0"/>
           <w:bCs w:val="0"/>
@@ -942,7 +952,7 @@
       </w:r>
       <w:r>
         <w:rPr>
-          <w:rStyle w:val="Textoennegrita"/>
+          <w:rStyle w:val="Fuerte"/>
           <w:rFonts w:asciiTheme="minorHAnsi" w:hAnsiTheme="minorHAnsi" w:cstheme="minorHAnsi"/>
           <w:sz w:val="22"/>
           <w:szCs w:val="22"/>
@@ -982,6 +992,7 @@
     <w:p>
       <w:pPr>
         <w:spacing w:after="0" w:line="300" w:lineRule="atLeast"/>
+        <w:jc w:val="both"/>
         <w:rPr>
           <w:rFonts w:eastAsia="Times New Roman" w:cstheme="minorHAnsi"/>
           <w:kern w:val="0"/>
@@ -1170,6 +1181,7 @@
     <w:p>
       <w:pPr>
         <w:spacing w:after="0" w:line="300" w:lineRule="atLeast"/>
+        <w:jc w:val="both"/>
         <w:rPr>
           <w:rFonts w:eastAsia="Times New Roman" w:cstheme="minorHAnsi"/>
           <w:kern w:val="0"/>
@@ -1291,38 +1303,39 @@
           <w:lang w:eastAsia="es-CO"/>
           <w14:ligatures w14:val="none"/>
         </w:rPr>
+        <w:t>Figura 2. Valor mediano registrado por municipio, 2015–2023</w:t>
+      </w:r>
+    </w:p>
+    <w:p>
+      <w:pPr>
+        <w:spacing w:after="0" w:line="300" w:lineRule="atLeast"/>
+        <w:rPr>
+          <w:rFonts w:eastAsia="Times New Roman" w:cstheme="minorHAnsi"/>
+          <w:kern w:val="0"/>
+          <w:lang w:eastAsia="es-CO"/>
+          <w14:ligatures w14:val="none"/>
+        </w:rPr>
+      </w:pPr>
+    </w:p>
+    <w:p>
+      <w:pPr>
+        <w:spacing w:after="0" w:line="300" w:lineRule="atLeast"/>
+        <w:jc w:val="both"/>
+        <w:rPr>
+          <w:rFonts w:eastAsia="Times New Roman" w:cstheme="minorHAnsi"/>
+          <w:kern w:val="0"/>
+          <w:lang w:eastAsia="es-CO"/>
+          <w14:ligatures w14:val="none"/>
+        </w:rPr>
+      </w:pPr>
+      <w:r>
+        <w:rPr>
+          <w:rFonts w:eastAsia="Times New Roman" w:cstheme="minorHAnsi"/>
+          <w:kern w:val="0"/>
+          <w:lang w:eastAsia="es-CO"/>
+          <w14:ligatures w14:val="none"/>
+        </w:rPr>
         <w:lastRenderedPageBreak/>
-        <w:t>Figura 2. Valor mediano registrado por municipio, 2015–2023</w:t>
-      </w:r>
-    </w:p>
-    <w:p>
-      <w:pPr>
-        <w:spacing w:after="0" w:line="300" w:lineRule="atLeast"/>
-        <w:rPr>
-          <w:rFonts w:eastAsia="Times New Roman" w:cstheme="minorHAnsi"/>
-          <w:kern w:val="0"/>
-          <w:lang w:eastAsia="es-CO"/>
-          <w14:ligatures w14:val="none"/>
-        </w:rPr>
-      </w:pPr>
-    </w:p>
-    <w:p>
-      <w:pPr>
-        <w:spacing w:after="0" w:line="300" w:lineRule="atLeast"/>
-        <w:rPr>
-          <w:rFonts w:eastAsia="Times New Roman" w:cstheme="minorHAnsi"/>
-          <w:kern w:val="0"/>
-          <w:lang w:eastAsia="es-CO"/>
-          <w14:ligatures w14:val="none"/>
-        </w:rPr>
-      </w:pPr>
-      <w:r>
-        <w:rPr>
-          <w:rFonts w:eastAsia="Times New Roman" w:cstheme="minorHAnsi"/>
-          <w:kern w:val="0"/>
-          <w:lang w:eastAsia="es-CO"/>
-          <w14:ligatures w14:val="none"/>
-        </w:rPr>
         <w:t>Al revisar la distribución de los valores registrados se encontraron diferencias importantes entre el promedio y la mediana. Para el conjunto analizado, Armenia presenta una mediana de $68 millones frente a un promedio cercano a $101,6 millones; Manizales una mediana de $99 millones frente a un promedio de $210,2 millones; y Pereira una mediana de $92,5 millones frente a un promedio de $283,9 millones. Estas diferencias, junto con la presencia de valores mínimos y máximos muy alejados, muestran que el promedio puede verse afectado por valores extremos. Por esta razón, se utilizó la mediana para realizar una comparación menos afectada por dichos valores. En el periodo analizado, la mediana pasó de $45,1 millones a $108 millones en Armenia, de $83,1 millones a $135 millones en Manizales y de $79,7 millones a $123 millones en Pereira entre 2015 y 2023. Estos valores corresponden a los registros disponibles y no están ajustados por inflación, por lo que se utilizan únicamente como una comparación descriptiva de su evolución.</w:t>
       </w:r>
     </w:p>
@@ -1354,6 +1367,7 @@
     <w:p>
       <w:pPr>
         <w:spacing w:after="0" w:line="300" w:lineRule="atLeast"/>
+        <w:jc w:val="both"/>
         <w:rPr>
           <w:rFonts w:eastAsia="Times New Roman" w:cstheme="minorHAnsi"/>
           <w:kern w:val="0"/>
@@ -1502,6 +1516,7 @@
         <w:keepNext/>
         <w:keepLines/>
         <w:spacing w:before="360" w:after="80"/>
+        <w:jc w:val="both"/>
         <w:outlineLvl w:val="0"/>
         <w:rPr>
           <w:lang w:val="es-ES"/>
@@ -1545,6 +1560,7 @@
         <w:keepNext/>
         <w:keepLines/>
         <w:spacing w:before="360" w:after="80"/>
+        <w:jc w:val="both"/>
         <w:outlineLvl w:val="0"/>
         <w:rPr>
           <w:lang w:val="es-ES"/>
@@ -1615,6 +1631,7 @@
         <w:keepNext/>
         <w:keepLines/>
         <w:spacing w:before="360" w:after="80"/>
+        <w:jc w:val="both"/>
         <w:outlineLvl w:val="0"/>
         <w:rPr>
           <w:lang w:val="es-ES"/>
@@ -1639,6 +1656,66 @@
           <w:lang w:val="es-ES"/>
         </w:rPr>
         <w:t xml:space="preserve"> Control (DVC), integrado con Git y Amazon S3.</w:t>
+      </w:r>
+    </w:p>
+    <w:p>
+      <w:pPr>
+        <w:keepNext/>
+        <w:keepLines/>
+        <w:spacing w:before="360" w:after="80"/>
+        <w:jc w:val="both"/>
+        <w:outlineLvl w:val="0"/>
+        <w:rPr>
+          <w:lang w:val="es-ES"/>
+        </w:rPr>
+      </w:pPr>
+      <w:r>
+        <w:rPr>
+          <w:lang w:val="es-ES"/>
+        </w:rPr>
+        <w:t xml:space="preserve">El conjunto de datos datos_inmobiliarios.csv se incorporó al seguimiento de DVC mediante el comando </w:t>
+      </w:r>
+      <w:proofErr w:type="spellStart"/>
+      <w:r>
+        <w:rPr>
+          <w:lang w:val="es-ES"/>
+        </w:rPr>
+        <w:t>dvc</w:t>
+      </w:r>
+      <w:proofErr w:type="spellEnd"/>
+      <w:r>
+        <w:rPr>
+          <w:lang w:val="es-ES"/>
+        </w:rPr>
+        <w:t xml:space="preserve"> </w:t>
+      </w:r>
+      <w:proofErr w:type="spellStart"/>
+      <w:r>
+        <w:rPr>
+          <w:lang w:val="es-ES"/>
+        </w:rPr>
+        <w:t>add</w:t>
+      </w:r>
+      <w:proofErr w:type="spellEnd"/>
+      <w:r>
+        <w:rPr>
+          <w:lang w:val="es-ES"/>
+        </w:rPr>
+        <w:t xml:space="preserve">. Esta operación generó el archivo </w:t>
+      </w:r>
+      <w:proofErr w:type="spellStart"/>
+      <w:r>
+        <w:rPr>
+          <w:lang w:val="es-ES"/>
+        </w:rPr>
+        <w:t>datos_inmobiliarios.csv.dvc</w:t>
+      </w:r>
+      <w:proofErr w:type="spellEnd"/>
+      <w:r>
+        <w:rPr>
+          <w:lang w:val="es-ES"/>
+        </w:rPr>
+        <w:t>, que permite identificar la versión de los datos utilizada en el proyecto.</w:t>
       </w:r>
     </w:p>
     <w:p>
@@ -1655,49 +1732,7 @@
         <w:rPr>
           <w:lang w:val="es-ES"/>
         </w:rPr>
-        <w:t xml:space="preserve">El conjunto de datos datos_inmobiliarios.csv se incorporó al seguimiento de DVC mediante el comando </w:t>
-      </w:r>
-      <w:proofErr w:type="spellStart"/>
-      <w:r>
-        <w:rPr>
-          <w:lang w:val="es-ES"/>
-        </w:rPr>
-        <w:t>dvc</w:t>
-      </w:r>
-      <w:proofErr w:type="spellEnd"/>
-      <w:r>
-        <w:rPr>
-          <w:lang w:val="es-ES"/>
-        </w:rPr>
-        <w:t xml:space="preserve"> </w:t>
-      </w:r>
-      <w:proofErr w:type="spellStart"/>
-      <w:r>
-        <w:rPr>
-          <w:lang w:val="es-ES"/>
-        </w:rPr>
-        <w:t>add</w:t>
-      </w:r>
-      <w:proofErr w:type="spellEnd"/>
-      <w:r>
-        <w:rPr>
-          <w:lang w:val="es-ES"/>
-        </w:rPr>
-        <w:t xml:space="preserve">. Esta operación generó el archivo </w:t>
-      </w:r>
-      <w:proofErr w:type="spellStart"/>
-      <w:r>
-        <w:rPr>
-          <w:lang w:val="es-ES"/>
-        </w:rPr>
-        <w:t>datos_inmobiliarios.csv.dvc</w:t>
-      </w:r>
-      <w:proofErr w:type="spellEnd"/>
-      <w:r>
-        <w:rPr>
-          <w:lang w:val="es-ES"/>
-        </w:rPr>
-        <w:t>, que permite identificar la versión de los datos utilizada en el proyecto.</w:t>
+        <w:t>Se configuró Amazon S3 como almacenamiento remoto de DVC:</w:t>
       </w:r>
     </w:p>
     <w:p>
@@ -1710,11 +1745,33 @@
           <w:lang w:val="es-ES"/>
         </w:rPr>
       </w:pPr>
-      <w:r>
-        <w:rPr>
-          <w:lang w:val="es-ES"/>
-        </w:rPr>
-        <w:t>Se configuró Amazon S3 como almacenamiento remoto de DVC:</w:t>
+      <w:proofErr w:type="spellStart"/>
+      <w:r>
+        <w:rPr>
+          <w:lang w:val="es-ES"/>
+        </w:rPr>
+        <w:t>Bucket</w:t>
+      </w:r>
+      <w:proofErr w:type="spellEnd"/>
+      <w:r>
+        <w:rPr>
+          <w:lang w:val="es-ES"/>
+        </w:rPr>
+        <w:t xml:space="preserve">: </w:t>
+      </w:r>
+      <w:proofErr w:type="spellStart"/>
+      <w:r>
+        <w:rPr>
+          <w:lang w:val="es-ES"/>
+        </w:rPr>
+        <w:t>miad</w:t>
+      </w:r>
+      <w:proofErr w:type="spellEnd"/>
+      <w:r>
+        <w:rPr>
+          <w:lang w:val="es-ES"/>
+        </w:rPr>
+        <w:t>-proyecto-inmobiliario</w:t>
       </w:r>
     </w:p>
     <w:p>
@@ -1727,33 +1784,11 @@
           <w:lang w:val="es-ES"/>
         </w:rPr>
       </w:pPr>
-      <w:proofErr w:type="spellStart"/>
-      <w:r>
-        <w:rPr>
-          <w:lang w:val="es-ES"/>
-        </w:rPr>
-        <w:t>Bucket</w:t>
-      </w:r>
-      <w:proofErr w:type="spellEnd"/>
-      <w:r>
-        <w:rPr>
-          <w:lang w:val="es-ES"/>
-        </w:rPr>
-        <w:t xml:space="preserve">: </w:t>
-      </w:r>
-      <w:proofErr w:type="spellStart"/>
-      <w:r>
-        <w:rPr>
-          <w:lang w:val="es-ES"/>
-        </w:rPr>
-        <w:t>miad</w:t>
-      </w:r>
-      <w:proofErr w:type="spellEnd"/>
-      <w:r>
-        <w:rPr>
-          <w:lang w:val="es-ES"/>
-        </w:rPr>
-        <w:t>-proyecto-inmobiliario</w:t>
+      <w:r>
+        <w:rPr>
+          <w:lang w:val="es-ES"/>
+        </w:rPr>
+        <w:t>Ruta del almacenamiento: s3://miad-proyecto-inmobiliario/dvc-storage</w:t>
       </w:r>
     </w:p>
     <w:p>
@@ -1761,23 +1796,7 @@
         <w:keepNext/>
         <w:keepLines/>
         <w:spacing w:before="360" w:after="80"/>
-        <w:outlineLvl w:val="0"/>
-        <w:rPr>
-          <w:lang w:val="es-ES"/>
-        </w:rPr>
-      </w:pPr>
-      <w:r>
-        <w:rPr>
-          <w:lang w:val="es-ES"/>
-        </w:rPr>
-        <w:t>Ruta del almacenamiento: s3://miad-proyecto-inmobiliario/dvc-storage</w:t>
-      </w:r>
-    </w:p>
-    <w:p>
-      <w:pPr>
-        <w:keepNext/>
-        <w:keepLines/>
-        <w:spacing w:before="360" w:after="80"/>
+        <w:jc w:val="both"/>
         <w:outlineLvl w:val="0"/>
         <w:rPr>
           <w:lang w:val="es-ES"/>
@@ -1908,6 +1927,7 @@
           <w:numId w:val="2"/>
         </w:numPr>
         <w:spacing w:before="360" w:after="80"/>
+        <w:jc w:val="both"/>
         <w:outlineLvl w:val="0"/>
         <w:rPr>
           <w:lang w:val="es-ES"/>
@@ -1980,6 +2000,7 @@
           <w:numId w:val="2"/>
         </w:numPr>
         <w:spacing w:before="360" w:after="80"/>
+        <w:jc w:val="both"/>
         <w:outlineLvl w:val="0"/>
         <w:rPr>
           <w:lang w:val="es-ES"/>
@@ -2092,6 +2113,7 @@
       </w:pPr>
       <w:r>
         <w:rPr>
+          <w:noProof/>
           <w:lang w:val="es-ES"/>
         </w:rPr>
         <w:drawing>
@@ -2238,6 +2260,7 @@
       </w:pPr>
       <w:r>
         <w:rPr>
+          <w:noProof/>
           <w:lang w:val="es-ES"/>
         </w:rPr>
         <w:lastRenderedPageBreak/>
@@ -2369,6 +2392,7 @@
       </w:pPr>
       <w:r>
         <w:rPr>
+          <w:noProof/>
           <w:lang w:val="es-ES"/>
         </w:rPr>
         <w:drawing>
@@ -2453,6 +2477,7 @@
       </w:pPr>
       <w:r>
         <w:rPr>
+          <w:noProof/>
           <w:lang w:val="es-ES"/>
         </w:rPr>
         <w:drawing>
@@ -2603,6 +2628,7 @@
         <w:keepNext/>
         <w:keepLines/>
         <w:spacing w:before="360" w:after="80"/>
+        <w:jc w:val="both"/>
         <w:outlineLvl w:val="0"/>
         <w:rPr>
           <w:lang w:val="es-ES"/>
@@ -2613,6 +2639,275 @@
           <w:lang w:val="es-ES"/>
         </w:rPr>
         <w:t>Las evidencias presentadas permiten verificar la integración de DVC con el repositorio GitHub y el almacenamiento remoto Amazon S3. Se documenta el registro de los datos, su transferencia al almacenamiento remoto y su posterior recuperación desde una copia independiente del proyecto, confirmando la reproducibilidad del proceso de gestión de datos.</w:t>
+      </w:r>
+    </w:p>
+    <w:p>
+      <w:pPr>
+        <w:keepNext/>
+        <w:keepLines/>
+        <w:spacing w:before="360" w:after="80"/>
+        <w:jc w:val="both"/>
+        <w:outlineLvl w:val="0"/>
+        <w:rPr>
+          <w:lang w:val="es-ES"/>
+        </w:rPr>
+      </w:pPr>
+      <w:r>
+        <w:rPr>
+          <w:lang w:val="es-ES"/>
+        </w:rPr>
+        <w:t xml:space="preserve">Consideración de acceso: el almacenamiento S3 es privado y su utilización requiere credenciales AWS autorizadas. La implementación se probó desde una instancia EC2 de AWS </w:t>
+      </w:r>
+      <w:proofErr w:type="spellStart"/>
+      <w:r>
+        <w:rPr>
+          <w:lang w:val="es-ES"/>
+        </w:rPr>
+        <w:t>Academy</w:t>
+      </w:r>
+      <w:proofErr w:type="spellEnd"/>
+      <w:r>
+        <w:rPr>
+          <w:lang w:val="es-ES"/>
+        </w:rPr>
+        <w:t xml:space="preserve"> utilizando credenciales temporales del laboratorio; por tanto, el acceso posterior depende de la vigencia de dichas credenciales y de los permisos disponibles.</w:t>
+      </w:r>
+    </w:p>
+    <w:p>
+      <w:pPr>
+        <w:pStyle w:val="Ttulo1"/>
+      </w:pPr>
+      <w:r>
+        <w:lastRenderedPageBreak/>
+        <w:t>7. Reporte de trabajo en equipo</w:t>
+      </w:r>
+    </w:p>
+    <w:p>
+      <w:pPr>
+        <w:keepNext/>
+        <w:keepLines/>
+        <w:spacing w:before="360" w:after="80"/>
+        <w:jc w:val="both"/>
+        <w:outlineLvl w:val="0"/>
+        <w:rPr>
+          <w:lang w:val="es-ES"/>
+        </w:rPr>
+      </w:pPr>
+      <w:r>
+        <w:rPr>
+          <w:lang w:val="es-ES"/>
+        </w:rPr>
+        <w:t xml:space="preserve">El proyecto fue desarrollado por un equipo conformado por Jecika León, </w:t>
+      </w:r>
+      <w:r>
+        <w:rPr>
+          <w:lang w:val="es-ES"/>
+        </w:rPr>
+        <w:t>Y</w:t>
+      </w:r>
+      <w:r>
+        <w:rPr>
+          <w:lang w:val="es-ES"/>
+        </w:rPr>
+        <w:t>vonne Campos, Guillermo Prieto y Juan Sebastián Victoria. Las actividades se distribuyeron entre la elaboración del informe, la exploración de datos, el diseño del prototipo y la configuración de herramientas de control de versiones.</w:t>
+      </w:r>
+    </w:p>
+    <w:p>
+      <w:pPr>
+        <w:keepNext/>
+        <w:keepLines/>
+        <w:spacing w:before="360" w:after="80"/>
+        <w:jc w:val="both"/>
+        <w:outlineLvl w:val="0"/>
+        <w:rPr>
+          <w:lang w:val="es-ES"/>
+        </w:rPr>
+      </w:pPr>
+      <w:r>
+        <w:rPr>
+          <w:b/>
+          <w:bCs/>
+          <w:lang w:val="es-ES"/>
+        </w:rPr>
+        <w:t>Guillermo Prieto:</w:t>
+      </w:r>
+      <w:r>
+        <w:rPr>
+          <w:lang w:val="es-ES"/>
+        </w:rPr>
+        <w:t xml:space="preserve"> realizó la publicación y actualización de los archivos del proyecto en GitHub, incluyendo el notebook de exploración, el informe y la primera versión del mockup del tablero. Su participación está registrada mediante tres </w:t>
+      </w:r>
+      <w:proofErr w:type="spellStart"/>
+      <w:r>
+        <w:rPr>
+          <w:lang w:val="es-ES"/>
+        </w:rPr>
+        <w:t>commits</w:t>
+      </w:r>
+      <w:proofErr w:type="spellEnd"/>
+      <w:r>
+        <w:rPr>
+          <w:lang w:val="es-ES"/>
+        </w:rPr>
+        <w:t xml:space="preserve"> en el repositorio.</w:t>
+      </w:r>
+    </w:p>
+    <w:p>
+      <w:pPr>
+        <w:keepNext/>
+        <w:keepLines/>
+        <w:spacing w:before="360" w:after="80"/>
+        <w:jc w:val="both"/>
+        <w:outlineLvl w:val="0"/>
+        <w:rPr>
+          <w:lang w:val="es-ES"/>
+        </w:rPr>
+      </w:pPr>
+      <w:r>
+        <w:rPr>
+          <w:b/>
+          <w:bCs/>
+          <w:lang w:val="es-ES"/>
+        </w:rPr>
+        <w:t>Juan Sebastián Victoria:</w:t>
+      </w:r>
+      <w:r>
+        <w:rPr>
+          <w:lang w:val="es-ES"/>
+        </w:rPr>
+        <w:t xml:space="preserve"> realizó la implementación de Data </w:t>
+      </w:r>
+      <w:proofErr w:type="spellStart"/>
+      <w:r>
+        <w:rPr>
+          <w:lang w:val="es-ES"/>
+        </w:rPr>
+        <w:t>Version</w:t>
+      </w:r>
+      <w:proofErr w:type="spellEnd"/>
+      <w:r>
+        <w:rPr>
+          <w:lang w:val="es-ES"/>
+        </w:rPr>
+        <w:t xml:space="preserve"> Control (DVC), configuró Amazon S3 como almacenamiento remoto y ejecutó pruebas exitosas de almacenamiento y recuperación de datos mediante </w:t>
+      </w:r>
+      <w:proofErr w:type="spellStart"/>
+      <w:r>
+        <w:rPr>
+          <w:lang w:val="es-ES"/>
+        </w:rPr>
+        <w:t>dvc</w:t>
+      </w:r>
+      <w:proofErr w:type="spellEnd"/>
+      <w:r>
+        <w:rPr>
+          <w:lang w:val="es-ES"/>
+        </w:rPr>
+        <w:t xml:space="preserve"> </w:t>
+      </w:r>
+      <w:proofErr w:type="spellStart"/>
+      <w:r>
+        <w:rPr>
+          <w:lang w:val="es-ES"/>
+        </w:rPr>
+        <w:t>push</w:t>
+      </w:r>
+      <w:proofErr w:type="spellEnd"/>
+      <w:r>
+        <w:rPr>
+          <w:lang w:val="es-ES"/>
+        </w:rPr>
+        <w:t xml:space="preserve"> y </w:t>
+      </w:r>
+      <w:proofErr w:type="spellStart"/>
+      <w:r>
+        <w:rPr>
+          <w:lang w:val="es-ES"/>
+        </w:rPr>
+        <w:t>dvc</w:t>
+      </w:r>
+      <w:proofErr w:type="spellEnd"/>
+      <w:r>
+        <w:rPr>
+          <w:lang w:val="es-ES"/>
+        </w:rPr>
+        <w:t xml:space="preserve"> </w:t>
+      </w:r>
+      <w:proofErr w:type="spellStart"/>
+      <w:r>
+        <w:rPr>
+          <w:lang w:val="es-ES"/>
+        </w:rPr>
+        <w:t>pull</w:t>
+      </w:r>
+      <w:proofErr w:type="spellEnd"/>
+      <w:r>
+        <w:rPr>
+          <w:lang w:val="es-ES"/>
+        </w:rPr>
+        <w:t xml:space="preserve">. Estos cambios quedaron registrados en el </w:t>
+      </w:r>
+      <w:proofErr w:type="spellStart"/>
+      <w:r>
+        <w:rPr>
+          <w:lang w:val="es-ES"/>
+        </w:rPr>
+        <w:t>commit</w:t>
+      </w:r>
+      <w:proofErr w:type="spellEnd"/>
+      <w:r>
+        <w:rPr>
+          <w:lang w:val="es-ES"/>
+        </w:rPr>
+        <w:t xml:space="preserve"> ba5822f.</w:t>
+      </w:r>
+    </w:p>
+    <w:p>
+      <w:pPr>
+        <w:keepNext/>
+        <w:keepLines/>
+        <w:spacing w:before="360" w:after="80"/>
+        <w:jc w:val="both"/>
+        <w:outlineLvl w:val="0"/>
+        <w:rPr>
+          <w:b/>
+          <w:bCs/>
+          <w:lang w:val="es-ES"/>
+        </w:rPr>
+      </w:pPr>
+      <w:r>
+        <w:rPr>
+          <w:b/>
+          <w:bCs/>
+          <w:lang w:val="es-ES"/>
+        </w:rPr>
+        <w:t xml:space="preserve">Yvonne Campos: </w:t>
+      </w:r>
+      <w:r>
+        <w:rPr>
+          <w:lang w:val="es-ES"/>
+        </w:rPr>
+        <w:t xml:space="preserve">amplió en </w:t>
+      </w:r>
+      <w:r>
+        <w:rPr>
+          <w:lang w:val="es-ES"/>
+        </w:rPr>
+        <w:t xml:space="preserve">el notebook de exploración con el cálculo de variaciones porcentuales anuales y un índice de compraventas con base 2015 = 100 para Armenia, Manizales y Pereira. Incluyó gráficas comparativas e interpretación de resultados. Este aporte quedó registrado en GitHub mediante el </w:t>
+      </w:r>
+      <w:proofErr w:type="spellStart"/>
+      <w:r>
+        <w:rPr>
+          <w:lang w:val="es-ES"/>
+        </w:rPr>
+        <w:t>commit</w:t>
+      </w:r>
+      <w:proofErr w:type="spellEnd"/>
+      <w:r>
+        <w:rPr>
+          <w:lang w:val="es-ES"/>
+        </w:rPr>
+        <w:t xml:space="preserve"> b68a6f6.</w:t>
       </w:r>
     </w:p>
     <w:p>
@@ -2627,32 +2922,83 @@
       </w:pPr>
       <w:r>
         <w:rPr>
-          <w:lang w:val="es-ES"/>
-        </w:rPr>
-        <w:t xml:space="preserve">Consideración de acceso: el almacenamiento S3 es privado y su utilización requiere credenciales AWS autorizadas. La implementación se probó desde una instancia EC2 de AWS </w:t>
+          <w:b/>
+          <w:bCs/>
+          <w:lang w:val="es-ES"/>
+        </w:rPr>
+        <w:t>Jecika León:</w:t>
+      </w:r>
+      <w:r>
+        <w:rPr>
+          <w:lang w:val="es-ES"/>
+        </w:rPr>
+        <w:t xml:space="preserve"> particip</w:t>
+      </w:r>
+      <w:r>
+        <w:rPr>
+          <w:lang w:val="es-ES"/>
+        </w:rPr>
+        <w:t>ó</w:t>
+      </w:r>
+      <w:r>
+        <w:rPr>
+          <w:lang w:val="es-ES"/>
+        </w:rPr>
+        <w:t xml:space="preserve"> en la elaboración del informe escrito del proyecto. Sus contribuciones se incorporaron al documento que posteriormente fue publicado en GitHub por Guillermo Prieto, razón por la cual no aparecen como autoras individuales de </w:t>
       </w:r>
       <w:proofErr w:type="spellStart"/>
       <w:r>
         <w:rPr>
           <w:lang w:val="es-ES"/>
         </w:rPr>
-        <w:t>Academy</w:t>
+        <w:t>commits</w:t>
       </w:r>
       <w:proofErr w:type="spellEnd"/>
       <w:r>
         <w:rPr>
           <w:lang w:val="es-ES"/>
         </w:rPr>
-        <w:t xml:space="preserve"> utilizando credenciales temporales del laboratorio; por tanto, el acceso posterior depende de la vigencia de dichas credenciales y de los permisos disponibles.</w:t>
-      </w:r>
-    </w:p>
-    <w:p>
-      <w:pPr>
-        <w:pStyle w:val="Ttulo1"/>
-      </w:pPr>
-      <w:r>
-        <w:lastRenderedPageBreak/>
-        <w:t>7. Reporte de trabajo en equipo</w:t>
+        <w:t>.</w:t>
+      </w:r>
+    </w:p>
+    <w:p>
+      <w:pPr>
+        <w:keepNext/>
+        <w:keepLines/>
+        <w:spacing w:before="360" w:after="80"/>
+        <w:jc w:val="both"/>
+        <w:outlineLvl w:val="0"/>
+        <w:rPr>
+          <w:lang w:val="es-ES"/>
+        </w:rPr>
+      </w:pPr>
+      <w:r>
+        <w:rPr>
+          <w:b/>
+          <w:bCs/>
+          <w:lang w:val="es-ES"/>
+        </w:rPr>
+        <w:t>Coordinación y trazabilidad:</w:t>
+      </w:r>
+      <w:r>
+        <w:rPr>
+          <w:lang w:val="es-ES"/>
+        </w:rPr>
+        <w:t xml:space="preserve"> el equipo utilizó GitHub como repositorio central para consolidar los entregables. Las contribuciones técnicas se evidencian mediante el historial de </w:t>
+      </w:r>
+      <w:proofErr w:type="spellStart"/>
+      <w:r>
+        <w:rPr>
+          <w:lang w:val="es-ES"/>
+        </w:rPr>
+        <w:t>commits</w:t>
+      </w:r>
+      <w:proofErr w:type="spellEnd"/>
+      <w:r>
+        <w:rPr>
+          <w:lang w:val="es-ES"/>
+        </w:rPr>
+        <w:t>, mientras que el trabajo colaborativo de redacción se documenta en este reporte. Se reconoce que el historial de Git no refleja de manera individual todas las actividades realizadas fuera del repositorio.</w:t>
       </w:r>
     </w:p>
     <w:p>
@@ -2666,10 +3012,41 @@
         </w:rPr>
       </w:pPr>
       <w:r>
-        <w:rPr>
-          <w:lang w:val="es-ES"/>
-        </w:rPr>
-        <w:t>El proyecto fue desarrollado por un equipo conformado por Jecika León, Ivonne Campos, Guillermo Prieto y Juan Sebastián Victoria. Las actividades se distribuyeron entre la elaboración del informe, la exploración de datos, el diseño del prototipo y la configuración de herramientas de control de versiones.</w:t>
+        <w:drawing>
+          <wp:inline distT="0" distB="0" distL="0" distR="0" wp14:anchorId="25B7F219" wp14:editId="4E0FDB32">
+            <wp:extent cx="5029200" cy="2507202"/>
+            <wp:effectExtent l="0" t="0" r="0" b="7620"/>
+            <wp:docPr id="489345457" name="Imagen 1"/>
+            <wp:cNvGraphicFramePr>
+              <a:graphicFrameLocks xmlns:a="http://schemas.openxmlformats.org/drawingml/2006/main" noChangeAspect="1"/>
+            </wp:cNvGraphicFramePr>
+            <a:graphic xmlns:a="http://schemas.openxmlformats.org/drawingml/2006/main">
+              <a:graphicData uri="http://schemas.openxmlformats.org/drawingml/2006/picture">
+                <pic:pic xmlns:pic="http://schemas.openxmlformats.org/drawingml/2006/picture">
+                  <pic:nvPicPr>
+                    <pic:cNvPr id="489345457" name=""/>
+                    <pic:cNvPicPr/>
+                  </pic:nvPicPr>
+                  <pic:blipFill>
+                    <a:blip r:embed="rId14"/>
+                    <a:stretch>
+                      <a:fillRect/>
+                    </a:stretch>
+                  </pic:blipFill>
+                  <pic:spPr>
+                    <a:xfrm>
+                      <a:off x="0" y="0"/>
+                      <a:ext cx="5037609" cy="2511394"/>
+                    </a:xfrm>
+                    <a:prstGeom prst="rect">
+                      <a:avLst/>
+                    </a:prstGeom>
+                  </pic:spPr>
+                </pic:pic>
+              </a:graphicData>
+            </a:graphic>
+          </wp:inline>
+        </w:drawing>
       </w:r>
     </w:p>
     <w:p>
@@ -2679,252 +3056,15 @@
         <w:spacing w:before="360" w:after="80"/>
         <w:outlineLvl w:val="0"/>
         <w:rPr>
-          <w:lang w:val="es-ES"/>
-        </w:rPr>
-      </w:pPr>
-      <w:r>
-        <w:rPr>
           <w:b/>
           <w:bCs/>
           <w:lang w:val="es-ES"/>
         </w:rPr>
-        <w:t>Guillermo Prieto:</w:t>
-      </w:r>
-      <w:r>
-        <w:rPr>
-          <w:lang w:val="es-ES"/>
-        </w:rPr>
-        <w:t xml:space="preserve"> realizó la publicación y actualización de los archivos del proyecto en GitHub, incluyendo el notebook de exploración, el informe y la primera versión del mockup del tablero. Su participación está registrada mediante tres </w:t>
-      </w:r>
-      <w:proofErr w:type="spellStart"/>
-      <w:r>
-        <w:rPr>
-          <w:lang w:val="es-ES"/>
-        </w:rPr>
-        <w:t>commits</w:t>
-      </w:r>
-      <w:proofErr w:type="spellEnd"/>
-      <w:r>
-        <w:rPr>
-          <w:lang w:val="es-ES"/>
-        </w:rPr>
-        <w:t xml:space="preserve"> en el repositorio.</w:t>
-      </w:r>
-    </w:p>
-    <w:p>
-      <w:pPr>
-        <w:keepNext/>
-        <w:keepLines/>
-        <w:spacing w:before="360" w:after="80"/>
-        <w:outlineLvl w:val="0"/>
-        <w:rPr>
-          <w:lang w:val="es-ES"/>
-        </w:rPr>
-      </w:pPr>
-      <w:r>
-        <w:rPr>
-          <w:b/>
-          <w:bCs/>
-          <w:lang w:val="es-ES"/>
-        </w:rPr>
-        <w:t>Juan Sebastián Victoria:</w:t>
-      </w:r>
-      <w:r>
-        <w:rPr>
-          <w:lang w:val="es-ES"/>
-        </w:rPr>
-        <w:t xml:space="preserve"> realizó la implementación de Data </w:t>
-      </w:r>
-      <w:proofErr w:type="spellStart"/>
-      <w:r>
-        <w:rPr>
-          <w:lang w:val="es-ES"/>
-        </w:rPr>
-        <w:t>Version</w:t>
-      </w:r>
-      <w:proofErr w:type="spellEnd"/>
-      <w:r>
-        <w:rPr>
-          <w:lang w:val="es-ES"/>
-        </w:rPr>
-        <w:t xml:space="preserve"> Control (DVC), configuró Amazon S3 como almacenamiento remoto y ejecutó pruebas exitosas de almacenamiento y recuperación de datos mediante </w:t>
-      </w:r>
-      <w:proofErr w:type="spellStart"/>
-      <w:r>
-        <w:rPr>
-          <w:lang w:val="es-ES"/>
-        </w:rPr>
-        <w:t>dvc</w:t>
-      </w:r>
-      <w:proofErr w:type="spellEnd"/>
-      <w:r>
-        <w:rPr>
-          <w:lang w:val="es-ES"/>
-        </w:rPr>
-        <w:t xml:space="preserve"> </w:t>
-      </w:r>
-      <w:proofErr w:type="spellStart"/>
-      <w:r>
-        <w:rPr>
-          <w:lang w:val="es-ES"/>
-        </w:rPr>
-        <w:t>push</w:t>
-      </w:r>
-      <w:proofErr w:type="spellEnd"/>
-      <w:r>
-        <w:rPr>
-          <w:lang w:val="es-ES"/>
-        </w:rPr>
-        <w:t xml:space="preserve"> y </w:t>
-      </w:r>
-      <w:proofErr w:type="spellStart"/>
-      <w:r>
-        <w:rPr>
-          <w:lang w:val="es-ES"/>
-        </w:rPr>
-        <w:t>dvc</w:t>
-      </w:r>
-      <w:proofErr w:type="spellEnd"/>
-      <w:r>
-        <w:rPr>
-          <w:lang w:val="es-ES"/>
-        </w:rPr>
-        <w:t xml:space="preserve"> </w:t>
-      </w:r>
-      <w:proofErr w:type="spellStart"/>
-      <w:r>
-        <w:rPr>
-          <w:lang w:val="es-ES"/>
-        </w:rPr>
-        <w:t>pull</w:t>
-      </w:r>
-      <w:proofErr w:type="spellEnd"/>
-      <w:r>
-        <w:rPr>
-          <w:lang w:val="es-ES"/>
-        </w:rPr>
-        <w:t xml:space="preserve">. Estos cambios quedaron registrados en el </w:t>
-      </w:r>
-      <w:proofErr w:type="spellStart"/>
-      <w:r>
-        <w:rPr>
-          <w:lang w:val="es-ES"/>
-        </w:rPr>
-        <w:t>commit</w:t>
-      </w:r>
-      <w:proofErr w:type="spellEnd"/>
-      <w:r>
-        <w:rPr>
-          <w:lang w:val="es-ES"/>
-        </w:rPr>
-        <w:t xml:space="preserve"> ba5822f.</w:t>
-      </w:r>
-    </w:p>
-    <w:p>
-      <w:pPr>
-        <w:keepNext/>
-        <w:keepLines/>
-        <w:spacing w:before="360" w:after="80"/>
-        <w:outlineLvl w:val="0"/>
-        <w:rPr>
-          <w:lang w:val="es-ES"/>
-        </w:rPr>
-      </w:pPr>
-      <w:r>
-        <w:rPr>
-          <w:b/>
-          <w:bCs/>
-          <w:lang w:val="es-ES"/>
-        </w:rPr>
-        <w:t>Jecika León e Ivonne Campos:</w:t>
-      </w:r>
-      <w:r>
-        <w:rPr>
-          <w:lang w:val="es-ES"/>
-        </w:rPr>
-        <w:t xml:space="preserve"> participaron en la elaboración del informe escrito del proyecto. Sus contribuciones se incorporaron al documento que posteriormente fue publicado en GitHub por Guillermo Prieto, razón por la cual no aparecen como autoras individuales de </w:t>
-      </w:r>
-      <w:proofErr w:type="spellStart"/>
-      <w:r>
-        <w:rPr>
-          <w:lang w:val="es-ES"/>
-        </w:rPr>
-        <w:t>commits</w:t>
-      </w:r>
-      <w:proofErr w:type="spellEnd"/>
-      <w:r>
-        <w:rPr>
-          <w:lang w:val="es-ES"/>
-        </w:rPr>
-        <w:t>.</w:t>
-      </w:r>
-    </w:p>
-    <w:p>
-      <w:pPr>
-        <w:keepNext/>
-        <w:keepLines/>
-        <w:spacing w:before="360" w:after="80"/>
-        <w:outlineLvl w:val="0"/>
-        <w:rPr>
-          <w:lang w:val="es-ES"/>
-        </w:rPr>
-      </w:pPr>
-      <w:r>
-        <w:rPr>
-          <w:b/>
-          <w:bCs/>
-          <w:lang w:val="es-ES"/>
-        </w:rPr>
-        <w:t>Coordinación y trazabilidad:</w:t>
-      </w:r>
-      <w:r>
-        <w:rPr>
-          <w:lang w:val="es-ES"/>
-        </w:rPr>
-        <w:t xml:space="preserve"> el equipo utilizó GitHub como repositorio central para consolidar los entregables. Las contribuciones técnicas se evidencian mediante el historial de </w:t>
-      </w:r>
-      <w:proofErr w:type="spellStart"/>
-      <w:r>
-        <w:rPr>
-          <w:lang w:val="es-ES"/>
-        </w:rPr>
-        <w:t>commits</w:t>
-      </w:r>
-      <w:proofErr w:type="spellEnd"/>
-      <w:r>
-        <w:rPr>
-          <w:lang w:val="es-ES"/>
-        </w:rPr>
-        <w:t>, mientras que el trabajo colaborativo de redacción se documenta en este reporte. Se reconoce que el historial de Git no refleja de manera individual todas las actividades realizadas fuera del repositorio.</w:t>
-      </w:r>
-    </w:p>
-    <w:p>
-      <w:pPr>
-        <w:keepNext/>
-        <w:keepLines/>
-        <w:spacing w:before="360" w:after="80"/>
-        <w:outlineLvl w:val="0"/>
-        <w:rPr>
-          <w:lang w:val="es-ES"/>
-        </w:rPr>
-      </w:pPr>
-    </w:p>
-    <w:p>
-      <w:pPr>
-        <w:keepNext/>
-        <w:keepLines/>
-        <w:spacing w:before="360" w:after="80"/>
-        <w:outlineLvl w:val="0"/>
-        <w:rPr>
-          <w:b/>
-          <w:bCs/>
-          <w:lang w:val="es-ES"/>
-        </w:rPr>
       </w:pPr>
     </w:p>
     <w:sectPr>
       <w:pgSz w:w="12240" w:h="15840"/>
-      <w:pgMar w:top="1417" w:right="1701" w:bottom="1417" w:left="1701" w:header="708" w:footer="708" w:gutter="0"/>
+      <w:pgMar w:top="1417" w:right="1701" w:bottom="1276" w:left="1701" w:header="708" w:footer="708" w:gutter="0"/>
       <w:cols w:space="708"/>
       <w:docGrid w:linePitch="360"/>
     </w:sectPr>
@@ -4159,7 +4299,7 @@
       <w14:ligatures w14:val="none"/>
     </w:rPr>
   </w:style>
-  <w:style w:type="character" w:styleId="Textoennegrita">
+  <w:style w:type="character" w:styleId="Fuerte">
     <w:name w:val="Strong"/>
     <w:basedOn w:val="Fuentedeprrafopredeter"/>
     <w:uiPriority w:val="22"/>

</xml_diff>

<commit_message>
Se modifica el archivo word y el mockup teniendo en cuenta el problema y el contexto
</commit_message>
<xml_diff>
--- a/Reporte_Proyecto_DSA.docx
+++ b/Reporte_Proyecto_DSA.docx
@@ -28,7 +28,7 @@
       <w:sdtContent>
         <w:p>
           <w:pPr>
-            <w:pStyle w:val="TtuloTDC"/>
+            <w:pStyle w:val="TOCHeading"/>
             <w:ind w:firstLine="708"/>
           </w:pPr>
           <w:r>
@@ -40,7 +40,7 @@
         </w:p>
         <w:p>
           <w:pPr>
-            <w:pStyle w:val="TDC1"/>
+            <w:pStyle w:val="TOC1"/>
             <w:tabs>
               <w:tab w:val="right" w:leader="dot" w:pos="8828"/>
             </w:tabs>
@@ -64,7 +64,7 @@
           <w:hyperlink w:anchor="_Toc243490725" w:history="1">
             <w:r>
               <w:rPr>
-                <w:rStyle w:val="Hipervnculo"/>
+                <w:rStyle w:val="Hyperlink"/>
                 <w:noProof/>
               </w:rPr>
               <w:t>1. Problema y contexto</w:t>
@@ -121,7 +121,7 @@
         </w:p>
         <w:p>
           <w:pPr>
-            <w:pStyle w:val="TDC1"/>
+            <w:pStyle w:val="TOC1"/>
             <w:tabs>
               <w:tab w:val="right" w:leader="dot" w:pos="8828"/>
             </w:tabs>
@@ -136,7 +136,7 @@
           <w:hyperlink w:anchor="_Toc243490726" w:history="1">
             <w:r>
               <w:rPr>
-                <w:rStyle w:val="Hipervnculo"/>
+                <w:rStyle w:val="Hyperlink"/>
                 <w:noProof/>
               </w:rPr>
               <w:t>2. Pregunta de negocio y alcance del proyecto</w:t>
@@ -193,7 +193,7 @@
         </w:p>
         <w:p>
           <w:pPr>
-            <w:pStyle w:val="TDC1"/>
+            <w:pStyle w:val="TOC1"/>
             <w:tabs>
               <w:tab w:val="right" w:leader="dot" w:pos="8828"/>
             </w:tabs>
@@ -208,7 +208,7 @@
           <w:hyperlink w:anchor="_Toc243490727" w:history="1">
             <w:r>
               <w:rPr>
-                <w:rStyle w:val="Hipervnculo"/>
+                <w:rStyle w:val="Hyperlink"/>
                 <w:noProof/>
               </w:rPr>
               <w:t>3. Descripción de los conjuntos de datos</w:t>
@@ -252,7 +252,7 @@
                 <w:noProof/>
                 <w:webHidden/>
               </w:rPr>
-              <w:t>1</w:t>
+              <w:t>2</w:t>
             </w:r>
             <w:r>
               <w:rPr>
@@ -265,7 +265,7 @@
         </w:p>
         <w:p>
           <w:pPr>
-            <w:pStyle w:val="TDC1"/>
+            <w:pStyle w:val="TOC1"/>
             <w:tabs>
               <w:tab w:val="right" w:leader="dot" w:pos="8828"/>
             </w:tabs>
@@ -280,7 +280,7 @@
           <w:hyperlink w:anchor="_Toc243490728" w:history="1">
             <w:r>
               <w:rPr>
-                <w:rStyle w:val="Hipervnculo"/>
+                <w:rStyle w:val="Hyperlink"/>
                 <w:noProof/>
               </w:rPr>
               <w:t>4. Exploración de los datos</w:t>
@@ -324,7 +324,7 @@
                 <w:noProof/>
                 <w:webHidden/>
               </w:rPr>
-              <w:t>1</w:t>
+              <w:t>2</w:t>
             </w:r>
             <w:r>
               <w:rPr>
@@ -337,7 +337,7 @@
         </w:p>
         <w:p>
           <w:pPr>
-            <w:pStyle w:val="TDC1"/>
+            <w:pStyle w:val="TOC1"/>
             <w:tabs>
               <w:tab w:val="right" w:leader="dot" w:pos="8828"/>
             </w:tabs>
@@ -352,7 +352,7 @@
           <w:hyperlink w:anchor="_Toc243490729" w:history="1">
             <w:r>
               <w:rPr>
-                <w:rStyle w:val="Hipervnculo"/>
+                <w:rStyle w:val="Hyperlink"/>
                 <w:noProof/>
               </w:rPr>
               <w:t>5. Maqueta (mockup) del prototipo</w:t>
@@ -396,7 +396,7 @@
                 <w:noProof/>
                 <w:webHidden/>
               </w:rPr>
-              <w:t>1</w:t>
+              <w:t>4</w:t>
             </w:r>
             <w:r>
               <w:rPr>
@@ -409,7 +409,7 @@
         </w:p>
         <w:p>
           <w:pPr>
-            <w:pStyle w:val="TDC1"/>
+            <w:pStyle w:val="TOC1"/>
             <w:tabs>
               <w:tab w:val="right" w:leader="dot" w:pos="8828"/>
             </w:tabs>
@@ -424,7 +424,7 @@
           <w:hyperlink w:anchor="_Toc243490730" w:history="1">
             <w:r>
               <w:rPr>
-                <w:rStyle w:val="Hipervnculo"/>
+                <w:rStyle w:val="Hyperlink"/>
                 <w:noProof/>
               </w:rPr>
               <w:t>6. Repositorios y soportes</w:t>
@@ -468,7 +468,7 @@
                 <w:noProof/>
                 <w:webHidden/>
               </w:rPr>
-              <w:t>1</w:t>
+              <w:t>5</w:t>
             </w:r>
             <w:r>
               <w:rPr>
@@ -494,7 +494,7 @@
     <w:bookmarkStart w:id="0" w:name="_Toc243490725" w:displacedByCustomXml="prev"/>
     <w:p>
       <w:pPr>
-        <w:pStyle w:val="Ttulo1"/>
+        <w:pStyle w:val="Heading1"/>
         <w:numPr>
           <w:ilvl w:val="0"/>
           <w:numId w:val="1"/>
@@ -508,7 +508,170 @@
     </w:p>
     <w:p>
       <w:pPr>
+        <w:jc w:val="both"/>
+      </w:pPr>
+      <w:r>
+        <w:t xml:space="preserve">El proyecto parte de la necesidad de los </w:t>
+      </w:r>
+      <w:r>
+        <w:rPr>
+          <w:b/>
+          <w:bCs/>
+        </w:rPr>
+        <w:t>inversionistas</w:t>
+      </w:r>
+      <w:r>
+        <w:t xml:space="preserve"> de contar con información comparable para decidir en cuáles municipios profundizar estudios de inversión inmobiliaria. Aunque existen datos históricos de transacciones, estos requieren preparación y análisis, pues incluyen distintos actos jurídicos y presentan diferencias en la disponibilidad de valores y en las características registradas. Por ello, es necesario establecer criterios comunes de selección y comparación. Para este proyecto se analizarán las compraventas de predios urbanos </w:t>
+      </w:r>
+      <w:r>
+        <w:t xml:space="preserve">de </w:t>
+      </w:r>
+      <w:r>
+        <w:rPr>
+          <w:b/>
+          <w:bCs/>
+        </w:rPr>
+        <w:t>Armenia, Manizales y Pereira</w:t>
+      </w:r>
+      <w:r>
+        <w:t xml:space="preserve"> durante el </w:t>
+      </w:r>
+      <w:r>
+        <w:rPr>
+          <w:b/>
+          <w:bCs/>
+        </w:rPr>
+        <w:t>periodo 2015–2023</w:t>
+      </w:r>
+      <w:r>
+        <w:t>. Se busca transformar estos registros en información que permita comprender y comparar la evolución de la actividad transaccional y la distribución de los valores registrados.</w:t>
+      </w:r>
+    </w:p>
+    <w:p>
+      <w:pPr>
+        <w:jc w:val="both"/>
+      </w:pPr>
+      <w:r>
+        <w:t>El análisis se complementará con estimaciones exploratorias de valores registrados y señales de operaciones atípicas que ameriten revisión. La utilidad de estos componentes dependerá de la calidad de los datos, las variables disponibles y su desempeño frente a los criterios de evaluación definidos. La ausencia de características físicas detalladas limita la comparación entre inmuebles y la explicación de sus valores. Los resultados servirán como apoyo para priorizar municipios donde realizar estudios posteriores. Se interpretarán dentro del alcance histórico establecido, sin constituir recomendaciones directas de inversión, garantías de rentabilidad ni evidencia de irregularidad en las operaciones señaladas.</w:t>
+      </w:r>
+    </w:p>
+    <w:p>
+      <w:pPr>
+        <w:pStyle w:val="Heading1"/>
+        <w:numPr>
+          <w:ilvl w:val="0"/>
+          <w:numId w:val="1"/>
+        </w:numPr>
+        <w:spacing w:line="240" w:lineRule="auto"/>
+      </w:pPr>
+      <w:bookmarkStart w:id="1" w:name="_Toc243490726"/>
+      <w:r>
+        <w:t>Pregunta de negocio y alcance del proyecto</w:t>
+      </w:r>
+      <w:bookmarkEnd w:id="1"/>
+    </w:p>
+    <w:p>
+      <w:pPr>
+        <w:spacing w:after="0"/>
+      </w:pPr>
+    </w:p>
+    <w:p>
+      <w:pPr>
+        <w:spacing w:after="0" w:line="240" w:lineRule="auto"/>
+        <w:jc w:val="both"/>
+        <w:rPr>
+          <w:rFonts w:eastAsia="Times New Roman" w:cstheme="minorHAnsi"/>
+          <w:kern w:val="0"/>
+          <w:lang w:eastAsia="es-CO"/>
+          <w14:ligatures w14:val="none"/>
+        </w:rPr>
+      </w:pPr>
+      <w:r>
+        <w:rPr>
+          <w:rFonts w:eastAsia="Times New Roman" w:cstheme="minorHAnsi"/>
+          <w:kern w:val="0"/>
+          <w:lang w:eastAsia="es-CO"/>
+          <w14:ligatures w14:val="none"/>
+        </w:rPr>
+        <w:t>¿Cómo apoyar a los inversionistas en la priorización de municipios para profundizar estudios de inversión inmobiliaria urbana, mediante la comparación de su actividad transaccional histórica y sus valores registrados?</w:t>
+      </w:r>
+    </w:p>
+    <w:p>
+      <w:pPr>
+        <w:spacing w:after="0" w:line="240" w:lineRule="auto"/>
+        <w:jc w:val="both"/>
+        <w:rPr>
+          <w:rFonts w:eastAsia="Times New Roman" w:cstheme="minorHAnsi"/>
+          <w:kern w:val="0"/>
+          <w:lang w:eastAsia="es-CO"/>
+          <w14:ligatures w14:val="none"/>
+        </w:rPr>
+      </w:pPr>
+    </w:p>
+    <w:p>
+      <w:pPr>
+        <w:spacing w:after="0" w:line="240" w:lineRule="auto"/>
+        <w:jc w:val="both"/>
+        <w:rPr>
+          <w:rFonts w:eastAsia="Times New Roman" w:cstheme="minorHAnsi"/>
+          <w:kern w:val="0"/>
+          <w:lang w:eastAsia="es-CO"/>
+          <w14:ligatures w14:val="none"/>
+        </w:rPr>
+      </w:pPr>
+      <w:r>
+        <w:rPr>
+          <w:rFonts w:eastAsia="Times New Roman" w:cstheme="minorHAnsi"/>
+          <w:kern w:val="0"/>
+          <w:lang w:eastAsia="es-CO"/>
+          <w14:ligatures w14:val="none"/>
+        </w:rPr>
+        <w:t>El proyecto se concentrará en el análisis de compraventas de predios urbanos en Armenia, Manizales y Pereira durante el periodo 2015–2023. Se utilizarán registros de compraventa co</w:t>
+      </w:r>
+      <w:r>
+        <w:rPr>
+          <w:rFonts w:eastAsia="Times New Roman" w:cstheme="minorHAnsi"/>
+          <w:kern w:val="0"/>
+          <w:lang w:eastAsia="es-CO"/>
+          <w14:ligatures w14:val="none"/>
+        </w:rPr>
+        <w:t>n valores positivos y sin indicador de múltiples valores, con el fin de trabajar con criterios comunes entre los tres municipios.</w:t>
+      </w:r>
+    </w:p>
+    <w:p>
+      <w:pPr>
+        <w:spacing w:after="0" w:line="240" w:lineRule="auto"/>
+        <w:jc w:val="both"/>
+      </w:pPr>
+      <w:r>
+        <w:rPr>
+          <w:rFonts w:eastAsia="Times New Roman" w:cstheme="minorHAnsi"/>
+          <w:kern w:val="0"/>
+          <w:lang w:eastAsia="es-CO"/>
+          <w14:ligatures w14:val="none"/>
+        </w:rPr>
+        <w:t>La solución buscará combinar un componente descriptivo, que permita comparar la actividad transaccional y los valores registrados, con un componente predictivo orientado a la estimación de valores. Los resultados servirán como apoyo para identificar qué municipios pueden ser priorizados para estudios posteriores de inversión. El alcance no incluye recomendaciones sobre la compra de inmuebles específicos ni pretende garantizar una rentabilidad futura.</w:t>
+      </w:r>
+    </w:p>
+    <w:p>
+      <w:pPr>
+        <w:pStyle w:val="Heading1"/>
+        <w:numPr>
+          <w:ilvl w:val="0"/>
+          <w:numId w:val="1"/>
+        </w:numPr>
+      </w:pPr>
+      <w:bookmarkStart w:id="2" w:name="_Toc243490727"/>
+      <w:r>
+        <w:lastRenderedPageBreak/>
+        <w:t>Descripción de los conjuntos de datos</w:t>
+      </w:r>
+      <w:bookmarkEnd w:id="2"/>
+    </w:p>
+    <w:p>
+      <w:pPr>
         <w:pStyle w:val="NormalWeb"/>
+        <w:spacing w:line="300" w:lineRule="atLeast"/>
         <w:jc w:val="both"/>
         <w:rPr>
           <w:rFonts w:asciiTheme="minorHAnsi" w:hAnsiTheme="minorHAnsi" w:cstheme="minorHAnsi"/>
@@ -522,7 +685,32 @@
           <w:sz w:val="22"/>
           <w:szCs w:val="22"/>
         </w:rPr>
-        <w:t>El proyecto parte de la necesidad de contar con información que permita comparar de una forma más clara la actividad inmobiliaria de diferentes territorios. Aunque existen datos históricos sobre transacciones inmobiliarias, estos requieren preparación y análisis antes de poder utilizarlos para comparar municipios, ya que los datos incluyen distintos tipos de operaciones inmobiliarias y es necesario establecer criterios comunes para realizar la comparación.</w:t>
+        <w:t>Para el proyecto se utilizará como fuente principal el conjunto de datos</w:t>
+      </w:r>
+      <w:r>
+        <w:rPr>
+          <w:rFonts w:asciiTheme="minorHAnsi" w:hAnsiTheme="minorHAnsi" w:cstheme="minorHAnsi"/>
+          <w:sz w:val="22"/>
+          <w:szCs w:val="22"/>
+        </w:rPr>
+        <w:t xml:space="preserve"> </w:t>
+      </w:r>
+      <w:r>
+        <w:rPr>
+          <w:rStyle w:val="Strong"/>
+          <w:rFonts w:asciiTheme="minorHAnsi" w:hAnsiTheme="minorHAnsi" w:cstheme="minorHAnsi"/>
+          <w:sz w:val="22"/>
+          <w:szCs w:val="22"/>
+        </w:rPr>
+        <w:t>“Registro de Transacciones Inmobiliarias en Colombia IGAC 2015–2023”</w:t>
+      </w:r>
+      <w:r>
+        <w:rPr>
+          <w:rFonts w:asciiTheme="minorHAnsi" w:hAnsiTheme="minorHAnsi" w:cstheme="minorHAnsi"/>
+          <w:sz w:val="22"/>
+          <w:szCs w:val="22"/>
+        </w:rPr>
+        <w:t>, disponible en el portal de Datos Abiertos Colombia. La información puede consultarse mediante su API y contiene registros de transacciones inmobiliarias de diferentes municipios del país.</w:t>
       </w:r>
     </w:p>
     <w:p>
@@ -542,67 +730,92 @@
           <w:sz w:val="22"/>
           <w:szCs w:val="22"/>
         </w:rPr>
-        <w:t xml:space="preserve">Para este proyecto se trabajará con información de transacciones inmobiliarias de </w:t>
-      </w:r>
-      <w:r>
-        <w:rPr>
-          <w:rStyle w:val="Fuerte"/>
+        <w:t xml:space="preserve">Para el alcance definido se trabajará con los registros correspondientes a </w:t>
+      </w:r>
+      <w:r>
+        <w:rPr>
+          <w:rStyle w:val="Strong"/>
+          <w:rFonts w:asciiTheme="minorHAnsi" w:hAnsiTheme="minorHAnsi" w:cstheme="minorHAnsi"/>
+          <w:sz w:val="22"/>
+          <w:szCs w:val="22"/>
+        </w:rPr>
+        <w:t>Armenia, Manizales y Pereira</w:t>
+      </w:r>
+      <w:r>
+        <w:rPr>
+          <w:rFonts w:asciiTheme="minorHAnsi" w:hAnsiTheme="minorHAnsi" w:cstheme="minorHAnsi"/>
+          <w:sz w:val="22"/>
+          <w:szCs w:val="22"/>
+        </w:rPr>
+        <w:t xml:space="preserve"> entre los años </w:t>
+      </w:r>
+      <w:r>
+        <w:rPr>
+          <w:rStyle w:val="Strong"/>
+          <w:rFonts w:asciiTheme="minorHAnsi" w:hAnsiTheme="minorHAnsi" w:cstheme="minorHAnsi"/>
+          <w:sz w:val="22"/>
+          <w:szCs w:val="22"/>
+        </w:rPr>
+        <w:t xml:space="preserve">2015 </w:t>
+      </w:r>
+      <w:r>
+        <w:rPr>
+          <w:rStyle w:val="Strong"/>
           <w:rFonts w:asciiTheme="minorHAnsi" w:hAnsiTheme="minorHAnsi" w:cstheme="minorHAnsi"/>
           <w:b w:val="0"/>
           <w:bCs w:val="0"/>
           <w:sz w:val="22"/>
           <w:szCs w:val="22"/>
         </w:rPr>
-        <w:t>Armenia, Manizales y Pereira</w:t>
-      </w:r>
-      <w:r>
-        <w:rPr>
-          <w:rFonts w:asciiTheme="minorHAnsi" w:hAnsiTheme="minorHAnsi" w:cstheme="minorHAnsi"/>
-          <w:b/>
-          <w:bCs/>
-          <w:sz w:val="22"/>
-          <w:szCs w:val="22"/>
-        </w:rPr>
-        <w:t xml:space="preserve">, </w:t>
-      </w:r>
-      <w:r>
-        <w:rPr>
+        <w:t>y</w:t>
+      </w:r>
+      <w:r>
+        <w:rPr>
+          <w:rStyle w:val="Strong"/>
           <w:rFonts w:asciiTheme="minorHAnsi" w:hAnsiTheme="minorHAnsi" w:cstheme="minorHAnsi"/>
           <w:sz w:val="22"/>
           <w:szCs w:val="22"/>
         </w:rPr>
-        <w:t>tomando como periodo de análisis los años</w:t>
+        <w:t xml:space="preserve"> 2023</w:t>
       </w:r>
       <w:r>
         <w:rPr>
           <w:rFonts w:asciiTheme="minorHAnsi" w:hAnsiTheme="minorHAnsi" w:cstheme="minorHAnsi"/>
-          <w:b/>
-          <w:bCs/>
           <w:sz w:val="22"/>
           <w:szCs w:val="22"/>
         </w:rPr>
-        <w:t xml:space="preserve"> </w:t>
-      </w:r>
-      <w:r>
-        <w:rPr>
-          <w:rStyle w:val="Fuerte"/>
+        <w:t xml:space="preserve">. Dentro de la información disponible se tendrán en cuenta variables que permiten identificar el municipio, el año de registro, la naturaleza jurídica de la operación, la clasificación urbana del predio y el valor registrado. </w:t>
+      </w:r>
+    </w:p>
+    <w:p>
+      <w:pPr>
+        <w:pStyle w:val="NormalWeb"/>
+        <w:spacing w:line="300" w:lineRule="atLeast"/>
+        <w:jc w:val="both"/>
+        <w:rPr>
+          <w:rFonts w:asciiTheme="minorHAnsi" w:hAnsiTheme="minorHAnsi" w:cstheme="minorHAnsi"/>
+          <w:sz w:val="22"/>
+          <w:szCs w:val="22"/>
+        </w:rPr>
+      </w:pPr>
+      <w:r>
+        <w:rPr>
+          <w:rFonts w:asciiTheme="minorHAnsi" w:hAnsiTheme="minorHAnsi" w:cstheme="minorHAnsi"/>
+          <w:sz w:val="22"/>
+          <w:szCs w:val="22"/>
+        </w:rPr>
+        <w:t xml:space="preserve">Como parte de la preparación de los datos se seleccionaron las operaciones cuya naturaleza jurídica corresponde a </w:t>
+      </w:r>
+      <w:r>
+        <w:rPr>
+          <w:rStyle w:val="Strong"/>
           <w:rFonts w:asciiTheme="minorHAnsi" w:hAnsiTheme="minorHAnsi" w:cstheme="minorHAnsi"/>
           <w:b w:val="0"/>
           <w:bCs w:val="0"/>
           <w:sz w:val="22"/>
           <w:szCs w:val="22"/>
         </w:rPr>
-        <w:t>2015 a 2023</w:t>
-      </w:r>
-      <w:r>
-        <w:rPr>
-          <w:rFonts w:asciiTheme="minorHAnsi" w:hAnsiTheme="minorHAnsi" w:cstheme="minorHAnsi"/>
-          <w:b/>
-          <w:bCs/>
-          <w:sz w:val="22"/>
-          <w:szCs w:val="22"/>
-        </w:rPr>
-        <w:t>.</w:t>
+        <w:t>COMPRAVENTA</w:t>
       </w:r>
       <w:r>
         <w:rPr>
@@ -610,368 +823,48 @@
           <w:sz w:val="22"/>
           <w:szCs w:val="22"/>
         </w:rPr>
-        <w:t xml:space="preserve"> El interés principal es aprovechar estos datos para generar información que sirva como apoyo en la priorización de municipios donde se puedan profundizar posteriormente estudios de inversión inmobiliaria.</w:t>
-      </w:r>
-    </w:p>
-    <w:p>
-      <w:pPr>
-        <w:jc w:val="both"/>
-        <w:rPr>
-          <w:rFonts w:eastAsia="Times New Roman" w:cstheme="minorHAnsi"/>
-          <w:kern w:val="0"/>
-          <w:lang w:eastAsia="es-CO"/>
-          <w14:ligatures w14:val="none"/>
-        </w:rPr>
-      </w:pPr>
-      <w:r>
-        <w:rPr>
-          <w:rFonts w:eastAsia="Times New Roman" w:cstheme="minorHAnsi"/>
-          <w:kern w:val="0"/>
-          <w:lang w:eastAsia="es-CO"/>
-          <w14:ligatures w14:val="none"/>
-        </w:rPr>
-        <w:t>El análisis se enfocará en compraventas de predios urbanos y buscará combinar la revisión de la actividad transaccional histórica con el análisis de los valores registrados. De esta manera, se espera contar con elementos de comparación entre los municipios seleccionados. Además, el componente predictivo permitirá complementar este análisis mediante la estimación de valores a partir de la información disponible, aportando un elemento adicional para apoyar la evaluación de los municipios. Los resultados no se interpretarán como una recomendación directa de inversión ni como una garantía de rentabilidad.</w:t>
-      </w:r>
-    </w:p>
-    <w:p/>
-    <w:p>
-      <w:pPr>
-        <w:pStyle w:val="Ttulo1"/>
-        <w:numPr>
-          <w:ilvl w:val="0"/>
-          <w:numId w:val="1"/>
-        </w:numPr>
-        <w:spacing w:line="240" w:lineRule="auto"/>
-      </w:pPr>
-      <w:bookmarkStart w:id="1" w:name="_Toc243490726"/>
-      <w:r>
-        <w:t>Pregunta de negocio y alcance del proyecto</w:t>
-      </w:r>
-      <w:bookmarkEnd w:id="1"/>
-    </w:p>
-    <w:p>
-      <w:pPr>
-        <w:spacing w:after="0"/>
-      </w:pPr>
-    </w:p>
-    <w:p>
-      <w:pPr>
-        <w:spacing w:after="0" w:line="240" w:lineRule="auto"/>
-        <w:jc w:val="both"/>
-        <w:rPr>
-          <w:rFonts w:eastAsia="Times New Roman" w:cstheme="minorHAnsi"/>
-          <w:kern w:val="0"/>
-          <w:lang w:eastAsia="es-CO"/>
-          <w14:ligatures w14:val="none"/>
-        </w:rPr>
-      </w:pPr>
-      <w:r>
-        <w:rPr>
-          <w:rFonts w:eastAsia="Times New Roman" w:cstheme="minorHAnsi"/>
-          <w:kern w:val="0"/>
-          <w:lang w:eastAsia="es-CO"/>
-          <w14:ligatures w14:val="none"/>
-        </w:rPr>
-        <w:t>¿Cómo apoyar a los inversionistas en la priorización de municipios para profundizar estudios de inversión inmobiliaria urbana, mediante la comparación de su actividad transaccional histórica y sus valores registrados?</w:t>
-      </w:r>
-    </w:p>
-    <w:p>
-      <w:pPr>
-        <w:spacing w:after="0" w:line="240" w:lineRule="auto"/>
-        <w:jc w:val="both"/>
-        <w:rPr>
-          <w:rFonts w:eastAsia="Times New Roman" w:cstheme="minorHAnsi"/>
-          <w:kern w:val="0"/>
-          <w:lang w:eastAsia="es-CO"/>
-          <w14:ligatures w14:val="none"/>
-        </w:rPr>
-      </w:pPr>
-    </w:p>
-    <w:p>
-      <w:pPr>
-        <w:spacing w:after="0" w:line="240" w:lineRule="auto"/>
-        <w:jc w:val="both"/>
-        <w:rPr>
-          <w:rFonts w:eastAsia="Times New Roman" w:cstheme="minorHAnsi"/>
-          <w:kern w:val="0"/>
-          <w:lang w:eastAsia="es-CO"/>
-          <w14:ligatures w14:val="none"/>
-        </w:rPr>
-      </w:pPr>
-      <w:r>
-        <w:rPr>
-          <w:rFonts w:eastAsia="Times New Roman" w:cstheme="minorHAnsi"/>
-          <w:kern w:val="0"/>
-          <w:lang w:eastAsia="es-CO"/>
-          <w14:ligatures w14:val="none"/>
-        </w:rPr>
-        <w:t>El proyecto se concentrará en el análisis de compraventas de predios urbanos en Armenia, Manizales y Pereira durante el periodo 2015–2023. Se utilizarán registros de compraventa co</w:t>
-      </w:r>
-      <w:r>
-        <w:rPr>
-          <w:rFonts w:eastAsia="Times New Roman" w:cstheme="minorHAnsi"/>
-          <w:kern w:val="0"/>
-          <w:lang w:eastAsia="es-CO"/>
-          <w14:ligatures w14:val="none"/>
-        </w:rPr>
-        <w:t xml:space="preserve">n </w:t>
-      </w:r>
-      <w:r>
-        <w:rPr>
-          <w:rFonts w:eastAsia="Times New Roman" w:cstheme="minorHAnsi"/>
-          <w:kern w:val="0"/>
-          <w:lang w:eastAsia="es-CO"/>
-          <w14:ligatures w14:val="none"/>
-        </w:rPr>
-        <w:lastRenderedPageBreak/>
-        <w:t>valores positivos y sin indicador de múltiples valores, con el fin de trabajar con criterios comunes entre los tres municipios.</w:t>
-      </w:r>
-    </w:p>
-    <w:p>
-      <w:pPr>
-        <w:spacing w:after="0" w:line="240" w:lineRule="auto"/>
-        <w:jc w:val="both"/>
-        <w:rPr>
-          <w:rFonts w:eastAsia="Times New Roman" w:cstheme="minorHAnsi"/>
-          <w:kern w:val="0"/>
-          <w:lang w:eastAsia="es-CO"/>
-          <w14:ligatures w14:val="none"/>
-        </w:rPr>
-      </w:pPr>
-      <w:r>
-        <w:rPr>
-          <w:rFonts w:eastAsia="Times New Roman" w:cstheme="minorHAnsi"/>
-          <w:kern w:val="0"/>
-          <w:lang w:eastAsia="es-CO"/>
-          <w14:ligatures w14:val="none"/>
-        </w:rPr>
-        <w:t>La solución buscará combinar un componente descriptivo, que permita comparar la actividad transaccional y los valores registrados, con un componente predictivo orientado a la estimación de valores. Los resultados servirán como apoyo para identificar qué municipios pueden ser priorizados para estudios posteriores de inversión. El alcance no incluye recomendaciones sobre la compra de inmuebles específicos ni pretende garantizar una rentabilidad futura.</w:t>
-      </w:r>
-    </w:p>
-    <w:p>
-      <w:pPr>
-        <w:spacing w:after="0" w:line="240" w:lineRule="auto"/>
-        <w:rPr>
-          <w:rFonts w:eastAsia="Times New Roman" w:cstheme="minorHAnsi"/>
-          <w:kern w:val="0"/>
-          <w:lang w:eastAsia="es-CO"/>
-          <w14:ligatures w14:val="none"/>
-        </w:rPr>
-      </w:pPr>
-    </w:p>
-    <w:p/>
-    <w:p>
-      <w:pPr>
-        <w:pStyle w:val="Ttulo1"/>
-        <w:numPr>
-          <w:ilvl w:val="0"/>
-          <w:numId w:val="1"/>
-        </w:numPr>
-      </w:pPr>
-      <w:bookmarkStart w:id="2" w:name="_Toc243490727"/>
-      <w:r>
-        <w:t>Descripción de los conjuntos de datos</w:t>
-      </w:r>
-      <w:bookmarkEnd w:id="2"/>
-    </w:p>
-    <w:p>
-      <w:pPr>
-        <w:pStyle w:val="NormalWeb"/>
-        <w:spacing w:line="300" w:lineRule="atLeast"/>
-        <w:jc w:val="both"/>
-        <w:rPr>
-          <w:rFonts w:asciiTheme="minorHAnsi" w:hAnsiTheme="minorHAnsi" w:cstheme="minorHAnsi"/>
-          <w:sz w:val="22"/>
-          <w:szCs w:val="22"/>
-        </w:rPr>
-      </w:pPr>
-      <w:r>
-        <w:rPr>
-          <w:rFonts w:asciiTheme="minorHAnsi" w:hAnsiTheme="minorHAnsi" w:cstheme="minorHAnsi"/>
-          <w:sz w:val="22"/>
-          <w:szCs w:val="22"/>
-        </w:rPr>
-        <w:t>Para el proyecto se utilizará como fuente principal el conjunto de datos</w:t>
-      </w:r>
-      <w:r>
-        <w:rPr>
-          <w:rFonts w:asciiTheme="minorHAnsi" w:hAnsiTheme="minorHAnsi" w:cstheme="minorHAnsi"/>
-          <w:sz w:val="22"/>
-          <w:szCs w:val="22"/>
-        </w:rPr>
-        <w:t xml:space="preserve"> </w:t>
-      </w:r>
-      <w:r>
-        <w:rPr>
-          <w:rStyle w:val="Fuerte"/>
-          <w:rFonts w:asciiTheme="minorHAnsi" w:hAnsiTheme="minorHAnsi" w:cstheme="minorHAnsi"/>
-          <w:sz w:val="22"/>
-          <w:szCs w:val="22"/>
-        </w:rPr>
-        <w:t>“Registro de Transacciones Inmobiliarias en Colombia IGAC 2015–2023”</w:t>
-      </w:r>
-      <w:r>
-        <w:rPr>
-          <w:rFonts w:asciiTheme="minorHAnsi" w:hAnsiTheme="minorHAnsi" w:cstheme="minorHAnsi"/>
-          <w:sz w:val="22"/>
-          <w:szCs w:val="22"/>
-        </w:rPr>
-        <w:t>, disponible en el portal de Datos Abiertos Colombia. La información puede consultarse mediante su API y contiene registros de transacciones inmobiliarias de diferentes municipios del país.</w:t>
-      </w:r>
-    </w:p>
-    <w:p>
-      <w:pPr>
-        <w:pStyle w:val="NormalWeb"/>
-        <w:spacing w:line="300" w:lineRule="atLeast"/>
-        <w:jc w:val="both"/>
-        <w:rPr>
-          <w:rFonts w:asciiTheme="minorHAnsi" w:hAnsiTheme="minorHAnsi" w:cstheme="minorHAnsi"/>
-          <w:sz w:val="22"/>
-          <w:szCs w:val="22"/>
-        </w:rPr>
-      </w:pPr>
-      <w:r>
-        <w:rPr>
-          <w:rFonts w:asciiTheme="minorHAnsi" w:hAnsiTheme="minorHAnsi" w:cstheme="minorHAnsi"/>
-          <w:sz w:val="22"/>
-          <w:szCs w:val="22"/>
-        </w:rPr>
-        <w:t xml:space="preserve">Para el alcance definido se trabajará con los registros correspondientes a </w:t>
-      </w:r>
-      <w:r>
-        <w:rPr>
-          <w:rStyle w:val="Fuerte"/>
-          <w:rFonts w:asciiTheme="minorHAnsi" w:hAnsiTheme="minorHAnsi" w:cstheme="minorHAnsi"/>
-          <w:sz w:val="22"/>
-          <w:szCs w:val="22"/>
-        </w:rPr>
-        <w:t>Armenia, Manizales y Pereira</w:t>
-      </w:r>
-      <w:r>
-        <w:rPr>
-          <w:rFonts w:asciiTheme="minorHAnsi" w:hAnsiTheme="minorHAnsi" w:cstheme="minorHAnsi"/>
-          <w:sz w:val="22"/>
-          <w:szCs w:val="22"/>
-        </w:rPr>
-        <w:t xml:space="preserve"> entre los años </w:t>
-      </w:r>
-      <w:r>
-        <w:rPr>
-          <w:rStyle w:val="Fuerte"/>
-          <w:rFonts w:asciiTheme="minorHAnsi" w:hAnsiTheme="minorHAnsi" w:cstheme="minorHAnsi"/>
-          <w:sz w:val="22"/>
-          <w:szCs w:val="22"/>
-        </w:rPr>
-        <w:t xml:space="preserve">2015 </w:t>
-      </w:r>
-      <w:r>
-        <w:rPr>
-          <w:rStyle w:val="Fuerte"/>
+        <w:t xml:space="preserve">, clasificadas como </w:t>
+      </w:r>
+      <w:r>
+        <w:rPr>
+          <w:rStyle w:val="Strong"/>
           <w:rFonts w:asciiTheme="minorHAnsi" w:hAnsiTheme="minorHAnsi" w:cstheme="minorHAnsi"/>
           <w:b w:val="0"/>
           <w:bCs w:val="0"/>
           <w:sz w:val="22"/>
           <w:szCs w:val="22"/>
         </w:rPr>
-        <w:t>y</w:t>
-      </w:r>
-      <w:r>
-        <w:rPr>
-          <w:rStyle w:val="Fuerte"/>
+        <w:t>URBANO</w:t>
+      </w:r>
+      <w:r>
+        <w:rPr>
           <w:rFonts w:asciiTheme="minorHAnsi" w:hAnsiTheme="minorHAnsi" w:cstheme="minorHAnsi"/>
           <w:sz w:val="22"/>
           <w:szCs w:val="22"/>
         </w:rPr>
-        <w:t xml:space="preserve"> 2023</w:t>
-      </w:r>
-      <w:r>
-        <w:rPr>
+        <w:t xml:space="preserve">, con un valor registrado mayor que cero y sin indicador de múltiples valores. Aplicando estos criterios a los tres municipios se obtuvo una selección inicial de </w:t>
+      </w:r>
+      <w:r>
+        <w:rPr>
+          <w:rStyle w:val="Strong"/>
           <w:rFonts w:asciiTheme="minorHAnsi" w:hAnsiTheme="minorHAnsi" w:cstheme="minorHAnsi"/>
           <w:sz w:val="22"/>
           <w:szCs w:val="22"/>
         </w:rPr>
-        <w:t xml:space="preserve">. Dentro de la información disponible se tendrán en cuenta variables que permiten identificar el municipio, el año de registro, la naturaleza jurídica de la operación, la clasificación urbana del predio y el valor registrado. </w:t>
-      </w:r>
-    </w:p>
-    <w:p>
-      <w:pPr>
-        <w:pStyle w:val="NormalWeb"/>
-        <w:spacing w:line="300" w:lineRule="atLeast"/>
-        <w:jc w:val="both"/>
+        <w:t>214.036 registros</w:t>
+      </w:r>
+      <w:r>
         <w:rPr>
           <w:rFonts w:asciiTheme="minorHAnsi" w:hAnsiTheme="minorHAnsi" w:cstheme="minorHAnsi"/>
           <w:sz w:val="22"/>
           <w:szCs w:val="22"/>
         </w:rPr>
-      </w:pPr>
-      <w:r>
-        <w:rPr>
-          <w:rFonts w:asciiTheme="minorHAnsi" w:hAnsiTheme="minorHAnsi" w:cstheme="minorHAnsi"/>
-          <w:sz w:val="22"/>
-          <w:szCs w:val="22"/>
-        </w:rPr>
-        <w:t xml:space="preserve">Como parte de la preparación de los datos se seleccionaron las operaciones cuya naturaleza jurídica corresponde a </w:t>
-      </w:r>
-      <w:r>
-        <w:rPr>
-          <w:rStyle w:val="Fuerte"/>
-          <w:rFonts w:asciiTheme="minorHAnsi" w:hAnsiTheme="minorHAnsi" w:cstheme="minorHAnsi"/>
-          <w:b w:val="0"/>
-          <w:bCs w:val="0"/>
-          <w:sz w:val="22"/>
-          <w:szCs w:val="22"/>
-        </w:rPr>
-        <w:t>COMPRAVENTA</w:t>
-      </w:r>
-      <w:r>
-        <w:rPr>
-          <w:rFonts w:asciiTheme="minorHAnsi" w:hAnsiTheme="minorHAnsi" w:cstheme="minorHAnsi"/>
-          <w:sz w:val="22"/>
-          <w:szCs w:val="22"/>
-        </w:rPr>
-        <w:t xml:space="preserve">, clasificadas como </w:t>
-      </w:r>
-      <w:r>
-        <w:rPr>
-          <w:rStyle w:val="Fuerte"/>
-          <w:rFonts w:asciiTheme="minorHAnsi" w:hAnsiTheme="minorHAnsi" w:cstheme="minorHAnsi"/>
-          <w:b w:val="0"/>
-          <w:bCs w:val="0"/>
-          <w:sz w:val="22"/>
-          <w:szCs w:val="22"/>
-        </w:rPr>
-        <w:t>URBANO</w:t>
-      </w:r>
-      <w:r>
-        <w:rPr>
-          <w:rFonts w:asciiTheme="minorHAnsi" w:hAnsiTheme="minorHAnsi" w:cstheme="minorHAnsi"/>
-          <w:sz w:val="22"/>
-          <w:szCs w:val="22"/>
-        </w:rPr>
-        <w:t xml:space="preserve">, con un valor registrado mayor que cero y sin indicador de múltiples valores. Aplicando estos criterios a los tres municipios se obtuvo una selección inicial de </w:t>
-      </w:r>
-      <w:r>
-        <w:rPr>
-          <w:rStyle w:val="Fuerte"/>
-          <w:rFonts w:asciiTheme="minorHAnsi" w:hAnsiTheme="minorHAnsi" w:cstheme="minorHAnsi"/>
-          <w:sz w:val="22"/>
-          <w:szCs w:val="22"/>
-        </w:rPr>
-        <w:t>214.036 registros</w:t>
-      </w:r>
-      <w:r>
-        <w:rPr>
-          <w:rFonts w:asciiTheme="minorHAnsi" w:hAnsiTheme="minorHAnsi" w:cstheme="minorHAnsi"/>
-          <w:sz w:val="22"/>
-          <w:szCs w:val="22"/>
-        </w:rPr>
         <w:t>, distribuidos a lo largo de los nueve años del periodo analizado.</w:t>
       </w:r>
     </w:p>
-    <w:p/>
-    <w:p>
-      <w:pPr>
-        <w:pStyle w:val="Ttulo1"/>
+    <w:p>
+      <w:pPr>
+        <w:pStyle w:val="Heading1"/>
         <w:numPr>
           <w:ilvl w:val="0"/>
           <w:numId w:val="1"/>
@@ -1007,7 +900,7 @@
           <w:lang w:eastAsia="es-CO"/>
           <w14:ligatures w14:val="none"/>
         </w:rPr>
-        <w:t xml:space="preserve">Para la exploración inicial se analizaron las compraventas de predios urbanos de Armenia, Manizales y Pereira durante el periodo 2015–2023. Después de aplicar los criterios definidos para el proyecto, se trabajó con </w:t>
+        <w:t xml:space="preserve">Para la exploración inicial se seleccionaron registros de compraventas de predios urbanos de Armenia, Manizales y Pereira durante el periodo 2015–2023, con valor registrado mayor que cero e indicador de múltiples valores igual a cero. Se obtuvieron </w:t>
       </w:r>
       <w:r>
         <w:rPr>
@@ -1027,7 +920,7 @@
           <w:lang w:eastAsia="es-CO"/>
           <w14:ligatures w14:val="none"/>
         </w:rPr>
-        <w:t xml:space="preserve">, distribuidos entre Armenia con </w:t>
+        <w:t xml:space="preserve">: </w:t>
       </w:r>
       <w:r>
         <w:rPr>
@@ -1038,7 +931,7 @@
           <w:lang w:eastAsia="es-CO"/>
           <w14:ligatures w14:val="none"/>
         </w:rPr>
-        <w:t>86.560</w:t>
+        <w:t>86.560 de Armenia, 66.295 de Manizales y 61.181 de Pereira</w:t>
       </w:r>
       <w:r>
         <w:rPr>
@@ -1047,47 +940,889 @@
           <w:lang w:eastAsia="es-CO"/>
           <w14:ligatures w14:val="none"/>
         </w:rPr>
-        <w:t xml:space="preserve">, Manizales con </w:t>
-      </w:r>
-      <w:r>
-        <w:rPr>
-          <w:rFonts w:eastAsia="Times New Roman" w:cstheme="minorHAnsi"/>
-          <w:b/>
-          <w:bCs/>
-          <w:kern w:val="0"/>
-          <w:lang w:eastAsia="es-CO"/>
-          <w14:ligatures w14:val="none"/>
-        </w:rPr>
-        <w:t>66.295</w:t>
-      </w:r>
-      <w:r>
+        <w:t>. Este subconjunto permite comparar la cantidad de registros que cumplen los filtros y la distribución de sus valores. Los conteos no representan necesariamente inmuebles únicos ni la totalidad de las compraventas urbanas del periodo.</w:t>
+      </w:r>
+    </w:p>
+    <w:p>
+      <w:pPr>
+        <w:spacing w:after="0" w:line="300" w:lineRule="atLeast"/>
+        <w:jc w:val="both"/>
         <w:rPr>
           <w:rFonts w:eastAsia="Times New Roman" w:cstheme="minorHAnsi"/>
           <w:kern w:val="0"/>
           <w:lang w:eastAsia="es-CO"/>
           <w14:ligatures w14:val="none"/>
         </w:rPr>
-        <w:t xml:space="preserve"> y Pereira con </w:t>
-      </w:r>
-      <w:r>
-        <w:rPr>
-          <w:rFonts w:eastAsia="Times New Roman" w:cstheme="minorHAnsi"/>
-          <w:b/>
-          <w:bCs/>
-          <w:kern w:val="0"/>
-          <w:lang w:eastAsia="es-CO"/>
-          <w14:ligatures w14:val="none"/>
-        </w:rPr>
-        <w:t>61.181</w:t>
-      </w:r>
-      <w:r>
+      </w:pPr>
+    </w:p>
+    <w:tbl>
+      <w:tblPr>
+        <w:tblStyle w:val="GridTable3-Accent3"/>
+        <w:tblW w:w="9001" w:type="dxa"/>
+        <w:tblLook w:val="04A0" w:firstRow="1" w:lastRow="0" w:firstColumn="1" w:lastColumn="0" w:noHBand="0" w:noVBand="1"/>
+      </w:tblPr>
+      <w:tblGrid>
+        <w:gridCol w:w="4376"/>
+        <w:gridCol w:w="1548"/>
+        <w:gridCol w:w="1546"/>
+        <w:gridCol w:w="1531"/>
+      </w:tblGrid>
+      <w:tr>
+        <w:trPr>
+          <w:cnfStyle w:val="100000000000" w:firstRow="1" w:lastRow="0" w:firstColumn="0" w:lastColumn="0" w:oddVBand="0" w:evenVBand="0" w:oddHBand="0" w:evenHBand="0" w:firstRowFirstColumn="0" w:firstRowLastColumn="0" w:lastRowFirstColumn="0" w:lastRowLastColumn="0"/>
+          <w:trHeight w:val="296"/>
+        </w:trPr>
+        <w:tc>
+          <w:tcPr>
+            <w:cnfStyle w:val="001000000100" w:firstRow="0" w:lastRow="0" w:firstColumn="1" w:lastColumn="0" w:oddVBand="0" w:evenVBand="0" w:oddHBand="0" w:evenHBand="0" w:firstRowFirstColumn="1" w:firstRowLastColumn="0" w:lastRowFirstColumn="0" w:lastRowLastColumn="0"/>
+            <w:tcW w:w="4376" w:type="dxa"/>
+            <w:hideMark/>
+          </w:tcPr>
+          <w:p>
+            <w:pPr>
+              <w:spacing w:line="300" w:lineRule="atLeast"/>
+              <w:jc w:val="both"/>
+              <w:rPr>
+                <w:rFonts w:eastAsia="Times New Roman" w:cstheme="minorHAnsi"/>
+                <w:kern w:val="0"/>
+                <w:lang w:eastAsia="es-CO"/>
+                <w14:ligatures w14:val="none"/>
+              </w:rPr>
+            </w:pPr>
+            <w:r>
+              <w:rPr>
+                <w:rFonts w:eastAsia="Times New Roman" w:cstheme="minorHAnsi"/>
+                <w:kern w:val="0"/>
+                <w:lang w:eastAsia="es-CO"/>
+                <w14:ligatures w14:val="none"/>
+              </w:rPr>
+              <w:t>Indicador</w:t>
+            </w:r>
+          </w:p>
+        </w:tc>
+        <w:tc>
+          <w:tcPr>
+            <w:tcW w:w="1548" w:type="dxa"/>
+            <w:hideMark/>
+          </w:tcPr>
+          <w:p>
+            <w:pPr>
+              <w:spacing w:line="300" w:lineRule="atLeast"/>
+              <w:jc w:val="both"/>
+              <w:cnfStyle w:val="100000000000" w:firstRow="1" w:lastRow="0" w:firstColumn="0" w:lastColumn="0" w:oddVBand="0" w:evenVBand="0" w:oddHBand="0" w:evenHBand="0" w:firstRowFirstColumn="0" w:firstRowLastColumn="0" w:lastRowFirstColumn="0" w:lastRowLastColumn="0"/>
+              <w:rPr>
+                <w:rFonts w:eastAsia="Times New Roman" w:cstheme="minorHAnsi"/>
+                <w:kern w:val="0"/>
+                <w:lang w:eastAsia="es-CO"/>
+                <w14:ligatures w14:val="none"/>
+              </w:rPr>
+            </w:pPr>
+            <w:r>
+              <w:rPr>
+                <w:rFonts w:eastAsia="Times New Roman" w:cstheme="minorHAnsi"/>
+                <w:kern w:val="0"/>
+                <w:lang w:eastAsia="es-CO"/>
+                <w14:ligatures w14:val="none"/>
+              </w:rPr>
+              <w:t>Armenia</w:t>
+            </w:r>
+          </w:p>
+        </w:tc>
+        <w:tc>
+          <w:tcPr>
+            <w:tcW w:w="1546" w:type="dxa"/>
+            <w:hideMark/>
+          </w:tcPr>
+          <w:p>
+            <w:pPr>
+              <w:spacing w:line="300" w:lineRule="atLeast"/>
+              <w:jc w:val="both"/>
+              <w:cnfStyle w:val="100000000000" w:firstRow="1" w:lastRow="0" w:firstColumn="0" w:lastColumn="0" w:oddVBand="0" w:evenVBand="0" w:oddHBand="0" w:evenHBand="0" w:firstRowFirstColumn="0" w:firstRowLastColumn="0" w:lastRowFirstColumn="0" w:lastRowLastColumn="0"/>
+              <w:rPr>
+                <w:rFonts w:eastAsia="Times New Roman" w:cstheme="minorHAnsi"/>
+                <w:kern w:val="0"/>
+                <w:lang w:eastAsia="es-CO"/>
+                <w14:ligatures w14:val="none"/>
+              </w:rPr>
+            </w:pPr>
+            <w:r>
+              <w:rPr>
+                <w:rFonts w:eastAsia="Times New Roman" w:cstheme="minorHAnsi"/>
+                <w:kern w:val="0"/>
+                <w:lang w:eastAsia="es-CO"/>
+                <w14:ligatures w14:val="none"/>
+              </w:rPr>
+              <w:t>Manizales</w:t>
+            </w:r>
+          </w:p>
+        </w:tc>
+        <w:tc>
+          <w:tcPr>
+            <w:tcW w:w="1531" w:type="dxa"/>
+            <w:hideMark/>
+          </w:tcPr>
+          <w:p>
+            <w:pPr>
+              <w:spacing w:line="300" w:lineRule="atLeast"/>
+              <w:jc w:val="both"/>
+              <w:cnfStyle w:val="100000000000" w:firstRow="1" w:lastRow="0" w:firstColumn="0" w:lastColumn="0" w:oddVBand="0" w:evenVBand="0" w:oddHBand="0" w:evenHBand="0" w:firstRowFirstColumn="0" w:firstRowLastColumn="0" w:lastRowFirstColumn="0" w:lastRowLastColumn="0"/>
+              <w:rPr>
+                <w:rFonts w:eastAsia="Times New Roman" w:cstheme="minorHAnsi"/>
+                <w:kern w:val="0"/>
+                <w:lang w:eastAsia="es-CO"/>
+                <w14:ligatures w14:val="none"/>
+              </w:rPr>
+            </w:pPr>
+            <w:r>
+              <w:rPr>
+                <w:rFonts w:eastAsia="Times New Roman" w:cstheme="minorHAnsi"/>
+                <w:kern w:val="0"/>
+                <w:lang w:eastAsia="es-CO"/>
+                <w14:ligatures w14:val="none"/>
+              </w:rPr>
+              <w:t>Pereira</w:t>
+            </w:r>
+          </w:p>
+        </w:tc>
+      </w:tr>
+      <w:tr>
+        <w:trPr>
+          <w:cnfStyle w:val="000000100000" w:firstRow="0" w:lastRow="0" w:firstColumn="0" w:lastColumn="0" w:oddVBand="0" w:evenVBand="0" w:oddHBand="1" w:evenHBand="0" w:firstRowFirstColumn="0" w:firstRowLastColumn="0" w:lastRowFirstColumn="0" w:lastRowLastColumn="0"/>
+          <w:trHeight w:val="296"/>
+        </w:trPr>
+        <w:tc>
+          <w:tcPr>
+            <w:cnfStyle w:val="001000000000" w:firstRow="0" w:lastRow="0" w:firstColumn="1" w:lastColumn="0" w:oddVBand="0" w:evenVBand="0" w:oddHBand="0" w:evenHBand="0" w:firstRowFirstColumn="0" w:firstRowLastColumn="0" w:lastRowFirstColumn="0" w:lastRowLastColumn="0"/>
+            <w:tcW w:w="4376" w:type="dxa"/>
+            <w:hideMark/>
+          </w:tcPr>
+          <w:p>
+            <w:pPr>
+              <w:spacing w:line="300" w:lineRule="atLeast"/>
+              <w:jc w:val="both"/>
+              <w:rPr>
+                <w:rFonts w:eastAsia="Times New Roman" w:cstheme="minorHAnsi"/>
+                <w:kern w:val="0"/>
+                <w:lang w:eastAsia="es-CO"/>
+                <w14:ligatures w14:val="none"/>
+              </w:rPr>
+            </w:pPr>
+            <w:r>
+              <w:rPr>
+                <w:rFonts w:eastAsia="Times New Roman" w:cstheme="minorHAnsi"/>
+                <w:kern w:val="0"/>
+                <w:lang w:eastAsia="es-CO"/>
+                <w14:ligatures w14:val="none"/>
+              </w:rPr>
+              <w:t>Registros preseleccionados, 2015–2023</w:t>
+            </w:r>
+          </w:p>
+        </w:tc>
+        <w:tc>
+          <w:tcPr>
+            <w:tcW w:w="1548" w:type="dxa"/>
+            <w:hideMark/>
+          </w:tcPr>
+          <w:p>
+            <w:pPr>
+              <w:spacing w:line="300" w:lineRule="atLeast"/>
+              <w:jc w:val="both"/>
+              <w:cnfStyle w:val="000000100000" w:firstRow="0" w:lastRow="0" w:firstColumn="0" w:lastColumn="0" w:oddVBand="0" w:evenVBand="0" w:oddHBand="1" w:evenHBand="0" w:firstRowFirstColumn="0" w:firstRowLastColumn="0" w:lastRowFirstColumn="0" w:lastRowLastColumn="0"/>
+              <w:rPr>
+                <w:rFonts w:eastAsia="Times New Roman" w:cstheme="minorHAnsi"/>
+                <w:kern w:val="0"/>
+                <w:lang w:eastAsia="es-CO"/>
+                <w14:ligatures w14:val="none"/>
+              </w:rPr>
+            </w:pPr>
+            <w:r>
+              <w:rPr>
+                <w:rFonts w:eastAsia="Times New Roman" w:cstheme="minorHAnsi"/>
+                <w:kern w:val="0"/>
+                <w:lang w:eastAsia="es-CO"/>
+                <w14:ligatures w14:val="none"/>
+              </w:rPr>
+              <w:t>86.560</w:t>
+            </w:r>
+          </w:p>
+        </w:tc>
+        <w:tc>
+          <w:tcPr>
+            <w:tcW w:w="1546" w:type="dxa"/>
+            <w:hideMark/>
+          </w:tcPr>
+          <w:p>
+            <w:pPr>
+              <w:spacing w:line="300" w:lineRule="atLeast"/>
+              <w:jc w:val="both"/>
+              <w:cnfStyle w:val="000000100000" w:firstRow="0" w:lastRow="0" w:firstColumn="0" w:lastColumn="0" w:oddVBand="0" w:evenVBand="0" w:oddHBand="1" w:evenHBand="0" w:firstRowFirstColumn="0" w:firstRowLastColumn="0" w:lastRowFirstColumn="0" w:lastRowLastColumn="0"/>
+              <w:rPr>
+                <w:rFonts w:eastAsia="Times New Roman" w:cstheme="minorHAnsi"/>
+                <w:kern w:val="0"/>
+                <w:lang w:eastAsia="es-CO"/>
+                <w14:ligatures w14:val="none"/>
+              </w:rPr>
+            </w:pPr>
+            <w:r>
+              <w:rPr>
+                <w:rFonts w:eastAsia="Times New Roman" w:cstheme="minorHAnsi"/>
+                <w:kern w:val="0"/>
+                <w:lang w:eastAsia="es-CO"/>
+                <w14:ligatures w14:val="none"/>
+              </w:rPr>
+              <w:t>66.295</w:t>
+            </w:r>
+          </w:p>
+        </w:tc>
+        <w:tc>
+          <w:tcPr>
+            <w:tcW w:w="1531" w:type="dxa"/>
+            <w:hideMark/>
+          </w:tcPr>
+          <w:p>
+            <w:pPr>
+              <w:spacing w:line="300" w:lineRule="atLeast"/>
+              <w:jc w:val="both"/>
+              <w:cnfStyle w:val="000000100000" w:firstRow="0" w:lastRow="0" w:firstColumn="0" w:lastColumn="0" w:oddVBand="0" w:evenVBand="0" w:oddHBand="1" w:evenHBand="0" w:firstRowFirstColumn="0" w:firstRowLastColumn="0" w:lastRowFirstColumn="0" w:lastRowLastColumn="0"/>
+              <w:rPr>
+                <w:rFonts w:eastAsia="Times New Roman" w:cstheme="minorHAnsi"/>
+                <w:kern w:val="0"/>
+                <w:lang w:eastAsia="es-CO"/>
+                <w14:ligatures w14:val="none"/>
+              </w:rPr>
+            </w:pPr>
+            <w:r>
+              <w:rPr>
+                <w:rFonts w:eastAsia="Times New Roman" w:cstheme="minorHAnsi"/>
+                <w:kern w:val="0"/>
+                <w:lang w:eastAsia="es-CO"/>
+                <w14:ligatures w14:val="none"/>
+              </w:rPr>
+              <w:t>61.181</w:t>
+            </w:r>
+          </w:p>
+        </w:tc>
+      </w:tr>
+      <w:tr>
+        <w:trPr>
+          <w:trHeight w:val="296"/>
+        </w:trPr>
+        <w:tc>
+          <w:tcPr>
+            <w:cnfStyle w:val="001000000000" w:firstRow="0" w:lastRow="0" w:firstColumn="1" w:lastColumn="0" w:oddVBand="0" w:evenVBand="0" w:oddHBand="0" w:evenHBand="0" w:firstRowFirstColumn="0" w:firstRowLastColumn="0" w:lastRowFirstColumn="0" w:lastRowLastColumn="0"/>
+            <w:tcW w:w="4376" w:type="dxa"/>
+            <w:hideMark/>
+          </w:tcPr>
+          <w:p>
+            <w:pPr>
+              <w:spacing w:line="300" w:lineRule="atLeast"/>
+              <w:jc w:val="both"/>
+              <w:rPr>
+                <w:rFonts w:eastAsia="Times New Roman" w:cstheme="minorHAnsi"/>
+                <w:kern w:val="0"/>
+                <w:lang w:eastAsia="es-CO"/>
+                <w14:ligatures w14:val="none"/>
+              </w:rPr>
+            </w:pPr>
+            <w:r>
+              <w:rPr>
+                <w:rFonts w:eastAsia="Times New Roman" w:cstheme="minorHAnsi"/>
+                <w:kern w:val="0"/>
+                <w:lang w:eastAsia="es-CO"/>
+                <w14:ligatures w14:val="none"/>
+              </w:rPr>
+              <w:t>Participación en el conjunto analizado</w:t>
+            </w:r>
+          </w:p>
+        </w:tc>
+        <w:tc>
+          <w:tcPr>
+            <w:tcW w:w="1548" w:type="dxa"/>
+            <w:hideMark/>
+          </w:tcPr>
+          <w:p>
+            <w:pPr>
+              <w:spacing w:line="300" w:lineRule="atLeast"/>
+              <w:jc w:val="both"/>
+              <w:cnfStyle w:val="000000000000" w:firstRow="0" w:lastRow="0" w:firstColumn="0" w:lastColumn="0" w:oddVBand="0" w:evenVBand="0" w:oddHBand="0" w:evenHBand="0" w:firstRowFirstColumn="0" w:firstRowLastColumn="0" w:lastRowFirstColumn="0" w:lastRowLastColumn="0"/>
+              <w:rPr>
+                <w:rFonts w:eastAsia="Times New Roman" w:cstheme="minorHAnsi"/>
+                <w:kern w:val="0"/>
+                <w:lang w:eastAsia="es-CO"/>
+                <w14:ligatures w14:val="none"/>
+              </w:rPr>
+            </w:pPr>
+            <w:r>
+              <w:rPr>
+                <w:rFonts w:eastAsia="Times New Roman" w:cstheme="minorHAnsi"/>
+                <w:kern w:val="0"/>
+                <w:lang w:eastAsia="es-CO"/>
+                <w14:ligatures w14:val="none"/>
+              </w:rPr>
+              <w:t>40,44 %</w:t>
+            </w:r>
+          </w:p>
+        </w:tc>
+        <w:tc>
+          <w:tcPr>
+            <w:tcW w:w="1546" w:type="dxa"/>
+            <w:hideMark/>
+          </w:tcPr>
+          <w:p>
+            <w:pPr>
+              <w:spacing w:line="300" w:lineRule="atLeast"/>
+              <w:jc w:val="both"/>
+              <w:cnfStyle w:val="000000000000" w:firstRow="0" w:lastRow="0" w:firstColumn="0" w:lastColumn="0" w:oddVBand="0" w:evenVBand="0" w:oddHBand="0" w:evenHBand="0" w:firstRowFirstColumn="0" w:firstRowLastColumn="0" w:lastRowFirstColumn="0" w:lastRowLastColumn="0"/>
+              <w:rPr>
+                <w:rFonts w:eastAsia="Times New Roman" w:cstheme="minorHAnsi"/>
+                <w:kern w:val="0"/>
+                <w:lang w:eastAsia="es-CO"/>
+                <w14:ligatures w14:val="none"/>
+              </w:rPr>
+            </w:pPr>
+            <w:r>
+              <w:rPr>
+                <w:rFonts w:eastAsia="Times New Roman" w:cstheme="minorHAnsi"/>
+                <w:kern w:val="0"/>
+                <w:lang w:eastAsia="es-CO"/>
+                <w14:ligatures w14:val="none"/>
+              </w:rPr>
+              <w:t>30,97 %</w:t>
+            </w:r>
+          </w:p>
+        </w:tc>
+        <w:tc>
+          <w:tcPr>
+            <w:tcW w:w="1531" w:type="dxa"/>
+            <w:hideMark/>
+          </w:tcPr>
+          <w:p>
+            <w:pPr>
+              <w:spacing w:line="300" w:lineRule="atLeast"/>
+              <w:jc w:val="both"/>
+              <w:cnfStyle w:val="000000000000" w:firstRow="0" w:lastRow="0" w:firstColumn="0" w:lastColumn="0" w:oddVBand="0" w:evenVBand="0" w:oddHBand="0" w:evenHBand="0" w:firstRowFirstColumn="0" w:firstRowLastColumn="0" w:lastRowFirstColumn="0" w:lastRowLastColumn="0"/>
+              <w:rPr>
+                <w:rFonts w:eastAsia="Times New Roman" w:cstheme="minorHAnsi"/>
+                <w:kern w:val="0"/>
+                <w:lang w:eastAsia="es-CO"/>
+                <w14:ligatures w14:val="none"/>
+              </w:rPr>
+            </w:pPr>
+            <w:r>
+              <w:rPr>
+                <w:rFonts w:eastAsia="Times New Roman" w:cstheme="minorHAnsi"/>
+                <w:kern w:val="0"/>
+                <w:lang w:eastAsia="es-CO"/>
+                <w14:ligatures w14:val="none"/>
+              </w:rPr>
+              <w:t>28,58 %</w:t>
+            </w:r>
+          </w:p>
+        </w:tc>
+      </w:tr>
+      <w:tr>
+        <w:trPr>
+          <w:cnfStyle w:val="000000100000" w:firstRow="0" w:lastRow="0" w:firstColumn="0" w:lastColumn="0" w:oddVBand="0" w:evenVBand="0" w:oddHBand="1" w:evenHBand="0" w:firstRowFirstColumn="0" w:firstRowLastColumn="0" w:lastRowFirstColumn="0" w:lastRowLastColumn="0"/>
+          <w:trHeight w:val="296"/>
+        </w:trPr>
+        <w:tc>
+          <w:tcPr>
+            <w:cnfStyle w:val="001000000000" w:firstRow="0" w:lastRow="0" w:firstColumn="1" w:lastColumn="0" w:oddVBand="0" w:evenVBand="0" w:oddHBand="0" w:evenHBand="0" w:firstRowFirstColumn="0" w:firstRowLastColumn="0" w:lastRowFirstColumn="0" w:lastRowLastColumn="0"/>
+            <w:tcW w:w="4376" w:type="dxa"/>
+            <w:hideMark/>
+          </w:tcPr>
+          <w:p>
+            <w:pPr>
+              <w:spacing w:line="300" w:lineRule="atLeast"/>
+              <w:jc w:val="both"/>
+              <w:rPr>
+                <w:rFonts w:eastAsia="Times New Roman" w:cstheme="minorHAnsi"/>
+                <w:kern w:val="0"/>
+                <w:lang w:eastAsia="es-CO"/>
+                <w14:ligatures w14:val="none"/>
+              </w:rPr>
+            </w:pPr>
+            <w:r>
+              <w:rPr>
+                <w:rFonts w:eastAsia="Times New Roman" w:cstheme="minorHAnsi"/>
+                <w:kern w:val="0"/>
+                <w:lang w:eastAsia="es-CO"/>
+                <w14:ligatures w14:val="none"/>
+              </w:rPr>
+              <w:t>Variación de registros 2020 frente a 2019</w:t>
+            </w:r>
+          </w:p>
+        </w:tc>
+        <w:tc>
+          <w:tcPr>
+            <w:tcW w:w="1548" w:type="dxa"/>
+            <w:hideMark/>
+          </w:tcPr>
+          <w:p>
+            <w:pPr>
+              <w:spacing w:line="300" w:lineRule="atLeast"/>
+              <w:jc w:val="both"/>
+              <w:cnfStyle w:val="000000100000" w:firstRow="0" w:lastRow="0" w:firstColumn="0" w:lastColumn="0" w:oddVBand="0" w:evenVBand="0" w:oddHBand="1" w:evenHBand="0" w:firstRowFirstColumn="0" w:firstRowLastColumn="0" w:lastRowFirstColumn="0" w:lastRowLastColumn="0"/>
+              <w:rPr>
+                <w:rFonts w:eastAsia="Times New Roman" w:cstheme="minorHAnsi"/>
+                <w:kern w:val="0"/>
+                <w:lang w:eastAsia="es-CO"/>
+                <w14:ligatures w14:val="none"/>
+              </w:rPr>
+            </w:pPr>
+            <w:r>
+              <w:rPr>
+                <w:rFonts w:eastAsia="Times New Roman" w:cstheme="minorHAnsi"/>
+                <w:kern w:val="0"/>
+                <w:lang w:eastAsia="es-CO"/>
+                <w14:ligatures w14:val="none"/>
+              </w:rPr>
+              <w:t>−1,06 %</w:t>
+            </w:r>
+          </w:p>
+        </w:tc>
+        <w:tc>
+          <w:tcPr>
+            <w:tcW w:w="1546" w:type="dxa"/>
+            <w:hideMark/>
+          </w:tcPr>
+          <w:p>
+            <w:pPr>
+              <w:spacing w:line="300" w:lineRule="atLeast"/>
+              <w:jc w:val="both"/>
+              <w:cnfStyle w:val="000000100000" w:firstRow="0" w:lastRow="0" w:firstColumn="0" w:lastColumn="0" w:oddVBand="0" w:evenVBand="0" w:oddHBand="1" w:evenHBand="0" w:firstRowFirstColumn="0" w:firstRowLastColumn="0" w:lastRowFirstColumn="0" w:lastRowLastColumn="0"/>
+              <w:rPr>
+                <w:rFonts w:eastAsia="Times New Roman" w:cstheme="minorHAnsi"/>
+                <w:kern w:val="0"/>
+                <w:lang w:eastAsia="es-CO"/>
+                <w14:ligatures w14:val="none"/>
+              </w:rPr>
+            </w:pPr>
+            <w:r>
+              <w:rPr>
+                <w:rFonts w:eastAsia="Times New Roman" w:cstheme="minorHAnsi"/>
+                <w:kern w:val="0"/>
+                <w:lang w:eastAsia="es-CO"/>
+                <w14:ligatures w14:val="none"/>
+              </w:rPr>
+              <w:t>−19,44 %</w:t>
+            </w:r>
+          </w:p>
+        </w:tc>
+        <w:tc>
+          <w:tcPr>
+            <w:tcW w:w="1531" w:type="dxa"/>
+            <w:hideMark/>
+          </w:tcPr>
+          <w:p>
+            <w:pPr>
+              <w:spacing w:line="300" w:lineRule="atLeast"/>
+              <w:jc w:val="both"/>
+              <w:cnfStyle w:val="000000100000" w:firstRow="0" w:lastRow="0" w:firstColumn="0" w:lastColumn="0" w:oddVBand="0" w:evenVBand="0" w:oddHBand="1" w:evenHBand="0" w:firstRowFirstColumn="0" w:firstRowLastColumn="0" w:lastRowFirstColumn="0" w:lastRowLastColumn="0"/>
+              <w:rPr>
+                <w:rFonts w:eastAsia="Times New Roman" w:cstheme="minorHAnsi"/>
+                <w:kern w:val="0"/>
+                <w:lang w:eastAsia="es-CO"/>
+                <w14:ligatures w14:val="none"/>
+              </w:rPr>
+            </w:pPr>
+            <w:r>
+              <w:rPr>
+                <w:rFonts w:eastAsia="Times New Roman" w:cstheme="minorHAnsi"/>
+                <w:kern w:val="0"/>
+                <w:lang w:eastAsia="es-CO"/>
+                <w14:ligatures w14:val="none"/>
+              </w:rPr>
+              <w:t>−8,88 %</w:t>
+            </w:r>
+          </w:p>
+        </w:tc>
+      </w:tr>
+      <w:tr>
+        <w:trPr>
+          <w:trHeight w:val="296"/>
+        </w:trPr>
+        <w:tc>
+          <w:tcPr>
+            <w:cnfStyle w:val="001000000000" w:firstRow="0" w:lastRow="0" w:firstColumn="1" w:lastColumn="0" w:oddVBand="0" w:evenVBand="0" w:oddHBand="0" w:evenHBand="0" w:firstRowFirstColumn="0" w:firstRowLastColumn="0" w:lastRowFirstColumn="0" w:lastRowLastColumn="0"/>
+            <w:tcW w:w="4376" w:type="dxa"/>
+            <w:hideMark/>
+          </w:tcPr>
+          <w:p>
+            <w:pPr>
+              <w:spacing w:line="300" w:lineRule="atLeast"/>
+              <w:jc w:val="both"/>
+              <w:rPr>
+                <w:rFonts w:eastAsia="Times New Roman" w:cstheme="minorHAnsi"/>
+                <w:kern w:val="0"/>
+                <w:lang w:eastAsia="es-CO"/>
+                <w14:ligatures w14:val="none"/>
+              </w:rPr>
+            </w:pPr>
+            <w:r>
+              <w:rPr>
+                <w:rFonts w:eastAsia="Times New Roman" w:cstheme="minorHAnsi"/>
+                <w:kern w:val="0"/>
+                <w:lang w:eastAsia="es-CO"/>
+                <w14:ligatures w14:val="none"/>
+              </w:rPr>
+              <w:t>Variación de registros 2021 frente a 2020</w:t>
+            </w:r>
+          </w:p>
+        </w:tc>
+        <w:tc>
+          <w:tcPr>
+            <w:tcW w:w="1548" w:type="dxa"/>
+            <w:hideMark/>
+          </w:tcPr>
+          <w:p>
+            <w:pPr>
+              <w:spacing w:line="300" w:lineRule="atLeast"/>
+              <w:jc w:val="both"/>
+              <w:cnfStyle w:val="000000000000" w:firstRow="0" w:lastRow="0" w:firstColumn="0" w:lastColumn="0" w:oddVBand="0" w:evenVBand="0" w:oddHBand="0" w:evenHBand="0" w:firstRowFirstColumn="0" w:firstRowLastColumn="0" w:lastRowFirstColumn="0" w:lastRowLastColumn="0"/>
+              <w:rPr>
+                <w:rFonts w:eastAsia="Times New Roman" w:cstheme="minorHAnsi"/>
+                <w:kern w:val="0"/>
+                <w:lang w:eastAsia="es-CO"/>
+                <w14:ligatures w14:val="none"/>
+              </w:rPr>
+            </w:pPr>
+            <w:r>
+              <w:rPr>
+                <w:rFonts w:eastAsia="Times New Roman" w:cstheme="minorHAnsi"/>
+                <w:kern w:val="0"/>
+                <w:lang w:eastAsia="es-CO"/>
+                <w14:ligatures w14:val="none"/>
+              </w:rPr>
+              <w:t>+28,41 %</w:t>
+            </w:r>
+          </w:p>
+        </w:tc>
+        <w:tc>
+          <w:tcPr>
+            <w:tcW w:w="1546" w:type="dxa"/>
+            <w:hideMark/>
+          </w:tcPr>
+          <w:p>
+            <w:pPr>
+              <w:spacing w:line="300" w:lineRule="atLeast"/>
+              <w:jc w:val="both"/>
+              <w:cnfStyle w:val="000000000000" w:firstRow="0" w:lastRow="0" w:firstColumn="0" w:lastColumn="0" w:oddVBand="0" w:evenVBand="0" w:oddHBand="0" w:evenHBand="0" w:firstRowFirstColumn="0" w:firstRowLastColumn="0" w:lastRowFirstColumn="0" w:lastRowLastColumn="0"/>
+              <w:rPr>
+                <w:rFonts w:eastAsia="Times New Roman" w:cstheme="minorHAnsi"/>
+                <w:kern w:val="0"/>
+                <w:lang w:eastAsia="es-CO"/>
+                <w14:ligatures w14:val="none"/>
+              </w:rPr>
+            </w:pPr>
+            <w:r>
+              <w:rPr>
+                <w:rFonts w:eastAsia="Times New Roman" w:cstheme="minorHAnsi"/>
+                <w:kern w:val="0"/>
+                <w:lang w:eastAsia="es-CO"/>
+                <w14:ligatures w14:val="none"/>
+              </w:rPr>
+              <w:t>+35,43 %</w:t>
+            </w:r>
+          </w:p>
+        </w:tc>
+        <w:tc>
+          <w:tcPr>
+            <w:tcW w:w="1531" w:type="dxa"/>
+            <w:hideMark/>
+          </w:tcPr>
+          <w:p>
+            <w:pPr>
+              <w:spacing w:line="300" w:lineRule="atLeast"/>
+              <w:jc w:val="both"/>
+              <w:cnfStyle w:val="000000000000" w:firstRow="0" w:lastRow="0" w:firstColumn="0" w:lastColumn="0" w:oddVBand="0" w:evenVBand="0" w:oddHBand="0" w:evenHBand="0" w:firstRowFirstColumn="0" w:firstRowLastColumn="0" w:lastRowFirstColumn="0" w:lastRowLastColumn="0"/>
+              <w:rPr>
+                <w:rFonts w:eastAsia="Times New Roman" w:cstheme="minorHAnsi"/>
+                <w:kern w:val="0"/>
+                <w:lang w:eastAsia="es-CO"/>
+                <w14:ligatures w14:val="none"/>
+              </w:rPr>
+            </w:pPr>
+            <w:r>
+              <w:rPr>
+                <w:rFonts w:eastAsia="Times New Roman" w:cstheme="minorHAnsi"/>
+                <w:kern w:val="0"/>
+                <w:lang w:eastAsia="es-CO"/>
+                <w14:ligatures w14:val="none"/>
+              </w:rPr>
+              <w:t>+18,95 %</w:t>
+            </w:r>
+          </w:p>
+        </w:tc>
+      </w:tr>
+      <w:tr>
+        <w:trPr>
+          <w:cnfStyle w:val="000000100000" w:firstRow="0" w:lastRow="0" w:firstColumn="0" w:lastColumn="0" w:oddVBand="0" w:evenVBand="0" w:oddHBand="1" w:evenHBand="0" w:firstRowFirstColumn="0" w:firstRowLastColumn="0" w:lastRowFirstColumn="0" w:lastRowLastColumn="0"/>
+          <w:trHeight w:val="296"/>
+        </w:trPr>
+        <w:tc>
+          <w:tcPr>
+            <w:cnfStyle w:val="001000000000" w:firstRow="0" w:lastRow="0" w:firstColumn="1" w:lastColumn="0" w:oddVBand="0" w:evenVBand="0" w:oddHBand="0" w:evenHBand="0" w:firstRowFirstColumn="0" w:firstRowLastColumn="0" w:lastRowFirstColumn="0" w:lastRowLastColumn="0"/>
+            <w:tcW w:w="4376" w:type="dxa"/>
+            <w:hideMark/>
+          </w:tcPr>
+          <w:p>
+            <w:pPr>
+              <w:spacing w:line="300" w:lineRule="atLeast"/>
+              <w:jc w:val="both"/>
+              <w:rPr>
+                <w:rFonts w:eastAsia="Times New Roman" w:cstheme="minorHAnsi"/>
+                <w:kern w:val="0"/>
+                <w:lang w:eastAsia="es-CO"/>
+                <w14:ligatures w14:val="none"/>
+              </w:rPr>
+            </w:pPr>
+            <w:r>
+              <w:rPr>
+                <w:rFonts w:eastAsia="Times New Roman" w:cstheme="minorHAnsi"/>
+                <w:kern w:val="0"/>
+                <w:lang w:eastAsia="es-CO"/>
+                <w14:ligatures w14:val="none"/>
+              </w:rPr>
+              <w:t>Variación de registros 2023 frente a 2022</w:t>
+            </w:r>
+          </w:p>
+        </w:tc>
+        <w:tc>
+          <w:tcPr>
+            <w:tcW w:w="1548" w:type="dxa"/>
+            <w:hideMark/>
+          </w:tcPr>
+          <w:p>
+            <w:pPr>
+              <w:spacing w:line="300" w:lineRule="atLeast"/>
+              <w:jc w:val="both"/>
+              <w:cnfStyle w:val="000000100000" w:firstRow="0" w:lastRow="0" w:firstColumn="0" w:lastColumn="0" w:oddVBand="0" w:evenVBand="0" w:oddHBand="1" w:evenHBand="0" w:firstRowFirstColumn="0" w:firstRowLastColumn="0" w:lastRowFirstColumn="0" w:lastRowLastColumn="0"/>
+              <w:rPr>
+                <w:rFonts w:eastAsia="Times New Roman" w:cstheme="minorHAnsi"/>
+                <w:kern w:val="0"/>
+                <w:lang w:eastAsia="es-CO"/>
+                <w14:ligatures w14:val="none"/>
+              </w:rPr>
+            </w:pPr>
+            <w:r>
+              <w:rPr>
+                <w:rFonts w:eastAsia="Times New Roman" w:cstheme="minorHAnsi"/>
+                <w:kern w:val="0"/>
+                <w:lang w:eastAsia="es-CO"/>
+                <w14:ligatures w14:val="none"/>
+              </w:rPr>
+              <w:t>−4,04 %</w:t>
+            </w:r>
+          </w:p>
+        </w:tc>
+        <w:tc>
+          <w:tcPr>
+            <w:tcW w:w="1546" w:type="dxa"/>
+            <w:hideMark/>
+          </w:tcPr>
+          <w:p>
+            <w:pPr>
+              <w:spacing w:line="300" w:lineRule="atLeast"/>
+              <w:jc w:val="both"/>
+              <w:cnfStyle w:val="000000100000" w:firstRow="0" w:lastRow="0" w:firstColumn="0" w:lastColumn="0" w:oddVBand="0" w:evenVBand="0" w:oddHBand="1" w:evenHBand="0" w:firstRowFirstColumn="0" w:firstRowLastColumn="0" w:lastRowFirstColumn="0" w:lastRowLastColumn="0"/>
+              <w:rPr>
+                <w:rFonts w:eastAsia="Times New Roman" w:cstheme="minorHAnsi"/>
+                <w:kern w:val="0"/>
+                <w:lang w:eastAsia="es-CO"/>
+                <w14:ligatures w14:val="none"/>
+              </w:rPr>
+            </w:pPr>
+            <w:r>
+              <w:rPr>
+                <w:rFonts w:eastAsia="Times New Roman" w:cstheme="minorHAnsi"/>
+                <w:kern w:val="0"/>
+                <w:lang w:eastAsia="es-CO"/>
+                <w14:ligatures w14:val="none"/>
+              </w:rPr>
+              <w:t>−25,86 %</w:t>
+            </w:r>
+          </w:p>
+        </w:tc>
+        <w:tc>
+          <w:tcPr>
+            <w:tcW w:w="1531" w:type="dxa"/>
+            <w:hideMark/>
+          </w:tcPr>
+          <w:p>
+            <w:pPr>
+              <w:spacing w:line="300" w:lineRule="atLeast"/>
+              <w:jc w:val="both"/>
+              <w:cnfStyle w:val="000000100000" w:firstRow="0" w:lastRow="0" w:firstColumn="0" w:lastColumn="0" w:oddVBand="0" w:evenVBand="0" w:oddHBand="1" w:evenHBand="0" w:firstRowFirstColumn="0" w:firstRowLastColumn="0" w:lastRowFirstColumn="0" w:lastRowLastColumn="0"/>
+              <w:rPr>
+                <w:rFonts w:eastAsia="Times New Roman" w:cstheme="minorHAnsi"/>
+                <w:kern w:val="0"/>
+                <w:lang w:eastAsia="es-CO"/>
+                <w14:ligatures w14:val="none"/>
+              </w:rPr>
+            </w:pPr>
+            <w:r>
+              <w:rPr>
+                <w:rFonts w:eastAsia="Times New Roman" w:cstheme="minorHAnsi"/>
+                <w:kern w:val="0"/>
+                <w:lang w:eastAsia="es-CO"/>
+                <w14:ligatures w14:val="none"/>
+              </w:rPr>
+              <w:t>−15,62 %</w:t>
+            </w:r>
+          </w:p>
+        </w:tc>
+      </w:tr>
+      <w:tr>
+        <w:trPr>
+          <w:trHeight w:val="592"/>
+        </w:trPr>
+        <w:tc>
+          <w:tcPr>
+            <w:cnfStyle w:val="001000000000" w:firstRow="0" w:lastRow="0" w:firstColumn="1" w:lastColumn="0" w:oddVBand="0" w:evenVBand="0" w:oddHBand="0" w:evenHBand="0" w:firstRowFirstColumn="0" w:firstRowLastColumn="0" w:lastRowFirstColumn="0" w:lastRowLastColumn="0"/>
+            <w:tcW w:w="4376" w:type="dxa"/>
+            <w:hideMark/>
+          </w:tcPr>
+          <w:p>
+            <w:pPr>
+              <w:spacing w:line="300" w:lineRule="atLeast"/>
+              <w:jc w:val="both"/>
+              <w:rPr>
+                <w:rFonts w:eastAsia="Times New Roman" w:cstheme="minorHAnsi"/>
+                <w:kern w:val="0"/>
+                <w:lang w:eastAsia="es-CO"/>
+                <w14:ligatures w14:val="none"/>
+              </w:rPr>
+            </w:pPr>
+            <w:r>
+              <w:rPr>
+                <w:rFonts w:eastAsia="Times New Roman" w:cstheme="minorHAnsi"/>
+                <w:kern w:val="0"/>
+                <w:lang w:eastAsia="es-CO"/>
+                <w14:ligatures w14:val="none"/>
+              </w:rPr>
+              <w:t>Mediana del valor registrado en 2023</w:t>
+            </w:r>
+          </w:p>
+        </w:tc>
+        <w:tc>
+          <w:tcPr>
+            <w:tcW w:w="1548" w:type="dxa"/>
+            <w:hideMark/>
+          </w:tcPr>
+          <w:p>
+            <w:pPr>
+              <w:spacing w:line="300" w:lineRule="atLeast"/>
+              <w:jc w:val="both"/>
+              <w:cnfStyle w:val="000000000000" w:firstRow="0" w:lastRow="0" w:firstColumn="0" w:lastColumn="0" w:oddVBand="0" w:evenVBand="0" w:oddHBand="0" w:evenHBand="0" w:firstRowFirstColumn="0" w:firstRowLastColumn="0" w:lastRowFirstColumn="0" w:lastRowLastColumn="0"/>
+              <w:rPr>
+                <w:rFonts w:eastAsia="Times New Roman" w:cstheme="minorHAnsi"/>
+                <w:kern w:val="0"/>
+                <w:lang w:eastAsia="es-CO"/>
+                <w14:ligatures w14:val="none"/>
+              </w:rPr>
+            </w:pPr>
+            <w:r>
+              <w:rPr>
+                <w:rFonts w:eastAsia="Times New Roman" w:cstheme="minorHAnsi"/>
+                <w:kern w:val="0"/>
+                <w:lang w:eastAsia="es-CO"/>
+                <w14:ligatures w14:val="none"/>
+              </w:rPr>
+              <w:t>$108 millones</w:t>
+            </w:r>
+          </w:p>
+        </w:tc>
+        <w:tc>
+          <w:tcPr>
+            <w:tcW w:w="1546" w:type="dxa"/>
+            <w:hideMark/>
+          </w:tcPr>
+          <w:p>
+            <w:pPr>
+              <w:spacing w:line="300" w:lineRule="atLeast"/>
+              <w:jc w:val="both"/>
+              <w:cnfStyle w:val="000000000000" w:firstRow="0" w:lastRow="0" w:firstColumn="0" w:lastColumn="0" w:oddVBand="0" w:evenVBand="0" w:oddHBand="0" w:evenHBand="0" w:firstRowFirstColumn="0" w:firstRowLastColumn="0" w:lastRowFirstColumn="0" w:lastRowLastColumn="0"/>
+              <w:rPr>
+                <w:rFonts w:eastAsia="Times New Roman" w:cstheme="minorHAnsi"/>
+                <w:kern w:val="0"/>
+                <w:lang w:eastAsia="es-CO"/>
+                <w14:ligatures w14:val="none"/>
+              </w:rPr>
+            </w:pPr>
+            <w:r>
+              <w:rPr>
+                <w:rFonts w:eastAsia="Times New Roman" w:cstheme="minorHAnsi"/>
+                <w:kern w:val="0"/>
+                <w:lang w:eastAsia="es-CO"/>
+                <w14:ligatures w14:val="none"/>
+              </w:rPr>
+              <w:t>$135 millones</w:t>
+            </w:r>
+          </w:p>
+        </w:tc>
+        <w:tc>
+          <w:tcPr>
+            <w:tcW w:w="1531" w:type="dxa"/>
+            <w:hideMark/>
+          </w:tcPr>
+          <w:p>
+            <w:pPr>
+              <w:spacing w:line="300" w:lineRule="atLeast"/>
+              <w:jc w:val="both"/>
+              <w:cnfStyle w:val="000000000000" w:firstRow="0" w:lastRow="0" w:firstColumn="0" w:lastColumn="0" w:oddVBand="0" w:evenVBand="0" w:oddHBand="0" w:evenHBand="0" w:firstRowFirstColumn="0" w:firstRowLastColumn="0" w:lastRowFirstColumn="0" w:lastRowLastColumn="0"/>
+              <w:rPr>
+                <w:rFonts w:eastAsia="Times New Roman" w:cstheme="minorHAnsi"/>
+                <w:kern w:val="0"/>
+                <w:lang w:eastAsia="es-CO"/>
+                <w14:ligatures w14:val="none"/>
+              </w:rPr>
+            </w:pPr>
+            <w:r>
+              <w:rPr>
+                <w:rFonts w:eastAsia="Times New Roman" w:cstheme="minorHAnsi"/>
+                <w:kern w:val="0"/>
+                <w:lang w:eastAsia="es-CO"/>
+                <w14:ligatures w14:val="none"/>
+              </w:rPr>
+              <w:t>$123 millones</w:t>
+            </w:r>
+          </w:p>
+        </w:tc>
+      </w:tr>
+    </w:tbl>
+    <w:p>
+      <w:pPr>
+        <w:spacing w:after="0" w:line="300" w:lineRule="atLeast"/>
+        <w:jc w:val="both"/>
         <w:rPr>
           <w:rFonts w:eastAsia="Times New Roman" w:cstheme="minorHAnsi"/>
           <w:kern w:val="0"/>
           <w:lang w:eastAsia="es-CO"/>
           <w14:ligatures w14:val="none"/>
         </w:rPr>
-        <w:t xml:space="preserve"> registros. La información disponible permite comparar tanto la cantidad de operaciones registradas como los valores asociados a estas transacciones.</w:t>
+      </w:pPr>
+      <w:r>
+        <w:rPr>
+          <w:rFonts w:eastAsia="Times New Roman" w:cstheme="minorHAnsi"/>
+          <w:i/>
+          <w:iCs/>
+          <w:kern w:val="0"/>
+          <w:sz w:val="18"/>
+          <w:szCs w:val="18"/>
+          <w:lang w:eastAsia="es-CO"/>
+          <w14:ligatures w14:val="none"/>
+        </w:rPr>
+        <w:t>Fuente: cálculos propios con consultas a la API del IGAC del 25 de octubre de 2026. Valores monetarios nominales</w:t>
+      </w:r>
+      <w:r>
+        <w:rPr>
+          <w:rFonts w:eastAsia="Times New Roman" w:cstheme="minorHAnsi"/>
+          <w:kern w:val="0"/>
+          <w:lang w:eastAsia="es-CO"/>
+          <w14:ligatures w14:val="none"/>
+        </w:rPr>
+        <w:t>.</w:t>
       </w:r>
     </w:p>
     <w:p>
@@ -1149,7 +1884,35 @@
     <w:p>
       <w:pPr>
         <w:spacing w:after="0" w:line="300" w:lineRule="atLeast"/>
-        <w:jc w:val="right"/>
+        <w:jc w:val="both"/>
+        <w:rPr>
+          <w:rFonts w:eastAsia="Times New Roman" w:cstheme="minorHAnsi"/>
+          <w:i/>
+          <w:iCs/>
+          <w:kern w:val="0"/>
+          <w:sz w:val="18"/>
+          <w:szCs w:val="18"/>
+          <w:lang w:eastAsia="es-CO"/>
+          <w14:ligatures w14:val="none"/>
+        </w:rPr>
+      </w:pPr>
+      <w:r>
+        <w:rPr>
+          <w:rFonts w:eastAsia="Times New Roman" w:cstheme="minorHAnsi"/>
+          <w:i/>
+          <w:iCs/>
+          <w:kern w:val="0"/>
+          <w:sz w:val="18"/>
+          <w:szCs w:val="18"/>
+          <w:lang w:eastAsia="es-CO"/>
+          <w14:ligatures w14:val="none"/>
+        </w:rPr>
+        <w:t>Figura 1. Registros preseleccionados de compraventa urbana por municipio, 2015–2023.</w:t>
+      </w:r>
+    </w:p>
+    <w:p>
+      <w:pPr>
+        <w:spacing w:after="0" w:line="300" w:lineRule="atLeast"/>
         <w:rPr>
           <w:rFonts w:eastAsia="Times New Roman" w:cstheme="minorHAnsi"/>
           <w:kern w:val="0"/>
@@ -1157,25 +1920,461 @@
           <w14:ligatures w14:val="none"/>
         </w:rPr>
       </w:pPr>
-      <w:r>
+    </w:p>
+    <w:p>
+      <w:pPr>
+        <w:spacing w:after="0" w:line="300" w:lineRule="atLeast"/>
+        <w:jc w:val="both"/>
         <w:rPr>
           <w:rFonts w:eastAsia="Times New Roman" w:cstheme="minorHAnsi"/>
           <w:kern w:val="0"/>
           <w:lang w:eastAsia="es-CO"/>
           <w14:ligatures w14:val="none"/>
         </w:rPr>
-        <w:t>Figura 1. Compraventas urbanas registradas por municipio, 2015–2023.</w:t>
-      </w:r>
-    </w:p>
-    <w:p>
-      <w:pPr>
-        <w:spacing w:after="0" w:line="300" w:lineRule="atLeast"/>
+      </w:pPr>
+      <w:r>
         <w:rPr>
           <w:rFonts w:eastAsia="Times New Roman" w:cstheme="minorHAnsi"/>
           <w:kern w:val="0"/>
           <w:lang w:eastAsia="es-CO"/>
           <w14:ligatures w14:val="none"/>
         </w:rPr>
+        <w:t>Armenia presenta la mayor cantidad de registros preseleccionados en todos los años analizados. Manizales ocupa el segundo lugar en la mayoría de los años, mientras Pereira la supera en 2016 y 2017. En 2020 se observa una disminución respecto a 2019 en los tres municipios y un aumento en 2021. Posteriormente, sus comportamientos difieren: Armenia disminuye en 2022 y 2023, mientras Manizales y Pereira aumentan en 2022 y disminuyen en 2023.</w:t>
+      </w:r>
+    </w:p>
+    <w:p>
+      <w:pPr>
+        <w:spacing w:after="0" w:line="300" w:lineRule="atLeast"/>
+        <w:rPr>
+          <w:rFonts w:eastAsia="Times New Roman" w:cstheme="minorHAnsi"/>
+          <w:kern w:val="0"/>
+          <w:lang w:eastAsia="es-CO"/>
+          <w14:ligatures w14:val="none"/>
+        </w:rPr>
+      </w:pPr>
+    </w:p>
+    <w:tbl>
+      <w:tblPr>
+        <w:tblStyle w:val="PlainTable2"/>
+        <w:tblW w:w="6507" w:type="dxa"/>
+        <w:tblLook w:val="04A0" w:firstRow="1" w:lastRow="0" w:firstColumn="1" w:lastColumn="0" w:noHBand="0" w:noVBand="1"/>
+      </w:tblPr>
+      <w:tblGrid>
+        <w:gridCol w:w="2724"/>
+        <w:gridCol w:w="1877"/>
+        <w:gridCol w:w="1906"/>
+      </w:tblGrid>
+      <w:tr>
+        <w:trPr>
+          <w:cnfStyle w:val="100000000000" w:firstRow="1" w:lastRow="0" w:firstColumn="0" w:lastColumn="0" w:oddVBand="0" w:evenVBand="0" w:oddHBand="0" w:evenHBand="0" w:firstRowFirstColumn="0" w:firstRowLastColumn="0" w:lastRowFirstColumn="0" w:lastRowLastColumn="0"/>
+          <w:trHeight w:val="355"/>
+        </w:trPr>
+        <w:tc>
+          <w:tcPr>
+            <w:cnfStyle w:val="001000000000" w:firstRow="0" w:lastRow="0" w:firstColumn="1" w:lastColumn="0" w:oddVBand="0" w:evenVBand="0" w:oddHBand="0" w:evenHBand="0" w:firstRowFirstColumn="0" w:firstRowLastColumn="0" w:lastRowFirstColumn="0" w:lastRowLastColumn="0"/>
+            <w:tcW w:w="0" w:type="auto"/>
+            <w:hideMark/>
+          </w:tcPr>
+          <w:p>
+            <w:pPr>
+              <w:spacing w:line="300" w:lineRule="atLeast"/>
+              <w:rPr>
+                <w:rFonts w:eastAsia="Times New Roman" w:cstheme="minorHAnsi"/>
+                <w:i/>
+                <w:iCs/>
+                <w:kern w:val="0"/>
+                <w:lang w:eastAsia="es-CO"/>
+                <w14:ligatures w14:val="none"/>
+              </w:rPr>
+            </w:pPr>
+            <w:r>
+              <w:rPr>
+                <w:rFonts w:eastAsia="Times New Roman" w:cstheme="minorHAnsi"/>
+                <w:i/>
+                <w:iCs/>
+                <w:kern w:val="0"/>
+                <w:lang w:eastAsia="es-CO"/>
+                <w14:ligatures w14:val="none"/>
+              </w:rPr>
+              <w:t>Dato de 2015–2023</w:t>
+            </w:r>
+          </w:p>
+        </w:tc>
+        <w:tc>
+          <w:tcPr>
+            <w:tcW w:w="0" w:type="auto"/>
+            <w:hideMark/>
+          </w:tcPr>
+          <w:p>
+            <w:pPr>
+              <w:spacing w:line="300" w:lineRule="atLeast"/>
+              <w:cnfStyle w:val="100000000000" w:firstRow="1" w:lastRow="0" w:firstColumn="0" w:lastColumn="0" w:oddVBand="0" w:evenVBand="0" w:oddHBand="0" w:evenHBand="0" w:firstRowFirstColumn="0" w:firstRowLastColumn="0" w:lastRowFirstColumn="0" w:lastRowLastColumn="0"/>
+              <w:rPr>
+                <w:rFonts w:eastAsia="Times New Roman" w:cstheme="minorHAnsi"/>
+                <w:i/>
+                <w:iCs/>
+                <w:kern w:val="0"/>
+                <w:lang w:eastAsia="es-CO"/>
+                <w14:ligatures w14:val="none"/>
+              </w:rPr>
+            </w:pPr>
+            <w:r>
+              <w:rPr>
+                <w:rFonts w:eastAsia="Times New Roman" w:cstheme="minorHAnsi"/>
+                <w:i/>
+                <w:iCs/>
+                <w:kern w:val="0"/>
+                <w:lang w:eastAsia="es-CO"/>
+                <w14:ligatures w14:val="none"/>
+              </w:rPr>
+              <w:t>Mediana</w:t>
+            </w:r>
+          </w:p>
+        </w:tc>
+        <w:tc>
+          <w:tcPr>
+            <w:tcW w:w="0" w:type="auto"/>
+            <w:hideMark/>
+          </w:tcPr>
+          <w:p>
+            <w:pPr>
+              <w:spacing w:line="300" w:lineRule="atLeast"/>
+              <w:cnfStyle w:val="100000000000" w:firstRow="1" w:lastRow="0" w:firstColumn="0" w:lastColumn="0" w:oddVBand="0" w:evenVBand="0" w:oddHBand="0" w:evenHBand="0" w:firstRowFirstColumn="0" w:firstRowLastColumn="0" w:lastRowFirstColumn="0" w:lastRowLastColumn="0"/>
+              <w:rPr>
+                <w:rFonts w:eastAsia="Times New Roman" w:cstheme="minorHAnsi"/>
+                <w:i/>
+                <w:iCs/>
+                <w:kern w:val="0"/>
+                <w:lang w:eastAsia="es-CO"/>
+                <w14:ligatures w14:val="none"/>
+              </w:rPr>
+            </w:pPr>
+            <w:r>
+              <w:rPr>
+                <w:rFonts w:eastAsia="Times New Roman" w:cstheme="minorHAnsi"/>
+                <w:i/>
+                <w:iCs/>
+                <w:kern w:val="0"/>
+                <w:lang w:eastAsia="es-CO"/>
+                <w14:ligatures w14:val="none"/>
+              </w:rPr>
+              <w:t>Promedio</w:t>
+            </w:r>
+          </w:p>
+        </w:tc>
+      </w:tr>
+      <w:tr>
+        <w:trPr>
+          <w:cnfStyle w:val="000000100000" w:firstRow="0" w:lastRow="0" w:firstColumn="0" w:lastColumn="0" w:oddVBand="0" w:evenVBand="0" w:oddHBand="1" w:evenHBand="0" w:firstRowFirstColumn="0" w:firstRowLastColumn="0" w:lastRowFirstColumn="0" w:lastRowLastColumn="0"/>
+          <w:trHeight w:val="355"/>
+        </w:trPr>
+        <w:tc>
+          <w:tcPr>
+            <w:cnfStyle w:val="001000000000" w:firstRow="0" w:lastRow="0" w:firstColumn="1" w:lastColumn="0" w:oddVBand="0" w:evenVBand="0" w:oddHBand="0" w:evenHBand="0" w:firstRowFirstColumn="0" w:firstRowLastColumn="0" w:lastRowFirstColumn="0" w:lastRowLastColumn="0"/>
+            <w:tcW w:w="0" w:type="auto"/>
+            <w:hideMark/>
+          </w:tcPr>
+          <w:p>
+            <w:pPr>
+              <w:spacing w:line="300" w:lineRule="atLeast"/>
+              <w:rPr>
+                <w:rFonts w:eastAsia="Times New Roman" w:cstheme="minorHAnsi"/>
+                <w:i/>
+                <w:iCs/>
+                <w:kern w:val="0"/>
+                <w:lang w:eastAsia="es-CO"/>
+                <w14:ligatures w14:val="none"/>
+              </w:rPr>
+            </w:pPr>
+            <w:r>
+              <w:rPr>
+                <w:rFonts w:eastAsia="Times New Roman" w:cstheme="minorHAnsi"/>
+                <w:i/>
+                <w:iCs/>
+                <w:kern w:val="0"/>
+                <w:lang w:eastAsia="es-CO"/>
+                <w14:ligatures w14:val="none"/>
+              </w:rPr>
+              <w:t>Mediana de Armenia</w:t>
+            </w:r>
+          </w:p>
+        </w:tc>
+        <w:tc>
+          <w:tcPr>
+            <w:tcW w:w="0" w:type="auto"/>
+            <w:hideMark/>
+          </w:tcPr>
+          <w:p>
+            <w:pPr>
+              <w:spacing w:line="300" w:lineRule="atLeast"/>
+              <w:cnfStyle w:val="000000100000" w:firstRow="0" w:lastRow="0" w:firstColumn="0" w:lastColumn="0" w:oddVBand="0" w:evenVBand="0" w:oddHBand="1" w:evenHBand="0" w:firstRowFirstColumn="0" w:firstRowLastColumn="0" w:lastRowFirstColumn="0" w:lastRowLastColumn="0"/>
+              <w:rPr>
+                <w:rFonts w:eastAsia="Times New Roman" w:cstheme="minorHAnsi"/>
+                <w:i/>
+                <w:iCs/>
+                <w:kern w:val="0"/>
+                <w:lang w:eastAsia="es-CO"/>
+                <w14:ligatures w14:val="none"/>
+              </w:rPr>
+            </w:pPr>
+            <w:r>
+              <w:rPr>
+                <w:rFonts w:eastAsia="Times New Roman" w:cstheme="minorHAnsi"/>
+                <w:i/>
+                <w:iCs/>
+                <w:kern w:val="0"/>
+                <w:lang w:eastAsia="es-CO"/>
+                <w14:ligatures w14:val="none"/>
+              </w:rPr>
+              <w:t>$68 millones</w:t>
+            </w:r>
+          </w:p>
+        </w:tc>
+        <w:tc>
+          <w:tcPr>
+            <w:tcW w:w="0" w:type="auto"/>
+            <w:hideMark/>
+          </w:tcPr>
+          <w:p>
+            <w:pPr>
+              <w:spacing w:line="300" w:lineRule="atLeast"/>
+              <w:cnfStyle w:val="000000100000" w:firstRow="0" w:lastRow="0" w:firstColumn="0" w:lastColumn="0" w:oddVBand="0" w:evenVBand="0" w:oddHBand="1" w:evenHBand="0" w:firstRowFirstColumn="0" w:firstRowLastColumn="0" w:lastRowFirstColumn="0" w:lastRowLastColumn="0"/>
+              <w:rPr>
+                <w:rFonts w:eastAsia="Times New Roman" w:cstheme="minorHAnsi"/>
+                <w:i/>
+                <w:iCs/>
+                <w:kern w:val="0"/>
+                <w:lang w:eastAsia="es-CO"/>
+                <w14:ligatures w14:val="none"/>
+              </w:rPr>
+            </w:pPr>
+            <w:r>
+              <w:rPr>
+                <w:rFonts w:eastAsia="Times New Roman" w:cstheme="minorHAnsi"/>
+                <w:b/>
+                <w:bCs/>
+                <w:i/>
+                <w:iCs/>
+                <w:kern w:val="0"/>
+                <w:lang w:eastAsia="es-CO"/>
+                <w14:ligatures w14:val="none"/>
+              </w:rPr>
+              <w:t>$70 millones</w:t>
+            </w:r>
+          </w:p>
+        </w:tc>
+      </w:tr>
+      <w:tr>
+        <w:trPr>
+          <w:trHeight w:val="355"/>
+        </w:trPr>
+        <w:tc>
+          <w:tcPr>
+            <w:cnfStyle w:val="001000000000" w:firstRow="0" w:lastRow="0" w:firstColumn="1" w:lastColumn="0" w:oddVBand="0" w:evenVBand="0" w:oddHBand="0" w:evenHBand="0" w:firstRowFirstColumn="0" w:firstRowLastColumn="0" w:lastRowFirstColumn="0" w:lastRowLastColumn="0"/>
+            <w:tcW w:w="0" w:type="auto"/>
+            <w:hideMark/>
+          </w:tcPr>
+          <w:p>
+            <w:pPr>
+              <w:spacing w:line="300" w:lineRule="atLeast"/>
+              <w:rPr>
+                <w:rFonts w:eastAsia="Times New Roman" w:cstheme="minorHAnsi"/>
+                <w:i/>
+                <w:iCs/>
+                <w:kern w:val="0"/>
+                <w:lang w:eastAsia="es-CO"/>
+                <w14:ligatures w14:val="none"/>
+              </w:rPr>
+            </w:pPr>
+            <w:r>
+              <w:rPr>
+                <w:rFonts w:eastAsia="Times New Roman" w:cstheme="minorHAnsi"/>
+                <w:i/>
+                <w:iCs/>
+                <w:kern w:val="0"/>
+                <w:lang w:eastAsia="es-CO"/>
+                <w14:ligatures w14:val="none"/>
+              </w:rPr>
+              <w:t>Promedio de Armenia</w:t>
+            </w:r>
+          </w:p>
+        </w:tc>
+        <w:tc>
+          <w:tcPr>
+            <w:tcW w:w="0" w:type="auto"/>
+            <w:hideMark/>
+          </w:tcPr>
+          <w:p>
+            <w:pPr>
+              <w:spacing w:line="300" w:lineRule="atLeast"/>
+              <w:cnfStyle w:val="000000000000" w:firstRow="0" w:lastRow="0" w:firstColumn="0" w:lastColumn="0" w:oddVBand="0" w:evenVBand="0" w:oddHBand="0" w:evenHBand="0" w:firstRowFirstColumn="0" w:firstRowLastColumn="0" w:lastRowFirstColumn="0" w:lastRowLastColumn="0"/>
+              <w:rPr>
+                <w:rFonts w:eastAsia="Times New Roman" w:cstheme="minorHAnsi"/>
+                <w:i/>
+                <w:iCs/>
+                <w:kern w:val="0"/>
+                <w:lang w:eastAsia="es-CO"/>
+                <w14:ligatures w14:val="none"/>
+              </w:rPr>
+            </w:pPr>
+            <w:r>
+              <w:rPr>
+                <w:rFonts w:eastAsia="Times New Roman" w:cstheme="minorHAnsi"/>
+                <w:i/>
+                <w:iCs/>
+                <w:kern w:val="0"/>
+                <w:lang w:eastAsia="es-CO"/>
+                <w14:ligatures w14:val="none"/>
+              </w:rPr>
+              <w:t>$101,6 millones</w:t>
+            </w:r>
+          </w:p>
+        </w:tc>
+        <w:tc>
+          <w:tcPr>
+            <w:tcW w:w="0" w:type="auto"/>
+            <w:hideMark/>
+          </w:tcPr>
+          <w:p>
+            <w:pPr>
+              <w:spacing w:line="300" w:lineRule="atLeast"/>
+              <w:cnfStyle w:val="000000000000" w:firstRow="0" w:lastRow="0" w:firstColumn="0" w:lastColumn="0" w:oddVBand="0" w:evenVBand="0" w:oddHBand="0" w:evenHBand="0" w:firstRowFirstColumn="0" w:firstRowLastColumn="0" w:lastRowFirstColumn="0" w:lastRowLastColumn="0"/>
+              <w:rPr>
+                <w:rFonts w:eastAsia="Times New Roman" w:cstheme="minorHAnsi"/>
+                <w:i/>
+                <w:iCs/>
+                <w:kern w:val="0"/>
+                <w:lang w:eastAsia="es-CO"/>
+                <w14:ligatures w14:val="none"/>
+              </w:rPr>
+            </w:pPr>
+            <w:r>
+              <w:rPr>
+                <w:rFonts w:eastAsia="Times New Roman" w:cstheme="minorHAnsi"/>
+                <w:b/>
+                <w:bCs/>
+                <w:i/>
+                <w:iCs/>
+                <w:kern w:val="0"/>
+                <w:lang w:eastAsia="es-CO"/>
+                <w14:ligatures w14:val="none"/>
+              </w:rPr>
+              <w:t>$102,4 millones</w:t>
+            </w:r>
+          </w:p>
+        </w:tc>
+      </w:tr>
+      <w:tr>
+        <w:trPr>
+          <w:cnfStyle w:val="000000100000" w:firstRow="0" w:lastRow="0" w:firstColumn="0" w:lastColumn="0" w:oddVBand="0" w:evenVBand="0" w:oddHBand="1" w:evenHBand="0" w:firstRowFirstColumn="0" w:firstRowLastColumn="0" w:lastRowFirstColumn="0" w:lastRowLastColumn="0"/>
+          <w:trHeight w:val="355"/>
+        </w:trPr>
+        <w:tc>
+          <w:tcPr>
+            <w:cnfStyle w:val="001000000000" w:firstRow="0" w:lastRow="0" w:firstColumn="1" w:lastColumn="0" w:oddVBand="0" w:evenVBand="0" w:oddHBand="0" w:evenHBand="0" w:firstRowFirstColumn="0" w:firstRowLastColumn="0" w:lastRowFirstColumn="0" w:lastRowLastColumn="0"/>
+            <w:tcW w:w="0" w:type="auto"/>
+            <w:hideMark/>
+          </w:tcPr>
+          <w:p>
+            <w:pPr>
+              <w:spacing w:line="300" w:lineRule="atLeast"/>
+              <w:rPr>
+                <w:rFonts w:eastAsia="Times New Roman" w:cstheme="minorHAnsi"/>
+                <w:i/>
+                <w:iCs/>
+                <w:kern w:val="0"/>
+                <w:lang w:eastAsia="es-CO"/>
+                <w14:ligatures w14:val="none"/>
+              </w:rPr>
+            </w:pPr>
+            <w:r>
+              <w:rPr>
+                <w:rFonts w:eastAsia="Times New Roman" w:cstheme="minorHAnsi"/>
+                <w:i/>
+                <w:iCs/>
+                <w:kern w:val="0"/>
+                <w:lang w:eastAsia="es-CO"/>
+                <w14:ligatures w14:val="none"/>
+              </w:rPr>
+              <w:t>Promedio de Manizales</w:t>
+            </w:r>
+          </w:p>
+        </w:tc>
+        <w:tc>
+          <w:tcPr>
+            <w:tcW w:w="0" w:type="auto"/>
+            <w:hideMark/>
+          </w:tcPr>
+          <w:p>
+            <w:pPr>
+              <w:spacing w:line="300" w:lineRule="atLeast"/>
+              <w:cnfStyle w:val="000000100000" w:firstRow="0" w:lastRow="0" w:firstColumn="0" w:lastColumn="0" w:oddVBand="0" w:evenVBand="0" w:oddHBand="1" w:evenHBand="0" w:firstRowFirstColumn="0" w:firstRowLastColumn="0" w:lastRowFirstColumn="0" w:lastRowLastColumn="0"/>
+              <w:rPr>
+                <w:rFonts w:eastAsia="Times New Roman" w:cstheme="minorHAnsi"/>
+                <w:i/>
+                <w:iCs/>
+                <w:kern w:val="0"/>
+                <w:lang w:eastAsia="es-CO"/>
+                <w14:ligatures w14:val="none"/>
+              </w:rPr>
+            </w:pPr>
+            <w:r>
+              <w:rPr>
+                <w:rFonts w:eastAsia="Times New Roman" w:cstheme="minorHAnsi"/>
+                <w:i/>
+                <w:iCs/>
+                <w:kern w:val="0"/>
+                <w:lang w:eastAsia="es-CO"/>
+                <w14:ligatures w14:val="none"/>
+              </w:rPr>
+              <w:t>$210,2 millones</w:t>
+            </w:r>
+          </w:p>
+        </w:tc>
+        <w:tc>
+          <w:tcPr>
+            <w:tcW w:w="0" w:type="auto"/>
+            <w:hideMark/>
+          </w:tcPr>
+          <w:p>
+            <w:pPr>
+              <w:spacing w:line="300" w:lineRule="atLeast"/>
+              <w:cnfStyle w:val="000000100000" w:firstRow="0" w:lastRow="0" w:firstColumn="0" w:lastColumn="0" w:oddVBand="0" w:evenVBand="0" w:oddHBand="1" w:evenHBand="0" w:firstRowFirstColumn="0" w:firstRowLastColumn="0" w:lastRowFirstColumn="0" w:lastRowLastColumn="0"/>
+              <w:rPr>
+                <w:rFonts w:eastAsia="Times New Roman" w:cstheme="minorHAnsi"/>
+                <w:i/>
+                <w:iCs/>
+                <w:kern w:val="0"/>
+                <w:lang w:eastAsia="es-CO"/>
+                <w14:ligatures w14:val="none"/>
+              </w:rPr>
+            </w:pPr>
+            <w:r>
+              <w:rPr>
+                <w:rFonts w:eastAsia="Times New Roman" w:cstheme="minorHAnsi"/>
+                <w:b/>
+                <w:bCs/>
+                <w:i/>
+                <w:iCs/>
+                <w:kern w:val="0"/>
+                <w:lang w:eastAsia="es-CO"/>
+                <w14:ligatures w14:val="none"/>
+              </w:rPr>
+              <w:t>$193,0 millones</w:t>
+            </w:r>
+          </w:p>
+        </w:tc>
+      </w:tr>
+    </w:tbl>
+    <w:p>
+      <w:pPr>
+        <w:spacing w:after="0" w:line="300" w:lineRule="atLeast"/>
+        <w:rPr>
+          <w:rFonts w:eastAsia="Times New Roman" w:cstheme="minorHAnsi"/>
+          <w:kern w:val="0"/>
+          <w:lang w:eastAsia="es-CO"/>
+          <w14:ligatures w14:val="none"/>
+        </w:rPr>
       </w:pPr>
     </w:p>
     <w:p>
@@ -1196,39 +2395,225 @@
           <w:lang w:eastAsia="es-CO"/>
           <w14:ligatures w14:val="none"/>
         </w:rPr>
-        <w:t xml:space="preserve">La comparación muestra que </w:t>
-      </w:r>
-      <w:r>
-        <w:rPr>
-          <w:rFonts w:eastAsia="Times New Roman" w:cstheme="minorHAnsi"/>
-          <w:b/>
-          <w:bCs/>
-          <w:kern w:val="0"/>
-          <w:lang w:eastAsia="es-CO"/>
-          <w14:ligatures w14:val="none"/>
-        </w:rPr>
-        <w:t>Armenia presenta la mayor cantidad de registros durante todo el periodo analizado</w:t>
-      </w:r>
-      <w:r>
+        <w:t>Al revisar los valores registrados durante 2015–2023, encontramos diferencias entre el promedio y la mediana. Armenia presenta una mediana de $70 millones y un promedio de $102,4 millones; Manizales, una mediana de $99 millones y un promedio de $193,0 millones; y Pereira, una mediana de $92,5 millones y un promedio de $283,9 millones. Estas diferencias, junto con los valores extremos observados, muestran que el promedio puede estar influido por operaciones con montos elevados. Por ello, utilizamos la mediana como una medida menos sensible a esos valores.</w:t>
+      </w:r>
+    </w:p>
+    <w:p>
+      <w:pPr>
+        <w:spacing w:after="0" w:line="300" w:lineRule="atLeast"/>
+        <w:jc w:val="both"/>
         <w:rPr>
           <w:rFonts w:eastAsia="Times New Roman" w:cstheme="minorHAnsi"/>
           <w:kern w:val="0"/>
           <w:lang w:eastAsia="es-CO"/>
           <w14:ligatures w14:val="none"/>
         </w:rPr>
-        <w:t>, seguida por Manizales y Pereira. También se observa una disminución de las compraventas registradas en los tres municipios durante 2020 y una recuperación en 2021. A partir de ese momento, los municipios presentan comportamientos diferentes, lo que permite observar que la actividad transaccional no ha evolucionado de la misma manera en las tres ciudades.</w:t>
-      </w:r>
-    </w:p>
-    <w:p>
-      <w:pPr>
-        <w:spacing w:after="0" w:line="300" w:lineRule="atLeast"/>
+      </w:pPr>
+      <w:r>
         <w:rPr>
           <w:rFonts w:eastAsia="Times New Roman" w:cstheme="minorHAnsi"/>
           <w:kern w:val="0"/>
           <w:lang w:eastAsia="es-CO"/>
           <w14:ligatures w14:val="none"/>
         </w:rPr>
-      </w:pPr>
+        <w:t>Entre 2015 y 2023, la mediana anual pasó de $45,1 millones a $108 millones en Armenia, de $83,1 millones a $135 millones en Manizales y de $79,7 millones a $123 millones en Pereira. Los montos son nominales y corresponden a registros que cumplen los filtros definidos. Su evolución no representa necesariamente la valorización de los mismos inmuebles, pues puede cambiar la composición de las operaciones y los valores no están ajustados por inflación.</w:t>
+      </w:r>
+    </w:p>
+    <w:p>
+      <w:pPr>
+        <w:spacing w:after="0" w:line="300" w:lineRule="atLeast"/>
+        <w:rPr>
+          <w:rFonts w:eastAsia="Times New Roman" w:cstheme="minorHAnsi"/>
+          <w:kern w:val="0"/>
+          <w:lang w:eastAsia="es-CO"/>
+          <w14:ligatures w14:val="none"/>
+        </w:rPr>
+      </w:pPr>
+    </w:p>
+    <w:p>
+      <w:pPr>
+        <w:pStyle w:val="Subtitle"/>
+        <w:rPr>
+          <w:rFonts w:eastAsia="Times New Roman"/>
+          <w:lang w:eastAsia="es-CO"/>
+        </w:rPr>
+      </w:pPr>
+      <w:r>
+        <w:rPr>
+          <w:rFonts w:eastAsia="Times New Roman"/>
+          <w:lang w:eastAsia="es-CO"/>
+        </w:rPr>
+        <w:t>Cobertura y calidad.</w:t>
+      </w:r>
+    </w:p>
+    <w:p>
+      <w:pPr>
+        <w:spacing w:after="0" w:line="300" w:lineRule="atLeast"/>
+        <w:jc w:val="both"/>
+        <w:rPr>
+          <w:rFonts w:eastAsia="Times New Roman" w:cstheme="minorHAnsi"/>
+          <w:kern w:val="0"/>
+          <w:lang w:eastAsia="es-CO"/>
+          <w14:ligatures w14:val="none"/>
+        </w:rPr>
+      </w:pPr>
+      <w:r>
+        <w:rPr>
+          <w:rFonts w:eastAsia="Times New Roman" w:cstheme="minorHAnsi"/>
+          <w:kern w:val="0"/>
+          <w:lang w:eastAsia="es-CO"/>
+          <w14:ligatures w14:val="none"/>
+        </w:rPr>
+        <w:t>La consulta identificó 214.190 registros de compraventa urbana para los tres municipios y el periodo seleccionado. De estos, 214.036 cumplen las condiciones de valor positivo y ausencia de indicador de múltiples valores, equivalentes al 99,93 %. Los 154 registros restantes podrán considerarse para describir actividad registral, pero se excluyen del análisis monetario bajo los filtros definidos. Esta cobertura no garantiza la calidad completa de los datos; todavía deben revisarse duplicados, inconsistencias y valores extremos.</w:t>
+      </w:r>
+    </w:p>
+    <w:p>
+      <w:pPr>
+        <w:spacing w:after="0" w:line="300" w:lineRule="atLeast"/>
+        <w:jc w:val="both"/>
+        <w:rPr>
+          <w:rFonts w:eastAsia="Times New Roman" w:cstheme="minorHAnsi"/>
+          <w:kern w:val="0"/>
+          <w:lang w:eastAsia="es-CO"/>
+          <w14:ligatures w14:val="none"/>
+        </w:rPr>
+      </w:pPr>
+    </w:p>
+    <w:p>
+      <w:pPr>
+        <w:pStyle w:val="Subtitle"/>
+        <w:rPr>
+          <w:rFonts w:eastAsia="Times New Roman"/>
+          <w:lang w:eastAsia="es-CO"/>
+        </w:rPr>
+      </w:pPr>
+      <w:r>
+        <w:rPr>
+          <w:rFonts w:eastAsia="Times New Roman"/>
+          <w:lang w:eastAsia="es-CO"/>
+        </w:rPr>
+        <w:lastRenderedPageBreak/>
+        <w:t>Conclusión.</w:t>
+      </w:r>
+    </w:p>
+    <w:p>
+      <w:pPr>
+        <w:spacing w:after="0" w:line="300" w:lineRule="atLeast"/>
+        <w:jc w:val="both"/>
+        <w:rPr>
+          <w:rFonts w:eastAsia="Times New Roman" w:cstheme="minorHAnsi"/>
+          <w:kern w:val="0"/>
+          <w:lang w:eastAsia="es-CO"/>
+          <w14:ligatures w14:val="none"/>
+        </w:rPr>
+      </w:pPr>
+      <w:r>
+        <w:rPr>
+          <w:rFonts w:eastAsia="Times New Roman" w:cstheme="minorHAnsi"/>
+          <w:kern w:val="0"/>
+          <w:lang w:eastAsia="es-CO"/>
+          <w14:ligatures w14:val="none"/>
+        </w:rPr>
+        <w:t xml:space="preserve">La exploración respalda el uso de indicadores descriptivos para comparar los municipios y muestra la necesidad de utilizar medidas resistentes a valores extremos, como la mediana y los cuartiles. Las diferencias monetarias no representan valorización de un mismo inmueble, pues pueden cambiar las características de las operaciones registradas. </w:t>
+      </w:r>
+      <w:bookmarkStart w:id="4" w:name="_Toc243490729"/>
+    </w:p>
+    <w:p>
+      <w:pPr>
+        <w:spacing w:after="0" w:line="300" w:lineRule="atLeast"/>
+        <w:jc w:val="both"/>
+        <w:rPr>
+          <w:rFonts w:eastAsia="Times New Roman" w:cstheme="minorHAnsi"/>
+          <w:kern w:val="0"/>
+          <w:lang w:eastAsia="es-CO"/>
+          <w14:ligatures w14:val="none"/>
+        </w:rPr>
+      </w:pPr>
+    </w:p>
+    <w:p>
+      <w:pPr>
+        <w:spacing w:after="0" w:line="300" w:lineRule="atLeast"/>
+        <w:jc w:val="both"/>
+        <w:rPr>
+          <w:rFonts w:asciiTheme="majorHAnsi" w:eastAsiaTheme="majorEastAsia" w:hAnsiTheme="majorHAnsi" w:cstheme="majorBidi"/>
+          <w:color w:val="2F5496" w:themeColor="accent1" w:themeShade="BF"/>
+          <w:sz w:val="40"/>
+          <w:szCs w:val="40"/>
+        </w:rPr>
+      </w:pPr>
+      <w:r>
+        <w:rPr>
+          <w:rFonts w:asciiTheme="majorHAnsi" w:eastAsiaTheme="majorEastAsia" w:hAnsiTheme="majorHAnsi" w:cstheme="majorBidi"/>
+          <w:color w:val="2F5496" w:themeColor="accent1" w:themeShade="BF"/>
+          <w:sz w:val="40"/>
+          <w:szCs w:val="40"/>
+        </w:rPr>
+        <w:t>Maqueta (mockup) del prototipo</w:t>
+      </w:r>
+      <w:bookmarkEnd w:id="4"/>
+    </w:p>
+    <w:p>
+      <w:pPr>
+        <w:spacing w:after="0" w:line="300" w:lineRule="atLeast"/>
+        <w:jc w:val="both"/>
+        <w:rPr>
+          <w:rFonts w:eastAsia="Times New Roman" w:cstheme="minorHAnsi"/>
+          <w:kern w:val="0"/>
+          <w:lang w:eastAsia="es-CO"/>
+          <w14:ligatures w14:val="none"/>
+        </w:rPr>
+      </w:pPr>
+      <w:r>
+        <w:rPr>
+          <w:rFonts w:eastAsia="Times New Roman" w:cstheme="minorHAnsi"/>
+          <w:kern w:val="0"/>
+          <w:lang w:eastAsia="es-CO"/>
+          <w14:ligatures w14:val="none"/>
+        </w:rPr>
+        <w:t>Como propuesta inicial, se diseñó la maqueta de un tablero dirigido a inversionistas interesados en comparar la actividad inmobiliaria de Armenia, Manizales y Pereira durante el periodo 2015–2023. El tablero presenta el número de registros de compraventa urbana, la participación de cada municipio, la variación interanual, la mediana y los cuartiles de los valores registrados. Estos indicadores permiten reconocer diferencias en el volumen de actividad, su evolución y la distribución de los montos.</w:t>
+      </w:r>
+    </w:p>
+    <w:p>
+      <w:pPr>
+        <w:spacing w:after="0" w:line="300" w:lineRule="atLeast"/>
+        <w:jc w:val="both"/>
+        <w:rPr>
+          <w:rFonts w:eastAsia="Times New Roman" w:cstheme="minorHAnsi"/>
+          <w:kern w:val="0"/>
+          <w:lang w:eastAsia="es-CO"/>
+          <w14:ligatures w14:val="none"/>
+        </w:rPr>
+      </w:pPr>
+      <w:r>
+        <w:rPr>
+          <w:rFonts w:eastAsia="Times New Roman" w:cstheme="minorHAnsi"/>
+          <w:kern w:val="0"/>
+          <w:lang w:eastAsia="es-CO"/>
+          <w14:ligatures w14:val="none"/>
+        </w:rPr>
+        <w:t>La maqueta también incluye una sección de cobertura y calidad de los datos, espacios previstos para las estimaciones de valores registrados y las alertas de operaciones atípicas, y una pantalla para justificar qué municipio estudiar con mayor profundidad utilizando indicadores y reconociendo las limitaciones de la información. Las estimaciones y alertas se presentan como componentes pendientes de desarrollo y evaluación.</w:t>
+      </w:r>
+    </w:p>
+    <w:p>
+      <w:pPr>
+        <w:spacing w:after="0" w:line="300" w:lineRule="atLeast"/>
+        <w:jc w:val="both"/>
+        <w:rPr>
+          <w:rFonts w:eastAsia="Times New Roman" w:cstheme="minorHAnsi"/>
+          <w:kern w:val="0"/>
+          <w:lang w:eastAsia="es-CO"/>
+          <w14:ligatures w14:val="none"/>
+        </w:rPr>
+      </w:pPr>
+      <w:r>
+        <w:rPr>
+          <w:rFonts w:eastAsia="Times New Roman" w:cstheme="minorHAnsi"/>
+          <w:kern w:val="0"/>
+          <w:lang w:eastAsia="es-CO"/>
+          <w14:ligatures w14:val="none"/>
+        </w:rPr>
+        <w:t>El propósito es facilitar una comparación comprensible que apoye la priorización de municipios para estudios posteriores. La maqueta representa la organización y el funcionamiento esperado del producto; sus botones y filtros son ilustrativos y sus resultados no constituyen recomendaciones directas de inversión ni garantías de rentabilidad.</w:t>
+      </w:r>
     </w:p>
     <w:p>
       <w:pPr>
@@ -1249,10 +2634,18 @@
           <w14:ligatures w14:val="none"/>
         </w:rPr>
         <w:drawing>
-          <wp:inline distT="0" distB="0" distL="0" distR="0" wp14:anchorId="63FCDDB2" wp14:editId="4B68ECC0">
-            <wp:extent cx="5612130" cy="3217545"/>
-            <wp:effectExtent l="0" t="0" r="7620" b="1905"/>
-            <wp:docPr id="177095938" name="Imagen 1"/>
+          <wp:anchor distT="0" distB="0" distL="114300" distR="114300" simplePos="0" relativeHeight="251658240" behindDoc="0" locked="0" layoutInCell="1" allowOverlap="1" wp14:anchorId="4A60AD96" wp14:editId="7B68A0D4">
+            <wp:simplePos x="0" y="0"/>
+            <wp:positionH relativeFrom="margin">
+              <wp:align>left</wp:align>
+            </wp:positionH>
+            <wp:positionV relativeFrom="paragraph">
+              <wp:posOffset>191721</wp:posOffset>
+            </wp:positionV>
+            <wp:extent cx="5767754" cy="3259133"/>
+            <wp:effectExtent l="0" t="0" r="4445" b="0"/>
+            <wp:wrapNone/>
+            <wp:docPr id="676672375" name="Picture 1"/>
             <wp:cNvGraphicFramePr>
               <a:graphicFrameLocks xmlns:a="http://schemas.openxmlformats.org/drawingml/2006/main" noChangeAspect="1"/>
             </wp:cNvGraphicFramePr>
@@ -1260,11 +2653,17 @@
               <a:graphicData uri="http://schemas.openxmlformats.org/drawingml/2006/picture">
                 <pic:pic xmlns:pic="http://schemas.openxmlformats.org/drawingml/2006/picture">
                   <pic:nvPicPr>
-                    <pic:cNvPr id="177095938" name=""/>
+                    <pic:cNvPr id="676672375" name=""/>
                     <pic:cNvPicPr/>
                   </pic:nvPicPr>
                   <pic:blipFill>
-                    <a:blip r:embed="rId7"/>
+                    <a:blip r:embed="rId7">
+                      <a:extLst>
+                        <a:ext uri="{28A0092B-C50C-407E-A947-70E740481C1C}">
+                          <a14:useLocalDpi xmlns:a14="http://schemas.microsoft.com/office/drawing/2010/main" val="0"/>
+                        </a:ext>
+                      </a:extLst>
+                    </a:blip>
                     <a:stretch>
                       <a:fillRect/>
                     </a:stretch>
@@ -1272,7 +2671,7 @@
                   <pic:spPr>
                     <a:xfrm>
                       <a:off x="0" y="0"/>
-                      <a:ext cx="5612130" cy="3217545"/>
+                      <a:ext cx="5790387" cy="3271922"/>
                     </a:xfrm>
                     <a:prstGeom prst="rect">
                       <a:avLst/>
@@ -1281,14 +2680,287 @@
                 </pic:pic>
               </a:graphicData>
             </a:graphic>
-          </wp:inline>
+            <wp14:sizeRelH relativeFrom="page">
+              <wp14:pctWidth>0</wp14:pctWidth>
+            </wp14:sizeRelH>
+            <wp14:sizeRelV relativeFrom="page">
+              <wp14:pctHeight>0</wp14:pctHeight>
+            </wp14:sizeRelV>
+          </wp:anchor>
         </w:drawing>
       </w:r>
     </w:p>
     <w:p>
       <w:pPr>
         <w:spacing w:after="0" w:line="300" w:lineRule="atLeast"/>
-        <w:jc w:val="right"/>
+        <w:rPr>
+          <w:rFonts w:eastAsia="Times New Roman" w:cstheme="minorHAnsi"/>
+          <w:i/>
+          <w:iCs/>
+          <w:kern w:val="0"/>
+          <w:sz w:val="18"/>
+          <w:szCs w:val="18"/>
+          <w:lang w:eastAsia="es-CO"/>
+          <w14:ligatures w14:val="none"/>
+        </w:rPr>
+      </w:pPr>
+    </w:p>
+    <w:p>
+      <w:pPr>
+        <w:spacing w:after="0" w:line="300" w:lineRule="atLeast"/>
+        <w:rPr>
+          <w:rFonts w:eastAsia="Times New Roman" w:cstheme="minorHAnsi"/>
+          <w:i/>
+          <w:iCs/>
+          <w:kern w:val="0"/>
+          <w:sz w:val="18"/>
+          <w:szCs w:val="18"/>
+          <w:lang w:eastAsia="es-CO"/>
+          <w14:ligatures w14:val="none"/>
+        </w:rPr>
+      </w:pPr>
+    </w:p>
+    <w:p>
+      <w:pPr>
+        <w:spacing w:after="0" w:line="300" w:lineRule="atLeast"/>
+        <w:rPr>
+          <w:rFonts w:eastAsia="Times New Roman" w:cstheme="minorHAnsi"/>
+          <w:i/>
+          <w:iCs/>
+          <w:kern w:val="0"/>
+          <w:sz w:val="18"/>
+          <w:szCs w:val="18"/>
+          <w:lang w:eastAsia="es-CO"/>
+          <w14:ligatures w14:val="none"/>
+        </w:rPr>
+      </w:pPr>
+    </w:p>
+    <w:p>
+      <w:pPr>
+        <w:spacing w:after="0" w:line="300" w:lineRule="atLeast"/>
+        <w:rPr>
+          <w:rFonts w:eastAsia="Times New Roman" w:cstheme="minorHAnsi"/>
+          <w:i/>
+          <w:iCs/>
+          <w:kern w:val="0"/>
+          <w:sz w:val="18"/>
+          <w:szCs w:val="18"/>
+          <w:lang w:eastAsia="es-CO"/>
+          <w14:ligatures w14:val="none"/>
+        </w:rPr>
+      </w:pPr>
+    </w:p>
+    <w:p>
+      <w:pPr>
+        <w:spacing w:after="0" w:line="300" w:lineRule="atLeast"/>
+        <w:rPr>
+          <w:rFonts w:eastAsia="Times New Roman" w:cstheme="minorHAnsi"/>
+          <w:i/>
+          <w:iCs/>
+          <w:kern w:val="0"/>
+          <w:sz w:val="18"/>
+          <w:szCs w:val="18"/>
+          <w:lang w:eastAsia="es-CO"/>
+          <w14:ligatures w14:val="none"/>
+        </w:rPr>
+      </w:pPr>
+    </w:p>
+    <w:p>
+      <w:pPr>
+        <w:spacing w:after="0" w:line="300" w:lineRule="atLeast"/>
+        <w:rPr>
+          <w:rFonts w:eastAsia="Times New Roman" w:cstheme="minorHAnsi"/>
+          <w:i/>
+          <w:iCs/>
+          <w:kern w:val="0"/>
+          <w:sz w:val="18"/>
+          <w:szCs w:val="18"/>
+          <w:lang w:eastAsia="es-CO"/>
+          <w14:ligatures w14:val="none"/>
+        </w:rPr>
+      </w:pPr>
+    </w:p>
+    <w:p>
+      <w:pPr>
+        <w:spacing w:after="0" w:line="300" w:lineRule="atLeast"/>
+        <w:rPr>
+          <w:rFonts w:eastAsia="Times New Roman" w:cstheme="minorHAnsi"/>
+          <w:i/>
+          <w:iCs/>
+          <w:kern w:val="0"/>
+          <w:sz w:val="18"/>
+          <w:szCs w:val="18"/>
+          <w:lang w:eastAsia="es-CO"/>
+          <w14:ligatures w14:val="none"/>
+        </w:rPr>
+      </w:pPr>
+    </w:p>
+    <w:p>
+      <w:pPr>
+        <w:spacing w:after="0" w:line="300" w:lineRule="atLeast"/>
+        <w:rPr>
+          <w:rFonts w:eastAsia="Times New Roman" w:cstheme="minorHAnsi"/>
+          <w:i/>
+          <w:iCs/>
+          <w:kern w:val="0"/>
+          <w:sz w:val="18"/>
+          <w:szCs w:val="18"/>
+          <w:lang w:eastAsia="es-CO"/>
+          <w14:ligatures w14:val="none"/>
+        </w:rPr>
+      </w:pPr>
+      <w:r>
+        <w:rPr>
+          <w:rFonts w:eastAsia="Times New Roman" w:cstheme="minorHAnsi"/>
+          <w:i/>
+          <w:iCs/>
+          <w:kern w:val="0"/>
+          <w:sz w:val="18"/>
+          <w:szCs w:val="18"/>
+          <w:lang w:eastAsia="es-CO"/>
+          <w14:ligatures w14:val="none"/>
+        </w:rPr>
+        <w:tab/>
+      </w:r>
+    </w:p>
+    <w:p>
+      <w:pPr>
+        <w:spacing w:after="0" w:line="300" w:lineRule="atLeast"/>
+        <w:rPr>
+          <w:rFonts w:eastAsia="Times New Roman" w:cstheme="minorHAnsi"/>
+          <w:i/>
+          <w:iCs/>
+          <w:kern w:val="0"/>
+          <w:sz w:val="18"/>
+          <w:szCs w:val="18"/>
+          <w:lang w:eastAsia="es-CO"/>
+          <w14:ligatures w14:val="none"/>
+        </w:rPr>
+      </w:pPr>
+    </w:p>
+    <w:p>
+      <w:pPr>
+        <w:spacing w:after="0" w:line="300" w:lineRule="atLeast"/>
+        <w:rPr>
+          <w:rFonts w:eastAsia="Times New Roman" w:cstheme="minorHAnsi"/>
+          <w:i/>
+          <w:iCs/>
+          <w:kern w:val="0"/>
+          <w:sz w:val="18"/>
+          <w:szCs w:val="18"/>
+          <w:lang w:eastAsia="es-CO"/>
+          <w14:ligatures w14:val="none"/>
+        </w:rPr>
+      </w:pPr>
+    </w:p>
+    <w:p>
+      <w:pPr>
+        <w:spacing w:after="0" w:line="300" w:lineRule="atLeast"/>
+        <w:rPr>
+          <w:rFonts w:eastAsia="Times New Roman" w:cstheme="minorHAnsi"/>
+          <w:i/>
+          <w:iCs/>
+          <w:kern w:val="0"/>
+          <w:sz w:val="18"/>
+          <w:szCs w:val="18"/>
+          <w:lang w:eastAsia="es-CO"/>
+          <w14:ligatures w14:val="none"/>
+        </w:rPr>
+      </w:pPr>
+    </w:p>
+    <w:p>
+      <w:pPr>
+        <w:spacing w:after="0" w:line="300" w:lineRule="atLeast"/>
+        <w:rPr>
+          <w:rFonts w:eastAsia="Times New Roman" w:cstheme="minorHAnsi"/>
+          <w:i/>
+          <w:iCs/>
+          <w:kern w:val="0"/>
+          <w:sz w:val="18"/>
+          <w:szCs w:val="18"/>
+          <w:lang w:eastAsia="es-CO"/>
+          <w14:ligatures w14:val="none"/>
+        </w:rPr>
+      </w:pPr>
+    </w:p>
+    <w:p>
+      <w:pPr>
+        <w:spacing w:after="0" w:line="300" w:lineRule="atLeast"/>
+        <w:rPr>
+          <w:rFonts w:eastAsia="Times New Roman" w:cstheme="minorHAnsi"/>
+          <w:i/>
+          <w:iCs/>
+          <w:kern w:val="0"/>
+          <w:sz w:val="18"/>
+          <w:szCs w:val="18"/>
+          <w:lang w:eastAsia="es-CO"/>
+          <w14:ligatures w14:val="none"/>
+        </w:rPr>
+      </w:pPr>
+    </w:p>
+    <w:p>
+      <w:pPr>
+        <w:spacing w:after="0" w:line="300" w:lineRule="atLeast"/>
+        <w:rPr>
+          <w:rFonts w:eastAsia="Times New Roman" w:cstheme="minorHAnsi"/>
+          <w:i/>
+          <w:iCs/>
+          <w:kern w:val="0"/>
+          <w:sz w:val="18"/>
+          <w:szCs w:val="18"/>
+          <w:lang w:eastAsia="es-CO"/>
+          <w14:ligatures w14:val="none"/>
+        </w:rPr>
+      </w:pPr>
+    </w:p>
+    <w:p>
+      <w:pPr>
+        <w:spacing w:after="0" w:line="300" w:lineRule="atLeast"/>
+        <w:rPr>
+          <w:rFonts w:eastAsia="Times New Roman" w:cstheme="minorHAnsi"/>
+          <w:i/>
+          <w:iCs/>
+          <w:kern w:val="0"/>
+          <w:sz w:val="18"/>
+          <w:szCs w:val="18"/>
+          <w:lang w:eastAsia="es-CO"/>
+          <w14:ligatures w14:val="none"/>
+        </w:rPr>
+      </w:pPr>
+    </w:p>
+    <w:p>
+      <w:pPr>
+        <w:spacing w:after="0" w:line="300" w:lineRule="atLeast"/>
+        <w:rPr>
+          <w:rFonts w:eastAsia="Times New Roman" w:cstheme="minorHAnsi"/>
+          <w:i/>
+          <w:iCs/>
+          <w:kern w:val="0"/>
+          <w:sz w:val="18"/>
+          <w:szCs w:val="18"/>
+          <w:lang w:eastAsia="es-CO"/>
+          <w14:ligatures w14:val="none"/>
+        </w:rPr>
+      </w:pPr>
+    </w:p>
+    <w:p>
+      <w:pPr>
+        <w:spacing w:after="0" w:line="300" w:lineRule="atLeast"/>
+        <w:rPr>
+          <w:rFonts w:eastAsia="Times New Roman" w:cstheme="minorHAnsi"/>
+          <w:i/>
+          <w:iCs/>
+          <w:kern w:val="0"/>
+          <w:sz w:val="18"/>
+          <w:szCs w:val="18"/>
+          <w:lang w:eastAsia="es-CO"/>
+          <w14:ligatures w14:val="none"/>
+        </w:rPr>
+      </w:pPr>
+    </w:p>
+    <w:p>
+      <w:pPr>
+        <w:spacing w:after="0" w:line="300" w:lineRule="atLeast"/>
         <w:rPr>
           <w:rFonts w:eastAsia="Times New Roman" w:cstheme="minorHAnsi"/>
           <w:kern w:val="0"/>
@@ -1299,193 +2971,30 @@
       <w:r>
         <w:rPr>
           <w:rFonts w:eastAsia="Times New Roman" w:cstheme="minorHAnsi"/>
+          <w:i/>
+          <w:iCs/>
           <w:kern w:val="0"/>
+          <w:sz w:val="18"/>
+          <w:szCs w:val="18"/>
           <w:lang w:eastAsia="es-CO"/>
           <w14:ligatures w14:val="none"/>
         </w:rPr>
-        <w:t>Figura 2. Valor mediano registrado por municipio, 2015–2023</w:t>
-      </w:r>
-    </w:p>
-    <w:p>
-      <w:pPr>
-        <w:spacing w:after="0" w:line="300" w:lineRule="atLeast"/>
+        <w:t>Figura 3. Maqueta inicial del prototipo propuesto.</w:t>
+      </w:r>
+    </w:p>
+    <w:p>
+      <w:pPr>
+        <w:pStyle w:val="Heading2"/>
         <w:rPr>
           <w:rFonts w:eastAsia="Times New Roman" w:cstheme="minorHAnsi"/>
+          <w:i/>
+          <w:iCs/>
           <w:kern w:val="0"/>
+          <w:sz w:val="18"/>
+          <w:szCs w:val="18"/>
           <w:lang w:eastAsia="es-CO"/>
           <w14:ligatures w14:val="none"/>
         </w:rPr>
-      </w:pPr>
-    </w:p>
-    <w:p>
-      <w:pPr>
-        <w:spacing w:after="0" w:line="300" w:lineRule="atLeast"/>
-        <w:jc w:val="both"/>
-        <w:rPr>
-          <w:rFonts w:eastAsia="Times New Roman" w:cstheme="minorHAnsi"/>
-          <w:kern w:val="0"/>
-          <w:lang w:eastAsia="es-CO"/>
-          <w14:ligatures w14:val="none"/>
-        </w:rPr>
-      </w:pPr>
-      <w:r>
-        <w:rPr>
-          <w:rFonts w:eastAsia="Times New Roman" w:cstheme="minorHAnsi"/>
-          <w:kern w:val="0"/>
-          <w:lang w:eastAsia="es-CO"/>
-          <w14:ligatures w14:val="none"/>
-        </w:rPr>
-        <w:lastRenderedPageBreak/>
-        <w:t>Al revisar la distribución de los valores registrados se encontraron diferencias importantes entre el promedio y la mediana. Para el conjunto analizado, Armenia presenta una mediana de $68 millones frente a un promedio cercano a $101,6 millones; Manizales una mediana de $99 millones frente a un promedio de $210,2 millones; y Pereira una mediana de $92,5 millones frente a un promedio de $283,9 millones. Estas diferencias, junto con la presencia de valores mínimos y máximos muy alejados, muestran que el promedio puede verse afectado por valores extremos. Por esta razón, se utilizó la mediana para realizar una comparación menos afectada por dichos valores. En el periodo analizado, la mediana pasó de $45,1 millones a $108 millones en Armenia, de $83,1 millones a $135 millones en Manizales y de $79,7 millones a $123 millones en Pereira entre 2015 y 2023. Estos valores corresponden a los registros disponibles y no están ajustados por inflación, por lo que se utilizan únicamente como una comparación descriptiva de su evolución.</w:t>
-      </w:r>
-    </w:p>
-    <w:p>
-      <w:pPr>
-        <w:spacing w:after="0" w:line="300" w:lineRule="atLeast"/>
-        <w:rPr>
-          <w:rFonts w:eastAsia="Times New Roman" w:cstheme="minorHAnsi"/>
-          <w:kern w:val="0"/>
-          <w:lang w:eastAsia="es-CO"/>
-          <w14:ligatures w14:val="none"/>
-        </w:rPr>
-      </w:pPr>
-    </w:p>
-    <w:p>
-      <w:pPr>
-        <w:pStyle w:val="Ttulo1"/>
-        <w:numPr>
-          <w:ilvl w:val="0"/>
-          <w:numId w:val="1"/>
-        </w:numPr>
-      </w:pPr>
-      <w:bookmarkStart w:id="4" w:name="_Toc243490729"/>
-      <w:r>
-        <w:t>Maqueta (mockup) del prototipo</w:t>
-      </w:r>
-      <w:bookmarkEnd w:id="4"/>
-    </w:p>
-    <w:p>
-      <w:pPr>
-        <w:spacing w:after="0" w:line="300" w:lineRule="atLeast"/>
-        <w:jc w:val="both"/>
-        <w:rPr>
-          <w:rFonts w:eastAsia="Times New Roman" w:cstheme="minorHAnsi"/>
-          <w:kern w:val="0"/>
-          <w:lang w:eastAsia="es-CO"/>
-          <w14:ligatures w14:val="none"/>
-        </w:rPr>
-      </w:pPr>
-      <w:r>
-        <w:rPr>
-          <w:rFonts w:eastAsia="Times New Roman" w:cstheme="minorHAnsi"/>
-          <w:kern w:val="0"/>
-          <w:lang w:eastAsia="es-CO"/>
-          <w14:ligatures w14:val="none"/>
-        </w:rPr>
-        <w:t>Como propuesta inicial del prototipo se plantea un tablero que permita comparar de forma sencilla la actividad inmobiliaria de Armenia, Manizales y Pereira. La maqueta reúne elementos para consultar la evolución de las compraventas y los valores registrados, comparar los municipios seleccionados y presentar posteriormente los resultados del componente predictivo. De esta manera, el prototipo busca integrar en una misma vista la información necesaria para apoyar la priorización de municipios para estudios posteriores de inversión inmobiliaria.</w:t>
-      </w:r>
-    </w:p>
-    <w:p>
-      <w:pPr>
-        <w:spacing w:after="0" w:line="300" w:lineRule="atLeast"/>
-        <w:rPr>
-          <w:rFonts w:eastAsia="Times New Roman" w:cstheme="minorHAnsi"/>
-          <w:kern w:val="0"/>
-          <w:lang w:eastAsia="es-CO"/>
-          <w14:ligatures w14:val="none"/>
-        </w:rPr>
-      </w:pPr>
-    </w:p>
-    <w:p>
-      <w:pPr>
-        <w:spacing w:after="0" w:line="300" w:lineRule="atLeast"/>
-        <w:rPr>
-          <w:rFonts w:eastAsia="Times New Roman" w:cstheme="minorHAnsi"/>
-          <w:kern w:val="0"/>
-          <w:lang w:eastAsia="es-CO"/>
-          <w14:ligatures w14:val="none"/>
-        </w:rPr>
-      </w:pPr>
-      <w:r>
-        <w:rPr>
-          <w:rFonts w:eastAsia="Times New Roman" w:cstheme="minorHAnsi"/>
-          <w:noProof/>
-          <w:kern w:val="0"/>
-          <w:lang w:eastAsia="es-CO"/>
-          <w14:ligatures w14:val="none"/>
-        </w:rPr>
-        <w:drawing>
-          <wp:inline distT="0" distB="0" distL="0" distR="0" wp14:anchorId="61BF39FA" wp14:editId="337E8ACE">
-            <wp:extent cx="5612130" cy="3128645"/>
-            <wp:effectExtent l="0" t="0" r="7620" b="0"/>
-            <wp:docPr id="577539495" name="Imagen 1"/>
-            <wp:cNvGraphicFramePr>
-              <a:graphicFrameLocks xmlns:a="http://schemas.openxmlformats.org/drawingml/2006/main" noChangeAspect="1"/>
-            </wp:cNvGraphicFramePr>
-            <a:graphic xmlns:a="http://schemas.openxmlformats.org/drawingml/2006/main">
-              <a:graphicData uri="http://schemas.openxmlformats.org/drawingml/2006/picture">
-                <pic:pic xmlns:pic="http://schemas.openxmlformats.org/drawingml/2006/picture">
-                  <pic:nvPicPr>
-                    <pic:cNvPr id="577539495" name=""/>
-                    <pic:cNvPicPr/>
-                  </pic:nvPicPr>
-                  <pic:blipFill>
-                    <a:blip r:embed="rId8"/>
-                    <a:stretch>
-                      <a:fillRect/>
-                    </a:stretch>
-                  </pic:blipFill>
-                  <pic:spPr>
-                    <a:xfrm>
-                      <a:off x="0" y="0"/>
-                      <a:ext cx="5612130" cy="3128645"/>
-                    </a:xfrm>
-                    <a:prstGeom prst="rect">
-                      <a:avLst/>
-                    </a:prstGeom>
-                  </pic:spPr>
-                </pic:pic>
-              </a:graphicData>
-            </a:graphic>
-          </wp:inline>
-        </w:drawing>
-      </w:r>
-    </w:p>
-    <w:p>
-      <w:pPr>
-        <w:spacing w:after="0" w:line="300" w:lineRule="atLeast"/>
-        <w:jc w:val="right"/>
-        <w:rPr>
-          <w:rFonts w:eastAsia="Times New Roman" w:cstheme="minorHAnsi"/>
-          <w:kern w:val="0"/>
-          <w:lang w:eastAsia="es-CO"/>
-          <w14:ligatures w14:val="none"/>
-        </w:rPr>
-      </w:pPr>
-      <w:r>
-        <w:rPr>
-          <w:rFonts w:eastAsia="Times New Roman" w:cstheme="minorHAnsi"/>
-          <w:kern w:val="0"/>
-          <w:lang w:eastAsia="es-CO"/>
-          <w14:ligatures w14:val="none"/>
-        </w:rPr>
-        <w:t>Figura 3. Maqueta inicial del prototipo propuesto.</w:t>
-      </w:r>
-    </w:p>
-    <w:p>
-      <w:pPr>
-        <w:spacing w:after="0" w:line="300" w:lineRule="atLeast"/>
-        <w:rPr>
-          <w:rFonts w:eastAsia="Times New Roman" w:cstheme="minorHAnsi"/>
-          <w:kern w:val="0"/>
-          <w:lang w:eastAsia="es-CO"/>
-          <w14:ligatures w14:val="none"/>
-        </w:rPr>
-      </w:pPr>
-    </w:p>
-    <w:p>
-      <w:pPr>
-        <w:pStyle w:val="Ttulo1"/>
       </w:pPr>
       <w:bookmarkStart w:id="5" w:name="_Toc243490730"/>
       <w:r>
@@ -1545,10 +3054,10 @@
         </w:rPr>
         <w:t xml:space="preserve">Repositorio: </w:t>
       </w:r>
-      <w:hyperlink r:id="rId9" w:history="1">
+      <w:hyperlink r:id="rId8" w:history="1">
         <w:r>
           <w:rPr>
-            <w:rStyle w:val="Hipervnculo"/>
+            <w:rStyle w:val="Hyperlink"/>
             <w:lang w:val="es-ES"/>
           </w:rPr>
           <w:t>https://github.com/GuillermoPrietoP/proyecto-inmobiliario-dsa</w:t>
@@ -1938,7 +3447,6 @@
         <w:rPr>
           <w:lang w:val="es-ES"/>
         </w:rPr>
-        <w:lastRenderedPageBreak/>
         <w:t>dvc</w:t>
       </w:r>
       <w:proofErr w:type="spellEnd"/>
@@ -2018,7 +3526,21 @@
         <w:rPr>
           <w:lang w:val="es-ES"/>
         </w:rPr>
-        <w:t xml:space="preserve"> status: se verificó la consistencia de los datos recuperados mediante el mensaje Data and pipelines are up </w:t>
+        <w:t xml:space="preserve"> </w:t>
+      </w:r>
+      <w:proofErr w:type="gramStart"/>
+      <w:r>
+        <w:rPr>
+          <w:lang w:val="es-ES"/>
+        </w:rPr>
+        <w:t>status</w:t>
+      </w:r>
+      <w:proofErr w:type="gramEnd"/>
+      <w:r>
+        <w:rPr>
+          <w:lang w:val="es-ES"/>
+        </w:rPr>
+        <w:t xml:space="preserve">: se verificó la consistencia de los datos recuperados mediante el mensaje Data and pipelines are up </w:t>
       </w:r>
       <w:proofErr w:type="spellStart"/>
       <w:r>
@@ -2080,6 +3602,7 @@
         <w:rPr>
           <w:lang w:val="es-ES"/>
         </w:rPr>
+        <w:lastRenderedPageBreak/>
         <w:t>6.3. Evidencias de implementación</w:t>
       </w:r>
     </w:p>
@@ -2102,11 +3625,6 @@
     </w:p>
     <w:p>
       <w:pPr>
-        <w:keepNext/>
-        <w:keepLines/>
-        <w:spacing w:before="360" w:after="80"/>
-        <w:jc w:val="right"/>
-        <w:outlineLvl w:val="0"/>
         <w:rPr>
           <w:lang w:val="es-ES"/>
         </w:rPr>
@@ -2132,7 +3650,7 @@
                     <pic:cNvPicPr/>
                   </pic:nvPicPr>
                   <pic:blipFill>
-                    <a:blip r:embed="rId10"/>
+                    <a:blip r:embed="rId9"/>
                     <a:stretch>
                       <a:fillRect/>
                     </a:stretch>
@@ -2152,6 +3670,13 @@
           </wp:inline>
         </w:drawing>
       </w:r>
+    </w:p>
+    <w:p>
+      <w:pPr>
+        <w:rPr>
+          <w:lang w:val="es-ES"/>
+        </w:rPr>
+      </w:pPr>
       <w:r>
         <w:rPr>
           <w:lang w:val="es-ES"/>
@@ -2225,35 +3750,6 @@
     </w:p>
     <w:p>
       <w:pPr>
-        <w:keepNext/>
-        <w:keepLines/>
-        <w:spacing w:before="360" w:after="80"/>
-        <w:jc w:val="right"/>
-        <w:outlineLvl w:val="0"/>
-        <w:rPr>
-          <w:lang w:val="es-ES"/>
-        </w:rPr>
-      </w:pPr>
-    </w:p>
-    <w:p>
-      <w:pPr>
-        <w:keepNext/>
-        <w:keepLines/>
-        <w:spacing w:before="360" w:after="80"/>
-        <w:jc w:val="right"/>
-        <w:outlineLvl w:val="0"/>
-        <w:rPr>
-          <w:lang w:val="es-ES"/>
-        </w:rPr>
-      </w:pPr>
-    </w:p>
-    <w:p>
-      <w:pPr>
-        <w:keepNext/>
-        <w:keepLines/>
-        <w:spacing w:before="360" w:after="80"/>
-        <w:jc w:val="right"/>
-        <w:outlineLvl w:val="0"/>
         <w:rPr>
           <w:lang w:val="es-ES"/>
         </w:rPr>
@@ -2263,11 +3759,10 @@
           <w:noProof/>
           <w:lang w:val="es-ES"/>
         </w:rPr>
-        <w:lastRenderedPageBreak/>
         <w:drawing>
-          <wp:inline distT="0" distB="0" distL="0" distR="0" wp14:anchorId="19D68A0D" wp14:editId="36928CFD">
-            <wp:extent cx="5324475" cy="1665367"/>
-            <wp:effectExtent l="0" t="0" r="0" b="0"/>
+          <wp:inline distT="0" distB="0" distL="0" distR="0" wp14:anchorId="19D68A0D" wp14:editId="4B1A7E27">
+            <wp:extent cx="5591908" cy="1749015"/>
+            <wp:effectExtent l="0" t="0" r="8890" b="3810"/>
             <wp:docPr id="1361615991" name="Imagen 2"/>
             <wp:cNvGraphicFramePr>
               <a:graphicFrameLocks xmlns:a="http://schemas.openxmlformats.org/drawingml/2006/main" noChangeAspect="1"/>
@@ -2282,7 +3777,7 @@
                     </pic:cNvPicPr>
                   </pic:nvPicPr>
                   <pic:blipFill rotWithShape="1">
-                    <a:blip r:embed="rId11">
+                    <a:blip r:embed="rId10">
                       <a:extLst>
                         <a:ext uri="{28A0092B-C50C-407E-A947-70E740481C1C}">
                           <a14:useLocalDpi xmlns:a14="http://schemas.microsoft.com/office/drawing/2010/main" val="0"/>
@@ -2297,7 +3792,7 @@
                   <pic:spPr bwMode="auto">
                     <a:xfrm>
                       <a:off x="0" y="0"/>
-                      <a:ext cx="5346694" cy="1672317"/>
+                      <a:ext cx="5708332" cy="1785430"/>
                     </a:xfrm>
                     <a:prstGeom prst="rect">
                       <a:avLst/>
@@ -2318,6 +3813,13 @@
           </wp:inline>
         </w:drawing>
       </w:r>
+    </w:p>
+    <w:p>
+      <w:pPr>
+        <w:rPr>
+          <w:lang w:val="es-ES"/>
+        </w:rPr>
+      </w:pPr>
       <w:r>
         <w:rPr>
           <w:lang w:val="es-ES"/>
@@ -2369,23 +3871,6 @@
     </w:p>
     <w:p>
       <w:pPr>
-        <w:keepNext/>
-        <w:keepLines/>
-        <w:spacing w:before="360" w:after="80"/>
-        <w:jc w:val="right"/>
-        <w:outlineLvl w:val="0"/>
-        <w:rPr>
-          <w:lang w:val="es-ES"/>
-        </w:rPr>
-      </w:pPr>
-    </w:p>
-    <w:p>
-      <w:pPr>
-        <w:keepNext/>
-        <w:keepLines/>
-        <w:spacing w:before="360" w:after="80"/>
-        <w:jc w:val="right"/>
-        <w:outlineLvl w:val="0"/>
         <w:rPr>
           <w:lang w:val="es-ES"/>
         </w:rPr>
@@ -2396,9 +3881,9 @@
           <w:lang w:val="es-ES"/>
         </w:rPr>
         <w:drawing>
-          <wp:inline distT="0" distB="0" distL="0" distR="0" wp14:anchorId="0B8912E9" wp14:editId="0AD63FF6">
-            <wp:extent cx="6134100" cy="1184760"/>
-            <wp:effectExtent l="0" t="0" r="0" b="0"/>
+          <wp:inline distT="0" distB="0" distL="0" distR="0" wp14:anchorId="0B8912E9" wp14:editId="22717471">
+            <wp:extent cx="5499081" cy="1062111"/>
+            <wp:effectExtent l="0" t="0" r="6985" b="5080"/>
             <wp:docPr id="57272160" name="Imagen 1"/>
             <wp:cNvGraphicFramePr>
               <a:graphicFrameLocks xmlns:a="http://schemas.openxmlformats.org/drawingml/2006/main" noChangeAspect="1"/>
@@ -2411,7 +3896,7 @@
                     <pic:cNvPicPr/>
                   </pic:nvPicPr>
                   <pic:blipFill>
-                    <a:blip r:embed="rId12"/>
+                    <a:blip r:embed="rId11"/>
                     <a:stretch>
                       <a:fillRect/>
                     </a:stretch>
@@ -2419,7 +3904,7 @@
                   <pic:spPr>
                     <a:xfrm>
                       <a:off x="0" y="0"/>
-                      <a:ext cx="6155839" cy="1188959"/>
+                      <a:ext cx="5618161" cy="1085110"/>
                     </a:xfrm>
                     <a:prstGeom prst="rect">
                       <a:avLst/>
@@ -2431,6 +3916,13 @@
           </wp:inline>
         </w:drawing>
       </w:r>
+    </w:p>
+    <w:p>
+      <w:pPr>
+        <w:rPr>
+          <w:lang w:val="es-ES"/>
+        </w:rPr>
+      </w:pPr>
       <w:r>
         <w:rPr>
           <w:lang w:val="es-ES"/>
@@ -2454,23 +3946,6 @@
     </w:p>
     <w:p>
       <w:pPr>
-        <w:keepNext/>
-        <w:keepLines/>
-        <w:spacing w:before="360" w:after="80"/>
-        <w:jc w:val="right"/>
-        <w:outlineLvl w:val="0"/>
-        <w:rPr>
-          <w:lang w:val="es-ES"/>
-        </w:rPr>
-      </w:pPr>
-    </w:p>
-    <w:p>
-      <w:pPr>
-        <w:keepNext/>
-        <w:keepLines/>
-        <w:spacing w:before="360" w:after="80"/>
-        <w:jc w:val="right"/>
-        <w:outlineLvl w:val="0"/>
         <w:rPr>
           <w:lang w:val="es-ES"/>
         </w:rPr>
@@ -2498,7 +3973,7 @@
                     </pic:cNvPicPr>
                   </pic:nvPicPr>
                   <pic:blipFill>
-                    <a:blip r:embed="rId13">
+                    <a:blip r:embed="rId12">
                       <a:extLst>
                         <a:ext uri="{28A0092B-C50C-407E-A947-70E740481C1C}">
                           <a14:useLocalDpi xmlns:a14="http://schemas.microsoft.com/office/drawing/2010/main" val="0"/>
@@ -2529,6 +4004,13 @@
           </wp:inline>
         </w:drawing>
       </w:r>
+    </w:p>
+    <w:p>
+      <w:pPr>
+        <w:rPr>
+          <w:lang w:val="es-ES"/>
+        </w:rPr>
+      </w:pPr>
       <w:r>
         <w:rPr>
           <w:lang w:val="es-ES"/>
@@ -2575,7 +4057,21 @@
         <w:rPr>
           <w:lang w:val="es-ES"/>
         </w:rPr>
-        <w:t xml:space="preserve"> status.</w:t>
+        <w:t xml:space="preserve"> </w:t>
+      </w:r>
+      <w:proofErr w:type="gramStart"/>
+      <w:r>
+        <w:rPr>
+          <w:lang w:val="es-ES"/>
+        </w:rPr>
+        <w:t>status</w:t>
+      </w:r>
+      <w:proofErr w:type="gramEnd"/>
+      <w:r>
+        <w:rPr>
+          <w:lang w:val="es-ES"/>
+        </w:rPr>
+        <w:t>.</w:t>
       </w:r>
     </w:p>
     <w:p>
@@ -2592,6 +4088,7 @@
         <w:rPr>
           <w:lang w:val="es-ES"/>
         </w:rPr>
+        <w:lastRenderedPageBreak/>
         <w:t xml:space="preserve">La implementación quedó registrada en GitHub mediante el </w:t>
       </w:r>
       <w:proofErr w:type="spellStart"/>
@@ -2675,10 +4172,9 @@
     </w:p>
     <w:p>
       <w:pPr>
-        <w:pStyle w:val="Ttulo1"/>
-      </w:pPr>
-      <w:r>
-        <w:lastRenderedPageBreak/>
+        <w:pStyle w:val="Heading1"/>
+      </w:pPr>
+      <w:r>
         <w:t>7. Reporte de trabajo en equipo</w:t>
       </w:r>
     </w:p>
@@ -2887,13 +4383,7 @@
         <w:rPr>
           <w:lang w:val="es-ES"/>
         </w:rPr>
-        <w:t xml:space="preserve">amplió en </w:t>
-      </w:r>
-      <w:r>
-        <w:rPr>
-          <w:lang w:val="es-ES"/>
-        </w:rPr>
-        <w:t xml:space="preserve">el notebook de exploración con el cálculo de variaciones porcentuales anuales y un índice de compraventas con base 2015 = 100 para Armenia, Manizales y Pereira. Incluyó gráficas comparativas e interpretación de resultados. Este aporte quedó registrado en GitHub mediante el </w:t>
+        <w:t xml:space="preserve">amplió en el notebook de exploración con el cálculo de variaciones porcentuales anuales y un índice de compraventas con base 2015 = 100 para Armenia, Manizales y Pereira. Incluyó gráficas comparativas e interpretación de resultados. Este aporte quedó registrado en GitHub mediante el </w:t>
       </w:r>
       <w:proofErr w:type="spellStart"/>
       <w:r>
@@ -2932,34 +4422,28 @@
         <w:rPr>
           <w:lang w:val="es-ES"/>
         </w:rPr>
-        <w:t xml:space="preserve"> particip</w:t>
-      </w:r>
-      <w:r>
-        <w:rPr>
-          <w:lang w:val="es-ES"/>
-        </w:rPr>
-        <w:t>ó</w:t>
-      </w:r>
-      <w:r>
-        <w:rPr>
-          <w:lang w:val="es-ES"/>
-        </w:rPr>
-        <w:t xml:space="preserve"> en la elaboración del informe escrito del proyecto. Sus contribuciones se incorporaron al documento que posteriormente fue publicado en GitHub por Guillermo Prieto, razón por la cual no aparecen como autoras individuales de </w:t>
+        <w:t xml:space="preserve"> </w:t>
+      </w:r>
+      <w:r>
+        <w:rPr>
+          <w:lang w:val="es-ES"/>
+        </w:rPr>
+        <w:t>Participó en la revisión y ajuste del informe y de la maqueta del prototipo, tomando como base los archivos previamente adelantados por Guillermo Prieto, Juan Sebastián Victoria e Ivette Yvonne Campos. Su aporte se centró en precisar detalles de redacción, revisar la coherencia entre el problema, el contexto y el alcance del proyecto, y complementar la presentación e interpretación de los indicadores. También contribuyó a perfilar la maqueta para facilitar la comprensión de la información por parte de los inversionistas, conservando la línea gráfica del trabajo inicial.</w:t>
+      </w:r>
+      <w:r>
+        <w:rPr>
+          <w:lang w:val="es-ES"/>
+        </w:rPr>
+        <w:t xml:space="preserve"> Este aporte quedó registrado en GitHub mediante el </w:t>
       </w:r>
       <w:proofErr w:type="spellStart"/>
       <w:r>
         <w:rPr>
           <w:lang w:val="es-ES"/>
         </w:rPr>
-        <w:t>commits</w:t>
+        <w:t>commit</w:t>
       </w:r>
       <w:proofErr w:type="spellEnd"/>
-      <w:r>
-        <w:rPr>
-          <w:lang w:val="es-ES"/>
-        </w:rPr>
-        <w:t>.</w:t>
-      </w:r>
     </w:p>
     <w:p>
       <w:pPr>
@@ -3012,6 +4496,10 @@
         </w:rPr>
       </w:pPr>
       <w:r>
+        <w:rPr>
+          <w:noProof/>
+        </w:rPr>
+        <w:lastRenderedPageBreak/>
         <w:drawing>
           <wp:inline distT="0" distB="0" distL="0" distR="0" wp14:anchorId="25B7F219" wp14:editId="4E0FDB32">
             <wp:extent cx="5029200" cy="2507202"/>
@@ -3028,7 +4516,7 @@
                     <pic:cNvPicPr/>
                   </pic:nvPicPr>
                   <pic:blipFill>
-                    <a:blip r:embed="rId14"/>
+                    <a:blip r:embed="rId13"/>
                     <a:stretch>
                       <a:fillRect/>
                     </a:stretch>
@@ -3049,22 +4537,9 @@
         </w:drawing>
       </w:r>
     </w:p>
-    <w:p>
-      <w:pPr>
-        <w:keepNext/>
-        <w:keepLines/>
-        <w:spacing w:before="360" w:after="80"/>
-        <w:outlineLvl w:val="0"/>
-        <w:rPr>
-          <w:b/>
-          <w:bCs/>
-          <w:lang w:val="es-ES"/>
-        </w:rPr>
-      </w:pPr>
-    </w:p>
     <w:sectPr>
       <w:pgSz w:w="12240" w:h="15840"/>
-      <w:pgMar w:top="1417" w:right="1701" w:bottom="1276" w:left="1701" w:header="708" w:footer="708" w:gutter="0"/>
+      <w:pgMar w:top="720" w:right="720" w:bottom="720" w:left="720" w:header="708" w:footer="708" w:gutter="0"/>
       <w:cols w:space="708"/>
       <w:docGrid w:linePitch="360"/>
     </w:sectPr>
@@ -3722,11 +5197,11 @@
     <w:name w:val="Normal"/>
     <w:qFormat/>
   </w:style>
-  <w:style w:type="paragraph" w:styleId="Ttulo1">
+  <w:style w:type="paragraph" w:styleId="Heading1">
     <w:name w:val="heading 1"/>
     <w:basedOn w:val="Normal"/>
     <w:next w:val="Normal"/>
-    <w:link w:val="Ttulo1Car"/>
+    <w:link w:val="Heading1Char"/>
     <w:uiPriority w:val="9"/>
     <w:qFormat/>
     <w:rsid w:val="00943AAC"/>
@@ -3743,13 +5218,12 @@
       <w:szCs w:val="40"/>
     </w:rPr>
   </w:style>
-  <w:style w:type="paragraph" w:styleId="Ttulo2">
+  <w:style w:type="paragraph" w:styleId="Heading2">
     <w:name w:val="heading 2"/>
     <w:basedOn w:val="Normal"/>
     <w:next w:val="Normal"/>
-    <w:link w:val="Ttulo2Car"/>
+    <w:link w:val="Heading2Char"/>
     <w:uiPriority w:val="9"/>
-    <w:semiHidden/>
     <w:unhideWhenUsed/>
     <w:qFormat/>
     <w:rsid w:val="00943AAC"/>
@@ -3766,11 +5240,11 @@
       <w:szCs w:val="32"/>
     </w:rPr>
   </w:style>
-  <w:style w:type="paragraph" w:styleId="Ttulo3">
+  <w:style w:type="paragraph" w:styleId="Heading3">
     <w:name w:val="heading 3"/>
     <w:basedOn w:val="Normal"/>
     <w:next w:val="Normal"/>
-    <w:link w:val="Ttulo3Car"/>
+    <w:link w:val="Heading3Char"/>
     <w:uiPriority w:val="9"/>
     <w:semiHidden/>
     <w:unhideWhenUsed/>
@@ -3789,11 +5263,11 @@
       <w:szCs w:val="28"/>
     </w:rPr>
   </w:style>
-  <w:style w:type="paragraph" w:styleId="Ttulo4">
+  <w:style w:type="paragraph" w:styleId="Heading4">
     <w:name w:val="heading 4"/>
     <w:basedOn w:val="Normal"/>
     <w:next w:val="Normal"/>
-    <w:link w:val="Ttulo4Car"/>
+    <w:link w:val="Heading4Char"/>
     <w:uiPriority w:val="9"/>
     <w:semiHidden/>
     <w:unhideWhenUsed/>
@@ -3812,11 +5286,11 @@
       <w:color w:val="2F5496" w:themeColor="accent1" w:themeShade="BF"/>
     </w:rPr>
   </w:style>
-  <w:style w:type="paragraph" w:styleId="Ttulo5">
+  <w:style w:type="paragraph" w:styleId="Heading5">
     <w:name w:val="heading 5"/>
     <w:basedOn w:val="Normal"/>
     <w:next w:val="Normal"/>
-    <w:link w:val="Ttulo5Car"/>
+    <w:link w:val="Heading5Char"/>
     <w:uiPriority w:val="9"/>
     <w:semiHidden/>
     <w:unhideWhenUsed/>
@@ -3833,11 +5307,11 @@
       <w:color w:val="2F5496" w:themeColor="accent1" w:themeShade="BF"/>
     </w:rPr>
   </w:style>
-  <w:style w:type="paragraph" w:styleId="Ttulo6">
+  <w:style w:type="paragraph" w:styleId="Heading6">
     <w:name w:val="heading 6"/>
     <w:basedOn w:val="Normal"/>
     <w:next w:val="Normal"/>
-    <w:link w:val="Ttulo6Car"/>
+    <w:link w:val="Heading6Char"/>
     <w:uiPriority w:val="9"/>
     <w:semiHidden/>
     <w:unhideWhenUsed/>
@@ -3856,11 +5330,11 @@
       <w:color w:val="595959" w:themeColor="text1" w:themeTint="A6"/>
     </w:rPr>
   </w:style>
-  <w:style w:type="paragraph" w:styleId="Ttulo7">
+  <w:style w:type="paragraph" w:styleId="Heading7">
     <w:name w:val="heading 7"/>
     <w:basedOn w:val="Normal"/>
     <w:next w:val="Normal"/>
-    <w:link w:val="Ttulo7Car"/>
+    <w:link w:val="Heading7Char"/>
     <w:uiPriority w:val="9"/>
     <w:semiHidden/>
     <w:unhideWhenUsed/>
@@ -3877,11 +5351,11 @@
       <w:color w:val="595959" w:themeColor="text1" w:themeTint="A6"/>
     </w:rPr>
   </w:style>
-  <w:style w:type="paragraph" w:styleId="Ttulo8">
+  <w:style w:type="paragraph" w:styleId="Heading8">
     <w:name w:val="heading 8"/>
     <w:basedOn w:val="Normal"/>
     <w:next w:val="Normal"/>
-    <w:link w:val="Ttulo8Car"/>
+    <w:link w:val="Heading8Char"/>
     <w:uiPriority w:val="9"/>
     <w:semiHidden/>
     <w:unhideWhenUsed/>
@@ -3900,11 +5374,11 @@
       <w:color w:val="272727" w:themeColor="text1" w:themeTint="D8"/>
     </w:rPr>
   </w:style>
-  <w:style w:type="paragraph" w:styleId="Ttulo9">
+  <w:style w:type="paragraph" w:styleId="Heading9">
     <w:name w:val="heading 9"/>
     <w:basedOn w:val="Normal"/>
     <w:next w:val="Normal"/>
-    <w:link w:val="Ttulo9Car"/>
+    <w:link w:val="Heading9Char"/>
     <w:uiPriority w:val="9"/>
     <w:semiHidden/>
     <w:unhideWhenUsed/>
@@ -3921,12 +5395,13 @@
       <w:color w:val="272727" w:themeColor="text1" w:themeTint="D8"/>
     </w:rPr>
   </w:style>
-  <w:style w:type="character" w:default="1" w:styleId="Fuentedeprrafopredeter">
+  <w:style w:type="character" w:default="1" w:styleId="DefaultParagraphFont">
     <w:name w:val="Default Paragraph Font"/>
     <w:uiPriority w:val="1"/>
+    <w:semiHidden/>
     <w:unhideWhenUsed/>
   </w:style>
-  <w:style w:type="table" w:default="1" w:styleId="Tablanormal">
+  <w:style w:type="table" w:default="1" w:styleId="TableNormal">
     <w:name w:val="Normal Table"/>
     <w:uiPriority w:val="99"/>
     <w:semiHidden/>
@@ -3941,16 +5416,16 @@
       </w:tblCellMar>
     </w:tblPr>
   </w:style>
-  <w:style w:type="numbering" w:default="1" w:styleId="Sinlista">
+  <w:style w:type="numbering" w:default="1" w:styleId="NoList">
     <w:name w:val="No List"/>
     <w:uiPriority w:val="99"/>
     <w:semiHidden/>
     <w:unhideWhenUsed/>
   </w:style>
-  <w:style w:type="character" w:customStyle="1" w:styleId="Ttulo1Car">
-    <w:name w:val="Título 1 Car"/>
-    <w:basedOn w:val="Fuentedeprrafopredeter"/>
-    <w:link w:val="Ttulo1"/>
+  <w:style w:type="character" w:customStyle="1" w:styleId="Heading1Char">
+    <w:name w:val="Heading 1 Char"/>
+    <w:basedOn w:val="DefaultParagraphFont"/>
+    <w:link w:val="Heading1"/>
     <w:uiPriority w:val="9"/>
     <w:rsid w:val="00943AAC"/>
     <w:rPr>
@@ -3960,12 +5435,11 @@
       <w:szCs w:val="40"/>
     </w:rPr>
   </w:style>
-  <w:style w:type="character" w:customStyle="1" w:styleId="Ttulo2Car">
-    <w:name w:val="Título 2 Car"/>
-    <w:basedOn w:val="Fuentedeprrafopredeter"/>
-    <w:link w:val="Ttulo2"/>
+  <w:style w:type="character" w:customStyle="1" w:styleId="Heading2Char">
+    <w:name w:val="Heading 2 Char"/>
+    <w:basedOn w:val="DefaultParagraphFont"/>
+    <w:link w:val="Heading2"/>
     <w:uiPriority w:val="9"/>
-    <w:semiHidden/>
     <w:rsid w:val="00943AAC"/>
     <w:rPr>
       <w:rFonts w:asciiTheme="majorHAnsi" w:eastAsiaTheme="majorEastAsia" w:hAnsiTheme="majorHAnsi" w:cstheme="majorBidi"/>
@@ -3974,10 +5448,10 @@
       <w:szCs w:val="32"/>
     </w:rPr>
   </w:style>
-  <w:style w:type="character" w:customStyle="1" w:styleId="Ttulo3Car">
-    <w:name w:val="Título 3 Car"/>
-    <w:basedOn w:val="Fuentedeprrafopredeter"/>
-    <w:link w:val="Ttulo3"/>
+  <w:style w:type="character" w:customStyle="1" w:styleId="Heading3Char">
+    <w:name w:val="Heading 3 Char"/>
+    <w:basedOn w:val="DefaultParagraphFont"/>
+    <w:link w:val="Heading3"/>
     <w:uiPriority w:val="9"/>
     <w:semiHidden/>
     <w:rsid w:val="00943AAC"/>
@@ -3988,10 +5462,10 @@
       <w:szCs w:val="28"/>
     </w:rPr>
   </w:style>
-  <w:style w:type="character" w:customStyle="1" w:styleId="Ttulo4Car">
-    <w:name w:val="Título 4 Car"/>
-    <w:basedOn w:val="Fuentedeprrafopredeter"/>
-    <w:link w:val="Ttulo4"/>
+  <w:style w:type="character" w:customStyle="1" w:styleId="Heading4Char">
+    <w:name w:val="Heading 4 Char"/>
+    <w:basedOn w:val="DefaultParagraphFont"/>
+    <w:link w:val="Heading4"/>
     <w:uiPriority w:val="9"/>
     <w:semiHidden/>
     <w:rsid w:val="00943AAC"/>
@@ -4002,10 +5476,10 @@
       <w:color w:val="2F5496" w:themeColor="accent1" w:themeShade="BF"/>
     </w:rPr>
   </w:style>
-  <w:style w:type="character" w:customStyle="1" w:styleId="Ttulo5Car">
-    <w:name w:val="Título 5 Car"/>
-    <w:basedOn w:val="Fuentedeprrafopredeter"/>
-    <w:link w:val="Ttulo5"/>
+  <w:style w:type="character" w:customStyle="1" w:styleId="Heading5Char">
+    <w:name w:val="Heading 5 Char"/>
+    <w:basedOn w:val="DefaultParagraphFont"/>
+    <w:link w:val="Heading5"/>
     <w:uiPriority w:val="9"/>
     <w:semiHidden/>
     <w:rsid w:val="00943AAC"/>
@@ -4014,10 +5488,10 @@
       <w:color w:val="2F5496" w:themeColor="accent1" w:themeShade="BF"/>
     </w:rPr>
   </w:style>
-  <w:style w:type="character" w:customStyle="1" w:styleId="Ttulo6Car">
-    <w:name w:val="Título 6 Car"/>
-    <w:basedOn w:val="Fuentedeprrafopredeter"/>
-    <w:link w:val="Ttulo6"/>
+  <w:style w:type="character" w:customStyle="1" w:styleId="Heading6Char">
+    <w:name w:val="Heading 6 Char"/>
+    <w:basedOn w:val="DefaultParagraphFont"/>
+    <w:link w:val="Heading6"/>
     <w:uiPriority w:val="9"/>
     <w:semiHidden/>
     <w:rsid w:val="00943AAC"/>
@@ -4028,10 +5502,10 @@
       <w:color w:val="595959" w:themeColor="text1" w:themeTint="A6"/>
     </w:rPr>
   </w:style>
-  <w:style w:type="character" w:customStyle="1" w:styleId="Ttulo7Car">
-    <w:name w:val="Título 7 Car"/>
-    <w:basedOn w:val="Fuentedeprrafopredeter"/>
-    <w:link w:val="Ttulo7"/>
+  <w:style w:type="character" w:customStyle="1" w:styleId="Heading7Char">
+    <w:name w:val="Heading 7 Char"/>
+    <w:basedOn w:val="DefaultParagraphFont"/>
+    <w:link w:val="Heading7"/>
     <w:uiPriority w:val="9"/>
     <w:semiHidden/>
     <w:rsid w:val="00943AAC"/>
@@ -4040,10 +5514,10 @@
       <w:color w:val="595959" w:themeColor="text1" w:themeTint="A6"/>
     </w:rPr>
   </w:style>
-  <w:style w:type="character" w:customStyle="1" w:styleId="Ttulo8Car">
-    <w:name w:val="Título 8 Car"/>
-    <w:basedOn w:val="Fuentedeprrafopredeter"/>
-    <w:link w:val="Ttulo8"/>
+  <w:style w:type="character" w:customStyle="1" w:styleId="Heading8Char">
+    <w:name w:val="Heading 8 Char"/>
+    <w:basedOn w:val="DefaultParagraphFont"/>
+    <w:link w:val="Heading8"/>
     <w:uiPriority w:val="9"/>
     <w:semiHidden/>
     <w:rsid w:val="00943AAC"/>
@@ -4054,10 +5528,10 @@
       <w:color w:val="272727" w:themeColor="text1" w:themeTint="D8"/>
     </w:rPr>
   </w:style>
-  <w:style w:type="character" w:customStyle="1" w:styleId="Ttulo9Car">
-    <w:name w:val="Título 9 Car"/>
-    <w:basedOn w:val="Fuentedeprrafopredeter"/>
-    <w:link w:val="Ttulo9"/>
+  <w:style w:type="character" w:customStyle="1" w:styleId="Heading9Char">
+    <w:name w:val="Heading 9 Char"/>
+    <w:basedOn w:val="DefaultParagraphFont"/>
+    <w:link w:val="Heading9"/>
     <w:uiPriority w:val="9"/>
     <w:semiHidden/>
     <w:rsid w:val="00943AAC"/>
@@ -4066,11 +5540,11 @@
       <w:color w:val="272727" w:themeColor="text1" w:themeTint="D8"/>
     </w:rPr>
   </w:style>
-  <w:style w:type="paragraph" w:styleId="Ttulo">
+  <w:style w:type="paragraph" w:styleId="Title">
     <w:name w:val="Title"/>
     <w:basedOn w:val="Normal"/>
     <w:next w:val="Normal"/>
-    <w:link w:val="TtuloCar"/>
+    <w:link w:val="TitleChar"/>
     <w:uiPriority w:val="10"/>
     <w:qFormat/>
     <w:rsid w:val="00943AAC"/>
@@ -4086,10 +5560,10 @@
       <w:szCs w:val="56"/>
     </w:rPr>
   </w:style>
-  <w:style w:type="character" w:customStyle="1" w:styleId="TtuloCar">
-    <w:name w:val="Título Car"/>
-    <w:basedOn w:val="Fuentedeprrafopredeter"/>
-    <w:link w:val="Ttulo"/>
+  <w:style w:type="character" w:customStyle="1" w:styleId="TitleChar">
+    <w:name w:val="Title Char"/>
+    <w:basedOn w:val="DefaultParagraphFont"/>
+    <w:link w:val="Title"/>
     <w:uiPriority w:val="10"/>
     <w:rsid w:val="00943AAC"/>
     <w:rPr>
@@ -4100,11 +5574,11 @@
       <w:szCs w:val="56"/>
     </w:rPr>
   </w:style>
-  <w:style w:type="paragraph" w:styleId="Subttulo">
+  <w:style w:type="paragraph" w:styleId="Subtitle">
     <w:name w:val="Subtitle"/>
     <w:basedOn w:val="Normal"/>
     <w:next w:val="Normal"/>
-    <w:link w:val="SubttuloCar"/>
+    <w:link w:val="SubtitleChar"/>
     <w:uiPriority w:val="11"/>
     <w:qFormat/>
     <w:rsid w:val="00943AAC"/>
@@ -4121,10 +5595,10 @@
       <w:szCs w:val="28"/>
     </w:rPr>
   </w:style>
-  <w:style w:type="character" w:customStyle="1" w:styleId="SubttuloCar">
-    <w:name w:val="Subtítulo Car"/>
-    <w:basedOn w:val="Fuentedeprrafopredeter"/>
-    <w:link w:val="Subttulo"/>
+  <w:style w:type="character" w:customStyle="1" w:styleId="SubtitleChar">
+    <w:name w:val="Subtitle Char"/>
+    <w:basedOn w:val="DefaultParagraphFont"/>
+    <w:link w:val="Subtitle"/>
     <w:uiPriority w:val="11"/>
     <w:rsid w:val="00943AAC"/>
     <w:rPr>
@@ -4135,11 +5609,11 @@
       <w:szCs w:val="28"/>
     </w:rPr>
   </w:style>
-  <w:style w:type="paragraph" w:styleId="Cita">
+  <w:style w:type="paragraph" w:styleId="Quote">
     <w:name w:val="Quote"/>
     <w:basedOn w:val="Normal"/>
     <w:next w:val="Normal"/>
-    <w:link w:val="CitaCar"/>
+    <w:link w:val="QuoteChar"/>
     <w:uiPriority w:val="29"/>
     <w:qFormat/>
     <w:rsid w:val="00943AAC"/>
@@ -4153,10 +5627,10 @@
       <w:color w:val="404040" w:themeColor="text1" w:themeTint="BF"/>
     </w:rPr>
   </w:style>
-  <w:style w:type="character" w:customStyle="1" w:styleId="CitaCar">
-    <w:name w:val="Cita Car"/>
-    <w:basedOn w:val="Fuentedeprrafopredeter"/>
-    <w:link w:val="Cita"/>
+  <w:style w:type="character" w:customStyle="1" w:styleId="QuoteChar">
+    <w:name w:val="Quote Char"/>
+    <w:basedOn w:val="DefaultParagraphFont"/>
+    <w:link w:val="Quote"/>
     <w:uiPriority w:val="29"/>
     <w:rsid w:val="00943AAC"/>
     <w:rPr>
@@ -4165,7 +5639,7 @@
       <w:color w:val="404040" w:themeColor="text1" w:themeTint="BF"/>
     </w:rPr>
   </w:style>
-  <w:style w:type="paragraph" w:styleId="Prrafodelista">
+  <w:style w:type="paragraph" w:styleId="ListParagraph">
     <w:name w:val="List Paragraph"/>
     <w:basedOn w:val="Normal"/>
     <w:uiPriority w:val="34"/>
@@ -4176,9 +5650,9 @@
       <w:contextualSpacing/>
     </w:pPr>
   </w:style>
-  <w:style w:type="character" w:styleId="nfasisintenso">
+  <w:style w:type="character" w:styleId="IntenseEmphasis">
     <w:name w:val="Intense Emphasis"/>
-    <w:basedOn w:val="Fuentedeprrafopredeter"/>
+    <w:basedOn w:val="DefaultParagraphFont"/>
     <w:uiPriority w:val="21"/>
     <w:qFormat/>
     <w:rsid w:val="00943AAC"/>
@@ -4188,11 +5662,11 @@
       <w:color w:val="2F5496" w:themeColor="accent1" w:themeShade="BF"/>
     </w:rPr>
   </w:style>
-  <w:style w:type="paragraph" w:styleId="Citadestacada">
+  <w:style w:type="paragraph" w:styleId="IntenseQuote">
     <w:name w:val="Intense Quote"/>
     <w:basedOn w:val="Normal"/>
     <w:next w:val="Normal"/>
-    <w:link w:val="CitadestacadaCar"/>
+    <w:link w:val="IntenseQuoteChar"/>
     <w:uiPriority w:val="30"/>
     <w:qFormat/>
     <w:rsid w:val="00943AAC"/>
@@ -4211,10 +5685,10 @@
       <w:color w:val="2F5496" w:themeColor="accent1" w:themeShade="BF"/>
     </w:rPr>
   </w:style>
-  <w:style w:type="character" w:customStyle="1" w:styleId="CitadestacadaCar">
-    <w:name w:val="Cita destacada Car"/>
-    <w:basedOn w:val="Fuentedeprrafopredeter"/>
-    <w:link w:val="Citadestacada"/>
+  <w:style w:type="character" w:customStyle="1" w:styleId="IntenseQuoteChar">
+    <w:name w:val="Intense Quote Char"/>
+    <w:basedOn w:val="DefaultParagraphFont"/>
+    <w:link w:val="IntenseQuote"/>
     <w:uiPriority w:val="30"/>
     <w:rsid w:val="00943AAC"/>
     <w:rPr>
@@ -4223,9 +5697,9 @@
       <w:color w:val="2F5496" w:themeColor="accent1" w:themeShade="BF"/>
     </w:rPr>
   </w:style>
-  <w:style w:type="character" w:styleId="Referenciaintensa">
+  <w:style w:type="character" w:styleId="IntenseReference">
     <w:name w:val="Intense Reference"/>
-    <w:basedOn w:val="Fuentedeprrafopredeter"/>
+    <w:basedOn w:val="DefaultParagraphFont"/>
     <w:uiPriority w:val="32"/>
     <w:qFormat/>
     <w:rsid w:val="00943AAC"/>
@@ -4237,9 +5711,9 @@
       <w:spacing w:val="5"/>
     </w:rPr>
   </w:style>
-  <w:style w:type="paragraph" w:styleId="TtuloTDC">
+  <w:style w:type="paragraph" w:styleId="TOCHeading">
     <w:name w:val="TOC Heading"/>
-    <w:basedOn w:val="Ttulo1"/>
+    <w:basedOn w:val="Heading1"/>
     <w:next w:val="Normal"/>
     <w:uiPriority w:val="39"/>
     <w:unhideWhenUsed/>
@@ -4257,7 +5731,7 @@
       <w14:ligatures w14:val="none"/>
     </w:rPr>
   </w:style>
-  <w:style w:type="paragraph" w:styleId="TDC1">
+  <w:style w:type="paragraph" w:styleId="TOC1">
     <w:name w:val="toc 1"/>
     <w:basedOn w:val="Normal"/>
     <w:next w:val="Normal"/>
@@ -4269,9 +5743,9 @@
       <w:spacing w:after="100"/>
     </w:pPr>
   </w:style>
-  <w:style w:type="character" w:styleId="Hipervnculo">
+  <w:style w:type="character" w:styleId="Hyperlink">
     <w:name w:val="Hyperlink"/>
-    <w:basedOn w:val="Fuentedeprrafopredeter"/>
+    <w:basedOn w:val="DefaultParagraphFont"/>
     <w:uiPriority w:val="99"/>
     <w:unhideWhenUsed/>
     <w:rsid w:val="007A0042"/>
@@ -4284,7 +5758,6 @@
     <w:name w:val="Normal (Web)"/>
     <w:basedOn w:val="Normal"/>
     <w:uiPriority w:val="99"/>
-    <w:semiHidden/>
     <w:unhideWhenUsed/>
     <w:rsid w:val="0051368E"/>
     <w:pPr>
@@ -4299,9 +5772,9 @@
       <w14:ligatures w14:val="none"/>
     </w:rPr>
   </w:style>
-  <w:style w:type="character" w:styleId="Fuerte">
+  <w:style w:type="character" w:styleId="Strong">
     <w:name w:val="Strong"/>
-    <w:basedOn w:val="Fuentedeprrafopredeter"/>
+    <w:basedOn w:val="DefaultParagraphFont"/>
     <w:uiPriority w:val="22"/>
     <w:qFormat/>
     <w:rsid w:val="0051368E"/>
@@ -4310,9 +5783,9 @@
       <w:bCs/>
     </w:rPr>
   </w:style>
-  <w:style w:type="character" w:styleId="Mencinsinresolver">
+  <w:style w:type="character" w:styleId="UnresolvedMention">
     <w:name w:val="Unresolved Mention"/>
-    <w:basedOn w:val="Fuentedeprrafopredeter"/>
+    <w:basedOn w:val="DefaultParagraphFont"/>
     <w:uiPriority w:val="99"/>
     <w:semiHidden/>
     <w:unhideWhenUsed/>
@@ -4321,6 +5794,541 @@
       <w:color w:val="605E5C"/>
       <w:shd w:val="clear" w:color="auto" w:fill="E1DFDD"/>
     </w:rPr>
+  </w:style>
+  <w:style w:type="table" w:styleId="GridTable5Dark-Accent6">
+    <w:name w:val="Grid Table 5 Dark Accent 6"/>
+    <w:basedOn w:val="TableNormal"/>
+    <w:uiPriority w:val="50"/>
+    <w:rsid w:val="00FE2A05"/>
+    <w:pPr>
+      <w:spacing w:after="0" w:line="240" w:lineRule="auto"/>
+    </w:pPr>
+    <w:tblPr>
+      <w:tblStyleRowBandSize w:val="1"/>
+      <w:tblStyleColBandSize w:val="1"/>
+      <w:tblBorders>
+        <w:top w:val="single" w:sz="4" w:space="0" w:color="FFFFFF" w:themeColor="background1"/>
+        <w:left w:val="single" w:sz="4" w:space="0" w:color="FFFFFF" w:themeColor="background1"/>
+        <w:bottom w:val="single" w:sz="4" w:space="0" w:color="FFFFFF" w:themeColor="background1"/>
+        <w:right w:val="single" w:sz="4" w:space="0" w:color="FFFFFF" w:themeColor="background1"/>
+        <w:insideH w:val="single" w:sz="4" w:space="0" w:color="FFFFFF" w:themeColor="background1"/>
+        <w:insideV w:val="single" w:sz="4" w:space="0" w:color="FFFFFF" w:themeColor="background1"/>
+      </w:tblBorders>
+    </w:tblPr>
+    <w:tcPr>
+      <w:shd w:val="clear" w:color="auto" w:fill="E2EFD9" w:themeFill="accent6" w:themeFillTint="33"/>
+    </w:tcPr>
+    <w:tblStylePr w:type="firstRow">
+      <w:rPr>
+        <w:b/>
+        <w:bCs/>
+        <w:color w:val="FFFFFF" w:themeColor="background1"/>
+      </w:rPr>
+      <w:tblPr/>
+      <w:tcPr>
+        <w:tcBorders>
+          <w:top w:val="single" w:sz="4" w:space="0" w:color="FFFFFF" w:themeColor="background1"/>
+          <w:left w:val="single" w:sz="4" w:space="0" w:color="FFFFFF" w:themeColor="background1"/>
+          <w:right w:val="single" w:sz="4" w:space="0" w:color="FFFFFF" w:themeColor="background1"/>
+          <w:insideH w:val="nil"/>
+          <w:insideV w:val="nil"/>
+        </w:tcBorders>
+        <w:shd w:val="clear" w:color="auto" w:fill="70AD47" w:themeFill="accent6"/>
+      </w:tcPr>
+    </w:tblStylePr>
+    <w:tblStylePr w:type="lastRow">
+      <w:rPr>
+        <w:b/>
+        <w:bCs/>
+        <w:color w:val="FFFFFF" w:themeColor="background1"/>
+      </w:rPr>
+      <w:tblPr/>
+      <w:tcPr>
+        <w:tcBorders>
+          <w:left w:val="single" w:sz="4" w:space="0" w:color="FFFFFF" w:themeColor="background1"/>
+          <w:bottom w:val="single" w:sz="4" w:space="0" w:color="FFFFFF" w:themeColor="background1"/>
+          <w:right w:val="single" w:sz="4" w:space="0" w:color="FFFFFF" w:themeColor="background1"/>
+          <w:insideH w:val="nil"/>
+          <w:insideV w:val="nil"/>
+        </w:tcBorders>
+        <w:shd w:val="clear" w:color="auto" w:fill="70AD47" w:themeFill="accent6"/>
+      </w:tcPr>
+    </w:tblStylePr>
+    <w:tblStylePr w:type="firstCol">
+      <w:rPr>
+        <w:b/>
+        <w:bCs/>
+        <w:color w:val="FFFFFF" w:themeColor="background1"/>
+      </w:rPr>
+      <w:tblPr/>
+      <w:tcPr>
+        <w:tcBorders>
+          <w:top w:val="single" w:sz="4" w:space="0" w:color="FFFFFF" w:themeColor="background1"/>
+          <w:left w:val="single" w:sz="4" w:space="0" w:color="FFFFFF" w:themeColor="background1"/>
+          <w:bottom w:val="single" w:sz="4" w:space="0" w:color="FFFFFF" w:themeColor="background1"/>
+          <w:insideV w:val="nil"/>
+        </w:tcBorders>
+        <w:shd w:val="clear" w:color="auto" w:fill="70AD47" w:themeFill="accent6"/>
+      </w:tcPr>
+    </w:tblStylePr>
+    <w:tblStylePr w:type="lastCol">
+      <w:rPr>
+        <w:b/>
+        <w:bCs/>
+        <w:color w:val="FFFFFF" w:themeColor="background1"/>
+      </w:rPr>
+      <w:tblPr/>
+      <w:tcPr>
+        <w:tcBorders>
+          <w:top w:val="single" w:sz="4" w:space="0" w:color="FFFFFF" w:themeColor="background1"/>
+          <w:bottom w:val="single" w:sz="4" w:space="0" w:color="FFFFFF" w:themeColor="background1"/>
+          <w:right w:val="single" w:sz="4" w:space="0" w:color="FFFFFF" w:themeColor="background1"/>
+          <w:insideV w:val="nil"/>
+        </w:tcBorders>
+        <w:shd w:val="clear" w:color="auto" w:fill="70AD47" w:themeFill="accent6"/>
+      </w:tcPr>
+    </w:tblStylePr>
+    <w:tblStylePr w:type="band1Vert">
+      <w:tblPr/>
+      <w:tcPr>
+        <w:shd w:val="clear" w:color="auto" w:fill="C5E0B3" w:themeFill="accent6" w:themeFillTint="66"/>
+      </w:tcPr>
+    </w:tblStylePr>
+    <w:tblStylePr w:type="band1Horz">
+      <w:tblPr/>
+      <w:tcPr>
+        <w:shd w:val="clear" w:color="auto" w:fill="C5E0B3" w:themeFill="accent6" w:themeFillTint="66"/>
+      </w:tcPr>
+    </w:tblStylePr>
+  </w:style>
+  <w:style w:type="table" w:styleId="GridTable3-Accent3">
+    <w:name w:val="Grid Table 3 Accent 3"/>
+    <w:basedOn w:val="TableNormal"/>
+    <w:uiPriority w:val="48"/>
+    <w:rsid w:val="00FE2A05"/>
+    <w:pPr>
+      <w:spacing w:after="0" w:line="240" w:lineRule="auto"/>
+    </w:pPr>
+    <w:tblPr>
+      <w:tblStyleRowBandSize w:val="1"/>
+      <w:tblStyleColBandSize w:val="1"/>
+      <w:tblBorders>
+        <w:top w:val="single" w:sz="4" w:space="0" w:color="C9C9C9" w:themeColor="accent3" w:themeTint="99"/>
+        <w:left w:val="single" w:sz="4" w:space="0" w:color="C9C9C9" w:themeColor="accent3" w:themeTint="99"/>
+        <w:bottom w:val="single" w:sz="4" w:space="0" w:color="C9C9C9" w:themeColor="accent3" w:themeTint="99"/>
+        <w:right w:val="single" w:sz="4" w:space="0" w:color="C9C9C9" w:themeColor="accent3" w:themeTint="99"/>
+        <w:insideH w:val="single" w:sz="4" w:space="0" w:color="C9C9C9" w:themeColor="accent3" w:themeTint="99"/>
+        <w:insideV w:val="single" w:sz="4" w:space="0" w:color="C9C9C9" w:themeColor="accent3" w:themeTint="99"/>
+      </w:tblBorders>
+    </w:tblPr>
+    <w:tblStylePr w:type="firstRow">
+      <w:rPr>
+        <w:b/>
+        <w:bCs/>
+      </w:rPr>
+      <w:tblPr/>
+      <w:tcPr>
+        <w:tcBorders>
+          <w:top w:val="nil"/>
+          <w:left w:val="nil"/>
+          <w:right w:val="nil"/>
+          <w:insideH w:val="nil"/>
+          <w:insideV w:val="nil"/>
+        </w:tcBorders>
+        <w:shd w:val="clear" w:color="auto" w:fill="FFFFFF" w:themeFill="background1"/>
+      </w:tcPr>
+    </w:tblStylePr>
+    <w:tblStylePr w:type="lastRow">
+      <w:rPr>
+        <w:b/>
+        <w:bCs/>
+      </w:rPr>
+      <w:tblPr/>
+      <w:tcPr>
+        <w:tcBorders>
+          <w:left w:val="nil"/>
+          <w:bottom w:val="nil"/>
+          <w:right w:val="nil"/>
+          <w:insideH w:val="nil"/>
+          <w:insideV w:val="nil"/>
+        </w:tcBorders>
+        <w:shd w:val="clear" w:color="auto" w:fill="FFFFFF" w:themeFill="background1"/>
+      </w:tcPr>
+    </w:tblStylePr>
+    <w:tblStylePr w:type="firstCol">
+      <w:pPr>
+        <w:jc w:val="right"/>
+      </w:pPr>
+      <w:rPr>
+        <w:i/>
+        <w:iCs/>
+      </w:rPr>
+      <w:tblPr/>
+      <w:tcPr>
+        <w:tcBorders>
+          <w:top w:val="nil"/>
+          <w:left w:val="nil"/>
+          <w:bottom w:val="nil"/>
+          <w:insideH w:val="nil"/>
+          <w:insideV w:val="nil"/>
+        </w:tcBorders>
+        <w:shd w:val="clear" w:color="auto" w:fill="FFFFFF" w:themeFill="background1"/>
+      </w:tcPr>
+    </w:tblStylePr>
+    <w:tblStylePr w:type="lastCol">
+      <w:rPr>
+        <w:i/>
+        <w:iCs/>
+      </w:rPr>
+      <w:tblPr/>
+      <w:tcPr>
+        <w:tcBorders>
+          <w:top w:val="nil"/>
+          <w:bottom w:val="nil"/>
+          <w:right w:val="nil"/>
+          <w:insideH w:val="nil"/>
+          <w:insideV w:val="nil"/>
+        </w:tcBorders>
+        <w:shd w:val="clear" w:color="auto" w:fill="FFFFFF" w:themeFill="background1"/>
+      </w:tcPr>
+    </w:tblStylePr>
+    <w:tblStylePr w:type="band1Vert">
+      <w:tblPr/>
+      <w:tcPr>
+        <w:shd w:val="clear" w:color="auto" w:fill="EDEDED" w:themeFill="accent3" w:themeFillTint="33"/>
+      </w:tcPr>
+    </w:tblStylePr>
+    <w:tblStylePr w:type="band1Horz">
+      <w:tblPr/>
+      <w:tcPr>
+        <w:shd w:val="clear" w:color="auto" w:fill="EDEDED" w:themeFill="accent3" w:themeFillTint="33"/>
+      </w:tcPr>
+    </w:tblStylePr>
+    <w:tblStylePr w:type="neCell">
+      <w:tblPr/>
+      <w:tcPr>
+        <w:tcBorders>
+          <w:bottom w:val="single" w:sz="4" w:space="0" w:color="C9C9C9" w:themeColor="accent3" w:themeTint="99"/>
+        </w:tcBorders>
+      </w:tcPr>
+    </w:tblStylePr>
+    <w:tblStylePr w:type="nwCell">
+      <w:tblPr/>
+      <w:tcPr>
+        <w:tcBorders>
+          <w:bottom w:val="single" w:sz="4" w:space="0" w:color="C9C9C9" w:themeColor="accent3" w:themeTint="99"/>
+        </w:tcBorders>
+      </w:tcPr>
+    </w:tblStylePr>
+    <w:tblStylePr w:type="seCell">
+      <w:tblPr/>
+      <w:tcPr>
+        <w:tcBorders>
+          <w:top w:val="single" w:sz="4" w:space="0" w:color="C9C9C9" w:themeColor="accent3" w:themeTint="99"/>
+        </w:tcBorders>
+      </w:tcPr>
+    </w:tblStylePr>
+    <w:tblStylePr w:type="swCell">
+      <w:tblPr/>
+      <w:tcPr>
+        <w:tcBorders>
+          <w:top w:val="single" w:sz="4" w:space="0" w:color="C9C9C9" w:themeColor="accent3" w:themeTint="99"/>
+        </w:tcBorders>
+      </w:tcPr>
+    </w:tblStylePr>
+  </w:style>
+  <w:style w:type="table" w:styleId="PlainTable3">
+    <w:name w:val="Plain Table 3"/>
+    <w:basedOn w:val="TableNormal"/>
+    <w:uiPriority w:val="43"/>
+    <w:rsid w:val="003A2B0B"/>
+    <w:pPr>
+      <w:spacing w:after="0" w:line="240" w:lineRule="auto"/>
+    </w:pPr>
+    <w:tblPr>
+      <w:tblStyleRowBandSize w:val="1"/>
+      <w:tblStyleColBandSize w:val="1"/>
+    </w:tblPr>
+    <w:tblStylePr w:type="firstRow">
+      <w:rPr>
+        <w:b/>
+        <w:bCs/>
+        <w:caps/>
+      </w:rPr>
+      <w:tblPr/>
+      <w:tcPr>
+        <w:tcBorders>
+          <w:bottom w:val="single" w:sz="4" w:space="0" w:color="7F7F7F" w:themeColor="text1" w:themeTint="80"/>
+        </w:tcBorders>
+      </w:tcPr>
+    </w:tblStylePr>
+    <w:tblStylePr w:type="lastRow">
+      <w:rPr>
+        <w:b/>
+        <w:bCs/>
+        <w:caps/>
+      </w:rPr>
+      <w:tblPr/>
+      <w:tcPr>
+        <w:tcBorders>
+          <w:top w:val="nil"/>
+        </w:tcBorders>
+      </w:tcPr>
+    </w:tblStylePr>
+    <w:tblStylePr w:type="firstCol">
+      <w:rPr>
+        <w:b/>
+        <w:bCs/>
+        <w:caps/>
+      </w:rPr>
+      <w:tblPr/>
+      <w:tcPr>
+        <w:tcBorders>
+          <w:right w:val="single" w:sz="4" w:space="0" w:color="7F7F7F" w:themeColor="text1" w:themeTint="80"/>
+        </w:tcBorders>
+      </w:tcPr>
+    </w:tblStylePr>
+    <w:tblStylePr w:type="lastCol">
+      <w:rPr>
+        <w:b/>
+        <w:bCs/>
+        <w:caps/>
+      </w:rPr>
+      <w:tblPr/>
+      <w:tcPr>
+        <w:tcBorders>
+          <w:left w:val="nil"/>
+        </w:tcBorders>
+      </w:tcPr>
+    </w:tblStylePr>
+    <w:tblStylePr w:type="band1Vert">
+      <w:tblPr/>
+      <w:tcPr>
+        <w:shd w:val="clear" w:color="auto" w:fill="F2F2F2" w:themeFill="background1" w:themeFillShade="F2"/>
+      </w:tcPr>
+    </w:tblStylePr>
+    <w:tblStylePr w:type="band1Horz">
+      <w:tblPr/>
+      <w:tcPr>
+        <w:shd w:val="clear" w:color="auto" w:fill="F2F2F2" w:themeFill="background1" w:themeFillShade="F2"/>
+      </w:tcPr>
+    </w:tblStylePr>
+    <w:tblStylePr w:type="neCell">
+      <w:tblPr/>
+      <w:tcPr>
+        <w:tcBorders>
+          <w:left w:val="nil"/>
+        </w:tcBorders>
+      </w:tcPr>
+    </w:tblStylePr>
+    <w:tblStylePr w:type="nwCell">
+      <w:tblPr/>
+      <w:tcPr>
+        <w:tcBorders>
+          <w:right w:val="nil"/>
+        </w:tcBorders>
+      </w:tcPr>
+    </w:tblStylePr>
+  </w:style>
+  <w:style w:type="table" w:styleId="PlainTable5">
+    <w:name w:val="Plain Table 5"/>
+    <w:basedOn w:val="TableNormal"/>
+    <w:uiPriority w:val="45"/>
+    <w:rsid w:val="003A2B0B"/>
+    <w:pPr>
+      <w:spacing w:after="0" w:line="240" w:lineRule="auto"/>
+    </w:pPr>
+    <w:tblPr>
+      <w:tblStyleRowBandSize w:val="1"/>
+      <w:tblStyleColBandSize w:val="1"/>
+    </w:tblPr>
+    <w:tblStylePr w:type="firstRow">
+      <w:rPr>
+        <w:rFonts w:asciiTheme="majorHAnsi" w:eastAsiaTheme="majorEastAsia" w:hAnsiTheme="majorHAnsi" w:cstheme="majorBidi"/>
+        <w:i/>
+        <w:iCs/>
+        <w:sz w:val="26"/>
+      </w:rPr>
+      <w:tblPr/>
+      <w:tcPr>
+        <w:tcBorders>
+          <w:bottom w:val="single" w:sz="4" w:space="0" w:color="7F7F7F" w:themeColor="text1" w:themeTint="80"/>
+        </w:tcBorders>
+        <w:shd w:val="clear" w:color="auto" w:fill="FFFFFF" w:themeFill="background1"/>
+      </w:tcPr>
+    </w:tblStylePr>
+    <w:tblStylePr w:type="lastRow">
+      <w:rPr>
+        <w:rFonts w:asciiTheme="majorHAnsi" w:eastAsiaTheme="majorEastAsia" w:hAnsiTheme="majorHAnsi" w:cstheme="majorBidi"/>
+        <w:i/>
+        <w:iCs/>
+        <w:sz w:val="26"/>
+      </w:rPr>
+      <w:tblPr/>
+      <w:tcPr>
+        <w:tcBorders>
+          <w:top w:val="single" w:sz="4" w:space="0" w:color="7F7F7F" w:themeColor="text1" w:themeTint="80"/>
+        </w:tcBorders>
+        <w:shd w:val="clear" w:color="auto" w:fill="FFFFFF" w:themeFill="background1"/>
+      </w:tcPr>
+    </w:tblStylePr>
+    <w:tblStylePr w:type="firstCol">
+      <w:pPr>
+        <w:jc w:val="right"/>
+      </w:pPr>
+      <w:rPr>
+        <w:rFonts w:asciiTheme="majorHAnsi" w:eastAsiaTheme="majorEastAsia" w:hAnsiTheme="majorHAnsi" w:cstheme="majorBidi"/>
+        <w:i/>
+        <w:iCs/>
+        <w:sz w:val="26"/>
+      </w:rPr>
+      <w:tblPr/>
+      <w:tcPr>
+        <w:tcBorders>
+          <w:right w:val="single" w:sz="4" w:space="0" w:color="7F7F7F" w:themeColor="text1" w:themeTint="80"/>
+        </w:tcBorders>
+        <w:shd w:val="clear" w:color="auto" w:fill="FFFFFF" w:themeFill="background1"/>
+      </w:tcPr>
+    </w:tblStylePr>
+    <w:tblStylePr w:type="lastCol">
+      <w:rPr>
+        <w:rFonts w:asciiTheme="majorHAnsi" w:eastAsiaTheme="majorEastAsia" w:hAnsiTheme="majorHAnsi" w:cstheme="majorBidi"/>
+        <w:i/>
+        <w:iCs/>
+        <w:sz w:val="26"/>
+      </w:rPr>
+      <w:tblPr/>
+      <w:tcPr>
+        <w:tcBorders>
+          <w:left w:val="single" w:sz="4" w:space="0" w:color="7F7F7F" w:themeColor="text1" w:themeTint="80"/>
+        </w:tcBorders>
+        <w:shd w:val="clear" w:color="auto" w:fill="FFFFFF" w:themeFill="background1"/>
+      </w:tcPr>
+    </w:tblStylePr>
+    <w:tblStylePr w:type="band1Vert">
+      <w:tblPr/>
+      <w:tcPr>
+        <w:shd w:val="clear" w:color="auto" w:fill="F2F2F2" w:themeFill="background1" w:themeFillShade="F2"/>
+      </w:tcPr>
+    </w:tblStylePr>
+    <w:tblStylePr w:type="band1Horz">
+      <w:tblPr/>
+      <w:tcPr>
+        <w:shd w:val="clear" w:color="auto" w:fill="F2F2F2" w:themeFill="background1" w:themeFillShade="F2"/>
+      </w:tcPr>
+    </w:tblStylePr>
+    <w:tblStylePr w:type="neCell">
+      <w:tblPr/>
+      <w:tcPr>
+        <w:tcBorders>
+          <w:left w:val="nil"/>
+        </w:tcBorders>
+      </w:tcPr>
+    </w:tblStylePr>
+    <w:tblStylePr w:type="nwCell">
+      <w:tblPr/>
+      <w:tcPr>
+        <w:tcBorders>
+          <w:right w:val="nil"/>
+        </w:tcBorders>
+      </w:tcPr>
+    </w:tblStylePr>
+    <w:tblStylePr w:type="seCell">
+      <w:tblPr/>
+      <w:tcPr>
+        <w:tcBorders>
+          <w:left w:val="nil"/>
+        </w:tcBorders>
+      </w:tcPr>
+    </w:tblStylePr>
+    <w:tblStylePr w:type="swCell">
+      <w:tblPr/>
+      <w:tcPr>
+        <w:tcBorders>
+          <w:right w:val="nil"/>
+        </w:tcBorders>
+      </w:tcPr>
+    </w:tblStylePr>
+  </w:style>
+  <w:style w:type="table" w:styleId="PlainTable2">
+    <w:name w:val="Plain Table 2"/>
+    <w:basedOn w:val="TableNormal"/>
+    <w:uiPriority w:val="42"/>
+    <w:rsid w:val="003A2B0B"/>
+    <w:pPr>
+      <w:spacing w:after="0" w:line="240" w:lineRule="auto"/>
+    </w:pPr>
+    <w:tblPr>
+      <w:tblStyleRowBandSize w:val="1"/>
+      <w:tblStyleColBandSize w:val="1"/>
+      <w:tblBorders>
+        <w:top w:val="single" w:sz="4" w:space="0" w:color="7F7F7F" w:themeColor="text1" w:themeTint="80"/>
+        <w:bottom w:val="single" w:sz="4" w:space="0" w:color="7F7F7F" w:themeColor="text1" w:themeTint="80"/>
+      </w:tblBorders>
+    </w:tblPr>
+    <w:tblStylePr w:type="firstRow">
+      <w:rPr>
+        <w:b/>
+        <w:bCs/>
+      </w:rPr>
+      <w:tblPr/>
+      <w:tcPr>
+        <w:tcBorders>
+          <w:bottom w:val="single" w:sz="4" w:space="0" w:color="7F7F7F" w:themeColor="text1" w:themeTint="80"/>
+        </w:tcBorders>
+      </w:tcPr>
+    </w:tblStylePr>
+    <w:tblStylePr w:type="lastRow">
+      <w:rPr>
+        <w:b/>
+        <w:bCs/>
+      </w:rPr>
+      <w:tblPr/>
+      <w:tcPr>
+        <w:tcBorders>
+          <w:top w:val="single" w:sz="4" w:space="0" w:color="7F7F7F" w:themeColor="text1" w:themeTint="80"/>
+        </w:tcBorders>
+      </w:tcPr>
+    </w:tblStylePr>
+    <w:tblStylePr w:type="firstCol">
+      <w:rPr>
+        <w:b/>
+        <w:bCs/>
+      </w:rPr>
+    </w:tblStylePr>
+    <w:tblStylePr w:type="lastCol">
+      <w:rPr>
+        <w:b/>
+        <w:bCs/>
+      </w:rPr>
+    </w:tblStylePr>
+    <w:tblStylePr w:type="band1Vert">
+      <w:tblPr/>
+      <w:tcPr>
+        <w:tcBorders>
+          <w:left w:val="single" w:sz="4" w:space="0" w:color="7F7F7F" w:themeColor="text1" w:themeTint="80"/>
+          <w:right w:val="single" w:sz="4" w:space="0" w:color="7F7F7F" w:themeColor="text1" w:themeTint="80"/>
+        </w:tcBorders>
+      </w:tcPr>
+    </w:tblStylePr>
+    <w:tblStylePr w:type="band2Vert">
+      <w:tblPr/>
+      <w:tcPr>
+        <w:tcBorders>
+          <w:left w:val="single" w:sz="4" w:space="0" w:color="7F7F7F" w:themeColor="text1" w:themeTint="80"/>
+          <w:right w:val="single" w:sz="4" w:space="0" w:color="7F7F7F" w:themeColor="text1" w:themeTint="80"/>
+        </w:tcBorders>
+      </w:tcPr>
+    </w:tblStylePr>
+    <w:tblStylePr w:type="band1Horz">
+      <w:tblPr/>
+      <w:tcPr>
+        <w:tcBorders>
+          <w:top w:val="single" w:sz="4" w:space="0" w:color="7F7F7F" w:themeColor="text1" w:themeTint="80"/>
+          <w:bottom w:val="single" w:sz="4" w:space="0" w:color="7F7F7F" w:themeColor="text1" w:themeTint="80"/>
+        </w:tcBorders>
+      </w:tcPr>
+    </w:tblStylePr>
   </w:style>
 </w:styles>
 </file>

</xml_diff>

<commit_message>
Se actualiza el documento word con el número de commit realizado por Jecika Leon y con la imagen de los commits realizados en el repositorio
</commit_message>
<xml_diff>
--- a/Reporte_Proyecto_DSA.docx
+++ b/Reporte_Proyecto_DSA.docx
@@ -4444,6 +4444,18 @@
         <w:t>commit</w:t>
       </w:r>
       <w:proofErr w:type="spellEnd"/>
+      <w:r>
+        <w:rPr>
+          <w:lang w:val="es-ES"/>
+        </w:rPr>
+        <w:t xml:space="preserve"> </w:t>
+      </w:r>
+      <w:r>
+        <w:rPr>
+          <w:lang w:val="es-ES"/>
+        </w:rPr>
+        <w:t>7989150</w:t>
+      </w:r>
     </w:p>
     <w:p>
       <w:pPr>
@@ -4497,14 +4509,14 @@
       </w:pPr>
       <w:r>
         <w:rPr>
-          <w:noProof/>
+          <w:lang w:val="es-ES"/>
         </w:rPr>
         <w:lastRenderedPageBreak/>
         <w:drawing>
-          <wp:inline distT="0" distB="0" distL="0" distR="0" wp14:anchorId="25B7F219" wp14:editId="4E0FDB32">
-            <wp:extent cx="5029200" cy="2507202"/>
-            <wp:effectExtent l="0" t="0" r="0" b="7620"/>
-            <wp:docPr id="489345457" name="Imagen 1"/>
+          <wp:inline distT="0" distB="0" distL="0" distR="0" wp14:anchorId="1215DDAB" wp14:editId="69D892E8">
+            <wp:extent cx="6858000" cy="3819525"/>
+            <wp:effectExtent l="0" t="0" r="0" b="9525"/>
+            <wp:docPr id="865910582" name="Picture 1"/>
             <wp:cNvGraphicFramePr>
               <a:graphicFrameLocks xmlns:a="http://schemas.openxmlformats.org/drawingml/2006/main" noChangeAspect="1"/>
             </wp:cNvGraphicFramePr>
@@ -4512,7 +4524,7 @@
               <a:graphicData uri="http://schemas.openxmlformats.org/drawingml/2006/picture">
                 <pic:pic xmlns:pic="http://schemas.openxmlformats.org/drawingml/2006/picture">
                   <pic:nvPicPr>
-                    <pic:cNvPr id="489345457" name=""/>
+                    <pic:cNvPr id="865910582" name=""/>
                     <pic:cNvPicPr/>
                   </pic:nvPicPr>
                   <pic:blipFill>
@@ -4524,7 +4536,7 @@
                   <pic:spPr>
                     <a:xfrm>
                       <a:off x="0" y="0"/>
-                      <a:ext cx="5037609" cy="2511394"/>
+                      <a:ext cx="6858000" cy="3819525"/>
                     </a:xfrm>
                     <a:prstGeom prst="rect">
                       <a:avLst/>

</xml_diff>

<commit_message>
Se modifica word, exploracion de datos y se agregan las figuras actividad y distribution en la version final entrega proyecto 1
</commit_message>
<xml_diff>
--- a/Reporte_Proyecto_DSA.docx
+++ b/Reporte_Proyecto_DSA.docx
@@ -4,16 +4,7 @@
   <w:body>
     <w:sdt>
       <w:sdtPr>
-        <w:rPr>
-          <w:rFonts w:asciiTheme="minorHAnsi" w:eastAsiaTheme="minorHAnsi" w:hAnsiTheme="minorHAnsi" w:cstheme="minorBidi"/>
-          <w:color w:val="auto"/>
-          <w:kern w:val="2"/>
-          <w:sz w:val="22"/>
-          <w:szCs w:val="22"/>
-          <w:lang w:val="es-ES" w:eastAsia="en-US"/>
-          <w14:ligatures w14:val="standardContextual"/>
-        </w:rPr>
-        <w:id w:val="485522806"/>
+        <w:id w:val="-233546425"/>
         <w:docPartObj>
           <w:docPartGallery w:val="Table of Contents"/>
           <w:docPartUnique/>
@@ -21,28 +12,53 @@
       </w:sdtPr>
       <w:sdtEndPr>
         <w:rPr>
+          <w:rFonts w:asciiTheme="minorHAnsi" w:eastAsiaTheme="minorHAnsi" w:hAnsiTheme="minorHAnsi" w:cstheme="minorBidi"/>
           <w:b/>
           <w:bCs/>
+          <w:noProof/>
+          <w:color w:val="auto"/>
+          <w:kern w:val="2"/>
+          <w:sz w:val="22"/>
+          <w:szCs w:val="22"/>
+          <w:lang w:eastAsia="en-US"/>
+          <w14:ligatures w14:val="standardContextual"/>
         </w:rPr>
       </w:sdtEndPr>
       <w:sdtContent>
         <w:p>
           <w:pPr>
             <w:pStyle w:val="TOCHeading"/>
-            <w:ind w:firstLine="708"/>
+            <w:rPr>
+              <w:rStyle w:val="BookTitle"/>
+              <w:sz w:val="24"/>
+              <w:szCs w:val="24"/>
+            </w:rPr>
           </w:pPr>
           <w:r>
             <w:rPr>
-              <w:lang w:val="es-ES"/>
+              <w:rStyle w:val="BookTitle"/>
+              <w:sz w:val="24"/>
+              <w:szCs w:val="24"/>
             </w:rPr>
-            <w:t>Contenido</w:t>
+            <w:t>Ivette Yvonne Campos Bravo · Jecika Nataly León Linares · Juan Sebastián Victoria Sánchez · Guillermo Prieto Peralta</w:t>
+          </w:r>
+        </w:p>
+        <w:p>
+          <w:pPr>
+            <w:pStyle w:val="TOCHeading"/>
+          </w:pPr>
+          <w:r>
+            <w:t>Conten</w:t>
+          </w:r>
+          <w:r>
+            <w:t>ido</w:t>
           </w:r>
         </w:p>
         <w:p>
           <w:pPr>
             <w:pStyle w:val="TOC1"/>
             <w:tabs>
-              <w:tab w:val="right" w:leader="dot" w:pos="8828"/>
+              <w:tab w:val="right" w:leader="dot" w:pos="10790"/>
             </w:tabs>
             <w:rPr>
               <w:rFonts w:eastAsiaTheme="minorEastAsia"/>
@@ -61,13 +77,13 @@
           <w:r>
             <w:fldChar w:fldCharType="separate"/>
           </w:r>
-          <w:hyperlink w:anchor="_Toc243490725" w:history="1">
+          <w:hyperlink w:anchor="_Toc243839249" w:history="1">
             <w:r>
               <w:rPr>
                 <w:rStyle w:val="Hyperlink"/>
                 <w:noProof/>
               </w:rPr>
-              <w:t>1. Problema y contexto</w:t>
+              <w:t>Problema y contexto</w:t>
             </w:r>
             <w:r>
               <w:rPr>
@@ -88,7 +104,7 @@
                 <w:noProof/>
                 <w:webHidden/>
               </w:rPr>
-              <w:instrText xml:space="preserve"> PAGEREF _Toc243490725 \h </w:instrText>
+              <w:instrText xml:space="preserve"> PAGEREF _Toc243839249 \h </w:instrText>
             </w:r>
             <w:r>
               <w:rPr>
@@ -123,7 +139,7 @@
           <w:pPr>
             <w:pStyle w:val="TOC1"/>
             <w:tabs>
-              <w:tab w:val="right" w:leader="dot" w:pos="8828"/>
+              <w:tab w:val="right" w:leader="dot" w:pos="10790"/>
             </w:tabs>
             <w:rPr>
               <w:rFonts w:eastAsiaTheme="minorEastAsia"/>
@@ -133,13 +149,13 @@
               <w:lang w:eastAsia="es-CO"/>
             </w:rPr>
           </w:pPr>
-          <w:hyperlink w:anchor="_Toc243490726" w:history="1">
+          <w:hyperlink w:anchor="_Toc243839250" w:history="1">
             <w:r>
               <w:rPr>
                 <w:rStyle w:val="Hyperlink"/>
                 <w:noProof/>
               </w:rPr>
-              <w:t>2. Pregunta de negocio y alcance del proyecto</w:t>
+              <w:t>Pregunta de negocio y alcance del proyecto</w:t>
             </w:r>
             <w:r>
               <w:rPr>
@@ -160,7 +176,7 @@
                 <w:noProof/>
                 <w:webHidden/>
               </w:rPr>
-              <w:instrText xml:space="preserve"> PAGEREF _Toc243490726 \h </w:instrText>
+              <w:instrText xml:space="preserve"> PAGEREF _Toc243839250 \h </w:instrText>
             </w:r>
             <w:r>
               <w:rPr>
@@ -195,7 +211,7 @@
           <w:pPr>
             <w:pStyle w:val="TOC1"/>
             <w:tabs>
-              <w:tab w:val="right" w:leader="dot" w:pos="8828"/>
+              <w:tab w:val="right" w:leader="dot" w:pos="10790"/>
             </w:tabs>
             <w:rPr>
               <w:rFonts w:eastAsiaTheme="minorEastAsia"/>
@@ -205,13 +221,13 @@
               <w:lang w:eastAsia="es-CO"/>
             </w:rPr>
           </w:pPr>
-          <w:hyperlink w:anchor="_Toc243490727" w:history="1">
+          <w:hyperlink w:anchor="_Toc243839251" w:history="1">
             <w:r>
               <w:rPr>
                 <w:rStyle w:val="Hyperlink"/>
                 <w:noProof/>
               </w:rPr>
-              <w:t>3. Descripción de los conjuntos de datos</w:t>
+              <w:t>Descripción de los conjuntos de datos</w:t>
             </w:r>
             <w:r>
               <w:rPr>
@@ -232,7 +248,7 @@
                 <w:noProof/>
                 <w:webHidden/>
               </w:rPr>
-              <w:instrText xml:space="preserve"> PAGEREF _Toc243490727 \h </w:instrText>
+              <w:instrText xml:space="preserve"> PAGEREF _Toc243839251 \h </w:instrText>
             </w:r>
             <w:r>
               <w:rPr>
@@ -267,7 +283,7 @@
           <w:pPr>
             <w:pStyle w:val="TOC1"/>
             <w:tabs>
-              <w:tab w:val="right" w:leader="dot" w:pos="8828"/>
+              <w:tab w:val="right" w:leader="dot" w:pos="10790"/>
             </w:tabs>
             <w:rPr>
               <w:rFonts w:eastAsiaTheme="minorEastAsia"/>
@@ -277,13 +293,13 @@
               <w:lang w:eastAsia="es-CO"/>
             </w:rPr>
           </w:pPr>
-          <w:hyperlink w:anchor="_Toc243490728" w:history="1">
+          <w:hyperlink w:anchor="_Toc243839252" w:history="1">
             <w:r>
               <w:rPr>
                 <w:rStyle w:val="Hyperlink"/>
                 <w:noProof/>
               </w:rPr>
-              <w:t>4. Exploración de los datos</w:t>
+              <w:t>Exploración de los datos</w:t>
             </w:r>
             <w:r>
               <w:rPr>
@@ -304,7 +320,7 @@
                 <w:noProof/>
                 <w:webHidden/>
               </w:rPr>
-              <w:instrText xml:space="preserve"> PAGEREF _Toc243490728 \h </w:instrText>
+              <w:instrText xml:space="preserve"> PAGEREF _Toc243839252 \h </w:instrText>
             </w:r>
             <w:r>
               <w:rPr>
@@ -339,7 +355,7 @@
           <w:pPr>
             <w:pStyle w:val="TOC1"/>
             <w:tabs>
-              <w:tab w:val="right" w:leader="dot" w:pos="8828"/>
+              <w:tab w:val="right" w:leader="dot" w:pos="10790"/>
             </w:tabs>
             <w:rPr>
               <w:rFonts w:eastAsiaTheme="minorEastAsia"/>
@@ -349,13 +365,13 @@
               <w:lang w:eastAsia="es-CO"/>
             </w:rPr>
           </w:pPr>
-          <w:hyperlink w:anchor="_Toc243490729" w:history="1">
+          <w:hyperlink w:anchor="_Toc243839253" w:history="1">
             <w:r>
               <w:rPr>
                 <w:rStyle w:val="Hyperlink"/>
                 <w:noProof/>
               </w:rPr>
-              <w:t>5. Maqueta (mockup) del prototipo</w:t>
+              <w:t>Maqueta (mockup) del prototipo</w:t>
             </w:r>
             <w:r>
               <w:rPr>
@@ -376,7 +392,7 @@
                 <w:noProof/>
                 <w:webHidden/>
               </w:rPr>
-              <w:instrText xml:space="preserve"> PAGEREF _Toc243490729 \h </w:instrText>
+              <w:instrText xml:space="preserve"> PAGEREF _Toc243839253 \h </w:instrText>
             </w:r>
             <w:r>
               <w:rPr>
@@ -411,7 +427,7 @@
           <w:pPr>
             <w:pStyle w:val="TOC1"/>
             <w:tabs>
-              <w:tab w:val="right" w:leader="dot" w:pos="8828"/>
+              <w:tab w:val="right" w:leader="dot" w:pos="10790"/>
             </w:tabs>
             <w:rPr>
               <w:rFonts w:eastAsiaTheme="minorEastAsia"/>
@@ -421,13 +437,13 @@
               <w:lang w:eastAsia="es-CO"/>
             </w:rPr>
           </w:pPr>
-          <w:hyperlink w:anchor="_Toc243490730" w:history="1">
+          <w:hyperlink w:anchor="_Toc243839254" w:history="1">
             <w:r>
               <w:rPr>
                 <w:rStyle w:val="Hyperlink"/>
                 <w:noProof/>
               </w:rPr>
-              <w:t>6. Repositorios y soportes</w:t>
+              <w:t>Repositorios y soportes</w:t>
             </w:r>
             <w:r>
               <w:rPr>
@@ -448,7 +464,7 @@
                 <w:noProof/>
                 <w:webHidden/>
               </w:rPr>
-              <w:instrText xml:space="preserve"> PAGEREF _Toc243490730 \h </w:instrText>
+              <w:instrText xml:space="preserve"> PAGEREF _Toc243839254 \h </w:instrText>
             </w:r>
             <w:r>
               <w:rPr>
@@ -469,6 +485,296 @@
                 <w:webHidden/>
               </w:rPr>
               <w:t>5</w:t>
+            </w:r>
+            <w:r>
+              <w:rPr>
+                <w:noProof/>
+                <w:webHidden/>
+              </w:rPr>
+              <w:fldChar w:fldCharType="end"/>
+            </w:r>
+          </w:hyperlink>
+        </w:p>
+        <w:p>
+          <w:pPr>
+            <w:pStyle w:val="TOC2"/>
+            <w:tabs>
+              <w:tab w:val="right" w:leader="dot" w:pos="10790"/>
+            </w:tabs>
+            <w:rPr>
+              <w:rFonts w:eastAsiaTheme="minorEastAsia"/>
+              <w:noProof/>
+              <w:sz w:val="24"/>
+              <w:szCs w:val="24"/>
+              <w:lang w:eastAsia="es-CO"/>
+            </w:rPr>
+          </w:pPr>
+          <w:hyperlink w:anchor="_Toc243839255" w:history="1">
+            <w:r>
+              <w:rPr>
+                <w:rStyle w:val="Hyperlink"/>
+                <w:noProof/>
+                <w:lang w:val="es-ES"/>
+              </w:rPr>
+              <w:t>6.1. Repositorio de código y documentación – GitHub:</w:t>
+            </w:r>
+            <w:r>
+              <w:rPr>
+                <w:noProof/>
+                <w:webHidden/>
+              </w:rPr>
+              <w:tab/>
+            </w:r>
+            <w:r>
+              <w:rPr>
+                <w:noProof/>
+                <w:webHidden/>
+              </w:rPr>
+              <w:fldChar w:fldCharType="begin"/>
+            </w:r>
+            <w:r>
+              <w:rPr>
+                <w:noProof/>
+                <w:webHidden/>
+              </w:rPr>
+              <w:instrText xml:space="preserve"> PAGEREF _Toc243839255 \h </w:instrText>
+            </w:r>
+            <w:r>
+              <w:rPr>
+                <w:noProof/>
+                <w:webHidden/>
+              </w:rPr>
+            </w:r>
+            <w:r>
+              <w:rPr>
+                <w:noProof/>
+                <w:webHidden/>
+              </w:rPr>
+              <w:fldChar w:fldCharType="separate"/>
+            </w:r>
+            <w:r>
+              <w:rPr>
+                <w:noProof/>
+                <w:webHidden/>
+              </w:rPr>
+              <w:t>5</w:t>
+            </w:r>
+            <w:r>
+              <w:rPr>
+                <w:noProof/>
+                <w:webHidden/>
+              </w:rPr>
+              <w:fldChar w:fldCharType="end"/>
+            </w:r>
+          </w:hyperlink>
+        </w:p>
+        <w:p>
+          <w:pPr>
+            <w:pStyle w:val="TOC2"/>
+            <w:tabs>
+              <w:tab w:val="right" w:leader="dot" w:pos="10790"/>
+            </w:tabs>
+            <w:rPr>
+              <w:rFonts w:eastAsiaTheme="minorEastAsia"/>
+              <w:noProof/>
+              <w:sz w:val="24"/>
+              <w:szCs w:val="24"/>
+              <w:lang w:eastAsia="es-CO"/>
+            </w:rPr>
+          </w:pPr>
+          <w:hyperlink w:anchor="_Toc243839256" w:history="1">
+            <w:r>
+              <w:rPr>
+                <w:rStyle w:val="Hyperlink"/>
+                <w:noProof/>
+              </w:rPr>
+              <w:t>6.2. Versionamiento de datos con DVC y Amazon S3</w:t>
+            </w:r>
+            <w:r>
+              <w:rPr>
+                <w:noProof/>
+                <w:webHidden/>
+              </w:rPr>
+              <w:tab/>
+            </w:r>
+            <w:r>
+              <w:rPr>
+                <w:noProof/>
+                <w:webHidden/>
+              </w:rPr>
+              <w:fldChar w:fldCharType="begin"/>
+            </w:r>
+            <w:r>
+              <w:rPr>
+                <w:noProof/>
+                <w:webHidden/>
+              </w:rPr>
+              <w:instrText xml:space="preserve"> PAGEREF _Toc243839256 \h </w:instrText>
+            </w:r>
+            <w:r>
+              <w:rPr>
+                <w:noProof/>
+                <w:webHidden/>
+              </w:rPr>
+            </w:r>
+            <w:r>
+              <w:rPr>
+                <w:noProof/>
+                <w:webHidden/>
+              </w:rPr>
+              <w:fldChar w:fldCharType="separate"/>
+            </w:r>
+            <w:r>
+              <w:rPr>
+                <w:noProof/>
+                <w:webHidden/>
+              </w:rPr>
+              <w:t>5</w:t>
+            </w:r>
+            <w:r>
+              <w:rPr>
+                <w:noProof/>
+                <w:webHidden/>
+              </w:rPr>
+              <w:fldChar w:fldCharType="end"/>
+            </w:r>
+          </w:hyperlink>
+        </w:p>
+        <w:p>
+          <w:pPr>
+            <w:pStyle w:val="TOC2"/>
+            <w:tabs>
+              <w:tab w:val="right" w:leader="dot" w:pos="10790"/>
+            </w:tabs>
+            <w:rPr>
+              <w:rFonts w:eastAsiaTheme="minorEastAsia"/>
+              <w:noProof/>
+              <w:sz w:val="24"/>
+              <w:szCs w:val="24"/>
+              <w:lang w:eastAsia="es-CO"/>
+            </w:rPr>
+          </w:pPr>
+          <w:hyperlink w:anchor="_Toc243839257" w:history="1">
+            <w:r>
+              <w:rPr>
+                <w:rStyle w:val="Hyperlink"/>
+                <w:noProof/>
+                <w:lang w:val="es-ES"/>
+              </w:rPr>
+              <w:t>6.3. Evidencias de implementación</w:t>
+            </w:r>
+            <w:r>
+              <w:rPr>
+                <w:noProof/>
+                <w:webHidden/>
+              </w:rPr>
+              <w:tab/>
+            </w:r>
+            <w:r>
+              <w:rPr>
+                <w:noProof/>
+                <w:webHidden/>
+              </w:rPr>
+              <w:fldChar w:fldCharType="begin"/>
+            </w:r>
+            <w:r>
+              <w:rPr>
+                <w:noProof/>
+                <w:webHidden/>
+              </w:rPr>
+              <w:instrText xml:space="preserve"> PAGEREF _Toc243839257 \h </w:instrText>
+            </w:r>
+            <w:r>
+              <w:rPr>
+                <w:noProof/>
+                <w:webHidden/>
+              </w:rPr>
+            </w:r>
+            <w:r>
+              <w:rPr>
+                <w:noProof/>
+                <w:webHidden/>
+              </w:rPr>
+              <w:fldChar w:fldCharType="separate"/>
+            </w:r>
+            <w:r>
+              <w:rPr>
+                <w:noProof/>
+                <w:webHidden/>
+              </w:rPr>
+              <w:t>6</w:t>
+            </w:r>
+            <w:r>
+              <w:rPr>
+                <w:noProof/>
+                <w:webHidden/>
+              </w:rPr>
+              <w:fldChar w:fldCharType="end"/>
+            </w:r>
+          </w:hyperlink>
+        </w:p>
+        <w:p>
+          <w:pPr>
+            <w:pStyle w:val="TOC1"/>
+            <w:tabs>
+              <w:tab w:val="right" w:leader="dot" w:pos="10790"/>
+            </w:tabs>
+            <w:rPr>
+              <w:rFonts w:eastAsiaTheme="minorEastAsia"/>
+              <w:noProof/>
+              <w:sz w:val="24"/>
+              <w:szCs w:val="24"/>
+              <w:lang w:eastAsia="es-CO"/>
+            </w:rPr>
+          </w:pPr>
+          <w:hyperlink w:anchor="_Toc243839258" w:history="1">
+            <w:r>
+              <w:rPr>
+                <w:rStyle w:val="Hyperlink"/>
+                <w:noProof/>
+              </w:rPr>
+              <w:t>Reporte de trabajo en equipo</w:t>
+            </w:r>
+            <w:r>
+              <w:rPr>
+                <w:noProof/>
+                <w:webHidden/>
+              </w:rPr>
+              <w:tab/>
+            </w:r>
+            <w:r>
+              <w:rPr>
+                <w:noProof/>
+                <w:webHidden/>
+              </w:rPr>
+              <w:fldChar w:fldCharType="begin"/>
+            </w:r>
+            <w:r>
+              <w:rPr>
+                <w:noProof/>
+                <w:webHidden/>
+              </w:rPr>
+              <w:instrText xml:space="preserve"> PAGEREF _Toc243839258 \h </w:instrText>
+            </w:r>
+            <w:r>
+              <w:rPr>
+                <w:noProof/>
+                <w:webHidden/>
+              </w:rPr>
+            </w:r>
+            <w:r>
+              <w:rPr>
+                <w:noProof/>
+                <w:webHidden/>
+              </w:rPr>
+              <w:fldChar w:fldCharType="separate"/>
+            </w:r>
+            <w:r>
+              <w:rPr>
+                <w:noProof/>
+                <w:webHidden/>
+              </w:rPr>
+              <w:t>7</w:t>
             </w:r>
             <w:r>
               <w:rPr>
@@ -484,23 +790,18 @@
             <w:rPr>
               <w:b/>
               <w:bCs/>
-              <w:lang w:val="es-ES"/>
+              <w:noProof/>
             </w:rPr>
             <w:fldChar w:fldCharType="end"/>
           </w:r>
         </w:p>
       </w:sdtContent>
     </w:sdt>
-    <w:bookmarkStart w:id="0" w:name="_Toc243490725" w:displacedByCustomXml="prev"/>
     <w:p>
       <w:pPr>
         <w:pStyle w:val="Heading1"/>
-        <w:numPr>
-          <w:ilvl w:val="0"/>
-          <w:numId w:val="1"/>
-        </w:numPr>
-        <w:spacing w:line="240" w:lineRule="auto"/>
-      </w:pPr>
+      </w:pPr>
+      <w:bookmarkStart w:id="0" w:name="_Toc243839249"/>
       <w:r>
         <w:t>Problema y contexto</w:t>
       </w:r>
@@ -558,22 +859,12 @@
     <w:p>
       <w:pPr>
         <w:pStyle w:val="Heading1"/>
-        <w:numPr>
-          <w:ilvl w:val="0"/>
-          <w:numId w:val="1"/>
-        </w:numPr>
-        <w:spacing w:line="240" w:lineRule="auto"/>
-      </w:pPr>
-      <w:bookmarkStart w:id="1" w:name="_Toc243490726"/>
+      </w:pPr>
+      <w:bookmarkStart w:id="1" w:name="_Toc243839250"/>
       <w:r>
         <w:t>Pregunta de negocio y alcance del proyecto</w:t>
       </w:r>
       <w:bookmarkEnd w:id="1"/>
-    </w:p>
-    <w:p>
-      <w:pPr>
-        <w:spacing w:after="0"/>
-      </w:pPr>
     </w:p>
     <w:p>
       <w:pPr>
@@ -642,74 +933,62 @@
       <w:pPr>
         <w:spacing w:after="0" w:line="240" w:lineRule="auto"/>
         <w:jc w:val="both"/>
-      </w:pPr>
-      <w:r>
         <w:rPr>
           <w:rFonts w:eastAsia="Times New Roman" w:cstheme="minorHAnsi"/>
           <w:kern w:val="0"/>
           <w:lang w:eastAsia="es-CO"/>
           <w14:ligatures w14:val="none"/>
         </w:rPr>
+      </w:pPr>
+      <w:r>
+        <w:rPr>
+          <w:rFonts w:eastAsia="Times New Roman" w:cstheme="minorHAnsi"/>
+          <w:kern w:val="0"/>
+          <w:lang w:eastAsia="es-CO"/>
+          <w14:ligatures w14:val="none"/>
+        </w:rPr>
+        <w:lastRenderedPageBreak/>
         <w:t>La solución buscará combinar un componente descriptivo, que permita comparar la actividad transaccional y los valores registrados, con un componente predictivo orientado a la estimación de valores. Los resultados servirán como apoyo para identificar qué municipios pueden ser priorizados para estudios posteriores de inversión. El alcance no incluye recomendaciones sobre la compra de inmuebles específicos ni pretende garantizar una rentabilidad futura.</w:t>
       </w:r>
     </w:p>
     <w:p>
       <w:pPr>
+        <w:spacing w:after="0" w:line="240" w:lineRule="auto"/>
+        <w:jc w:val="both"/>
+      </w:pPr>
+    </w:p>
+    <w:p>
+      <w:pPr>
         <w:pStyle w:val="Heading1"/>
-        <w:numPr>
-          <w:ilvl w:val="0"/>
-          <w:numId w:val="1"/>
-        </w:numPr>
-      </w:pPr>
-      <w:bookmarkStart w:id="2" w:name="_Toc243490727"/>
-      <w:r>
-        <w:lastRenderedPageBreak/>
+      </w:pPr>
+      <w:bookmarkStart w:id="2" w:name="_Toc243839251"/>
+      <w:r>
         <w:t>Descripción de los conjuntos de datos</w:t>
       </w:r>
       <w:bookmarkEnd w:id="2"/>
     </w:p>
     <w:p>
       <w:pPr>
-        <w:pStyle w:val="NormalWeb"/>
-        <w:spacing w:line="300" w:lineRule="atLeast"/>
-        <w:jc w:val="both"/>
-        <w:rPr>
-          <w:rFonts w:asciiTheme="minorHAnsi" w:hAnsiTheme="minorHAnsi" w:cstheme="minorHAnsi"/>
-          <w:sz w:val="22"/>
-          <w:szCs w:val="22"/>
-        </w:rPr>
-      </w:pPr>
-      <w:r>
-        <w:rPr>
-          <w:rFonts w:asciiTheme="minorHAnsi" w:hAnsiTheme="minorHAnsi" w:cstheme="minorHAnsi"/>
-          <w:sz w:val="22"/>
-          <w:szCs w:val="22"/>
-        </w:rPr>
+        <w:rPr>
+          <w:rFonts w:asciiTheme="majorHAnsi" w:hAnsiTheme="majorHAnsi" w:cstheme="majorBidi"/>
+          <w:sz w:val="40"/>
+          <w:szCs w:val="40"/>
+        </w:rPr>
+      </w:pPr>
+      <w:r>
         <w:t>Para el proyecto se utilizará como fuente principal el conjunto de datos</w:t>
       </w:r>
       <w:r>
-        <w:rPr>
-          <w:rFonts w:asciiTheme="minorHAnsi" w:hAnsiTheme="minorHAnsi" w:cstheme="minorHAnsi"/>
-          <w:sz w:val="22"/>
-          <w:szCs w:val="22"/>
-        </w:rPr>
         <w:t xml:space="preserve"> </w:t>
       </w:r>
       <w:r>
         <w:rPr>
           <w:rStyle w:val="Strong"/>
-          <w:rFonts w:asciiTheme="minorHAnsi" w:hAnsiTheme="minorHAnsi" w:cstheme="minorHAnsi"/>
-          <w:sz w:val="22"/>
-          <w:szCs w:val="22"/>
+          <w:rFonts w:cstheme="minorHAnsi"/>
         </w:rPr>
         <w:t>“Registro de Transacciones Inmobiliarias en Colombia IGAC 2015–2023”</w:t>
       </w:r>
       <w:r>
-        <w:rPr>
-          <w:rFonts w:asciiTheme="minorHAnsi" w:hAnsiTheme="minorHAnsi" w:cstheme="minorHAnsi"/>
-          <w:sz w:val="22"/>
-          <w:szCs w:val="22"/>
-        </w:rPr>
         <w:t>, disponible en el portal de Datos Abiertos Colombia. La información puede consultarse mediante su API y contiene registros de transacciones inmobiliarias de diferentes municipios del país.</w:t>
       </w:r>
     </w:p>
@@ -865,22 +1144,12 @@
     <w:p>
       <w:pPr>
         <w:pStyle w:val="Heading1"/>
-        <w:numPr>
-          <w:ilvl w:val="0"/>
-          <w:numId w:val="1"/>
-        </w:numPr>
-        <w:spacing w:before="0" w:after="0" w:line="240" w:lineRule="auto"/>
-      </w:pPr>
-      <w:bookmarkStart w:id="3" w:name="_Toc243490728"/>
+      </w:pPr>
+      <w:bookmarkStart w:id="3" w:name="_Toc243839252"/>
       <w:r>
         <w:t>Exploración de los datos</w:t>
       </w:r>
       <w:bookmarkEnd w:id="3"/>
-    </w:p>
-    <w:p>
-      <w:pPr>
-        <w:spacing w:after="0" w:line="240" w:lineRule="auto"/>
-      </w:pPr>
     </w:p>
     <w:p>
       <w:pPr>
@@ -1860,7 +2129,7 @@
                     <pic:cNvPicPr/>
                   </pic:nvPicPr>
                   <pic:blipFill>
-                    <a:blip r:embed="rId6"/>
+                    <a:blip r:embed="rId8"/>
                     <a:stretch>
                       <a:fillRect/>
                     </a:stretch>
@@ -2464,36 +2733,17 @@
           <w:lang w:eastAsia="es-CO"/>
           <w14:ligatures w14:val="none"/>
         </w:rPr>
-        <w:t>La consulta identificó 214.190 registros de compraventa urbana para los tres municipios y el periodo seleccionado. De estos, 214.036 cumplen las condiciones de valor positivo y ausencia de indicador de múltiples valores, equivalentes al 99,93 %. Los 154 registros restantes podrán considerarse para describir actividad registral, pero se excluyen del análisis monetario bajo los filtros definidos. Esta cobertura no garantiza la calidad completa de los datos; todavía deben revisarse duplicados, inconsistencias y valores extremos.</w:t>
-      </w:r>
-    </w:p>
-    <w:p>
-      <w:pPr>
-        <w:spacing w:after="0" w:line="300" w:lineRule="atLeast"/>
-        <w:jc w:val="both"/>
+        <w:t xml:space="preserve">La consulta identificó 214.190 registros de compraventa urbana para los tres municipios y el periodo seleccionado. De estos, 214.036 cumplen las condiciones de valor positivo y ausencia de indicador de múltiples valores, equivalentes al 99,93 %. Los 154 registros restantes podrán considerarse para describir actividad registral, pero se excluyen del análisis </w:t>
+      </w:r>
+      <w:r>
         <w:rPr>
           <w:rFonts w:eastAsia="Times New Roman" w:cstheme="minorHAnsi"/>
           <w:kern w:val="0"/>
           <w:lang w:eastAsia="es-CO"/>
           <w14:ligatures w14:val="none"/>
         </w:rPr>
-      </w:pPr>
-    </w:p>
-    <w:p>
-      <w:pPr>
-        <w:pStyle w:val="Subtitle"/>
-        <w:rPr>
-          <w:rFonts w:eastAsia="Times New Roman"/>
-          <w:lang w:eastAsia="es-CO"/>
-        </w:rPr>
-      </w:pPr>
-      <w:r>
-        <w:rPr>
-          <w:rFonts w:eastAsia="Times New Roman"/>
-          <w:lang w:eastAsia="es-CO"/>
-        </w:rPr>
         <w:lastRenderedPageBreak/>
-        <w:t>Conclusión.</w:t>
+        <w:t>monetario bajo los filtros definidos. Esta cobertura no garantiza la calidad completa de los datos; todavía deben revisarse duplicados, inconsistencias y valores extremos.</w:t>
       </w:r>
     </w:p>
     <w:p>
@@ -2507,47 +2757,50 @@
           <w14:ligatures w14:val="none"/>
         </w:rPr>
       </w:pPr>
-      <w:r>
+    </w:p>
+    <w:p>
+      <w:pPr>
+        <w:pStyle w:val="Subtitle"/>
+        <w:rPr>
+          <w:rFonts w:eastAsia="Times New Roman"/>
+          <w:lang w:eastAsia="es-CO"/>
+        </w:rPr>
+      </w:pPr>
+      <w:r>
+        <w:rPr>
+          <w:rFonts w:eastAsia="Times New Roman"/>
+          <w:lang w:eastAsia="es-CO"/>
+        </w:rPr>
+        <w:t>Conclusión.</w:t>
+      </w:r>
+    </w:p>
+    <w:p>
+      <w:pPr>
+        <w:spacing w:after="0" w:line="300" w:lineRule="atLeast"/>
+        <w:jc w:val="both"/>
         <w:rPr>
           <w:rFonts w:eastAsia="Times New Roman" w:cstheme="minorHAnsi"/>
           <w:kern w:val="0"/>
           <w:lang w:eastAsia="es-CO"/>
           <w14:ligatures w14:val="none"/>
         </w:rPr>
-        <w:t xml:space="preserve">La exploración respalda el uso de indicadores descriptivos para comparar los municipios y muestra la necesidad de utilizar medidas resistentes a valores extremos, como la mediana y los cuartiles. Las diferencias monetarias no representan valorización de un mismo inmueble, pues pueden cambiar las características de las operaciones registradas. </w:t>
-      </w:r>
-      <w:bookmarkStart w:id="4" w:name="_Toc243490729"/>
-    </w:p>
-    <w:p>
-      <w:pPr>
-        <w:spacing w:after="0" w:line="300" w:lineRule="atLeast"/>
-        <w:jc w:val="both"/>
+      </w:pPr>
+      <w:r>
         <w:rPr>
           <w:rFonts w:eastAsia="Times New Roman" w:cstheme="minorHAnsi"/>
           <w:kern w:val="0"/>
           <w:lang w:eastAsia="es-CO"/>
           <w14:ligatures w14:val="none"/>
         </w:rPr>
-      </w:pPr>
-    </w:p>
-    <w:p>
-      <w:pPr>
-        <w:spacing w:after="0" w:line="300" w:lineRule="atLeast"/>
-        <w:jc w:val="both"/>
-        <w:rPr>
-          <w:rFonts w:asciiTheme="majorHAnsi" w:eastAsiaTheme="majorEastAsia" w:hAnsiTheme="majorHAnsi" w:cstheme="majorBidi"/>
-          <w:color w:val="2F5496" w:themeColor="accent1" w:themeShade="BF"/>
-          <w:sz w:val="40"/>
-          <w:szCs w:val="40"/>
-        </w:rPr>
-      </w:pPr>
-      <w:r>
-        <w:rPr>
-          <w:rFonts w:asciiTheme="majorHAnsi" w:eastAsiaTheme="majorEastAsia" w:hAnsiTheme="majorHAnsi" w:cstheme="majorBidi"/>
-          <w:color w:val="2F5496" w:themeColor="accent1" w:themeShade="BF"/>
-          <w:sz w:val="40"/>
-          <w:szCs w:val="40"/>
-        </w:rPr>
+        <w:t xml:space="preserve">La exploración respalda el uso de indicadores descriptivos para comparar los municipios y muestra la necesidad de utilizar medidas resistentes a valores extremos, como la mediana y los cuartiles. Las diferencias monetarias no representan valorización de un mismo inmueble, pues pueden cambiar las características de las operaciones registradas. </w:t>
+      </w:r>
+    </w:p>
+    <w:p>
+      <w:pPr>
+        <w:pStyle w:val="Heading1"/>
+      </w:pPr>
+      <w:bookmarkStart w:id="4" w:name="_Toc243839253"/>
+      <w:r>
         <w:t>Maqueta (mockup) del prototipo</w:t>
       </w:r>
       <w:bookmarkEnd w:id="4"/>
@@ -2618,9 +2871,36 @@
     <w:p>
       <w:pPr>
         <w:spacing w:after="0" w:line="300" w:lineRule="atLeast"/>
+        <w:jc w:val="both"/>
         <w:rPr>
           <w:rFonts w:eastAsia="Times New Roman" w:cstheme="minorHAnsi"/>
           <w:kern w:val="0"/>
+          <w:lang w:eastAsia="es-CO"/>
+          <w14:ligatures w14:val="none"/>
+        </w:rPr>
+      </w:pPr>
+    </w:p>
+    <w:p>
+      <w:pPr>
+        <w:spacing w:after="0" w:line="300" w:lineRule="atLeast"/>
+        <w:rPr>
+          <w:rFonts w:eastAsia="Times New Roman" w:cstheme="minorHAnsi"/>
+          <w:kern w:val="0"/>
+          <w:lang w:eastAsia="es-CO"/>
+          <w14:ligatures w14:val="none"/>
+        </w:rPr>
+      </w:pPr>
+    </w:p>
+    <w:p>
+      <w:pPr>
+        <w:spacing w:after="0" w:line="300" w:lineRule="atLeast"/>
+        <w:rPr>
+          <w:rFonts w:eastAsia="Times New Roman" w:cstheme="minorHAnsi"/>
+          <w:i/>
+          <w:iCs/>
+          <w:kern w:val="0"/>
+          <w:sz w:val="18"/>
+          <w:szCs w:val="18"/>
           <w:lang w:eastAsia="es-CO"/>
           <w14:ligatures w14:val="none"/>
         </w:rPr>
@@ -2634,17 +2914,17 @@
           <w14:ligatures w14:val="none"/>
         </w:rPr>
         <w:drawing>
-          <wp:anchor distT="0" distB="0" distL="114300" distR="114300" simplePos="0" relativeHeight="251658240" behindDoc="0" locked="0" layoutInCell="1" allowOverlap="1" wp14:anchorId="4A60AD96" wp14:editId="7B68A0D4">
+          <wp:anchor distT="0" distB="0" distL="114300" distR="114300" simplePos="0" relativeHeight="251658240" behindDoc="0" locked="0" layoutInCell="1" allowOverlap="1" wp14:anchorId="4A60AD96" wp14:editId="3919060E">
             <wp:simplePos x="0" y="0"/>
             <wp:positionH relativeFrom="margin">
               <wp:align>left</wp:align>
             </wp:positionH>
             <wp:positionV relativeFrom="paragraph">
-              <wp:posOffset>191721</wp:posOffset>
+              <wp:posOffset>41275</wp:posOffset>
             </wp:positionV>
-            <wp:extent cx="5767754" cy="3259133"/>
-            <wp:effectExtent l="0" t="0" r="4445" b="0"/>
-            <wp:wrapNone/>
+            <wp:extent cx="3074670" cy="1737360"/>
+            <wp:effectExtent l="0" t="0" r="0" b="0"/>
+            <wp:wrapSquare wrapText="bothSides"/>
             <wp:docPr id="676672375" name="Picture 1"/>
             <wp:cNvGraphicFramePr>
               <a:graphicFrameLocks xmlns:a="http://schemas.openxmlformats.org/drawingml/2006/main" noChangeAspect="1"/>
@@ -2657,7 +2937,7 @@
                     <pic:cNvPicPr/>
                   </pic:nvPicPr>
                   <pic:blipFill>
-                    <a:blip r:embed="rId7">
+                    <a:blip r:embed="rId9" cstate="print">
                       <a:extLst>
                         <a:ext uri="{28A0092B-C50C-407E-A947-70E740481C1C}">
                           <a14:useLocalDpi xmlns:a14="http://schemas.microsoft.com/office/drawing/2010/main" val="0"/>
@@ -2671,7 +2951,7 @@
                   <pic:spPr>
                     <a:xfrm>
                       <a:off x="0" y="0"/>
-                      <a:ext cx="5790387" cy="3271922"/>
+                      <a:ext cx="3074670" cy="1737360"/>
                     </a:xfrm>
                     <a:prstGeom prst="rect">
                       <a:avLst/>
@@ -2680,19 +2960,16 @@
                 </pic:pic>
               </a:graphicData>
             </a:graphic>
-            <wp14:sizeRelH relativeFrom="page">
+            <wp14:sizeRelH relativeFrom="margin">
               <wp14:pctWidth>0</wp14:pctWidth>
             </wp14:sizeRelH>
-            <wp14:sizeRelV relativeFrom="page">
+            <wp14:sizeRelV relativeFrom="margin">
               <wp14:pctHeight>0</wp14:pctHeight>
             </wp14:sizeRelV>
           </wp:anchor>
         </w:drawing>
       </w:r>
-    </w:p>
-    <w:p>
-      <w:pPr>
-        <w:spacing w:after="0" w:line="300" w:lineRule="atLeast"/>
+      <w:r>
         <w:rPr>
           <w:rFonts w:eastAsia="Times New Roman" w:cstheme="minorHAnsi"/>
           <w:i/>
@@ -2703,7 +2980,42 @@
           <w:lang w:eastAsia="es-CO"/>
           <w14:ligatures w14:val="none"/>
         </w:rPr>
-      </w:pPr>
+        <w:drawing>
+          <wp:inline distT="0" distB="0" distL="0" distR="0" wp14:anchorId="2D3DA1C5" wp14:editId="24DEFF3D">
+            <wp:extent cx="3256173" cy="1758461"/>
+            <wp:effectExtent l="0" t="0" r="1905" b="0"/>
+            <wp:docPr id="52116466" name="Picture 1"/>
+            <wp:cNvGraphicFramePr>
+              <a:graphicFrameLocks xmlns:a="http://schemas.openxmlformats.org/drawingml/2006/main" noChangeAspect="1"/>
+            </wp:cNvGraphicFramePr>
+            <a:graphic xmlns:a="http://schemas.openxmlformats.org/drawingml/2006/main">
+              <a:graphicData uri="http://schemas.openxmlformats.org/drawingml/2006/picture">
+                <pic:pic xmlns:pic="http://schemas.openxmlformats.org/drawingml/2006/picture">
+                  <pic:nvPicPr>
+                    <pic:cNvPr id="52116466" name=""/>
+                    <pic:cNvPicPr/>
+                  </pic:nvPicPr>
+                  <pic:blipFill>
+                    <a:blip r:embed="rId10"/>
+                    <a:stretch>
+                      <a:fillRect/>
+                    </a:stretch>
+                  </pic:blipFill>
+                  <pic:spPr>
+                    <a:xfrm>
+                      <a:off x="0" y="0"/>
+                      <a:ext cx="3289443" cy="1776428"/>
+                    </a:xfrm>
+                    <a:prstGeom prst="rect">
+                      <a:avLst/>
+                    </a:prstGeom>
+                  </pic:spPr>
+                </pic:pic>
+              </a:graphicData>
+            </a:graphic>
+          </wp:inline>
+        </w:drawing>
+      </w:r>
     </w:p>
     <w:p>
       <w:pPr>
@@ -2734,10 +3046,7 @@
           <w14:ligatures w14:val="none"/>
         </w:rPr>
       </w:pPr>
-    </w:p>
-    <w:p>
-      <w:pPr>
-        <w:spacing w:after="0" w:line="300" w:lineRule="atLeast"/>
+      <w:r>
         <w:rPr>
           <w:rFonts w:eastAsia="Times New Roman" w:cstheme="minorHAnsi"/>
           <w:i/>
@@ -2748,11 +3057,43 @@
           <w:lang w:eastAsia="es-CO"/>
           <w14:ligatures w14:val="none"/>
         </w:rPr>
-      </w:pPr>
-    </w:p>
-    <w:p>
-      <w:pPr>
-        <w:spacing w:after="0" w:line="300" w:lineRule="atLeast"/>
+        <w:drawing>
+          <wp:inline distT="0" distB="0" distL="0" distR="0" wp14:anchorId="528FBEAB" wp14:editId="39DB9CBE">
+            <wp:extent cx="3096597" cy="1751428"/>
+            <wp:effectExtent l="0" t="0" r="8890" b="1270"/>
+            <wp:docPr id="1142447822" name="Picture 1"/>
+            <wp:cNvGraphicFramePr>
+              <a:graphicFrameLocks xmlns:a="http://schemas.openxmlformats.org/drawingml/2006/main" noChangeAspect="1"/>
+            </wp:cNvGraphicFramePr>
+            <a:graphic xmlns:a="http://schemas.openxmlformats.org/drawingml/2006/main">
+              <a:graphicData uri="http://schemas.openxmlformats.org/drawingml/2006/picture">
+                <pic:pic xmlns:pic="http://schemas.openxmlformats.org/drawingml/2006/picture">
+                  <pic:nvPicPr>
+                    <pic:cNvPr id="1142447822" name=""/>
+                    <pic:cNvPicPr/>
+                  </pic:nvPicPr>
+                  <pic:blipFill>
+                    <a:blip r:embed="rId11"/>
+                    <a:stretch>
+                      <a:fillRect/>
+                    </a:stretch>
+                  </pic:blipFill>
+                  <pic:spPr>
+                    <a:xfrm>
+                      <a:off x="0" y="0"/>
+                      <a:ext cx="3125043" cy="1767517"/>
+                    </a:xfrm>
+                    <a:prstGeom prst="rect">
+                      <a:avLst/>
+                    </a:prstGeom>
+                  </pic:spPr>
+                </pic:pic>
+              </a:graphicData>
+            </a:graphic>
+          </wp:inline>
+        </w:drawing>
+      </w:r>
+      <w:r>
         <w:rPr>
           <w:rFonts w:eastAsia="Times New Roman" w:cstheme="minorHAnsi"/>
           <w:i/>
@@ -2763,7 +3104,42 @@
           <w:lang w:eastAsia="es-CO"/>
           <w14:ligatures w14:val="none"/>
         </w:rPr>
-      </w:pPr>
+        <w:drawing>
+          <wp:inline distT="0" distB="0" distL="0" distR="0" wp14:anchorId="788CD991" wp14:editId="71778D92">
+            <wp:extent cx="3214223" cy="1868734"/>
+            <wp:effectExtent l="0" t="0" r="5715" b="0"/>
+            <wp:docPr id="1356323810" name="Picture 1"/>
+            <wp:cNvGraphicFramePr>
+              <a:graphicFrameLocks xmlns:a="http://schemas.openxmlformats.org/drawingml/2006/main" noChangeAspect="1"/>
+            </wp:cNvGraphicFramePr>
+            <a:graphic xmlns:a="http://schemas.openxmlformats.org/drawingml/2006/main">
+              <a:graphicData uri="http://schemas.openxmlformats.org/drawingml/2006/picture">
+                <pic:pic xmlns:pic="http://schemas.openxmlformats.org/drawingml/2006/picture">
+                  <pic:nvPicPr>
+                    <pic:cNvPr id="1356323810" name=""/>
+                    <pic:cNvPicPr/>
+                  </pic:nvPicPr>
+                  <pic:blipFill>
+                    <a:blip r:embed="rId12"/>
+                    <a:stretch>
+                      <a:fillRect/>
+                    </a:stretch>
+                  </pic:blipFill>
+                  <pic:spPr>
+                    <a:xfrm>
+                      <a:off x="0" y="0"/>
+                      <a:ext cx="3267709" cy="1899830"/>
+                    </a:xfrm>
+                    <a:prstGeom prst="rect">
+                      <a:avLst/>
+                    </a:prstGeom>
+                  </pic:spPr>
+                </pic:pic>
+              </a:graphicData>
+            </a:graphic>
+          </wp:inline>
+        </w:drawing>
+      </w:r>
     </w:p>
     <w:p>
       <w:pPr>
@@ -2794,10 +3170,7 @@
           <w14:ligatures w14:val="none"/>
         </w:rPr>
       </w:pPr>
-    </w:p>
-    <w:p>
-      <w:pPr>
-        <w:spacing w:after="0" w:line="300" w:lineRule="atLeast"/>
+      <w:r>
         <w:rPr>
           <w:rFonts w:eastAsia="Times New Roman" w:cstheme="minorHAnsi"/>
           <w:i/>
@@ -2808,7 +3181,43 @@
           <w:lang w:eastAsia="es-CO"/>
           <w14:ligatures w14:val="none"/>
         </w:rPr>
-      </w:pPr>
+        <w:lastRenderedPageBreak/>
+        <w:drawing>
+          <wp:inline distT="0" distB="0" distL="0" distR="0" wp14:anchorId="5B6C0E52" wp14:editId="1360E03E">
+            <wp:extent cx="3054845" cy="1695157"/>
+            <wp:effectExtent l="0" t="0" r="0" b="635"/>
+            <wp:docPr id="413600207" name="Picture 1"/>
+            <wp:cNvGraphicFramePr>
+              <a:graphicFrameLocks xmlns:a="http://schemas.openxmlformats.org/drawingml/2006/main" noChangeAspect="1"/>
+            </wp:cNvGraphicFramePr>
+            <a:graphic xmlns:a="http://schemas.openxmlformats.org/drawingml/2006/main">
+              <a:graphicData uri="http://schemas.openxmlformats.org/drawingml/2006/picture">
+                <pic:pic xmlns:pic="http://schemas.openxmlformats.org/drawingml/2006/picture">
+                  <pic:nvPicPr>
+                    <pic:cNvPr id="413600207" name=""/>
+                    <pic:cNvPicPr/>
+                  </pic:nvPicPr>
+                  <pic:blipFill>
+                    <a:blip r:embed="rId13"/>
+                    <a:stretch>
+                      <a:fillRect/>
+                    </a:stretch>
+                  </pic:blipFill>
+                  <pic:spPr>
+                    <a:xfrm>
+                      <a:off x="0" y="0"/>
+                      <a:ext cx="3097116" cy="1718614"/>
+                    </a:xfrm>
+                    <a:prstGeom prst="rect">
+                      <a:avLst/>
+                    </a:prstGeom>
+                  </pic:spPr>
+                </pic:pic>
+              </a:graphicData>
+            </a:graphic>
+          </wp:inline>
+        </w:drawing>
+      </w:r>
       <w:r>
         <w:rPr>
           <w:rFonts w:eastAsia="Times New Roman" w:cstheme="minorHAnsi"/>
@@ -2820,7 +3229,41 @@
           <w:lang w:eastAsia="es-CO"/>
           <w14:ligatures w14:val="none"/>
         </w:rPr>
-        <w:tab/>
+        <w:drawing>
+          <wp:inline distT="0" distB="0" distL="0" distR="0" wp14:anchorId="748CCFC1" wp14:editId="39D596C5">
+            <wp:extent cx="3476602" cy="1673811"/>
+            <wp:effectExtent l="0" t="0" r="0" b="3175"/>
+            <wp:docPr id="1765948213" name="Picture 1"/>
+            <wp:cNvGraphicFramePr>
+              <a:graphicFrameLocks xmlns:a="http://schemas.openxmlformats.org/drawingml/2006/main" noChangeAspect="1"/>
+            </wp:cNvGraphicFramePr>
+            <a:graphic xmlns:a="http://schemas.openxmlformats.org/drawingml/2006/main">
+              <a:graphicData uri="http://schemas.openxmlformats.org/drawingml/2006/picture">
+                <pic:pic xmlns:pic="http://schemas.openxmlformats.org/drawingml/2006/picture">
+                  <pic:nvPicPr>
+                    <pic:cNvPr id="1765948213" name=""/>
+                    <pic:cNvPicPr/>
+                  </pic:nvPicPr>
+                  <pic:blipFill>
+                    <a:blip r:embed="rId14"/>
+                    <a:stretch>
+                      <a:fillRect/>
+                    </a:stretch>
+                  </pic:blipFill>
+                  <pic:spPr>
+                    <a:xfrm>
+                      <a:off x="0" y="0"/>
+                      <a:ext cx="3495217" cy="1682773"/>
+                    </a:xfrm>
+                    <a:prstGeom prst="rect">
+                      <a:avLst/>
+                    </a:prstGeom>
+                  </pic:spPr>
+                </pic:pic>
+              </a:graphicData>
+            </a:graphic>
+          </wp:inline>
+        </w:drawing>
       </w:r>
     </w:p>
     <w:p>
@@ -2852,10 +3295,7 @@
           <w14:ligatures w14:val="none"/>
         </w:rPr>
       </w:pPr>
-    </w:p>
-    <w:p>
-      <w:pPr>
-        <w:spacing w:after="0" w:line="300" w:lineRule="atLeast"/>
+      <w:r>
         <w:rPr>
           <w:rFonts w:eastAsia="Times New Roman" w:cstheme="minorHAnsi"/>
           <w:i/>
@@ -2866,11 +3306,54 @@
           <w:lang w:eastAsia="es-CO"/>
           <w14:ligatures w14:val="none"/>
         </w:rPr>
-      </w:pPr>
+        <w:drawing>
+          <wp:inline distT="0" distB="0" distL="0" distR="0" wp14:anchorId="1C634FC1" wp14:editId="0A62EE44">
+            <wp:extent cx="3495822" cy="1956846"/>
+            <wp:effectExtent l="0" t="0" r="0" b="5715"/>
+            <wp:docPr id="267629390" name="Picture 1"/>
+            <wp:cNvGraphicFramePr>
+              <a:graphicFrameLocks xmlns:a="http://schemas.openxmlformats.org/drawingml/2006/main" noChangeAspect="1"/>
+            </wp:cNvGraphicFramePr>
+            <a:graphic xmlns:a="http://schemas.openxmlformats.org/drawingml/2006/main">
+              <a:graphicData uri="http://schemas.openxmlformats.org/drawingml/2006/picture">
+                <pic:pic xmlns:pic="http://schemas.openxmlformats.org/drawingml/2006/picture">
+                  <pic:nvPicPr>
+                    <pic:cNvPr id="267629390" name=""/>
+                    <pic:cNvPicPr/>
+                  </pic:nvPicPr>
+                  <pic:blipFill>
+                    <a:blip r:embed="rId15"/>
+                    <a:stretch>
+                      <a:fillRect/>
+                    </a:stretch>
+                  </pic:blipFill>
+                  <pic:spPr>
+                    <a:xfrm>
+                      <a:off x="0" y="0"/>
+                      <a:ext cx="3517811" cy="1969155"/>
+                    </a:xfrm>
+                    <a:prstGeom prst="rect">
+                      <a:avLst/>
+                    </a:prstGeom>
+                  </pic:spPr>
+                </pic:pic>
+              </a:graphicData>
+            </a:graphic>
+          </wp:inline>
+        </w:drawing>
+      </w:r>
     </w:p>
     <w:p>
       <w:pPr>
         <w:spacing w:after="0" w:line="300" w:lineRule="atLeast"/>
+        <w:rPr>
+          <w:rFonts w:eastAsia="Times New Roman" w:cstheme="minorHAnsi"/>
+          <w:kern w:val="0"/>
+          <w:lang w:eastAsia="es-CO"/>
+          <w14:ligatures w14:val="none"/>
+        </w:rPr>
+      </w:pPr>
+      <w:r>
         <w:rPr>
           <w:rFonts w:eastAsia="Times New Roman" w:cstheme="minorHAnsi"/>
           <w:i/>
@@ -2881,152 +3364,51 @@
           <w:lang w:eastAsia="es-CO"/>
           <w14:ligatures w14:val="none"/>
         </w:rPr>
-      </w:pPr>
-    </w:p>
-    <w:p>
-      <w:pPr>
-        <w:spacing w:after="0" w:line="300" w:lineRule="atLeast"/>
-        <w:rPr>
-          <w:rFonts w:eastAsia="Times New Roman" w:cstheme="minorHAnsi"/>
-          <w:i/>
-          <w:iCs/>
-          <w:kern w:val="0"/>
-          <w:sz w:val="18"/>
-          <w:szCs w:val="18"/>
-          <w:lang w:eastAsia="es-CO"/>
-          <w14:ligatures w14:val="none"/>
-        </w:rPr>
-      </w:pPr>
-    </w:p>
-    <w:p>
-      <w:pPr>
-        <w:spacing w:after="0" w:line="300" w:lineRule="atLeast"/>
-        <w:rPr>
-          <w:rFonts w:eastAsia="Times New Roman" w:cstheme="minorHAnsi"/>
-          <w:i/>
-          <w:iCs/>
-          <w:kern w:val="0"/>
-          <w:sz w:val="18"/>
-          <w:szCs w:val="18"/>
-          <w:lang w:eastAsia="es-CO"/>
-          <w14:ligatures w14:val="none"/>
-        </w:rPr>
-      </w:pPr>
-    </w:p>
-    <w:p>
-      <w:pPr>
-        <w:spacing w:after="0" w:line="300" w:lineRule="atLeast"/>
-        <w:rPr>
-          <w:rFonts w:eastAsia="Times New Roman" w:cstheme="minorHAnsi"/>
-          <w:i/>
-          <w:iCs/>
-          <w:kern w:val="0"/>
-          <w:sz w:val="18"/>
-          <w:szCs w:val="18"/>
-          <w:lang w:eastAsia="es-CO"/>
-          <w14:ligatures w14:val="none"/>
-        </w:rPr>
-      </w:pPr>
-    </w:p>
-    <w:p>
-      <w:pPr>
-        <w:spacing w:after="0" w:line="300" w:lineRule="atLeast"/>
-        <w:rPr>
-          <w:rFonts w:eastAsia="Times New Roman" w:cstheme="minorHAnsi"/>
-          <w:i/>
-          <w:iCs/>
-          <w:kern w:val="0"/>
-          <w:sz w:val="18"/>
-          <w:szCs w:val="18"/>
-          <w:lang w:eastAsia="es-CO"/>
-          <w14:ligatures w14:val="none"/>
-        </w:rPr>
-      </w:pPr>
-    </w:p>
-    <w:p>
-      <w:pPr>
-        <w:spacing w:after="0" w:line="300" w:lineRule="atLeast"/>
-        <w:rPr>
-          <w:rFonts w:eastAsia="Times New Roman" w:cstheme="minorHAnsi"/>
-          <w:i/>
-          <w:iCs/>
-          <w:kern w:val="0"/>
-          <w:sz w:val="18"/>
-          <w:szCs w:val="18"/>
-          <w:lang w:eastAsia="es-CO"/>
-          <w14:ligatures w14:val="none"/>
-        </w:rPr>
-      </w:pPr>
-    </w:p>
-    <w:p>
-      <w:pPr>
-        <w:spacing w:after="0" w:line="300" w:lineRule="atLeast"/>
-        <w:rPr>
-          <w:rFonts w:eastAsia="Times New Roman" w:cstheme="minorHAnsi"/>
-          <w:kern w:val="0"/>
-          <w:lang w:eastAsia="es-CO"/>
-          <w14:ligatures w14:val="none"/>
-        </w:rPr>
-      </w:pPr>
-      <w:r>
-        <w:rPr>
-          <w:rFonts w:eastAsia="Times New Roman" w:cstheme="minorHAnsi"/>
-          <w:i/>
-          <w:iCs/>
-          <w:kern w:val="0"/>
-          <w:sz w:val="18"/>
-          <w:szCs w:val="18"/>
-          <w:lang w:eastAsia="es-CO"/>
-          <w14:ligatures w14:val="none"/>
-        </w:rPr>
-        <w:t>Figura 3. Maqueta inicial del prototipo propuesto.</w:t>
-      </w:r>
+        <w:t>Maqueta inicial del prototipo propuesto.</w:t>
+      </w:r>
+    </w:p>
+    <w:p>
+      <w:pPr>
+        <w:pStyle w:val="Heading1"/>
+      </w:pPr>
+      <w:bookmarkStart w:id="5" w:name="_Toc243839254"/>
+      <w:r>
+        <w:t>Repositorios y soportes</w:t>
+      </w:r>
+      <w:bookmarkEnd w:id="5"/>
     </w:p>
     <w:p>
       <w:pPr>
         <w:pStyle w:val="Heading2"/>
         <w:rPr>
-          <w:rFonts w:eastAsia="Times New Roman" w:cstheme="minorHAnsi"/>
-          <w:i/>
-          <w:iCs/>
-          <w:kern w:val="0"/>
-          <w:sz w:val="18"/>
-          <w:szCs w:val="18"/>
-          <w:lang w:eastAsia="es-CO"/>
-          <w14:ligatures w14:val="none"/>
-        </w:rPr>
-      </w:pPr>
-      <w:bookmarkStart w:id="5" w:name="_Toc243490730"/>
-      <w:r>
-        <w:lastRenderedPageBreak/>
-        <w:t>6. Repositorios y soportes</w:t>
-      </w:r>
-      <w:bookmarkEnd w:id="5"/>
-    </w:p>
-    <w:p>
-      <w:pPr>
-        <w:keepNext/>
-        <w:keepLines/>
-        <w:spacing w:before="360" w:after="80"/>
-        <w:outlineLvl w:val="0"/>
-        <w:rPr>
-          <w:lang w:val="es-ES"/>
-        </w:rPr>
-      </w:pPr>
-      <w:r>
-        <w:rPr>
+          <w:lang w:val="es-ES"/>
+        </w:rPr>
+      </w:pPr>
+      <w:bookmarkStart w:id="6" w:name="_Toc243839255"/>
+      <w:r>
+        <w:rPr>
+          <w:rStyle w:val="Heading2Char"/>
           <w:lang w:val="es-ES"/>
         </w:rPr>
         <w:t>6.1. Repositorio de código y documentación – GitHub</w:t>
       </w:r>
-    </w:p>
-    <w:p>
-      <w:pPr>
-        <w:keepNext/>
-        <w:keepLines/>
-        <w:spacing w:before="360" w:after="80"/>
+      <w:r>
+        <w:rPr>
+          <w:lang w:val="es-ES"/>
+        </w:rPr>
+        <w:t>:</w:t>
+      </w:r>
+      <w:bookmarkEnd w:id="6"/>
+      <w:r>
+        <w:rPr>
+          <w:lang w:val="es-ES"/>
+        </w:rPr>
+        <w:t xml:space="preserve"> </w:t>
+      </w:r>
+    </w:p>
+    <w:p>
+      <w:pPr>
         <w:jc w:val="both"/>
-        <w:outlineLvl w:val="0"/>
         <w:rPr>
           <w:lang w:val="es-ES"/>
         </w:rPr>
@@ -3037,24 +3419,19 @@
         </w:rPr>
         <w:t>El proyecto cuenta con un repositorio en GitHub que permite centralizar el código, los documentos y los avances realizados por los integrantes del equipo. Mediante Git se mantiene un historial de versiones y contribuciones, facilitando la trazabilidad de los cambios durante el desarrollo de la solución analítica.</w:t>
       </w:r>
-    </w:p>
-    <w:p>
-      <w:pPr>
-        <w:keepNext/>
-        <w:keepLines/>
-        <w:spacing w:before="360" w:after="80"/>
-        <w:outlineLvl w:val="0"/>
-        <w:rPr>
-          <w:lang w:val="es-ES"/>
-        </w:rPr>
-      </w:pPr>
+      <w:r>
+        <w:rPr>
+          <w:lang w:val="es-ES"/>
+        </w:rPr>
+        <w:t xml:space="preserve">  </w:t>
+      </w:r>
       <w:r>
         <w:rPr>
           <w:lang w:val="es-ES"/>
         </w:rPr>
         <w:t xml:space="preserve">Repositorio: </w:t>
       </w:r>
-      <w:hyperlink r:id="rId8" w:history="1">
+      <w:hyperlink r:id="rId16" w:history="1">
         <w:r>
           <w:rPr>
             <w:rStyle w:val="Hyperlink"/>
@@ -3063,18 +3440,12 @@
           <w:t>https://github.com/GuillermoPrietoP/proyecto-inmobiliario-dsa</w:t>
         </w:r>
       </w:hyperlink>
-    </w:p>
-    <w:p>
-      <w:pPr>
-        <w:keepNext/>
-        <w:keepLines/>
-        <w:spacing w:before="360" w:after="80"/>
-        <w:jc w:val="both"/>
-        <w:outlineLvl w:val="0"/>
-        <w:rPr>
-          <w:lang w:val="es-ES"/>
-        </w:rPr>
-      </w:pPr>
+      <w:r>
+        <w:rPr>
+          <w:lang w:val="es-ES"/>
+        </w:rPr>
+        <w:t xml:space="preserve">  </w:t>
+      </w:r>
       <w:r>
         <w:rPr>
           <w:lang w:val="es-ES"/>
@@ -3106,42 +3477,25 @@
     </w:p>
     <w:p>
       <w:pPr>
-        <w:keepNext/>
-        <w:keepLines/>
-        <w:spacing w:before="360" w:after="80"/>
-        <w:outlineLvl w:val="0"/>
-        <w:rPr>
-          <w:lang w:val="es-ES"/>
-        </w:rPr>
-      </w:pPr>
-      <w:r>
-        <w:rPr>
-          <w:lang w:val="es-ES"/>
-        </w:rPr>
+        <w:pStyle w:val="Heading2"/>
+      </w:pPr>
+      <w:bookmarkStart w:id="7" w:name="_Toc243839256"/>
+      <w:r>
         <w:t xml:space="preserve">6.2. </w:t>
       </w:r>
       <w:proofErr w:type="spellStart"/>
       <w:r>
-        <w:rPr>
-          <w:lang w:val="es-ES"/>
-        </w:rPr>
         <w:t>Versionamiento</w:t>
       </w:r>
       <w:proofErr w:type="spellEnd"/>
       <w:r>
-        <w:rPr>
-          <w:lang w:val="es-ES"/>
-        </w:rPr>
         <w:t xml:space="preserve"> de datos con DVC y Amazon S3</w:t>
       </w:r>
-    </w:p>
-    <w:p>
-      <w:pPr>
-        <w:keepNext/>
-        <w:keepLines/>
-        <w:spacing w:before="360" w:after="80"/>
+      <w:bookmarkEnd w:id="7"/>
+    </w:p>
+    <w:p>
+      <w:pPr>
         <w:jc w:val="both"/>
-        <w:outlineLvl w:val="0"/>
         <w:rPr>
           <w:lang w:val="es-ES"/>
         </w:rPr>
@@ -3166,29 +3520,238 @@
         </w:rPr>
         <w:t xml:space="preserve"> Control (DVC), integrado con Git y Amazon S3.</w:t>
       </w:r>
-    </w:p>
-    <w:p>
-      <w:pPr>
-        <w:keepNext/>
-        <w:keepLines/>
-        <w:spacing w:before="360" w:after="80"/>
+      <w:r>
+        <w:rPr>
+          <w:lang w:val="es-ES"/>
+        </w:rPr>
+        <w:t xml:space="preserve"> </w:t>
+      </w:r>
+      <w:r>
+        <w:rPr>
+          <w:lang w:val="es-ES"/>
+        </w:rPr>
+        <w:t xml:space="preserve">El conjunto de datos datos_inmobiliarios.csv se incorporó al seguimiento de DVC mediante el comando </w:t>
+      </w:r>
+      <w:proofErr w:type="spellStart"/>
+      <w:r>
+        <w:rPr>
+          <w:lang w:val="es-ES"/>
+        </w:rPr>
+        <w:t>dvc</w:t>
+      </w:r>
+      <w:proofErr w:type="spellEnd"/>
+      <w:r>
+        <w:rPr>
+          <w:lang w:val="es-ES"/>
+        </w:rPr>
+        <w:t xml:space="preserve"> </w:t>
+      </w:r>
+      <w:proofErr w:type="spellStart"/>
+      <w:r>
+        <w:rPr>
+          <w:lang w:val="es-ES"/>
+        </w:rPr>
+        <w:t>add</w:t>
+      </w:r>
+      <w:proofErr w:type="spellEnd"/>
+      <w:r>
+        <w:rPr>
+          <w:lang w:val="es-ES"/>
+        </w:rPr>
+        <w:t xml:space="preserve">. Esta operación generó el archivo </w:t>
+      </w:r>
+      <w:proofErr w:type="spellStart"/>
+      <w:r>
+        <w:rPr>
+          <w:lang w:val="es-ES"/>
+        </w:rPr>
+        <w:t>datos_inmobiliarios.csv.dvc</w:t>
+      </w:r>
+      <w:proofErr w:type="spellEnd"/>
+      <w:r>
+        <w:rPr>
+          <w:lang w:val="es-ES"/>
+        </w:rPr>
+        <w:t>, que permite identificar la versión de los datos utilizada en el proyecto.</w:t>
+      </w:r>
+    </w:p>
+    <w:p>
+      <w:pPr>
         <w:jc w:val="both"/>
-        <w:outlineLvl w:val="0"/>
-        <w:rPr>
-          <w:lang w:val="es-ES"/>
-        </w:rPr>
-      </w:pPr>
-      <w:r>
-        <w:rPr>
-          <w:lang w:val="es-ES"/>
-        </w:rPr>
-        <w:t xml:space="preserve">El conjunto de datos datos_inmobiliarios.csv se incorporó al seguimiento de DVC mediante el comando </w:t>
+        <w:rPr>
+          <w:lang w:val="es-ES"/>
+        </w:rPr>
+      </w:pPr>
+      <w:r>
+        <w:rPr>
+          <w:lang w:val="es-ES"/>
+        </w:rPr>
+        <w:t>Se configuró Amazon S3 como almacenamiento remoto de DVC:</w:t>
+      </w:r>
+      <w:r>
+        <w:rPr>
+          <w:lang w:val="es-ES"/>
+        </w:rPr>
+        <w:t xml:space="preserve"> </w:t>
       </w:r>
       <w:proofErr w:type="spellStart"/>
       <w:r>
         <w:rPr>
           <w:lang w:val="es-ES"/>
         </w:rPr>
+        <w:t>Bucket</w:t>
+      </w:r>
+      <w:proofErr w:type="spellEnd"/>
+      <w:r>
+        <w:rPr>
+          <w:lang w:val="es-ES"/>
+        </w:rPr>
+        <w:t xml:space="preserve">: </w:t>
+      </w:r>
+      <w:proofErr w:type="spellStart"/>
+      <w:r>
+        <w:rPr>
+          <w:b/>
+          <w:bCs/>
+          <w:i/>
+          <w:iCs/>
+          <w:lang w:val="es-ES"/>
+        </w:rPr>
+        <w:t>miad</w:t>
+      </w:r>
+      <w:proofErr w:type="spellEnd"/>
+      <w:r>
+        <w:rPr>
+          <w:b/>
+          <w:bCs/>
+          <w:i/>
+          <w:iCs/>
+          <w:lang w:val="es-ES"/>
+        </w:rPr>
+        <w:t>-proyecto-</w:t>
+      </w:r>
+      <w:proofErr w:type="spellStart"/>
+      <w:r>
+        <w:rPr>
+          <w:b/>
+          <w:bCs/>
+          <w:i/>
+          <w:iCs/>
+          <w:lang w:val="es-ES"/>
+        </w:rPr>
+        <w:t>inmobiliario</w:t>
+      </w:r>
+      <w:proofErr w:type="spellEnd"/>
+    </w:p>
+    <w:p>
+      <w:pPr>
+        <w:jc w:val="both"/>
+        <w:rPr>
+          <w:b/>
+          <w:bCs/>
+          <w:i/>
+          <w:iCs/>
+          <w:lang w:val="es-ES"/>
+        </w:rPr>
+      </w:pPr>
+      <w:r>
+        <w:rPr>
+          <w:lang w:val="es-ES"/>
+        </w:rPr>
+        <w:t>Ruta del almacenamiento: s3:</w:t>
+      </w:r>
+      <w:r>
+        <w:rPr>
+          <w:lang w:val="es-ES"/>
+        </w:rPr>
+        <w:t xml:space="preserve"> </w:t>
+      </w:r>
+      <w:r>
+        <w:rPr>
+          <w:b/>
+          <w:bCs/>
+          <w:i/>
+          <w:iCs/>
+          <w:lang w:val="es-ES"/>
+        </w:rPr>
+        <w:t>//</w:t>
+      </w:r>
+      <w:proofErr w:type="spellStart"/>
+      <w:r>
+        <w:rPr>
+          <w:b/>
+          <w:bCs/>
+          <w:i/>
+          <w:iCs/>
+          <w:lang w:val="es-ES"/>
+        </w:rPr>
+        <w:t>miad</w:t>
+      </w:r>
+      <w:proofErr w:type="spellEnd"/>
+      <w:r>
+        <w:rPr>
+          <w:b/>
+          <w:bCs/>
+          <w:i/>
+          <w:iCs/>
+          <w:lang w:val="es-ES"/>
+        </w:rPr>
+        <w:t>-proyecto-inmobiliario/</w:t>
+      </w:r>
+      <w:proofErr w:type="spellStart"/>
+      <w:r>
+        <w:rPr>
+          <w:b/>
+          <w:bCs/>
+          <w:i/>
+          <w:iCs/>
+          <w:lang w:val="es-ES"/>
+        </w:rPr>
+        <w:t>dvc-storage</w:t>
+      </w:r>
+      <w:proofErr w:type="spellEnd"/>
+    </w:p>
+    <w:p>
+      <w:pPr>
+        <w:jc w:val="both"/>
+        <w:rPr>
+          <w:lang w:val="es-ES"/>
+        </w:rPr>
+      </w:pPr>
+      <w:r>
+        <w:rPr>
+          <w:lang w:val="es-ES"/>
+        </w:rPr>
+        <w:t>El archivo CSV dejó de almacenarse directamente en la versión actual del repositorio Git, mientras que sus metadatos de seguimiento permanecen en GitHub.</w:t>
+      </w:r>
+    </w:p>
+    <w:p>
+      <w:pPr>
+        <w:jc w:val="both"/>
+        <w:rPr>
+          <w:lang w:val="es-ES"/>
+        </w:rPr>
+      </w:pPr>
+      <w:r>
+        <w:rPr>
+          <w:lang w:val="es-ES"/>
+        </w:rPr>
+        <w:t>La configuración se validó mediante las siguientes operaciones:</w:t>
+      </w:r>
+    </w:p>
+    <w:p>
+      <w:pPr>
+        <w:jc w:val="both"/>
+        <w:rPr>
+          <w:lang w:val="es-ES"/>
+        </w:rPr>
+      </w:pPr>
+      <w:proofErr w:type="spellStart"/>
+      <w:r>
+        <w:rPr>
+          <w:lang w:val="es-ES"/>
+        </w:rPr>
+        <w:lastRenderedPageBreak/>
         <w:t>dvc</w:t>
       </w:r>
       <w:proofErr w:type="spellEnd"/>
@@ -3203,148 +3766,125 @@
         <w:rPr>
           <w:lang w:val="es-ES"/>
         </w:rPr>
-        <w:t>add</w:t>
+        <w:t>push</w:t>
       </w:r>
       <w:proofErr w:type="spellEnd"/>
       <w:r>
         <w:rPr>
           <w:lang w:val="es-ES"/>
         </w:rPr>
-        <w:t xml:space="preserve">. Esta operación generó el archivo </w:t>
+        <w:t xml:space="preserve">: se realizó exitosamente la transferencia del conjunto de datos hacia Amazon S3, obteniendo el resultado 1 file </w:t>
       </w:r>
       <w:proofErr w:type="spellStart"/>
       <w:r>
         <w:rPr>
           <w:lang w:val="es-ES"/>
         </w:rPr>
-        <w:t>datos_inmobiliarios.csv.dvc</w:t>
+        <w:t>pushed</w:t>
       </w:r>
       <w:proofErr w:type="spellEnd"/>
       <w:r>
         <w:rPr>
           <w:lang w:val="es-ES"/>
         </w:rPr>
-        <w:t>, que permite identificar la versión de los datos utilizada en el proyecto.</w:t>
-      </w:r>
-    </w:p>
-    <w:p>
-      <w:pPr>
-        <w:keepNext/>
-        <w:keepLines/>
-        <w:spacing w:before="360" w:after="80"/>
-        <w:outlineLvl w:val="0"/>
-        <w:rPr>
-          <w:lang w:val="es-ES"/>
-        </w:rPr>
-      </w:pPr>
-      <w:r>
-        <w:rPr>
-          <w:lang w:val="es-ES"/>
-        </w:rPr>
-        <w:t>Se configuró Amazon S3 como almacenamiento remoto de DVC:</w:t>
-      </w:r>
-    </w:p>
-    <w:p>
-      <w:pPr>
-        <w:keepNext/>
-        <w:keepLines/>
-        <w:spacing w:before="360" w:after="80"/>
-        <w:outlineLvl w:val="0"/>
-        <w:rPr>
-          <w:lang w:val="es-ES"/>
-        </w:rPr>
-      </w:pPr>
+        <w:t>.</w:t>
+      </w:r>
+    </w:p>
+    <w:p>
+      <w:pPr>
+        <w:jc w:val="both"/>
+        <w:rPr>
+          <w:lang w:val="es-ES"/>
+        </w:rPr>
+      </w:pPr>
+      <w:r>
+        <w:rPr>
+          <w:lang w:val="es-ES"/>
+        </w:rPr>
+        <w:t xml:space="preserve">Verificación en S3: se confirmó la existencia del objeto almacenado en el </w:t>
+      </w:r>
       <w:proofErr w:type="spellStart"/>
       <w:r>
         <w:rPr>
           <w:lang w:val="es-ES"/>
         </w:rPr>
-        <w:t>Bucket</w:t>
+        <w:t>bucket</w:t>
       </w:r>
       <w:proofErr w:type="spellEnd"/>
       <w:r>
         <w:rPr>
           <w:lang w:val="es-ES"/>
         </w:rPr>
-        <w:t xml:space="preserve">: </w:t>
-      </w:r>
+        <w:t xml:space="preserve"> mediante AWS CLI.</w:t>
+      </w:r>
+    </w:p>
+    <w:p>
+      <w:pPr>
+        <w:jc w:val="both"/>
+        <w:rPr>
+          <w:lang w:val="es-ES"/>
+        </w:rPr>
+      </w:pPr>
       <w:proofErr w:type="spellStart"/>
       <w:r>
         <w:rPr>
           <w:lang w:val="es-ES"/>
         </w:rPr>
-        <w:t>miad</w:t>
+        <w:t>dvc</w:t>
       </w:r>
       <w:proofErr w:type="spellEnd"/>
       <w:r>
         <w:rPr>
           <w:lang w:val="es-ES"/>
         </w:rPr>
-        <w:t>-proyecto-inmobiliario</w:t>
-      </w:r>
-    </w:p>
-    <w:p>
-      <w:pPr>
-        <w:keepNext/>
-        <w:keepLines/>
-        <w:spacing w:before="360" w:after="80"/>
-        <w:outlineLvl w:val="0"/>
-        <w:rPr>
-          <w:lang w:val="es-ES"/>
-        </w:rPr>
-      </w:pPr>
-      <w:r>
-        <w:rPr>
-          <w:lang w:val="es-ES"/>
-        </w:rPr>
-        <w:t>Ruta del almacenamiento: s3://miad-proyecto-inmobiliario/dvc-storage</w:t>
-      </w:r>
-    </w:p>
-    <w:p>
-      <w:pPr>
-        <w:keepNext/>
-        <w:keepLines/>
-        <w:spacing w:before="360" w:after="80"/>
+        <w:t xml:space="preserve"> </w:t>
+      </w:r>
+      <w:proofErr w:type="spellStart"/>
+      <w:r>
+        <w:rPr>
+          <w:lang w:val="es-ES"/>
+        </w:rPr>
+        <w:t>pull</w:t>
+      </w:r>
+      <w:proofErr w:type="spellEnd"/>
+      <w:r>
+        <w:rPr>
+          <w:lang w:val="es-ES"/>
+        </w:rPr>
+        <w:t xml:space="preserve">: se realizó una prueba de recuperación desde una copia independiente del repositorio, sin el archivo CSV ni la caché de datos local. El resultado fue 1 file </w:t>
+      </w:r>
+      <w:proofErr w:type="spellStart"/>
+      <w:r>
+        <w:rPr>
+          <w:lang w:val="es-ES"/>
+        </w:rPr>
+        <w:t>fetched</w:t>
+      </w:r>
+      <w:proofErr w:type="spellEnd"/>
+      <w:r>
+        <w:rPr>
+          <w:lang w:val="es-ES"/>
+        </w:rPr>
+        <w:t xml:space="preserve"> and 1 file </w:t>
+      </w:r>
+      <w:proofErr w:type="spellStart"/>
+      <w:r>
+        <w:rPr>
+          <w:lang w:val="es-ES"/>
+        </w:rPr>
+        <w:t>added</w:t>
+      </w:r>
+      <w:proofErr w:type="spellEnd"/>
+      <w:r>
+        <w:rPr>
+          <w:lang w:val="es-ES"/>
+        </w:rPr>
+        <w:t>.</w:t>
+      </w:r>
+    </w:p>
+    <w:p>
+      <w:pPr>
         <w:jc w:val="both"/>
-        <w:outlineLvl w:val="0"/>
-        <w:rPr>
-          <w:lang w:val="es-ES"/>
-        </w:rPr>
-      </w:pPr>
-      <w:r>
-        <w:rPr>
-          <w:lang w:val="es-ES"/>
-        </w:rPr>
-        <w:t>El archivo CSV dejó de almacenarse directamente en la versión actual del repositorio Git, mientras que sus metadatos de seguimiento permanecen en GitHub.</w:t>
-      </w:r>
-    </w:p>
-    <w:p>
-      <w:pPr>
-        <w:keepNext/>
-        <w:keepLines/>
-        <w:spacing w:before="360" w:after="80"/>
-        <w:outlineLvl w:val="0"/>
-        <w:rPr>
-          <w:lang w:val="es-ES"/>
-        </w:rPr>
-      </w:pPr>
-      <w:r>
-        <w:rPr>
-          <w:lang w:val="es-ES"/>
-        </w:rPr>
-        <w:t>La configuración se validó mediante las siguientes operaciones:</w:t>
-      </w:r>
-    </w:p>
-    <w:p>
-      <w:pPr>
-        <w:keepNext/>
-        <w:keepLines/>
-        <w:numPr>
-          <w:ilvl w:val="0"/>
-          <w:numId w:val="2"/>
-        </w:numPr>
-        <w:spacing w:before="360" w:after="80"/>
-        <w:outlineLvl w:val="0"/>
         <w:rPr>
           <w:lang w:val="es-ES"/>
         </w:rPr>
@@ -3363,255 +3903,93 @@
         </w:rPr>
         <w:t xml:space="preserve"> </w:t>
       </w:r>
+      <w:proofErr w:type="gramStart"/>
+      <w:r>
+        <w:rPr>
+          <w:lang w:val="es-ES"/>
+        </w:rPr>
+        <w:t>status</w:t>
+      </w:r>
+      <w:proofErr w:type="gramEnd"/>
+      <w:r>
+        <w:rPr>
+          <w:lang w:val="es-ES"/>
+        </w:rPr>
+        <w:t xml:space="preserve">: se verificó la consistencia de los datos recuperados mediante el mensaje Data and pipelines are up </w:t>
+      </w:r>
       <w:proofErr w:type="spellStart"/>
       <w:r>
         <w:rPr>
           <w:lang w:val="es-ES"/>
         </w:rPr>
-        <w:t>push</w:t>
+        <w:t>to</w:t>
       </w:r>
       <w:proofErr w:type="spellEnd"/>
       <w:r>
         <w:rPr>
           <w:lang w:val="es-ES"/>
         </w:rPr>
-        <w:t xml:space="preserve">: se realizó exitosamente la transferencia del conjunto de datos hacia Amazon S3, obteniendo el resultado 1 file </w:t>
+        <w:t xml:space="preserve"> date.</w:t>
+      </w:r>
+    </w:p>
+    <w:p>
+      <w:pPr>
+        <w:jc w:val="both"/>
+        <w:rPr>
+          <w:lang w:val="es-ES"/>
+        </w:rPr>
+      </w:pPr>
+      <w:r>
+        <w:rPr>
+          <w:lang w:val="es-ES"/>
+        </w:rPr>
+        <w:t xml:space="preserve">Estas pruebas demuestran el funcionamiento del </w:t>
       </w:r>
       <w:proofErr w:type="spellStart"/>
       <w:r>
         <w:rPr>
           <w:lang w:val="es-ES"/>
         </w:rPr>
-        <w:t>pushed</w:t>
+        <w:t>versionamiento</w:t>
       </w:r>
       <w:proofErr w:type="spellEnd"/>
       <w:r>
         <w:rPr>
           <w:lang w:val="es-ES"/>
         </w:rPr>
-        <w:t>.</w:t>
-      </w:r>
-    </w:p>
-    <w:p>
-      <w:pPr>
-        <w:keepNext/>
-        <w:keepLines/>
-        <w:numPr>
-          <w:ilvl w:val="0"/>
-          <w:numId w:val="2"/>
-        </w:numPr>
-        <w:spacing w:before="360" w:after="80"/>
-        <w:outlineLvl w:val="0"/>
-        <w:rPr>
-          <w:lang w:val="es-ES"/>
-        </w:rPr>
-      </w:pPr>
-      <w:r>
-        <w:rPr>
-          <w:lang w:val="es-ES"/>
-        </w:rPr>
-        <w:t xml:space="preserve">Verificación en S3: se confirmó la existencia del objeto almacenado en el </w:t>
-      </w:r>
-      <w:proofErr w:type="spellStart"/>
-      <w:r>
-        <w:rPr>
-          <w:lang w:val="es-ES"/>
-        </w:rPr>
-        <w:t>bucket</w:t>
-      </w:r>
-      <w:proofErr w:type="spellEnd"/>
-      <w:r>
-        <w:rPr>
-          <w:lang w:val="es-ES"/>
-        </w:rPr>
-        <w:t xml:space="preserve"> mediante AWS CLI.</w:t>
-      </w:r>
-    </w:p>
-    <w:p>
-      <w:pPr>
-        <w:keepNext/>
-        <w:keepLines/>
-        <w:numPr>
-          <w:ilvl w:val="0"/>
-          <w:numId w:val="2"/>
-        </w:numPr>
-        <w:spacing w:before="360" w:after="80"/>
-        <w:jc w:val="both"/>
-        <w:outlineLvl w:val="0"/>
-        <w:rPr>
-          <w:lang w:val="es-ES"/>
-        </w:rPr>
-      </w:pPr>
-      <w:proofErr w:type="spellStart"/>
-      <w:r>
-        <w:rPr>
-          <w:lang w:val="es-ES"/>
-        </w:rPr>
-        <w:t>dvc</w:t>
-      </w:r>
-      <w:proofErr w:type="spellEnd"/>
+        <w:t xml:space="preserve"> y la recuperación del conjunto de datos mediante DVC y S3.</w:t>
+      </w:r>
       <w:r>
         <w:rPr>
           <w:lang w:val="es-ES"/>
         </w:rPr>
         <w:t xml:space="preserve"> </w:t>
       </w:r>
-      <w:proofErr w:type="spellStart"/>
-      <w:r>
-        <w:rPr>
-          <w:lang w:val="es-ES"/>
-        </w:rPr>
-        <w:t>pull</w:t>
-      </w:r>
-      <w:proofErr w:type="spellEnd"/>
-      <w:r>
-        <w:rPr>
-          <w:lang w:val="es-ES"/>
-        </w:rPr>
-        <w:t xml:space="preserve">: se realizó una prueba de recuperación desde una copia independiente del repositorio, sin el archivo CSV ni la caché de datos local. El resultado fue 1 file </w:t>
-      </w:r>
-      <w:proofErr w:type="spellStart"/>
-      <w:r>
-        <w:rPr>
-          <w:lang w:val="es-ES"/>
-        </w:rPr>
-        <w:t>fetched</w:t>
-      </w:r>
-      <w:proofErr w:type="spellEnd"/>
-      <w:r>
-        <w:rPr>
-          <w:lang w:val="es-ES"/>
-        </w:rPr>
-        <w:t xml:space="preserve"> and 1 file </w:t>
-      </w:r>
-      <w:proofErr w:type="spellStart"/>
-      <w:r>
-        <w:rPr>
-          <w:lang w:val="es-ES"/>
-        </w:rPr>
-        <w:t>added</w:t>
-      </w:r>
-      <w:proofErr w:type="spellEnd"/>
-      <w:r>
-        <w:rPr>
-          <w:lang w:val="es-ES"/>
-        </w:rPr>
-        <w:t>.</w:t>
-      </w:r>
-    </w:p>
-    <w:p>
-      <w:pPr>
-        <w:keepNext/>
-        <w:keepLines/>
-        <w:numPr>
-          <w:ilvl w:val="0"/>
-          <w:numId w:val="2"/>
-        </w:numPr>
-        <w:spacing w:before="360" w:after="80"/>
-        <w:jc w:val="both"/>
-        <w:outlineLvl w:val="0"/>
-        <w:rPr>
-          <w:lang w:val="es-ES"/>
-        </w:rPr>
-      </w:pPr>
-      <w:proofErr w:type="spellStart"/>
-      <w:r>
-        <w:rPr>
-          <w:lang w:val="es-ES"/>
-        </w:rPr>
-        <w:t>dvc</w:t>
-      </w:r>
-      <w:proofErr w:type="spellEnd"/>
-      <w:r>
-        <w:rPr>
-          <w:lang w:val="es-ES"/>
-        </w:rPr>
-        <w:t xml:space="preserve"> </w:t>
-      </w:r>
-      <w:proofErr w:type="gramStart"/>
-      <w:r>
-        <w:rPr>
-          <w:lang w:val="es-ES"/>
-        </w:rPr>
-        <w:t>status</w:t>
-      </w:r>
-      <w:proofErr w:type="gramEnd"/>
-      <w:r>
-        <w:rPr>
-          <w:lang w:val="es-ES"/>
-        </w:rPr>
-        <w:t xml:space="preserve">: se verificó la consistencia de los datos recuperados mediante el mensaje Data and pipelines are up </w:t>
-      </w:r>
-      <w:proofErr w:type="spellStart"/>
-      <w:r>
-        <w:rPr>
-          <w:lang w:val="es-ES"/>
-        </w:rPr>
-        <w:t>to</w:t>
-      </w:r>
-      <w:proofErr w:type="spellEnd"/>
-      <w:r>
-        <w:rPr>
-          <w:lang w:val="es-ES"/>
-        </w:rPr>
-        <w:t xml:space="preserve"> date.</w:t>
-      </w:r>
-    </w:p>
-    <w:p>
-      <w:pPr>
-        <w:keepNext/>
-        <w:keepLines/>
-        <w:spacing w:before="360" w:after="80"/>
-        <w:outlineLvl w:val="0"/>
-        <w:rPr>
-          <w:lang w:val="es-ES"/>
-        </w:rPr>
-      </w:pPr>
-      <w:r>
-        <w:rPr>
-          <w:lang w:val="es-ES"/>
-        </w:rPr>
-        <w:t xml:space="preserve">Estas pruebas demuestran el funcionamiento del </w:t>
-      </w:r>
-      <w:proofErr w:type="spellStart"/>
-      <w:r>
-        <w:rPr>
-          <w:lang w:val="es-ES"/>
-        </w:rPr>
-        <w:t>versionamiento</w:t>
-      </w:r>
-      <w:proofErr w:type="spellEnd"/>
-      <w:r>
-        <w:rPr>
-          <w:lang w:val="es-ES"/>
-        </w:rPr>
-        <w:t xml:space="preserve"> y la recuperación del conjunto de datos mediante DVC y S3.</w:t>
-      </w:r>
-    </w:p>
-    <w:p>
-      <w:pPr>
-        <w:keepNext/>
-        <w:keepLines/>
-        <w:spacing w:before="360" w:after="80"/>
-        <w:outlineLvl w:val="0"/>
-        <w:rPr>
-          <w:lang w:val="es-ES"/>
-        </w:rPr>
-      </w:pPr>
-      <w:r>
-        <w:rPr>
-          <w:lang w:val="es-ES"/>
-        </w:rPr>
-        <w:lastRenderedPageBreak/>
-        <w:t>6.3. Evidencias de implementación</w:t>
-      </w:r>
-    </w:p>
-    <w:p>
-      <w:pPr>
-        <w:keepNext/>
-        <w:keepLines/>
-        <w:spacing w:before="360" w:after="80"/>
-        <w:outlineLvl w:val="0"/>
+    </w:p>
+    <w:p>
+      <w:pPr>
+        <w:pStyle w:val="Heading2"/>
+        <w:rPr>
+          <w:lang w:val="es-ES"/>
+        </w:rPr>
+      </w:pPr>
+      <w:bookmarkStart w:id="8" w:name="_Toc243839257"/>
+      <w:r>
+        <w:rPr>
+          <w:lang w:val="es-ES"/>
+        </w:rPr>
+        <w:t>6</w:t>
+      </w:r>
+      <w:r>
+        <w:rPr>
+          <w:lang w:val="es-ES"/>
+        </w:rPr>
+        <w:t>.3. Evidencias de implementación</w:t>
+      </w:r>
+      <w:bookmarkEnd w:id="8"/>
+    </w:p>
+    <w:p>
+      <w:pPr>
         <w:rPr>
           <w:lang w:val="es-ES"/>
         </w:rPr>
@@ -3635,9 +4013,9 @@
           <w:lang w:val="es-ES"/>
         </w:rPr>
         <w:drawing>
-          <wp:inline distT="0" distB="0" distL="0" distR="0" wp14:anchorId="71839998" wp14:editId="1DF329EB">
-            <wp:extent cx="5612130" cy="3241675"/>
-            <wp:effectExtent l="0" t="0" r="7620" b="0"/>
+          <wp:inline distT="0" distB="0" distL="0" distR="0" wp14:anchorId="71839998" wp14:editId="11EF4833">
+            <wp:extent cx="5591810" cy="3229938"/>
+            <wp:effectExtent l="0" t="0" r="8890" b="8890"/>
             <wp:docPr id="1887521468" name="Imagen 1"/>
             <wp:cNvGraphicFramePr>
               <a:graphicFrameLocks xmlns:a="http://schemas.openxmlformats.org/drawingml/2006/main" noChangeAspect="1"/>
@@ -3650,7 +4028,7 @@
                     <pic:cNvPicPr/>
                   </pic:nvPicPr>
                   <pic:blipFill>
-                    <a:blip r:embed="rId9"/>
+                    <a:blip r:embed="rId17"/>
                     <a:stretch>
                       <a:fillRect/>
                     </a:stretch>
@@ -3658,7 +4036,7 @@
                   <pic:spPr>
                     <a:xfrm>
                       <a:off x="0" y="0"/>
-                      <a:ext cx="5612130" cy="3241675"/>
+                      <a:ext cx="5638842" cy="3257105"/>
                     </a:xfrm>
                     <a:prstGeom prst="rect">
                       <a:avLst/>
@@ -3777,7 +4155,7 @@
                     </pic:cNvPicPr>
                   </pic:nvPicPr>
                   <pic:blipFill rotWithShape="1">
-                    <a:blip r:embed="rId10">
+                    <a:blip r:embed="rId18">
                       <a:extLst>
                         <a:ext uri="{28A0092B-C50C-407E-A947-70E740481C1C}">
                           <a14:useLocalDpi xmlns:a14="http://schemas.microsoft.com/office/drawing/2010/main" val="0"/>
@@ -3880,6 +4258,7 @@
           <w:noProof/>
           <w:lang w:val="es-ES"/>
         </w:rPr>
+        <w:lastRenderedPageBreak/>
         <w:drawing>
           <wp:inline distT="0" distB="0" distL="0" distR="0" wp14:anchorId="0B8912E9" wp14:editId="22717471">
             <wp:extent cx="5499081" cy="1062111"/>
@@ -3896,7 +4275,7 @@
                     <pic:cNvPicPr/>
                   </pic:nvPicPr>
                   <pic:blipFill>
-                    <a:blip r:embed="rId11"/>
+                    <a:blip r:embed="rId19"/>
                     <a:stretch>
                       <a:fillRect/>
                     </a:stretch>
@@ -3973,7 +4352,7 @@
                     </pic:cNvPicPr>
                   </pic:nvPicPr>
                   <pic:blipFill>
-                    <a:blip r:embed="rId12">
+                    <a:blip r:embed="rId20">
                       <a:extLst>
                         <a:ext uri="{28A0092B-C50C-407E-A947-70E740481C1C}">
                           <a14:useLocalDpi xmlns:a14="http://schemas.microsoft.com/office/drawing/2010/main" val="0"/>
@@ -4076,19 +4455,14 @@
     </w:p>
     <w:p>
       <w:pPr>
-        <w:keepNext/>
-        <w:keepLines/>
-        <w:spacing w:before="360" w:after="80"/>
-        <w:outlineLvl w:val="0"/>
-        <w:rPr>
-          <w:lang w:val="es-ES"/>
-        </w:rPr>
-      </w:pPr>
-      <w:r>
-        <w:rPr>
-          <w:lang w:val="es-ES"/>
-        </w:rPr>
-        <w:lastRenderedPageBreak/>
+        <w:rPr>
+          <w:lang w:val="es-ES"/>
+        </w:rPr>
+      </w:pPr>
+      <w:r>
+        <w:rPr>
+          <w:lang w:val="es-ES"/>
+        </w:rPr>
         <w:t xml:space="preserve">La implementación quedó registrada en GitHub mediante el </w:t>
       </w:r>
       <w:proofErr w:type="spellStart"/>
@@ -4122,99 +4496,80 @@
     </w:p>
     <w:p>
       <w:pPr>
-        <w:keepNext/>
-        <w:keepLines/>
-        <w:spacing w:before="360" w:after="80"/>
+        <w:rPr>
+          <w:lang w:val="es-ES"/>
+        </w:rPr>
+      </w:pPr>
+      <w:r>
+        <w:rPr>
+          <w:lang w:val="es-ES"/>
+        </w:rPr>
+        <w:t>Las evidencias presentadas permiten verificar la integración de DVC con el repositorio GitHub y el almacenamiento remoto Amazon S3. Se documenta el registro de los datos, su transferencia al almacenamiento remoto y su posterior recuperación desde una copia independiente del proyecto, confirmando la reproducibilidad del proceso de gestión de datos.</w:t>
+      </w:r>
+    </w:p>
+    <w:p>
+      <w:pPr>
+        <w:rPr>
+          <w:lang w:val="es-ES"/>
+        </w:rPr>
+      </w:pPr>
+      <w:r>
+        <w:rPr>
+          <w:lang w:val="es-ES"/>
+        </w:rPr>
+        <w:t xml:space="preserve">Consideración de acceso: el almacenamiento S3 es privado y su utilización requiere credenciales AWS autorizadas. La implementación se probó desde una instancia EC2 de AWS </w:t>
+      </w:r>
+      <w:proofErr w:type="spellStart"/>
+      <w:r>
+        <w:rPr>
+          <w:lang w:val="es-ES"/>
+        </w:rPr>
+        <w:t>Academy</w:t>
+      </w:r>
+      <w:proofErr w:type="spellEnd"/>
+      <w:r>
+        <w:rPr>
+          <w:lang w:val="es-ES"/>
+        </w:rPr>
+        <w:t xml:space="preserve"> utilizando credenciales temporales del laboratorio; por tanto, el acceso posterior depende de la vigencia de dichas credenciales y de los permisos disponibles.</w:t>
+      </w:r>
+    </w:p>
+    <w:p>
+      <w:pPr>
+        <w:pStyle w:val="Heading1"/>
+      </w:pPr>
+      <w:bookmarkStart w:id="9" w:name="_Toc243839258"/>
+      <w:r>
+        <w:t>Reporte de trabajo en equipo</w:t>
+      </w:r>
+      <w:bookmarkEnd w:id="9"/>
+    </w:p>
+    <w:p>
+      <w:pPr>
         <w:jc w:val="both"/>
-        <w:outlineLvl w:val="0"/>
-        <w:rPr>
-          <w:lang w:val="es-ES"/>
-        </w:rPr>
-      </w:pPr>
-      <w:r>
-        <w:rPr>
-          <w:lang w:val="es-ES"/>
-        </w:rPr>
-        <w:t>Las evidencias presentadas permiten verificar la integración de DVC con el repositorio GitHub y el almacenamiento remoto Amazon S3. Se documenta el registro de los datos, su transferencia al almacenamiento remoto y su posterior recuperación desde una copia independiente del proyecto, confirmando la reproducibilidad del proceso de gestión de datos.</w:t>
-      </w:r>
-    </w:p>
-    <w:p>
-      <w:pPr>
-        <w:keepNext/>
-        <w:keepLines/>
-        <w:spacing w:before="360" w:after="80"/>
+      </w:pPr>
+      <w:r>
+        <w:rPr>
+          <w:lang w:val="es-ES"/>
+        </w:rPr>
+        <w:t xml:space="preserve">El proyecto fue desarrollado por un equipo conformado por Jecika León, </w:t>
+      </w:r>
+      <w:r>
+        <w:rPr>
+          <w:lang w:val="es-ES"/>
+        </w:rPr>
+        <w:t>Y</w:t>
+      </w:r>
+      <w:r>
+        <w:rPr>
+          <w:lang w:val="es-ES"/>
+        </w:rPr>
+        <w:t>vonne Campos, Guillermo Prieto y Juan Sebastián Victoria. Las actividades se distribuyeron entre la elaboración del informe, la exploración de datos, el diseño del prototipo y la configuración de herramientas de control de versiones.</w:t>
+      </w:r>
+    </w:p>
+    <w:p>
+      <w:pPr>
         <w:jc w:val="both"/>
-        <w:outlineLvl w:val="0"/>
-        <w:rPr>
-          <w:lang w:val="es-ES"/>
-        </w:rPr>
-      </w:pPr>
-      <w:r>
-        <w:rPr>
-          <w:lang w:val="es-ES"/>
-        </w:rPr>
-        <w:t xml:space="preserve">Consideración de acceso: el almacenamiento S3 es privado y su utilización requiere credenciales AWS autorizadas. La implementación se probó desde una instancia EC2 de AWS </w:t>
-      </w:r>
-      <w:proofErr w:type="spellStart"/>
-      <w:r>
-        <w:rPr>
-          <w:lang w:val="es-ES"/>
-        </w:rPr>
-        <w:t>Academy</w:t>
-      </w:r>
-      <w:proofErr w:type="spellEnd"/>
-      <w:r>
-        <w:rPr>
-          <w:lang w:val="es-ES"/>
-        </w:rPr>
-        <w:t xml:space="preserve"> utilizando credenciales temporales del laboratorio; por tanto, el acceso posterior depende de la vigencia de dichas credenciales y de los permisos disponibles.</w:t>
-      </w:r>
-    </w:p>
-    <w:p>
-      <w:pPr>
-        <w:pStyle w:val="Heading1"/>
-      </w:pPr>
-      <w:r>
-        <w:t>7. Reporte de trabajo en equipo</w:t>
-      </w:r>
-    </w:p>
-    <w:p>
-      <w:pPr>
-        <w:keepNext/>
-        <w:keepLines/>
-        <w:spacing w:before="360" w:after="80"/>
-        <w:jc w:val="both"/>
-        <w:outlineLvl w:val="0"/>
-        <w:rPr>
-          <w:lang w:val="es-ES"/>
-        </w:rPr>
-      </w:pPr>
-      <w:r>
-        <w:rPr>
-          <w:lang w:val="es-ES"/>
-        </w:rPr>
-        <w:t xml:space="preserve">El proyecto fue desarrollado por un equipo conformado por Jecika León, </w:t>
-      </w:r>
-      <w:r>
-        <w:rPr>
-          <w:lang w:val="es-ES"/>
-        </w:rPr>
-        <w:t>Y</w:t>
-      </w:r>
-      <w:r>
-        <w:rPr>
-          <w:lang w:val="es-ES"/>
-        </w:rPr>
-        <w:t>vonne Campos, Guillermo Prieto y Juan Sebastián Victoria. Las actividades se distribuyeron entre la elaboración del informe, la exploración de datos, el diseño del prototipo y la configuración de herramientas de control de versiones.</w:t>
-      </w:r>
-    </w:p>
-    <w:p>
-      <w:pPr>
-        <w:keepNext/>
-        <w:keepLines/>
-        <w:spacing w:before="360" w:after="80"/>
-        <w:jc w:val="both"/>
-        <w:outlineLvl w:val="0"/>
         <w:rPr>
           <w:lang w:val="es-ES"/>
         </w:rPr>
@@ -4250,11 +4605,7 @@
     </w:p>
     <w:p>
       <w:pPr>
-        <w:keepNext/>
-        <w:keepLines/>
-        <w:spacing w:before="360" w:after="80"/>
         <w:jc w:val="both"/>
-        <w:outlineLvl w:val="0"/>
         <w:rPr>
           <w:lang w:val="es-ES"/>
         </w:rPr>
@@ -4360,11 +4711,7 @@
     </w:p>
     <w:p>
       <w:pPr>
-        <w:keepNext/>
-        <w:keepLines/>
-        <w:spacing w:before="360" w:after="80"/>
         <w:jc w:val="both"/>
-        <w:outlineLvl w:val="0"/>
         <w:rPr>
           <w:b/>
           <w:bCs/>
@@ -4402,10 +4749,7 @@
     </w:p>
     <w:p>
       <w:pPr>
-        <w:keepNext/>
-        <w:keepLines/>
-        <w:spacing w:before="360" w:after="80"/>
-        <w:outlineLvl w:val="0"/>
+        <w:jc w:val="both"/>
         <w:rPr>
           <w:lang w:val="es-ES"/>
         </w:rPr>
@@ -4428,7 +4772,14 @@
         <w:rPr>
           <w:lang w:val="es-ES"/>
         </w:rPr>
-        <w:t>Participó en la revisión y ajuste del informe y de la maqueta del prototipo, tomando como base los archivos previamente adelantados por Guillermo Prieto, Juan Sebastián Victoria e Ivette Yvonne Campos. Su aporte se centró en precisar detalles de redacción, revisar la coherencia entre el problema, el contexto y el alcance del proyecto, y complementar la presentación e interpretación de los indicadores. También contribuyó a perfilar la maqueta para facilitar la comprensión de la información por parte de los inversionistas, conservando la línea gráfica del trabajo inicial.</w:t>
+        <w:t xml:space="preserve">Participó en la revisión y ajuste del informe y de la maqueta del prototipo, tomando como base los archivos previamente adelantados por Guillermo Prieto, Juan Sebastián Victoria e Ivette Yvonne Campos. Su aporte se centró en precisar detalles de redacción, revisar la coherencia entre el problema, el contexto y el alcance del proyecto, y complementar la presentación e interpretación de los indicadores. También contribuyó a perfilar la maqueta para facilitar </w:t>
+      </w:r>
+      <w:r>
+        <w:rPr>
+          <w:lang w:val="es-ES"/>
+        </w:rPr>
+        <w:lastRenderedPageBreak/>
+        <w:t>la comprensión de la información por parte de los inversionistas, conservando la línea gráfica del trabajo inicial.</w:t>
       </w:r>
       <w:r>
         <w:rPr>
@@ -4459,11 +4810,7 @@
     </w:p>
     <w:p>
       <w:pPr>
-        <w:keepNext/>
-        <w:keepLines/>
-        <w:spacing w:before="360" w:after="80"/>
         <w:jc w:val="both"/>
-        <w:outlineLvl w:val="0"/>
         <w:rPr>
           <w:lang w:val="es-ES"/>
         </w:rPr>
@@ -4499,19 +4846,15 @@
     </w:p>
     <w:p>
       <w:pPr>
-        <w:keepNext/>
-        <w:keepLines/>
-        <w:spacing w:before="360" w:after="80"/>
-        <w:outlineLvl w:val="0"/>
-        <w:rPr>
-          <w:lang w:val="es-ES"/>
-        </w:rPr>
-      </w:pPr>
-      <w:r>
-        <w:rPr>
-          <w:lang w:val="es-ES"/>
-        </w:rPr>
-        <w:lastRenderedPageBreak/>
+        <w:rPr>
+          <w:lang w:val="es-ES"/>
+        </w:rPr>
+      </w:pPr>
+      <w:r>
+        <w:rPr>
+          <w:noProof/>
+          <w:lang w:val="es-ES"/>
+        </w:rPr>
         <w:drawing>
           <wp:inline distT="0" distB="0" distL="0" distR="0" wp14:anchorId="1215DDAB" wp14:editId="69D892E8">
             <wp:extent cx="6858000" cy="3819525"/>
@@ -4528,7 +4871,7 @@
                     <pic:cNvPicPr/>
                   </pic:nvPicPr>
                   <pic:blipFill>
-                    <a:blip r:embed="rId13"/>
+                    <a:blip r:embed="rId21"/>
                     <a:stretch>
                       <a:fillRect/>
                     </a:stretch>
@@ -4550,6 +4893,7 @@
       </w:r>
     </w:p>
     <w:sectPr>
+      <w:headerReference w:type="default" r:id="rId22"/>
       <w:pgSz w:w="12240" w:h="15840"/>
       <w:pgMar w:top="720" w:right="720" w:bottom="720" w:left="720" w:header="708" w:footer="708" w:gutter="0"/>
       <w:cols w:space="708"/>
@@ -4559,9 +4903,207 @@
 </w:document>
 </file>
 
+<file path=word/endnotes.xml><?xml version="1.0" encoding="utf-8"?>
+<w:endnotes xmlns:wpc="http://schemas.microsoft.com/office/word/2010/wordprocessingCanvas" xmlns:cx="http://schemas.microsoft.com/office/drawing/2014/chartex" xmlns:cx1="http://schemas.microsoft.com/office/drawing/2015/9/8/chartex" xmlns:cx2="http://schemas.microsoft.com/office/drawing/2015/10/21/chartex" xmlns:cx3="http://schemas.microsoft.com/office/drawing/2016/5/9/chartex" xmlns:cx4="http://schemas.microsoft.com/office/drawing/2016/5/10/chartex" xmlns:cx5="http://schemas.microsoft.com/office/drawing/2016/5/11/chartex" xmlns:cx6="http://schemas.microsoft.com/office/drawing/2016/5/12/chartex" xmlns:cx7="http://schemas.microsoft.com/office/drawing/2016/5/13/chartex" xmlns:cx8="http://schemas.microsoft.com/office/drawing/2016/5/14/chartex" xmlns:mc="http://schemas.openxmlformats.org/markup-compatibility/2006" xmlns:aink="http://schemas.microsoft.com/office/drawing/2016/ink" xmlns:am3d="http://schemas.microsoft.com/office/drawing/2017/model3d" xmlns:o="urn:schemas-microsoft-com:office:office" xmlns:oel="http://schemas.microsoft.com/office/2019/extlst" xmlns:r="http://schemas.openxmlformats.org/officeDocument/2006/relationships" xmlns:m="http://schemas.openxmlformats.org/officeDocument/2006/math" xmlns:v="urn:schemas-microsoft-com:vml" xmlns:wp14="http://schemas.microsoft.com/office/word/2010/wordprocessingDrawing" xmlns:wp="http://schemas.openxmlformats.org/drawingml/2006/wordprocessingDrawing" xmlns:w10="urn:schemas-microsoft-com:office:word" xmlns:w="http://schemas.openxmlformats.org/wordprocessingml/2006/main" xmlns:w14="http://schemas.microsoft.com/office/word/2010/wordml" xmlns:w15="http://schemas.microsoft.com/office/word/2012/wordml" xmlns:w16cex="http://schemas.microsoft.com/office/word/2018/wordml/cex" xmlns:w16cid="http://schemas.microsoft.com/office/word/2016/wordml/cid" xmlns:w16="http://schemas.microsoft.com/office/word/2018/wordml" xmlns:w16du="http://schemas.microsoft.com/office/word/2023/wordml/word16du" xmlns:w16sdtdh="http://schemas.microsoft.com/office/word/2020/wordml/sdtdatahash" xmlns:w16sdtfl="http://schemas.microsoft.com/office/word/2024/wordml/sdtformatlock" xmlns:w16se="http://schemas.microsoft.com/office/word/2015/wordml/symex" xmlns:wpg="http://schemas.microsoft.com/office/word/2010/wordprocessingGroup" xmlns:wpi="http://schemas.microsoft.com/office/word/2010/wordprocessingInk" xmlns:wne="http://schemas.microsoft.com/office/word/2006/wordml" xmlns:wps="http://schemas.microsoft.com/office/word/2010/wordprocessingShape" mc:Ignorable="w14 w15 w16se w16cid w16 w16cex w16sdtdh w16sdtfl w16du wp14">
+  <w:endnote w:type="separator" w:id="-1">
+    <w:p>
+      <w:pPr>
+        <w:spacing w:after="0" w:line="240" w:lineRule="auto"/>
+      </w:pPr>
+      <w:r>
+        <w:separator/>
+      </w:r>
+    </w:p>
+  </w:endnote>
+  <w:endnote w:type="continuationSeparator" w:id="0">
+    <w:p>
+      <w:pPr>
+        <w:spacing w:after="0" w:line="240" w:lineRule="auto"/>
+      </w:pPr>
+      <w:r>
+        <w:continuationSeparator/>
+      </w:r>
+    </w:p>
+  </w:endnote>
+</w:endnotes>
+</file>
+
+<file path=word/footnotes.xml><?xml version="1.0" encoding="utf-8"?>
+<w:footnotes xmlns:wpc="http://schemas.microsoft.com/office/word/2010/wordprocessingCanvas" xmlns:cx="http://schemas.microsoft.com/office/drawing/2014/chartex" xmlns:cx1="http://schemas.microsoft.com/office/drawing/2015/9/8/chartex" xmlns:cx2="http://schemas.microsoft.com/office/drawing/2015/10/21/chartex" xmlns:cx3="http://schemas.microsoft.com/office/drawing/2016/5/9/chartex" xmlns:cx4="http://schemas.microsoft.com/office/drawing/2016/5/10/chartex" xmlns:cx5="http://schemas.microsoft.com/office/drawing/2016/5/11/chartex" xmlns:cx6="http://schemas.microsoft.com/office/drawing/2016/5/12/chartex" xmlns:cx7="http://schemas.microsoft.com/office/drawing/2016/5/13/chartex" xmlns:cx8="http://schemas.microsoft.com/office/drawing/2016/5/14/chartex" xmlns:mc="http://schemas.openxmlformats.org/markup-compatibility/2006" xmlns:aink="http://schemas.microsoft.com/office/drawing/2016/ink" xmlns:am3d="http://schemas.microsoft.com/office/drawing/2017/model3d" xmlns:o="urn:schemas-microsoft-com:office:office" xmlns:oel="http://schemas.microsoft.com/office/2019/extlst" xmlns:r="http://schemas.openxmlformats.org/officeDocument/2006/relationships" xmlns:m="http://schemas.openxmlformats.org/officeDocument/2006/math" xmlns:v="urn:schemas-microsoft-com:vml" xmlns:wp14="http://schemas.microsoft.com/office/word/2010/wordprocessingDrawing" xmlns:wp="http://schemas.openxmlformats.org/drawingml/2006/wordprocessingDrawing" xmlns:w10="urn:schemas-microsoft-com:office:word" xmlns:w="http://schemas.openxmlformats.org/wordprocessingml/2006/main" xmlns:w14="http://schemas.microsoft.com/office/word/2010/wordml" xmlns:w15="http://schemas.microsoft.com/office/word/2012/wordml" xmlns:w16cex="http://schemas.microsoft.com/office/word/2018/wordml/cex" xmlns:w16cid="http://schemas.microsoft.com/office/word/2016/wordml/cid" xmlns:w16="http://schemas.microsoft.com/office/word/2018/wordml" xmlns:w16du="http://schemas.microsoft.com/office/word/2023/wordml/word16du" xmlns:w16sdtdh="http://schemas.microsoft.com/office/word/2020/wordml/sdtdatahash" xmlns:w16sdtfl="http://schemas.microsoft.com/office/word/2024/wordml/sdtformatlock" xmlns:w16se="http://schemas.microsoft.com/office/word/2015/wordml/symex" xmlns:wpg="http://schemas.microsoft.com/office/word/2010/wordprocessingGroup" xmlns:wpi="http://schemas.microsoft.com/office/word/2010/wordprocessingInk" xmlns:wne="http://schemas.microsoft.com/office/word/2006/wordml" xmlns:wps="http://schemas.microsoft.com/office/word/2010/wordprocessingShape" mc:Ignorable="w14 w15 w16se w16cid w16 w16cex w16sdtdh w16sdtfl w16du wp14">
+  <w:footnote w:type="separator" w:id="-1">
+    <w:p>
+      <w:pPr>
+        <w:spacing w:after="0" w:line="240" w:lineRule="auto"/>
+      </w:pPr>
+      <w:r>
+        <w:separator/>
+      </w:r>
+    </w:p>
+  </w:footnote>
+  <w:footnote w:type="continuationSeparator" w:id="0">
+    <w:p>
+      <w:pPr>
+        <w:spacing w:after="0" w:line="240" w:lineRule="auto"/>
+      </w:pPr>
+      <w:r>
+        <w:continuationSeparator/>
+      </w:r>
+    </w:p>
+  </w:footnote>
+</w:footnotes>
+</file>
+
+<file path=word/header1.xml><?xml version="1.0" encoding="utf-8"?>
+<w:hdr xmlns:wpc="http://schemas.microsoft.com/office/word/2010/wordprocessingCanvas" xmlns:cx="http://schemas.microsoft.com/office/drawing/2014/chartex" xmlns:cx1="http://schemas.microsoft.com/office/drawing/2015/9/8/chartex" xmlns:cx2="http://schemas.microsoft.com/office/drawing/2015/10/21/chartex" xmlns:cx3="http://schemas.microsoft.com/office/drawing/2016/5/9/chartex" xmlns:cx4="http://schemas.microsoft.com/office/drawing/2016/5/10/chartex" xmlns:cx5="http://schemas.microsoft.com/office/drawing/2016/5/11/chartex" xmlns:cx6="http://schemas.microsoft.com/office/drawing/2016/5/12/chartex" xmlns:cx7="http://schemas.microsoft.com/office/drawing/2016/5/13/chartex" xmlns:cx8="http://schemas.microsoft.com/office/drawing/2016/5/14/chartex" xmlns:mc="http://schemas.openxmlformats.org/markup-compatibility/2006" xmlns:aink="http://schemas.microsoft.com/office/drawing/2016/ink" xmlns:am3d="http://schemas.microsoft.com/office/drawing/2017/model3d" xmlns:o="urn:schemas-microsoft-com:office:office" xmlns:oel="http://schemas.microsoft.com/office/2019/extlst" xmlns:r="http://schemas.openxmlformats.org/officeDocument/2006/relationships" xmlns:m="http://schemas.openxmlformats.org/officeDocument/2006/math" xmlns:v="urn:schemas-microsoft-com:vml" xmlns:wp14="http://schemas.microsoft.com/office/word/2010/wordprocessingDrawing" xmlns:wp="http://schemas.openxmlformats.org/drawingml/2006/wordprocessingDrawing" xmlns:w10="urn:schemas-microsoft-com:office:word" xmlns:w="http://schemas.openxmlformats.org/wordprocessingml/2006/main" xmlns:w14="http://schemas.microsoft.com/office/word/2010/wordml" xmlns:w15="http://schemas.microsoft.com/office/word/2012/wordml" xmlns:w16cex="http://schemas.microsoft.com/office/word/2018/wordml/cex" xmlns:w16cid="http://schemas.microsoft.com/office/word/2016/wordml/cid" xmlns:w16="http://schemas.microsoft.com/office/word/2018/wordml" xmlns:w16du="http://schemas.microsoft.com/office/word/2023/wordml/word16du" xmlns:w16sdtdh="http://schemas.microsoft.com/office/word/2020/wordml/sdtdatahash" xmlns:w16sdtfl="http://schemas.microsoft.com/office/word/2024/wordml/sdtformatlock" xmlns:w16se="http://schemas.microsoft.com/office/word/2015/wordml/symex" xmlns:wpg="http://schemas.microsoft.com/office/word/2010/wordprocessingGroup" xmlns:wpi="http://schemas.microsoft.com/office/word/2010/wordprocessingInk" xmlns:wne="http://schemas.microsoft.com/office/word/2006/wordml" xmlns:wps="http://schemas.microsoft.com/office/word/2010/wordprocessingShape" mc:Ignorable="w14 w15 w16se w16cid w16 w16cex w16sdtdh w16sdtfl w16du wp14">
+  <w:p>
+    <w:pPr>
+      <w:pStyle w:val="Header"/>
+      <w:rPr>
+        <w:b/>
+        <w:bCs/>
+      </w:rPr>
+    </w:pPr>
+    <w:r>
+      <w:rPr>
+        <w:lang w:val="es-ES"/>
+      </w:rPr>
+      <w:t>GRUPO 4 |</w:t>
+    </w:r>
+    <w:r>
+      <w:rPr>
+        <w:b/>
+        <w:bCs/>
+      </w:rPr>
+      <w:t>Despliegue de soluciones analíticas</w:t>
+    </w:r>
+  </w:p>
+  <w:p>
+    <w:pPr>
+      <w:pStyle w:val="Header"/>
+      <w:rPr>
+        <w:lang w:val="es-ES"/>
+      </w:rPr>
+    </w:pPr>
+  </w:p>
+</w:hdr>
+</file>
+
 <file path=word/numbering.xml><?xml version="1.0" encoding="utf-8"?>
 <w:numbering xmlns:wpc="http://schemas.microsoft.com/office/word/2010/wordprocessingCanvas" xmlns:cx="http://schemas.microsoft.com/office/drawing/2014/chartex" xmlns:cx1="http://schemas.microsoft.com/office/drawing/2015/9/8/chartex" xmlns:cx2="http://schemas.microsoft.com/office/drawing/2015/10/21/chartex" xmlns:cx3="http://schemas.microsoft.com/office/drawing/2016/5/9/chartex" xmlns:cx4="http://schemas.microsoft.com/office/drawing/2016/5/10/chartex" xmlns:cx5="http://schemas.microsoft.com/office/drawing/2016/5/11/chartex" xmlns:cx6="http://schemas.microsoft.com/office/drawing/2016/5/12/chartex" xmlns:cx7="http://schemas.microsoft.com/office/drawing/2016/5/13/chartex" xmlns:cx8="http://schemas.microsoft.com/office/drawing/2016/5/14/chartex" xmlns:mc="http://schemas.openxmlformats.org/markup-compatibility/2006" xmlns:aink="http://schemas.microsoft.com/office/drawing/2016/ink" xmlns:am3d="http://schemas.microsoft.com/office/drawing/2017/model3d" xmlns:o="urn:schemas-microsoft-com:office:office" xmlns:oel="http://schemas.microsoft.com/office/2019/extlst" xmlns:r="http://schemas.openxmlformats.org/officeDocument/2006/relationships" xmlns:m="http://schemas.openxmlformats.org/officeDocument/2006/math" xmlns:v="urn:schemas-microsoft-com:vml" xmlns:wp14="http://schemas.microsoft.com/office/word/2010/wordprocessingDrawing" xmlns:wp="http://schemas.openxmlformats.org/drawingml/2006/wordprocessingDrawing" xmlns:w10="urn:schemas-microsoft-com:office:word" xmlns:w="http://schemas.openxmlformats.org/wordprocessingml/2006/main" xmlns:w14="http://schemas.microsoft.com/office/word/2010/wordml" xmlns:w15="http://schemas.microsoft.com/office/word/2012/wordml" xmlns:w16cex="http://schemas.microsoft.com/office/word/2018/wordml/cex" xmlns:w16cid="http://schemas.microsoft.com/office/word/2016/wordml/cid" xmlns:w16="http://schemas.microsoft.com/office/word/2018/wordml" xmlns:w16du="http://schemas.microsoft.com/office/word/2023/wordml/word16du" xmlns:w16sdtdh="http://schemas.microsoft.com/office/word/2020/wordml/sdtdatahash" xmlns:w16sdtfl="http://schemas.microsoft.com/office/word/2024/wordml/sdtformatlock" xmlns:w16se="http://schemas.microsoft.com/office/word/2015/wordml/symex" xmlns:wpg="http://schemas.microsoft.com/office/word/2010/wordprocessingGroup" xmlns:wpi="http://schemas.microsoft.com/office/word/2010/wordprocessingInk" xmlns:wne="http://schemas.microsoft.com/office/word/2006/wordml" xmlns:wps="http://schemas.microsoft.com/office/word/2010/wordprocessingShape" mc:Ignorable="w14 w15 w16se w16cid w16 w16cex w16sdtdh w16sdtfl w16du wp14">
   <w:abstractNum w:abstractNumId="0" w15:restartNumberingAfterBreak="0">
+    <w:nsid w:val="241D1927"/>
+    <w:multiLevelType w:val="hybridMultilevel"/>
+    <w:tmpl w:val="4D14458C"/>
+    <w:lvl w:ilvl="0" w:tplc="4B58E3BC">
+      <w:start w:val="6"/>
+      <w:numFmt w:val="bullet"/>
+      <w:lvlText w:val=""/>
+      <w:lvlJc w:val="left"/>
+      <w:pPr>
+        <w:ind w:left="720" w:hanging="360"/>
+      </w:pPr>
+      <w:rPr>
+        <w:rFonts w:ascii="Symbol" w:eastAsiaTheme="minorHAnsi" w:hAnsi="Symbol" w:cstheme="minorBidi" w:hint="default"/>
+      </w:rPr>
+    </w:lvl>
+    <w:lvl w:ilvl="1" w:tplc="240A0003" w:tentative="1">
+      <w:start w:val="1"/>
+      <w:numFmt w:val="bullet"/>
+      <w:lvlText w:val="o"/>
+      <w:lvlJc w:val="left"/>
+      <w:pPr>
+        <w:ind w:left="1440" w:hanging="360"/>
+      </w:pPr>
+      <w:rPr>
+        <w:rFonts w:ascii="Courier New" w:hAnsi="Courier New" w:cs="Courier New" w:hint="default"/>
+      </w:rPr>
+    </w:lvl>
+    <w:lvl w:ilvl="2" w:tplc="240A0005" w:tentative="1">
+      <w:start w:val="1"/>
+      <w:numFmt w:val="bullet"/>
+      <w:lvlText w:val=""/>
+      <w:lvlJc w:val="left"/>
+      <w:pPr>
+        <w:ind w:left="2160" w:hanging="360"/>
+      </w:pPr>
+      <w:rPr>
+        <w:rFonts w:ascii="Wingdings" w:hAnsi="Wingdings" w:hint="default"/>
+      </w:rPr>
+    </w:lvl>
+    <w:lvl w:ilvl="3" w:tplc="240A0001" w:tentative="1">
+      <w:start w:val="1"/>
+      <w:numFmt w:val="bullet"/>
+      <w:lvlText w:val=""/>
+      <w:lvlJc w:val="left"/>
+      <w:pPr>
+        <w:ind w:left="2880" w:hanging="360"/>
+      </w:pPr>
+      <w:rPr>
+        <w:rFonts w:ascii="Symbol" w:hAnsi="Symbol" w:hint="default"/>
+      </w:rPr>
+    </w:lvl>
+    <w:lvl w:ilvl="4" w:tplc="240A0003" w:tentative="1">
+      <w:start w:val="1"/>
+      <w:numFmt w:val="bullet"/>
+      <w:lvlText w:val="o"/>
+      <w:lvlJc w:val="left"/>
+      <w:pPr>
+        <w:ind w:left="3600" w:hanging="360"/>
+      </w:pPr>
+      <w:rPr>
+        <w:rFonts w:ascii="Courier New" w:hAnsi="Courier New" w:cs="Courier New" w:hint="default"/>
+      </w:rPr>
+    </w:lvl>
+    <w:lvl w:ilvl="5" w:tplc="240A0005" w:tentative="1">
+      <w:start w:val="1"/>
+      <w:numFmt w:val="bullet"/>
+      <w:lvlText w:val=""/>
+      <w:lvlJc w:val="left"/>
+      <w:pPr>
+        <w:ind w:left="4320" w:hanging="360"/>
+      </w:pPr>
+      <w:rPr>
+        <w:rFonts w:ascii="Wingdings" w:hAnsi="Wingdings" w:hint="default"/>
+      </w:rPr>
+    </w:lvl>
+    <w:lvl w:ilvl="6" w:tplc="240A0001" w:tentative="1">
+      <w:start w:val="1"/>
+      <w:numFmt w:val="bullet"/>
+      <w:lvlText w:val=""/>
+      <w:lvlJc w:val="left"/>
+      <w:pPr>
+        <w:ind w:left="5040" w:hanging="360"/>
+      </w:pPr>
+      <w:rPr>
+        <w:rFonts w:ascii="Symbol" w:hAnsi="Symbol" w:hint="default"/>
+      </w:rPr>
+    </w:lvl>
+    <w:lvl w:ilvl="7" w:tplc="240A0003" w:tentative="1">
+      <w:start w:val="1"/>
+      <w:numFmt w:val="bullet"/>
+      <w:lvlText w:val="o"/>
+      <w:lvlJc w:val="left"/>
+      <w:pPr>
+        <w:ind w:left="5760" w:hanging="360"/>
+      </w:pPr>
+      <w:rPr>
+        <w:rFonts w:ascii="Courier New" w:hAnsi="Courier New" w:cs="Courier New" w:hint="default"/>
+      </w:rPr>
+    </w:lvl>
+    <w:lvl w:ilvl="8" w:tplc="240A0005" w:tentative="1">
+      <w:start w:val="1"/>
+      <w:numFmt w:val="bullet"/>
+      <w:lvlText w:val=""/>
+      <w:lvlJc w:val="left"/>
+      <w:pPr>
+        <w:ind w:left="6480" w:hanging="360"/>
+      </w:pPr>
+      <w:rPr>
+        <w:rFonts w:ascii="Wingdings" w:hAnsi="Wingdings" w:hint="default"/>
+      </w:rPr>
+    </w:lvl>
+  </w:abstractNum>
+  <w:abstractNum w:abstractNumId="1" w15:restartNumberingAfterBreak="0">
     <w:nsid w:val="407E6571"/>
     <w:multiLevelType w:val="multilevel"/>
     <w:tmpl w:val="ED54780A"/>
@@ -4710,7 +5252,7 @@
       </w:rPr>
     </w:lvl>
   </w:abstractNum>
-  <w:abstractNum w:abstractNumId="1" w15:restartNumberingAfterBreak="0">
+  <w:abstractNum w:abstractNumId="2" w15:restartNumberingAfterBreak="0">
     <w:nsid w:val="57356727"/>
     <w:multiLevelType w:val="hybridMultilevel"/>
     <w:tmpl w:val="386E4D0C"/>
@@ -4800,9 +5342,12 @@
     </w:lvl>
   </w:abstractNum>
   <w:num w:numId="1" w16cid:durableId="1685279359">
+    <w:abstractNumId w:val="2"/>
+  </w:num>
+  <w:num w:numId="2" w16cid:durableId="1515922087">
     <w:abstractNumId w:val="1"/>
   </w:num>
-  <w:num w:numId="2" w16cid:durableId="1515922087">
+  <w:num w:numId="3" w16cid:durableId="425461387">
     <w:abstractNumId w:val="0"/>
   </w:num>
 </w:numbering>
@@ -5410,7 +5955,6 @@
   <w:style w:type="character" w:default="1" w:styleId="DefaultParagraphFont">
     <w:name w:val="Default Paragraph Font"/>
     <w:uiPriority w:val="1"/>
-    <w:semiHidden/>
     <w:unhideWhenUsed/>
   </w:style>
   <w:style w:type="table" w:default="1" w:styleId="TableNormal">
@@ -6342,6 +6886,96 @@
       </w:tcPr>
     </w:tblStylePr>
   </w:style>
+  <w:style w:type="paragraph" w:styleId="TOC2">
+    <w:name w:val="toc 2"/>
+    <w:basedOn w:val="Normal"/>
+    <w:next w:val="Normal"/>
+    <w:autoRedefine/>
+    <w:uiPriority w:val="39"/>
+    <w:unhideWhenUsed/>
+    <w:rsid w:val="00BA1092"/>
+    <w:pPr>
+      <w:spacing w:after="100"/>
+      <w:ind w:left="220"/>
+    </w:pPr>
+  </w:style>
+  <w:style w:type="paragraph" w:styleId="Header">
+    <w:name w:val="header"/>
+    <w:basedOn w:val="Normal"/>
+    <w:link w:val="HeaderChar"/>
+    <w:uiPriority w:val="99"/>
+    <w:unhideWhenUsed/>
+    <w:rsid w:val="00BA1092"/>
+    <w:pPr>
+      <w:tabs>
+        <w:tab w:val="center" w:pos="4419"/>
+        <w:tab w:val="right" w:pos="8838"/>
+      </w:tabs>
+      <w:spacing w:after="0" w:line="240" w:lineRule="auto"/>
+    </w:pPr>
+  </w:style>
+  <w:style w:type="character" w:customStyle="1" w:styleId="HeaderChar">
+    <w:name w:val="Header Char"/>
+    <w:basedOn w:val="DefaultParagraphFont"/>
+    <w:link w:val="Header"/>
+    <w:uiPriority w:val="99"/>
+    <w:rsid w:val="00BA1092"/>
+  </w:style>
+  <w:style w:type="paragraph" w:styleId="Footer">
+    <w:name w:val="footer"/>
+    <w:basedOn w:val="Normal"/>
+    <w:link w:val="FooterChar"/>
+    <w:uiPriority w:val="99"/>
+    <w:unhideWhenUsed/>
+    <w:rsid w:val="00BA1092"/>
+    <w:pPr>
+      <w:tabs>
+        <w:tab w:val="center" w:pos="4419"/>
+        <w:tab w:val="right" w:pos="8838"/>
+      </w:tabs>
+      <w:spacing w:after="0" w:line="240" w:lineRule="auto"/>
+    </w:pPr>
+  </w:style>
+  <w:style w:type="character" w:customStyle="1" w:styleId="FooterChar">
+    <w:name w:val="Footer Char"/>
+    <w:basedOn w:val="DefaultParagraphFont"/>
+    <w:link w:val="Footer"/>
+    <w:uiPriority w:val="99"/>
+    <w:rsid w:val="00BA1092"/>
+  </w:style>
+  <w:style w:type="character" w:styleId="BookTitle">
+    <w:name w:val="Book Title"/>
+    <w:basedOn w:val="DefaultParagraphFont"/>
+    <w:uiPriority w:val="33"/>
+    <w:qFormat/>
+    <w:rsid w:val="00BA1092"/>
+    <w:rPr>
+      <w:b/>
+      <w:bCs/>
+      <w:i/>
+      <w:iCs/>
+      <w:spacing w:val="5"/>
+    </w:rPr>
+  </w:style>
+  <w:style w:type="paragraph" w:styleId="TOC3">
+    <w:name w:val="toc 3"/>
+    <w:basedOn w:val="Normal"/>
+    <w:next w:val="Normal"/>
+    <w:autoRedefine/>
+    <w:uiPriority w:val="39"/>
+    <w:unhideWhenUsed/>
+    <w:rsid w:val="009629D2"/>
+    <w:pPr>
+      <w:spacing w:after="100"/>
+      <w:ind w:left="440"/>
+    </w:pPr>
+    <w:rPr>
+      <w:rFonts w:eastAsiaTheme="minorEastAsia" w:cs="Times New Roman"/>
+      <w:kern w:val="0"/>
+      <w:lang w:val="en-US"/>
+      <w14:ligatures w14:val="none"/>
+    </w:rPr>
+  </w:style>
 </w:styles>
 </file>
 

</xml_diff>

<commit_message>
Se actualiza el número del commit de la version final en el word
</commit_message>
<xml_diff>
--- a/Reporte_Proyecto_DSA.docx
+++ b/Reporte_Proyecto_DSA.docx
@@ -61,21 +61,7 @@
         <w:rPr>
           <w:lang w:val="es-CO"/>
         </w:rPr>
-        <w:t xml:space="preserve">1 </w:t>
-      </w:r>
-      <w:proofErr w:type="gramStart"/>
-      <w:r>
-        <w:rPr>
-          <w:lang w:val="es-CO"/>
-        </w:rPr>
-        <w:t>Problema</w:t>
-      </w:r>
-      <w:proofErr w:type="gramEnd"/>
-      <w:r>
-        <w:rPr>
-          <w:lang w:val="es-CO"/>
-        </w:rPr>
-        <w:t xml:space="preserve"> y contexto</w:t>
+        <w:t>1 Problema y contexto</w:t>
       </w:r>
     </w:p>
     <w:p>
@@ -115,21 +101,7 @@
         <w:rPr>
           <w:lang w:val="es-CO"/>
         </w:rPr>
-        <w:t xml:space="preserve">2 </w:t>
-      </w:r>
-      <w:proofErr w:type="gramStart"/>
-      <w:r>
-        <w:rPr>
-          <w:lang w:val="es-CO"/>
-        </w:rPr>
-        <w:t>Pregunta</w:t>
-      </w:r>
-      <w:proofErr w:type="gramEnd"/>
-      <w:r>
-        <w:rPr>
-          <w:lang w:val="es-CO"/>
-        </w:rPr>
-        <w:t xml:space="preserve"> de negocio y alcance</w:t>
+        <w:t>2 Pregunta de negocio y alcance</w:t>
       </w:r>
     </w:p>
     <w:p>
@@ -216,21 +188,7 @@
           <w:lang w:val="es-CO"/>
         </w:rPr>
         <w:lastRenderedPageBreak/>
-        <w:t xml:space="preserve">3 </w:t>
-      </w:r>
-      <w:proofErr w:type="gramStart"/>
-      <w:r>
-        <w:rPr>
-          <w:lang w:val="es-CO"/>
-        </w:rPr>
-        <w:t>Conjuntos</w:t>
-      </w:r>
-      <w:proofErr w:type="gramEnd"/>
-      <w:r>
-        <w:rPr>
-          <w:lang w:val="es-CO"/>
-        </w:rPr>
-        <w:t xml:space="preserve"> de datos y preparación</w:t>
+        <w:t>3 Conjuntos de datos y preparación</w:t>
       </w:r>
     </w:p>
     <w:p>
@@ -380,17 +338,8 @@
                 <w:b w:val="0"/>
                 <w:sz w:val="18"/>
               </w:rPr>
-              <w:t xml:space="preserve">municipio / </w:t>
+              <w:t>municipio / divipola</w:t>
             </w:r>
-            <w:proofErr w:type="spellStart"/>
-            <w:r>
-              <w:rPr>
-                <w:b w:val="0"/>
-                <w:sz w:val="18"/>
-              </w:rPr>
-              <w:t>divipola</w:t>
-            </w:r>
-            <w:proofErr w:type="spellEnd"/>
           </w:p>
         </w:tc>
         <w:tc>
@@ -429,7 +378,6 @@
             <w:pPr>
               <w:spacing w:before="40" w:after="60"/>
             </w:pPr>
-            <w:proofErr w:type="spellStart"/>
             <w:r>
               <w:rPr>
                 <w:b w:val="0"/>
@@ -437,7 +385,6 @@
               </w:rPr>
               <w:t>year_radica</w:t>
             </w:r>
-            <w:proofErr w:type="spellEnd"/>
           </w:p>
         </w:tc>
         <w:tc>
@@ -475,7 +422,6 @@
             <w:pPr>
               <w:spacing w:before="40" w:after="60"/>
             </w:pPr>
-            <w:proofErr w:type="spellStart"/>
             <w:r>
               <w:rPr>
                 <w:b w:val="0"/>
@@ -483,7 +429,6 @@
               </w:rPr>
               <w:t>nombre_natujur</w:t>
             </w:r>
-            <w:proofErr w:type="spellEnd"/>
           </w:p>
         </w:tc>
         <w:tc>
@@ -522,7 +467,6 @@
             <w:pPr>
               <w:spacing w:before="40" w:after="60"/>
             </w:pPr>
-            <w:proofErr w:type="spellStart"/>
             <w:r>
               <w:rPr>
                 <w:b w:val="0"/>
@@ -530,7 +474,6 @@
               </w:rPr>
               <w:t>tipo_predio_zona</w:t>
             </w:r>
-            <w:proofErr w:type="spellEnd"/>
           </w:p>
         </w:tc>
         <w:tc>
@@ -616,7 +559,6 @@
                 <w:lang w:val="es-CO"/>
               </w:rPr>
             </w:pPr>
-            <w:proofErr w:type="spellStart"/>
             <w:r>
               <w:rPr>
                 <w:b w:val="0"/>
@@ -625,7 +567,6 @@
               </w:rPr>
               <w:t>tiene_mas_de_un_valor</w:t>
             </w:r>
-            <w:proofErr w:type="spellEnd"/>
           </w:p>
         </w:tc>
         <w:tc>
@@ -663,40 +604,10 @@
         <w:rPr>
           <w:lang w:val="es-CO"/>
         </w:rPr>
-        <w:t xml:space="preserve">Se descargaron ocho campos, ordenando por </w:t>
-      </w:r>
-      <w:proofErr w:type="spellStart"/>
-      <w:r>
-        <w:rPr>
-          <w:lang w:val="es-CO"/>
-        </w:rPr>
-        <w:t>pk</w:t>
-      </w:r>
-      <w:proofErr w:type="spellEnd"/>
-      <w:r>
-        <w:rPr>
-          <w:lang w:val="es-CO"/>
-        </w:rPr>
-        <w:t xml:space="preserve"> en páginas de 40.000 registros. Se verificaron su unicidad, el periodo y los municipios. La selección base comprende 214.190 registros. Se excluyen del análisis monetario 144 con valor no positivo y 10 con indicador de múltiples valores; no hay intersección entre estos dos grupos. </w:t>
+        <w:t xml:space="preserve">Se descargaron ocho campos, ordenando por pk en páginas de 40.000 registros. Se verificaron su unicidad, el periodo y los municipios. La selección base comprende 214.190 registros. Se excluyen del análisis monetario 144 con valor no positivo y 10 con indicador de múltiples valores; no hay intersección entre estos dos grupos. </w:t>
       </w:r>
       <w:r>
-        <w:t xml:space="preserve">Se </w:t>
-      </w:r>
-      <w:proofErr w:type="spellStart"/>
-      <w:r>
-        <w:t>conservan</w:t>
-      </w:r>
-      <w:proofErr w:type="spellEnd"/>
-      <w:r>
-        <w:t xml:space="preserve"> 214.036 </w:t>
-      </w:r>
-      <w:proofErr w:type="spellStart"/>
-      <w:r>
-        <w:t>registros</w:t>
-      </w:r>
-      <w:proofErr w:type="spellEnd"/>
-      <w:r>
-        <w:t xml:space="preserve"> (99,9281 %).</w:t>
+        <w:t>Se conservan 214.036 registros (99,9281 %).</w:t>
       </w:r>
     </w:p>
     <w:tbl>
@@ -1190,21 +1101,7 @@
         <w:rPr>
           <w:lang w:val="es-CO"/>
         </w:rPr>
-        <w:t xml:space="preserve">En los ocho campos del corte base no se encontraron valores nulos, claves </w:t>
-      </w:r>
-      <w:proofErr w:type="spellStart"/>
-      <w:r>
-        <w:rPr>
-          <w:lang w:val="es-CO"/>
-        </w:rPr>
-        <w:t>pk</w:t>
-      </w:r>
-      <w:proofErr w:type="spellEnd"/>
-      <w:r>
-        <w:rPr>
-          <w:lang w:val="es-CO"/>
-        </w:rPr>
-        <w:t xml:space="preserve"> repetidas ni filas idénticas. Este resultado no implica ausencia de errores semánticos ni de varias operaciones sobre un mismo inmueble. Tampoco justifica eliminar filas que coincidan únicamente en municipio, año y monto: pueden representar operaciones distintas.</w:t>
+        <w:t>En los ocho campos del corte base no se encontraron valores nulos, claves pk repetidas ni filas idénticas. Este resultado no implica ausencia de errores semánticos ni de varias operaciones sobre un mismo inmueble. Tampoco justifica eliminar filas que coincidan únicamente en municipio, año y monto: pueden representar operaciones distintas.</w:t>
       </w:r>
     </w:p>
     <w:p>
@@ -1245,21 +1142,7 @@
           <w:lang w:val="es-CO"/>
         </w:rPr>
         <w:lastRenderedPageBreak/>
-        <w:t xml:space="preserve">4 </w:t>
-      </w:r>
-      <w:proofErr w:type="gramStart"/>
-      <w:r>
-        <w:rPr>
-          <w:lang w:val="es-CO"/>
-        </w:rPr>
-        <w:t>Exploración</w:t>
-      </w:r>
-      <w:proofErr w:type="gramEnd"/>
-      <w:r>
-        <w:rPr>
-          <w:lang w:val="es-CO"/>
-        </w:rPr>
-        <w:t xml:space="preserve"> de la actividad transaccional</w:t>
+        <w:t>4 Exploración de la actividad transaccional</w:t>
       </w:r>
     </w:p>
     <w:p>
@@ -1364,14 +1247,12 @@
             <w:pPr>
               <w:spacing w:before="40" w:after="60"/>
             </w:pPr>
-            <w:proofErr w:type="spellStart"/>
             <w:r>
               <w:rPr>
                 <w:sz w:val="18"/>
               </w:rPr>
               <w:t>Indicador</w:t>
             </w:r>
-            <w:proofErr w:type="spellEnd"/>
           </w:p>
         </w:tc>
         <w:tc>
@@ -1764,21 +1645,7 @@
           <w:lang w:val="es-CO"/>
         </w:rPr>
         <w:lastRenderedPageBreak/>
-        <w:t xml:space="preserve">5 </w:t>
-      </w:r>
-      <w:proofErr w:type="gramStart"/>
-      <w:r>
-        <w:rPr>
-          <w:lang w:val="es-CO"/>
-        </w:rPr>
-        <w:t>Distribución</w:t>
-      </w:r>
-      <w:proofErr w:type="gramEnd"/>
-      <w:r>
-        <w:rPr>
-          <w:lang w:val="es-CO"/>
-        </w:rPr>
-        <w:t xml:space="preserve"> de valores y operaciones atípicas</w:t>
+        <w:t>5 Distribución de valores y operaciones atípicas</w:t>
       </w:r>
     </w:p>
     <w:p>
@@ -2271,19 +2138,9 @@
       <w:pPr>
         <w:pStyle w:val="Heading2"/>
       </w:pPr>
-      <w:proofErr w:type="spellStart"/>
       <w:r>
-        <w:t>Revisión</w:t>
+        <w:t>Revisión de extremos</w:t>
       </w:r>
-      <w:proofErr w:type="spellEnd"/>
-      <w:r>
-        <w:t xml:space="preserve"> de </w:t>
-      </w:r>
-      <w:proofErr w:type="spellStart"/>
-      <w:r>
-        <w:t>extremos</w:t>
-      </w:r>
-      <w:proofErr w:type="spellEnd"/>
     </w:p>
     <w:tbl>
       <w:tblPr>
@@ -2718,21 +2575,7 @@
           <w:lang w:val="es-CO"/>
         </w:rPr>
         <w:lastRenderedPageBreak/>
-        <w:t xml:space="preserve">6 </w:t>
-      </w:r>
-      <w:proofErr w:type="gramStart"/>
-      <w:r>
-        <w:rPr>
-          <w:lang w:val="es-CO"/>
-        </w:rPr>
-        <w:t>Maqueta</w:t>
-      </w:r>
-      <w:proofErr w:type="gramEnd"/>
-      <w:r>
-        <w:rPr>
-          <w:lang w:val="es-CO"/>
-        </w:rPr>
-        <w:t xml:space="preserve"> del prototipo</w:t>
+        <w:t>6 Maqueta del prototipo</w:t>
       </w:r>
     </w:p>
     <w:p>
@@ -3059,29 +2902,8 @@
       </w:pPr>
       <w:r>
         <w:lastRenderedPageBreak/>
-        <w:t xml:space="preserve">6 </w:t>
+        <w:t>6 Maqueta y componentes previstos</w:t>
       </w:r>
-      <w:proofErr w:type="spellStart"/>
-      <w:r>
-        <w:t>Maqueta</w:t>
-      </w:r>
-      <w:proofErr w:type="spellEnd"/>
-      <w:r>
-        <w:t xml:space="preserve"> y </w:t>
-      </w:r>
-      <w:proofErr w:type="spellStart"/>
-      <w:r>
-        <w:t>componentes</w:t>
-      </w:r>
-      <w:proofErr w:type="spellEnd"/>
-      <w:r>
-        <w:t xml:space="preserve"> </w:t>
-      </w:r>
-      <w:proofErr w:type="spellStart"/>
-      <w:r>
-        <w:t>previstos</w:t>
-      </w:r>
-      <w:proofErr w:type="spellEnd"/>
     </w:p>
     <w:tbl>
       <w:tblPr>
@@ -3342,21 +3164,7 @@
         <w:rPr>
           <w:lang w:val="es-CO"/>
         </w:rPr>
-        <w:t xml:space="preserve">7 </w:t>
-      </w:r>
-      <w:proofErr w:type="gramStart"/>
-      <w:r>
-        <w:rPr>
-          <w:lang w:val="es-CO"/>
-        </w:rPr>
-        <w:t>Repositorios</w:t>
-      </w:r>
-      <w:proofErr w:type="gramEnd"/>
-      <w:r>
-        <w:rPr>
-          <w:lang w:val="es-CO"/>
-        </w:rPr>
-        <w:t xml:space="preserve"> y evidencias de implementación</w:t>
+        <w:t>7 Repositorios y evidencias de implementación</w:t>
       </w:r>
     </w:p>
     <w:p>
@@ -3436,29 +3244,7 @@
         <w:rPr>
           <w:lang w:val="es-ES"/>
         </w:rPr>
-        <w:t xml:space="preserve">En este repositorio se encuentran el notebook </w:t>
-      </w:r>
-      <w:proofErr w:type="spellStart"/>
-      <w:r>
-        <w:rPr>
-          <w:lang w:val="es-ES"/>
-        </w:rPr>
-        <w:t>exploracion_</w:t>
-      </w:r>
-      <w:proofErr w:type="gramStart"/>
-      <w:r>
-        <w:rPr>
-          <w:lang w:val="es-ES"/>
-        </w:rPr>
-        <w:t>datos.ipynb</w:t>
-      </w:r>
-      <w:proofErr w:type="spellEnd"/>
-      <w:proofErr w:type="gramEnd"/>
-      <w:r>
-        <w:rPr>
-          <w:lang w:val="es-ES"/>
-        </w:rPr>
-        <w:t>, el reporte del proyecto, el mockup del tablero y los archivos de configuración de DVC.</w:t>
+        <w:t>En este repositorio se encuentran el notebook exploracion_datos.ipynb, el reporte del proyecto, el mockup del tablero y los archivos de configuración de DVC.</w:t>
       </w:r>
     </w:p>
     <w:p>
@@ -3473,21 +3259,7 @@
         <w:rPr>
           <w:lang w:val="es-CO"/>
         </w:rPr>
-        <w:t xml:space="preserve">6.2. </w:t>
-      </w:r>
-      <w:proofErr w:type="spellStart"/>
-      <w:r>
-        <w:rPr>
-          <w:lang w:val="es-CO"/>
-        </w:rPr>
-        <w:t>Versionamiento</w:t>
-      </w:r>
-      <w:proofErr w:type="spellEnd"/>
-      <w:r>
-        <w:rPr>
-          <w:lang w:val="es-CO"/>
-        </w:rPr>
-        <w:t xml:space="preserve"> de datos con DVC y Amazon S3</w:t>
+        <w:t>6.2. Versionamiento de datos con DVC y Amazon S3</w:t>
       </w:r>
       <w:bookmarkEnd w:id="1"/>
     </w:p>
@@ -3502,21 +3274,7 @@
         <w:rPr>
           <w:lang w:val="es-ES"/>
         </w:rPr>
-        <w:t xml:space="preserve">Para gestionar los datos del proyecto se implementó Data </w:t>
-      </w:r>
-      <w:proofErr w:type="spellStart"/>
-      <w:r>
-        <w:rPr>
-          <w:lang w:val="es-ES"/>
-        </w:rPr>
-        <w:t>Version</w:t>
-      </w:r>
-      <w:proofErr w:type="spellEnd"/>
-      <w:r>
-        <w:rPr>
-          <w:lang w:val="es-ES"/>
-        </w:rPr>
-        <w:t xml:space="preserve"> Control (DVC), integrado con Git y Amazon S3.</w:t>
+        <w:t>Para gestionar los datos del proyecto se implementó Data Version Control (DVC), integrado con Git y Amazon S3.</w:t>
       </w:r>
       <w:r>
         <w:rPr>
@@ -3528,49 +3286,7 @@
         <w:rPr>
           <w:lang w:val="es-ES"/>
         </w:rPr>
-        <w:t xml:space="preserve">El conjunto de datos datos_inmobiliarios.csv se incorporó al seguimiento de DVC mediante el comando </w:t>
-      </w:r>
-      <w:proofErr w:type="spellStart"/>
-      <w:r>
-        <w:rPr>
-          <w:lang w:val="es-ES"/>
-        </w:rPr>
-        <w:t>dvc</w:t>
-      </w:r>
-      <w:proofErr w:type="spellEnd"/>
-      <w:r>
-        <w:rPr>
-          <w:lang w:val="es-ES"/>
-        </w:rPr>
-        <w:t xml:space="preserve"> </w:t>
-      </w:r>
-      <w:proofErr w:type="spellStart"/>
-      <w:r>
-        <w:rPr>
-          <w:lang w:val="es-ES"/>
-        </w:rPr>
-        <w:t>add</w:t>
-      </w:r>
-      <w:proofErr w:type="spellEnd"/>
-      <w:r>
-        <w:rPr>
-          <w:lang w:val="es-ES"/>
-        </w:rPr>
-        <w:t xml:space="preserve">. Esta operación generó el archivo </w:t>
-      </w:r>
-      <w:proofErr w:type="spellStart"/>
-      <w:r>
-        <w:rPr>
-          <w:lang w:val="es-ES"/>
-        </w:rPr>
-        <w:t>datos_inmobiliarios.csv.dvc</w:t>
-      </w:r>
-      <w:proofErr w:type="spellEnd"/>
-      <w:r>
-        <w:rPr>
-          <w:lang w:val="es-ES"/>
-        </w:rPr>
-        <w:t>, que permite identificar la versión de los datos utilizada en el proyecto.</w:t>
+        <w:t>El conjunto de datos datos_inmobiliarios.csv se incorporó al seguimiento de DVC mediante el comando dvc add. Esta operación generó el archivo datos_inmobiliarios.csv.dvc, que permite identificar la versión de los datos utilizada en el proyecto.</w:t>
       </w:r>
     </w:p>
     <w:p>
@@ -3592,21 +3308,12 @@
         </w:rPr>
         <w:t xml:space="preserve"> </w:t>
       </w:r>
-      <w:proofErr w:type="spellStart"/>
       <w:r>
         <w:rPr>
           <w:lang w:val="es-ES"/>
         </w:rPr>
-        <w:t>Bucket</w:t>
+        <w:t xml:space="preserve">Bucket: </w:t>
       </w:r>
-      <w:proofErr w:type="spellEnd"/>
-      <w:r>
-        <w:rPr>
-          <w:lang w:val="es-ES"/>
-        </w:rPr>
-        <w:t xml:space="preserve">: </w:t>
-      </w:r>
-      <w:proofErr w:type="spellStart"/>
       <w:r>
         <w:rPr>
           <w:b/>
@@ -3615,10 +3322,12 @@
           <w:iCs/>
           <w:lang w:val="es-ES"/>
         </w:rPr>
-        <w:t>miad</w:t>
+        <w:t>miad-proyecto-inmobiliario</w:t>
       </w:r>
-      <w:proofErr w:type="spellEnd"/>
-      <w:r>
+    </w:p>
+    <w:p>
+      <w:pPr>
+        <w:jc w:val="both"/>
         <w:rPr>
           <w:b/>
           <w:bCs/>
@@ -3626,12 +3335,20 @@
           <w:iCs/>
           <w:lang w:val="es-ES"/>
         </w:rPr>
-        <w:t>-proyecto-inmobiliario</w:t>
+      </w:pPr>
+      <w:r>
+        <w:rPr>
+          <w:lang w:val="es-ES"/>
+        </w:rPr>
+        <w:t>Ruta del almacenamiento: s3:</w:t>
       </w:r>
-    </w:p>
-    <w:p>
-      <w:pPr>
-        <w:jc w:val="both"/>
+      <w:r>
+        <w:rPr>
+          <w:lang w:val="es-ES"/>
+        </w:rPr>
+        <w:t xml:space="preserve"> </w:t>
+      </w:r>
+      <w:r>
         <w:rPr>
           <w:b/>
           <w:bCs/>
@@ -3639,63 +3356,8 @@
           <w:iCs/>
           <w:lang w:val="es-ES"/>
         </w:rPr>
-      </w:pPr>
-      <w:r>
-        <w:rPr>
-          <w:lang w:val="es-ES"/>
-        </w:rPr>
-        <w:t>Ruta del almacenamiento: s3:</w:t>
+        <w:t>//miad-proyecto-inmobiliario/dvc-storage</w:t>
       </w:r>
-      <w:r>
-        <w:rPr>
-          <w:lang w:val="es-ES"/>
-        </w:rPr>
-        <w:t xml:space="preserve"> </w:t>
-      </w:r>
-      <w:r>
-        <w:rPr>
-          <w:b/>
-          <w:bCs/>
-          <w:i/>
-          <w:iCs/>
-          <w:lang w:val="es-ES"/>
-        </w:rPr>
-        <w:t>//</w:t>
-      </w:r>
-      <w:proofErr w:type="spellStart"/>
-      <w:r>
-        <w:rPr>
-          <w:b/>
-          <w:bCs/>
-          <w:i/>
-          <w:iCs/>
-          <w:lang w:val="es-ES"/>
-        </w:rPr>
-        <w:t>miad</w:t>
-      </w:r>
-      <w:proofErr w:type="spellEnd"/>
-      <w:r>
-        <w:rPr>
-          <w:b/>
-          <w:bCs/>
-          <w:i/>
-          <w:iCs/>
-          <w:lang w:val="es-ES"/>
-        </w:rPr>
-        <w:t>-proyecto-inmobiliario/</w:t>
-      </w:r>
-      <w:proofErr w:type="spellStart"/>
-      <w:r>
-        <w:rPr>
-          <w:b/>
-          <w:bCs/>
-          <w:i/>
-          <w:iCs/>
-          <w:lang w:val="es-ES"/>
-        </w:rPr>
-        <w:t>dvc-storage</w:t>
-      </w:r>
-      <w:proofErr w:type="spellEnd"/>
     </w:p>
     <w:p>
       <w:pPr>
@@ -3733,47 +3395,11 @@
           <w:lang w:val="es-ES"/>
         </w:rPr>
       </w:pPr>
-      <w:proofErr w:type="spellStart"/>
       <w:r>
         <w:rPr>
           <w:lang w:val="es-ES"/>
         </w:rPr>
-        <w:t>dvc</w:t>
-      </w:r>
-      <w:proofErr w:type="spellEnd"/>
-      <w:r>
-        <w:rPr>
-          <w:lang w:val="es-ES"/>
-        </w:rPr>
-        <w:t xml:space="preserve"> </w:t>
-      </w:r>
-      <w:proofErr w:type="spellStart"/>
-      <w:r>
-        <w:rPr>
-          <w:lang w:val="es-ES"/>
-        </w:rPr>
-        <w:t>push</w:t>
-      </w:r>
-      <w:proofErr w:type="spellEnd"/>
-      <w:r>
-        <w:rPr>
-          <w:lang w:val="es-ES"/>
-        </w:rPr>
-        <w:t xml:space="preserve">: se realizó exitosamente la transferencia del conjunto de datos hacia Amazon S3, obteniendo el resultado 1 file </w:t>
-      </w:r>
-      <w:proofErr w:type="spellStart"/>
-      <w:r>
-        <w:rPr>
-          <w:lang w:val="es-ES"/>
-        </w:rPr>
-        <w:t>pushed</w:t>
-      </w:r>
-      <w:proofErr w:type="spellEnd"/>
-      <w:r>
-        <w:rPr>
-          <w:lang w:val="es-ES"/>
-        </w:rPr>
-        <w:t>.</w:t>
+        <w:t>dvc push: se realizó exitosamente la transferencia del conjunto de datos hacia Amazon S3, obteniendo el resultado 1 file pushed.</w:t>
       </w:r>
     </w:p>
     <w:p>
@@ -3787,21 +3413,7 @@
         <w:rPr>
           <w:lang w:val="es-ES"/>
         </w:rPr>
-        <w:t xml:space="preserve">Verificación en S3: se confirmó la existencia del objeto almacenado en el </w:t>
-      </w:r>
-      <w:proofErr w:type="spellStart"/>
-      <w:r>
-        <w:rPr>
-          <w:lang w:val="es-ES"/>
-        </w:rPr>
-        <w:t>bucket</w:t>
-      </w:r>
-      <w:proofErr w:type="spellEnd"/>
-      <w:r>
-        <w:rPr>
-          <w:lang w:val="es-ES"/>
-        </w:rPr>
-        <w:t xml:space="preserve"> mediante AWS CLI.</w:t>
+        <w:t>Verificación en S3: se confirmó la existencia del objeto almacenado en el bucket mediante AWS CLI.</w:t>
       </w:r>
     </w:p>
     <w:p>
@@ -3811,61 +3423,11 @@
           <w:lang w:val="es-ES"/>
         </w:rPr>
       </w:pPr>
-      <w:proofErr w:type="spellStart"/>
       <w:r>
         <w:rPr>
           <w:lang w:val="es-ES"/>
         </w:rPr>
-        <w:t>dvc</w:t>
-      </w:r>
-      <w:proofErr w:type="spellEnd"/>
-      <w:r>
-        <w:rPr>
-          <w:lang w:val="es-ES"/>
-        </w:rPr>
-        <w:t xml:space="preserve"> </w:t>
-      </w:r>
-      <w:proofErr w:type="spellStart"/>
-      <w:r>
-        <w:rPr>
-          <w:lang w:val="es-ES"/>
-        </w:rPr>
-        <w:t>pull</w:t>
-      </w:r>
-      <w:proofErr w:type="spellEnd"/>
-      <w:r>
-        <w:rPr>
-          <w:lang w:val="es-ES"/>
-        </w:rPr>
-        <w:t xml:space="preserve">: se realizó una prueba de recuperación desde una copia independiente del repositorio, sin el archivo CSV ni la caché de datos local. El resultado fue 1 file </w:t>
-      </w:r>
-      <w:proofErr w:type="spellStart"/>
-      <w:r>
-        <w:rPr>
-          <w:lang w:val="es-ES"/>
-        </w:rPr>
-        <w:t>fetched</w:t>
-      </w:r>
-      <w:proofErr w:type="spellEnd"/>
-      <w:r>
-        <w:rPr>
-          <w:lang w:val="es-ES"/>
-        </w:rPr>
-        <w:t xml:space="preserve"> and 1 file </w:t>
-      </w:r>
-      <w:proofErr w:type="spellStart"/>
-      <w:r>
-        <w:rPr>
-          <w:lang w:val="es-ES"/>
-        </w:rPr>
-        <w:t>added</w:t>
-      </w:r>
-      <w:proofErr w:type="spellEnd"/>
-      <w:r>
-        <w:rPr>
-          <w:lang w:val="es-ES"/>
-        </w:rPr>
-        <w:t>.</w:t>
+        <w:t>dvc pull: se realizó una prueba de recuperación desde una copia independiente del repositorio, sin el archivo CSV ni la caché de datos local. El resultado fue 1 file fetched and 1 file added.</w:t>
       </w:r>
     </w:p>
     <w:p>
@@ -3875,47 +3437,11 @@
           <w:lang w:val="es-ES"/>
         </w:rPr>
       </w:pPr>
-      <w:proofErr w:type="spellStart"/>
       <w:r>
         <w:rPr>
           <w:lang w:val="es-ES"/>
         </w:rPr>
-        <w:t>dvc</w:t>
-      </w:r>
-      <w:proofErr w:type="spellEnd"/>
-      <w:r>
-        <w:rPr>
-          <w:lang w:val="es-ES"/>
-        </w:rPr>
-        <w:t xml:space="preserve"> </w:t>
-      </w:r>
-      <w:proofErr w:type="gramStart"/>
-      <w:r>
-        <w:rPr>
-          <w:lang w:val="es-ES"/>
-        </w:rPr>
-        <w:t>status</w:t>
-      </w:r>
-      <w:proofErr w:type="gramEnd"/>
-      <w:r>
-        <w:rPr>
-          <w:lang w:val="es-ES"/>
-        </w:rPr>
-        <w:t xml:space="preserve">: se verificó la consistencia de los datos recuperados mediante el mensaje Data and pipelines are up </w:t>
-      </w:r>
-      <w:proofErr w:type="spellStart"/>
-      <w:r>
-        <w:rPr>
-          <w:lang w:val="es-ES"/>
-        </w:rPr>
-        <w:t>to</w:t>
-      </w:r>
-      <w:proofErr w:type="spellEnd"/>
-      <w:r>
-        <w:rPr>
-          <w:lang w:val="es-ES"/>
-        </w:rPr>
-        <w:t xml:space="preserve"> date.</w:t>
+        <w:t>dvc status: se verificó la consistencia de los datos recuperados mediante el mensaje Data and pipelines are up to date.</w:t>
       </w:r>
     </w:p>
     <w:p>
@@ -3929,21 +3455,7 @@
         <w:rPr>
           <w:lang w:val="es-ES"/>
         </w:rPr>
-        <w:t xml:space="preserve">Estas pruebas demuestran el funcionamiento del </w:t>
-      </w:r>
-      <w:proofErr w:type="spellStart"/>
-      <w:r>
-        <w:rPr>
-          <w:lang w:val="es-ES"/>
-        </w:rPr>
-        <w:t>versionamiento</w:t>
-      </w:r>
-      <w:proofErr w:type="spellEnd"/>
-      <w:r>
-        <w:rPr>
-          <w:lang w:val="es-ES"/>
-        </w:rPr>
-        <w:t xml:space="preserve"> y la recuperación del conjunto de datos mediante DVC y S3.</w:t>
+        <w:t>Estas pruebas demuestran el funcionamiento del versionamiento y la recuperación del conjunto de datos mediante DVC y S3.</w:t>
       </w:r>
       <w:r>
         <w:rPr>
@@ -4073,72 +3585,8 @@
           <w:sz w:val="17"/>
           <w:lang w:val="es-CO"/>
         </w:rPr>
-        <w:t xml:space="preserve">Figura 11. Publicación de cambios mediante </w:t>
+        <w:t>Figura 11. Publicación de cambios mediante git push origin main</w:t>
       </w:r>
-      <w:proofErr w:type="spellStart"/>
-      <w:r>
-        <w:rPr>
-          <w:i/>
-          <w:sz w:val="17"/>
-          <w:lang w:val="es-CO"/>
-        </w:rPr>
-        <w:t>git</w:t>
-      </w:r>
-      <w:proofErr w:type="spellEnd"/>
-      <w:r>
-        <w:rPr>
-          <w:i/>
-          <w:sz w:val="17"/>
-          <w:lang w:val="es-CO"/>
-        </w:rPr>
-        <w:t xml:space="preserve"> </w:t>
-      </w:r>
-      <w:proofErr w:type="spellStart"/>
-      <w:r>
-        <w:rPr>
-          <w:i/>
-          <w:sz w:val="17"/>
-          <w:lang w:val="es-CO"/>
-        </w:rPr>
-        <w:t>push</w:t>
-      </w:r>
-      <w:proofErr w:type="spellEnd"/>
-      <w:r>
-        <w:rPr>
-          <w:i/>
-          <w:sz w:val="17"/>
-          <w:lang w:val="es-CO"/>
-        </w:rPr>
-        <w:t xml:space="preserve"> </w:t>
-      </w:r>
-      <w:proofErr w:type="spellStart"/>
-      <w:r>
-        <w:rPr>
-          <w:i/>
-          <w:sz w:val="17"/>
-          <w:lang w:val="es-CO"/>
-        </w:rPr>
-        <w:t>origin</w:t>
-      </w:r>
-      <w:proofErr w:type="spellEnd"/>
-      <w:r>
-        <w:rPr>
-          <w:i/>
-          <w:sz w:val="17"/>
-          <w:lang w:val="es-CO"/>
-        </w:rPr>
-        <w:t xml:space="preserve"> </w:t>
-      </w:r>
-      <w:proofErr w:type="spellStart"/>
-      <w:r>
-        <w:rPr>
-          <w:i/>
-          <w:sz w:val="17"/>
-          <w:lang w:val="es-CO"/>
-        </w:rPr>
-        <w:t>main</w:t>
-      </w:r>
-      <w:proofErr w:type="spellEnd"/>
     </w:p>
     <w:p>
       <w:pPr>
@@ -4227,21 +3675,7 @@
           <w:lang w:val="es-CO"/>
         </w:rPr>
         <w:lastRenderedPageBreak/>
-        <w:t xml:space="preserve">7 </w:t>
-      </w:r>
-      <w:proofErr w:type="spellStart"/>
-      <w:r>
-        <w:rPr>
-          <w:lang w:val="es-CO"/>
-        </w:rPr>
-        <w:t>Versionamiento</w:t>
-      </w:r>
-      <w:proofErr w:type="spellEnd"/>
-      <w:r>
-        <w:rPr>
-          <w:lang w:val="es-CO"/>
-        </w:rPr>
-        <w:t xml:space="preserve"> y reproducibilidad</w:t>
+        <w:t>7 Versionamiento y reproducibilidad</w:t>
       </w:r>
     </w:p>
     <w:p>
@@ -4254,99 +3688,7 @@
         <w:rPr>
           <w:lang w:val="es-CO"/>
         </w:rPr>
-        <w:t xml:space="preserve">El equipo reportó configurar el remoto s3://miad-proyecto-inmobiliario/dvc-storage y ejecutar pruebas de transferencia y recuperación. La evidencia disponible incluye el </w:t>
-      </w:r>
-      <w:proofErr w:type="gramStart"/>
-      <w:r>
-        <w:rPr>
-          <w:lang w:val="es-CO"/>
-        </w:rPr>
-        <w:t>archivo .</w:t>
-      </w:r>
-      <w:proofErr w:type="spellStart"/>
-      <w:r>
-        <w:rPr>
-          <w:lang w:val="es-CO"/>
-        </w:rPr>
-        <w:t>dvc</w:t>
-      </w:r>
-      <w:proofErr w:type="spellEnd"/>
-      <w:proofErr w:type="gramEnd"/>
-      <w:r>
-        <w:rPr>
-          <w:lang w:val="es-CO"/>
-        </w:rPr>
-        <w:t xml:space="preserve">, la captura del objeto remoto y una ejecución de </w:t>
-      </w:r>
-      <w:proofErr w:type="spellStart"/>
-      <w:r>
-        <w:rPr>
-          <w:lang w:val="es-CO"/>
-        </w:rPr>
-        <w:t>dvc</w:t>
-      </w:r>
-      <w:proofErr w:type="spellEnd"/>
-      <w:r>
-        <w:rPr>
-          <w:lang w:val="es-CO"/>
-        </w:rPr>
-        <w:t xml:space="preserve"> </w:t>
-      </w:r>
-      <w:proofErr w:type="spellStart"/>
-      <w:r>
-        <w:rPr>
-          <w:lang w:val="es-CO"/>
-        </w:rPr>
-        <w:t>pull</w:t>
-      </w:r>
-      <w:proofErr w:type="spellEnd"/>
-      <w:r>
-        <w:rPr>
-          <w:lang w:val="es-CO"/>
-        </w:rPr>
-        <w:t xml:space="preserve">. La captura siguiente devuelve </w:t>
-      </w:r>
-      <w:proofErr w:type="spellStart"/>
-      <w:r>
-        <w:rPr>
-          <w:lang w:val="es-CO"/>
-        </w:rPr>
-        <w:t>Everything</w:t>
-      </w:r>
-      <w:proofErr w:type="spellEnd"/>
-      <w:r>
-        <w:rPr>
-          <w:lang w:val="es-CO"/>
-        </w:rPr>
-        <w:t xml:space="preserve"> </w:t>
-      </w:r>
-      <w:proofErr w:type="spellStart"/>
-      <w:r>
-        <w:rPr>
-          <w:lang w:val="es-CO"/>
-        </w:rPr>
-        <w:t>is</w:t>
-      </w:r>
-      <w:proofErr w:type="spellEnd"/>
-      <w:r>
-        <w:rPr>
-          <w:lang w:val="es-CO"/>
-        </w:rPr>
-        <w:t xml:space="preserve"> up </w:t>
-      </w:r>
-      <w:proofErr w:type="spellStart"/>
-      <w:r>
-        <w:rPr>
-          <w:lang w:val="es-CO"/>
-        </w:rPr>
-        <w:t>to</w:t>
-      </w:r>
-      <w:proofErr w:type="spellEnd"/>
-      <w:r>
-        <w:rPr>
-          <w:lang w:val="es-CO"/>
-        </w:rPr>
-        <w:t xml:space="preserve"> date</w:t>
+        <w:t>El equipo reportó configurar el remoto s3://miad-proyecto-inmobiliario/dvc-storage y ejecutar pruebas de transferencia y recuperación. La evidencia disponible incluye el archivo .dvc, la captura del objeto remoto y una ejecución de dvc pull. La captura siguiente devuelve Everything is up to date</w:t>
       </w:r>
       <w:r>
         <w:rPr>
@@ -4414,43 +3756,7 @@
           <w:sz w:val="17"/>
           <w:lang w:val="es-CO"/>
         </w:rPr>
-        <w:t xml:space="preserve">Figura 13. Ejecución de </w:t>
-      </w:r>
-      <w:proofErr w:type="spellStart"/>
-      <w:r>
-        <w:rPr>
-          <w:i/>
-          <w:sz w:val="17"/>
-          <w:lang w:val="es-CO"/>
-        </w:rPr>
-        <w:t>dvc</w:t>
-      </w:r>
-      <w:proofErr w:type="spellEnd"/>
-      <w:r>
-        <w:rPr>
-          <w:i/>
-          <w:sz w:val="17"/>
-          <w:lang w:val="es-CO"/>
-        </w:rPr>
-        <w:t xml:space="preserve"> </w:t>
-      </w:r>
-      <w:proofErr w:type="spellStart"/>
-      <w:r>
-        <w:rPr>
-          <w:i/>
-          <w:sz w:val="17"/>
-          <w:lang w:val="es-CO"/>
-        </w:rPr>
-        <w:t>pull</w:t>
-      </w:r>
-      <w:proofErr w:type="spellEnd"/>
-      <w:r>
-        <w:rPr>
-          <w:i/>
-          <w:sz w:val="17"/>
-          <w:lang w:val="es-CO"/>
-        </w:rPr>
-        <w:t xml:space="preserve"> </w:t>
+        <w:t xml:space="preserve">Figura 13. Ejecución de dvc pull </w:t>
       </w:r>
     </w:p>
     <w:p>
@@ -4512,25 +3818,7 @@
           <w:sz w:val="17"/>
           <w:lang w:val="es-CO"/>
         </w:rPr>
-        <w:t xml:space="preserve">Figura 14. Historial de contribuciones aportado por el equipo. La versión corregida del informe y del notebook requiere su correspondiente </w:t>
-      </w:r>
-      <w:proofErr w:type="spellStart"/>
-      <w:r>
-        <w:rPr>
-          <w:i/>
-          <w:sz w:val="17"/>
-          <w:lang w:val="es-CO"/>
-        </w:rPr>
-        <w:t>commit</w:t>
-      </w:r>
-      <w:proofErr w:type="spellEnd"/>
-      <w:r>
-        <w:rPr>
-          <w:i/>
-          <w:sz w:val="17"/>
-          <w:lang w:val="es-CO"/>
-        </w:rPr>
-        <w:t xml:space="preserve"> final; los identificadores mostrados corresponden a los aportes previos.</w:t>
+        <w:t>Figura 14. Historial de contribuciones aportado por el equipo. La versión corregida del informe y del notebook requiere su correspondiente commit final; los identificadores mostrados corresponden a los aportes previos.</w:t>
       </w:r>
     </w:p>
     <w:p>
@@ -4558,21 +3846,7 @@
           <w:lang w:val="es-CO"/>
         </w:rPr>
         <w:lastRenderedPageBreak/>
-        <w:t xml:space="preserve">8 </w:t>
-      </w:r>
-      <w:proofErr w:type="gramStart"/>
-      <w:r>
-        <w:rPr>
-          <w:lang w:val="es-CO"/>
-        </w:rPr>
-        <w:t>Reporte</w:t>
-      </w:r>
-      <w:proofErr w:type="gramEnd"/>
-      <w:r>
-        <w:rPr>
-          <w:lang w:val="es-CO"/>
-        </w:rPr>
-        <w:t xml:space="preserve"> de trabajo en equipo</w:t>
+        <w:t>8 Reporte de trabajo en equipo</w:t>
       </w:r>
     </w:p>
     <w:p>
@@ -4619,21 +3893,7 @@
         <w:rPr>
           <w:lang w:val="es-ES"/>
         </w:rPr>
-        <w:t xml:space="preserve"> realizó la publicación y actualización de los archivos del proyecto en GitHub, incluyendo el notebook de exploración, el informe y la primera versión del mockup del tablero. Su participación está registrada mediante tres </w:t>
-      </w:r>
-      <w:proofErr w:type="spellStart"/>
-      <w:r>
-        <w:rPr>
-          <w:lang w:val="es-ES"/>
-        </w:rPr>
-        <w:t>commits</w:t>
-      </w:r>
-      <w:proofErr w:type="spellEnd"/>
-      <w:r>
-        <w:rPr>
-          <w:lang w:val="es-ES"/>
-        </w:rPr>
-        <w:t xml:space="preserve"> en el repositorio.</w:t>
+        <w:t xml:space="preserve"> realizó la publicación y actualización de los archivos del proyecto en GitHub, incluyendo el notebook de exploración, el informe y la primera versión del mockup del tablero. Su participación está registrada mediante tres commits en el repositorio.</w:t>
       </w:r>
     </w:p>
     <w:p>
@@ -4662,91 +3922,7 @@
         <w:rPr>
           <w:lang w:val="es-ES"/>
         </w:rPr>
-        <w:t xml:space="preserve"> realizó la implementación de Data </w:t>
-      </w:r>
-      <w:proofErr w:type="spellStart"/>
-      <w:r>
-        <w:rPr>
-          <w:lang w:val="es-ES"/>
-        </w:rPr>
-        <w:t>Version</w:t>
-      </w:r>
-      <w:proofErr w:type="spellEnd"/>
-      <w:r>
-        <w:rPr>
-          <w:lang w:val="es-ES"/>
-        </w:rPr>
-        <w:t xml:space="preserve"> Control (DVC), configuró Amazon S3 como almacenamiento remoto y ejecutó pruebas exitosas de almacenamiento y recuperación de datos mediante </w:t>
-      </w:r>
-      <w:proofErr w:type="spellStart"/>
-      <w:r>
-        <w:rPr>
-          <w:lang w:val="es-ES"/>
-        </w:rPr>
-        <w:t>dvc</w:t>
-      </w:r>
-      <w:proofErr w:type="spellEnd"/>
-      <w:r>
-        <w:rPr>
-          <w:lang w:val="es-ES"/>
-        </w:rPr>
-        <w:t xml:space="preserve"> </w:t>
-      </w:r>
-      <w:proofErr w:type="spellStart"/>
-      <w:r>
-        <w:rPr>
-          <w:lang w:val="es-ES"/>
-        </w:rPr>
-        <w:t>push</w:t>
-      </w:r>
-      <w:proofErr w:type="spellEnd"/>
-      <w:r>
-        <w:rPr>
-          <w:lang w:val="es-ES"/>
-        </w:rPr>
-        <w:t xml:space="preserve"> y </w:t>
-      </w:r>
-      <w:proofErr w:type="spellStart"/>
-      <w:r>
-        <w:rPr>
-          <w:lang w:val="es-ES"/>
-        </w:rPr>
-        <w:t>dvc</w:t>
-      </w:r>
-      <w:proofErr w:type="spellEnd"/>
-      <w:r>
-        <w:rPr>
-          <w:lang w:val="es-ES"/>
-        </w:rPr>
-        <w:t xml:space="preserve"> </w:t>
-      </w:r>
-      <w:proofErr w:type="spellStart"/>
-      <w:r>
-        <w:rPr>
-          <w:lang w:val="es-ES"/>
-        </w:rPr>
-        <w:t>pull</w:t>
-      </w:r>
-      <w:proofErr w:type="spellEnd"/>
-      <w:r>
-        <w:rPr>
-          <w:lang w:val="es-ES"/>
-        </w:rPr>
-        <w:t xml:space="preserve">. Estos cambios quedaron registrados en el </w:t>
-      </w:r>
-      <w:proofErr w:type="spellStart"/>
-      <w:r>
-        <w:rPr>
-          <w:lang w:val="es-ES"/>
-        </w:rPr>
-        <w:t>commit</w:t>
-      </w:r>
-      <w:proofErr w:type="spellEnd"/>
-      <w:r>
-        <w:rPr>
-          <w:lang w:val="es-ES"/>
-        </w:rPr>
-        <w:t xml:space="preserve"> ba5822f.</w:t>
+        <w:t xml:space="preserve"> realizó la implementación de Data Version Control (DVC), configuró Amazon S3 como almacenamiento remoto y ejecutó pruebas exitosas de almacenamiento y recuperación de datos mediante dvc push y dvc pull. Estos cambios quedaron registrados en el commit ba5822f.</w:t>
       </w:r>
     </w:p>
     <w:p>
@@ -4777,21 +3953,7 @@
         <w:rPr>
           <w:lang w:val="es-ES"/>
         </w:rPr>
-        <w:t xml:space="preserve">amplió en el notebook de exploración con el cálculo de variaciones porcentuales anuales y un índice de compraventas con base 2015 = 100 para Armenia, Manizales y Pereira. Incluyó gráficas comparativas e interpretación de resultados. Este aporte quedó registrado en GitHub mediante el </w:t>
-      </w:r>
-      <w:proofErr w:type="spellStart"/>
-      <w:r>
-        <w:rPr>
-          <w:lang w:val="es-ES"/>
-        </w:rPr>
-        <w:t>commit</w:t>
-      </w:r>
-      <w:proofErr w:type="spellEnd"/>
-      <w:r>
-        <w:rPr>
-          <w:lang w:val="es-ES"/>
-        </w:rPr>
-        <w:t xml:space="preserve"> b68a6f6.</w:t>
+        <w:t>amplió en el notebook de exploración con el cálculo de variaciones porcentuales anuales y un índice de compraventas con base 2015 = 100 para Armenia, Manizales y Pereira. Incluyó gráficas comparativas e interpretación de resultados. Este aporte quedó registrado en GitHub mediante el commit b68a6f6.</w:t>
       </w:r>
     </w:p>
     <w:p>
@@ -4824,27 +3986,13 @@
         <w:rPr>
           <w:lang w:val="es-ES"/>
         </w:rPr>
-        <w:t xml:space="preserve"> Este aporte quedó registrado en GitHub mediante el </w:t>
-      </w:r>
-      <w:proofErr w:type="spellStart"/>
-      <w:r>
-        <w:rPr>
-          <w:lang w:val="es-ES"/>
-        </w:rPr>
-        <w:t>commit</w:t>
-      </w:r>
-      <w:proofErr w:type="spellEnd"/>
-      <w:r>
-        <w:rPr>
-          <w:lang w:val="es-ES"/>
-        </w:rPr>
-        <w:t xml:space="preserve"> </w:t>
+        <w:t xml:space="preserve"> Este aporte quedó registrado en GitHub mediante el commit </w:t>
       </w:r>
       <w:r>
         <w:rPr>
           <w:lang w:val="es-ES"/>
         </w:rPr>
-        <w:t>84f3884</w:t>
+        <w:t>b76fa4f</w:t>
       </w:r>
     </w:p>
     <w:p>
@@ -4866,21 +4014,7 @@
         <w:rPr>
           <w:lang w:val="es-ES"/>
         </w:rPr>
-        <w:t xml:space="preserve"> el equipo utilizó GitHub como repositorio central para consolidar los entregables. Las contribuciones técnicas se evidencian mediante el historial de </w:t>
-      </w:r>
-      <w:proofErr w:type="spellStart"/>
-      <w:r>
-        <w:rPr>
-          <w:lang w:val="es-ES"/>
-        </w:rPr>
-        <w:t>commits</w:t>
-      </w:r>
-      <w:proofErr w:type="spellEnd"/>
-      <w:r>
-        <w:rPr>
-          <w:lang w:val="es-ES"/>
-        </w:rPr>
-        <w:t>, mientras que el trabajo colaborativo de redacción se documenta en este reporte. Se reconoce que el historial de Git no refleja de manera individual todas las actividades realizadas fuera del repositorio.</w:t>
+        <w:t xml:space="preserve"> el equipo utilizó GitHub como repositorio central para consolidar los entregables. Las contribuciones técnicas se evidencian mediante el historial de commits, mientras que el trabajo colaborativo de redacción se documenta en este reporte. Se reconoce que el historial de Git no refleja de manera individual todas las actividades realizadas fuera del repositorio.</w:t>
       </w:r>
     </w:p>
     <w:p>
@@ -4898,21 +4032,19 @@
           <w:lang w:val="es-CO"/>
         </w:rPr>
       </w:pPr>
-      <w:proofErr w:type="spellStart"/>
       <w:r>
         <w:rPr>
           <w:rStyle w:val="BookTitle"/>
           <w:lang w:val="es-CO"/>
         </w:rPr>
-        <w:t>Commit</w:t>
+        <w:t xml:space="preserve">Commit de la versión final del informe y notebook: </w:t>
       </w:r>
-      <w:proofErr w:type="spellEnd"/>
       <w:r>
         <w:rPr>
           <w:rStyle w:val="BookTitle"/>
           <w:lang w:val="es-CO"/>
         </w:rPr>
-        <w:t xml:space="preserve"> de la versión final del informe y notebook: </w:t>
+        <w:t>b76fa4f</w:t>
       </w:r>
     </w:p>
     <w:sectPr>
@@ -4963,21 +4095,7 @@
       <w:rPr>
         <w:sz w:val="16"/>
       </w:rPr>
-      <w:t xml:space="preserve">Entrega 1 · 25 de </w:t>
-    </w:r>
-    <w:proofErr w:type="spellStart"/>
-    <w:r>
-      <w:rPr>
-        <w:sz w:val="16"/>
-      </w:rPr>
-      <w:t>octubre</w:t>
-    </w:r>
-    <w:proofErr w:type="spellEnd"/>
-    <w:r>
-      <w:rPr>
-        <w:sz w:val="16"/>
-      </w:rPr>
-      <w:t xml:space="preserve"> de 2026   |   </w:t>
+      <w:t xml:space="preserve">Entrega 1 · 25 de octubre de 2026   |   </w:t>
     </w:r>
     <w:r>
       <w:fldChar w:fldCharType="begin"/>
@@ -5856,7 +4974,6 @@
   <w:style w:type="character" w:default="1" w:styleId="DefaultParagraphFont">
     <w:name w:val="Default Paragraph Font"/>
     <w:uiPriority w:val="1"/>
-    <w:semiHidden/>
     <w:unhideWhenUsed/>
   </w:style>
   <w:style w:type="table" w:default="1" w:styleId="TableNormal">

</xml_diff>